<commit_message>
Add Product Entity Config
</commit_message>
<xml_diff>
--- a/ECommerce By Neil Cummings.docx
+++ b/ECommerce By Neil Cummings.docx
@@ -230,7 +230,6 @@
         </w:rPr>
         <w:t xml:space="preserve"> ی که داخل </w:t>
       </w:r>
-      <w:proofErr w:type="spellStart"/>
       <w:r>
         <w:rPr>
           <w:rFonts w:cs="B Nazanin"/>
@@ -240,7 +239,6 @@
         </w:rPr>
         <w:t>LaunchSettings</w:t>
       </w:r>
-      <w:proofErr w:type="spellEnd"/>
       <w:r>
         <w:rPr>
           <w:rFonts w:cs="B Nazanin" w:hint="cs"/>
@@ -249,20 +247,8 @@
           <w:rtl/>
           <w:lang w:bidi="fa-IR"/>
         </w:rPr>
-        <w:t xml:space="preserve"> برای اجرای برنامه تولید می شود تصادفی </w:t>
-      </w:r>
-      <w:proofErr w:type="gramStart"/>
-      <w:r>
-        <w:rPr>
-          <w:rFonts w:cs="B Nazanin" w:hint="cs"/>
-          <w:sz w:val="24"/>
-          <w:szCs w:val="24"/>
-          <w:rtl/>
-          <w:lang w:bidi="fa-IR"/>
-        </w:rPr>
-        <w:t>است .</w:t>
-      </w:r>
-      <w:proofErr w:type="gramEnd"/>
+        <w:t xml:space="preserve"> برای اجرای برنامه تولید می شود تصادفی است .</w:t>
+      </w:r>
     </w:p>
     <w:p>
       <w:pPr>
@@ -287,7 +273,6 @@
           <w:lang w:bidi="fa-IR"/>
         </w:rPr>
       </w:pPr>
-      <w:proofErr w:type="spellStart"/>
       <w:r>
         <w:rPr>
           <w:rFonts w:cs="B Nazanin"/>
@@ -299,7 +284,6 @@
         </w:rPr>
         <w:t>Program.cs</w:t>
       </w:r>
-      <w:proofErr w:type="spellEnd"/>
     </w:p>
     <w:p>
       <w:pPr>
@@ -389,27 +373,7 @@
           <w:szCs w:val="24"/>
           <w:lang w:bidi="fa-IR"/>
         </w:rPr>
-        <w:t>var app=</w:t>
-      </w:r>
-      <w:proofErr w:type="spellStart"/>
-      <w:r>
-        <w:rPr>
-          <w:rFonts w:cs="B Nazanin"/>
-          <w:sz w:val="24"/>
-          <w:szCs w:val="24"/>
-          <w:lang w:bidi="fa-IR"/>
-        </w:rPr>
-        <w:t>builder.Build</w:t>
-      </w:r>
-      <w:proofErr w:type="spellEnd"/>
-      <w:r>
-        <w:rPr>
-          <w:rFonts w:cs="B Nazanin"/>
-          <w:sz w:val="24"/>
-          <w:szCs w:val="24"/>
-          <w:lang w:bidi="fa-IR"/>
-        </w:rPr>
-        <w:t>()</w:t>
+        <w:t>var app=builder.Build()</w:t>
       </w:r>
       <w:r>
         <w:rPr>
@@ -438,9 +402,17 @@
           <w:rtl/>
           <w:lang w:bidi="fa-IR"/>
         </w:rPr>
-        <w:t xml:space="preserve"> و </w:t>
-      </w:r>
-      <w:proofErr w:type="spellStart"/>
+        <w:t xml:space="preserve"> و هرچی بعد از آن بیاد </w:t>
+      </w:r>
+      <w:r>
+        <w:rPr>
+          <w:rFonts w:cs="B Nazanin"/>
+          <w:sz w:val="24"/>
+          <w:szCs w:val="24"/>
+          <w:lang w:bidi="fa-IR"/>
+        </w:rPr>
+        <w:t>middleware</w:t>
+      </w:r>
       <w:r>
         <w:rPr>
           <w:rFonts w:cs="B Nazanin" w:hint="cs"/>
@@ -449,9 +421,20 @@
           <w:rtl/>
           <w:lang w:bidi="fa-IR"/>
         </w:rPr>
-        <w:t>هرچی</w:t>
-      </w:r>
-      <w:proofErr w:type="spellEnd"/>
+        <w:t xml:space="preserve"> هست .</w:t>
+      </w:r>
+    </w:p>
+    <w:p>
+      <w:pPr>
+        <w:bidi/>
+        <w:rPr>
+          <w:rFonts w:cs="B Nazanin"/>
+          <w:sz w:val="24"/>
+          <w:szCs w:val="24"/>
+          <w:rtl/>
+          <w:lang w:bidi="fa-IR"/>
+        </w:rPr>
+      </w:pPr>
       <w:r>
         <w:rPr>
           <w:rFonts w:cs="B Nazanin" w:hint="cs"/>
@@ -460,17 +443,17 @@
           <w:rtl/>
           <w:lang w:bidi="fa-IR"/>
         </w:rPr>
-        <w:t xml:space="preserve"> بعد از آن بیاد </w:t>
-      </w:r>
-      <w:r>
-        <w:rPr>
-          <w:rFonts w:cs="B Nazanin"/>
-          <w:sz w:val="24"/>
-          <w:szCs w:val="24"/>
-          <w:lang w:bidi="fa-IR"/>
-        </w:rPr>
-        <w:t>middleware</w:t>
-      </w:r>
+        <w:t>سرویس ها چیز هایی هستند که ما در داخل برنامه خود به کلاس های دیگر تزریق می کنیم .</w:t>
+      </w:r>
+    </w:p>
+    <w:p>
+      <w:pPr>
+        <w:bidi/>
+        <w:rPr>
+          <w:rFonts w:cs="B Nazanin"/>
+          <w:lang w:bidi="fa-IR"/>
+        </w:rPr>
+      </w:pPr>
       <w:r>
         <w:rPr>
           <w:rFonts w:cs="B Nazanin" w:hint="cs"/>
@@ -479,69 +462,6 @@
           <w:rtl/>
           <w:lang w:bidi="fa-IR"/>
         </w:rPr>
-        <w:t xml:space="preserve"> هست .</w:t>
-      </w:r>
-    </w:p>
-    <w:p>
-      <w:pPr>
-        <w:bidi/>
-        <w:rPr>
-          <w:rFonts w:cs="B Nazanin"/>
-          <w:sz w:val="24"/>
-          <w:szCs w:val="24"/>
-          <w:rtl/>
-          <w:lang w:bidi="fa-IR"/>
-        </w:rPr>
-      </w:pPr>
-      <w:r>
-        <w:rPr>
-          <w:rFonts w:cs="B Nazanin" w:hint="cs"/>
-          <w:sz w:val="24"/>
-          <w:szCs w:val="24"/>
-          <w:rtl/>
-          <w:lang w:bidi="fa-IR"/>
-        </w:rPr>
-        <w:t xml:space="preserve">سرویس ها چیز </w:t>
-      </w:r>
-      <w:proofErr w:type="spellStart"/>
-      <w:r>
-        <w:rPr>
-          <w:rFonts w:cs="B Nazanin" w:hint="cs"/>
-          <w:sz w:val="24"/>
-          <w:szCs w:val="24"/>
-          <w:rtl/>
-          <w:lang w:bidi="fa-IR"/>
-        </w:rPr>
-        <w:t>هایی</w:t>
-      </w:r>
-      <w:proofErr w:type="spellEnd"/>
-      <w:r>
-        <w:rPr>
-          <w:rFonts w:cs="B Nazanin" w:hint="cs"/>
-          <w:sz w:val="24"/>
-          <w:szCs w:val="24"/>
-          <w:rtl/>
-          <w:lang w:bidi="fa-IR"/>
-        </w:rPr>
-        <w:t xml:space="preserve"> هستند که ما در داخل برنامه خود به کلاس های دیگر تزریق می کنیم .</w:t>
-      </w:r>
-    </w:p>
-    <w:p>
-      <w:pPr>
-        <w:bidi/>
-        <w:rPr>
-          <w:rFonts w:cs="B Nazanin"/>
-          <w:lang w:bidi="fa-IR"/>
-        </w:rPr>
-      </w:pPr>
-      <w:r>
-        <w:rPr>
-          <w:rFonts w:cs="B Nazanin" w:hint="cs"/>
-          <w:sz w:val="24"/>
-          <w:szCs w:val="24"/>
-          <w:rtl/>
-          <w:lang w:bidi="fa-IR"/>
-        </w:rPr>
         <w:t xml:space="preserve">به معنای بهتر </w:t>
       </w:r>
       <w:r>
@@ -556,23 +476,7 @@
           <w:rFonts w:cs="B Nazanin"/>
           <w:lang w:bidi="fa-IR"/>
         </w:rPr>
-        <w:t xml:space="preserve"> </w:t>
-      </w:r>
-      <w:proofErr w:type="spellStart"/>
-      <w:r>
-        <w:rPr>
-          <w:rFonts w:cs="B Nazanin"/>
-          <w:lang w:bidi="fa-IR"/>
-        </w:rPr>
-        <w:t>Program.cs</w:t>
-      </w:r>
-      <w:proofErr w:type="spellEnd"/>
-      <w:r>
-        <w:rPr>
-          <w:rFonts w:cs="B Nazanin"/>
-          <w:lang w:bidi="fa-IR"/>
-        </w:rPr>
-        <w:t xml:space="preserve"> </w:t>
+        <w:t xml:space="preserve"> Program.cs </w:t>
       </w:r>
       <w:r>
         <w:rPr>
@@ -761,7 +665,6 @@
           <w:lang w:bidi="fa-IR"/>
         </w:rPr>
       </w:pPr>
-      <w:proofErr w:type="spellStart"/>
       <w:r>
         <w:rPr>
           <w:rFonts w:cs="B Nazanin"/>
@@ -771,7 +674,6 @@
         </w:rPr>
         <w:t>Appsetting.Json</w:t>
       </w:r>
-      <w:proofErr w:type="spellEnd"/>
       <w:r>
         <w:rPr>
           <w:rFonts w:cs="B Nazanin" w:hint="cs"/>
@@ -782,8 +684,6 @@
         </w:rPr>
         <w:t xml:space="preserve"> در همه حالات خوانده میشود ولی </w:t>
       </w:r>
-      <w:proofErr w:type="spellStart"/>
-      <w:proofErr w:type="gramStart"/>
       <w:r>
         <w:rPr>
           <w:rFonts w:cs="B Nazanin"/>
@@ -793,8 +693,6 @@
         </w:rPr>
         <w:t>Appsettings.Development.Json</w:t>
       </w:r>
-      <w:proofErr w:type="spellEnd"/>
-      <w:proofErr w:type="gramEnd"/>
       <w:r>
         <w:rPr>
           <w:rFonts w:cs="B Nazanin" w:hint="cs"/>
@@ -853,20 +751,8 @@
           <w:rtl/>
           <w:lang w:bidi="fa-IR"/>
         </w:rPr>
-        <w:t xml:space="preserve"> کنیم بیرون از کلاس در دسترس نخواهد </w:t>
-      </w:r>
-      <w:proofErr w:type="gramStart"/>
-      <w:r>
-        <w:rPr>
-          <w:rFonts w:cs="B Nazanin" w:hint="cs"/>
-          <w:sz w:val="24"/>
-          <w:szCs w:val="24"/>
-          <w:rtl/>
-          <w:lang w:bidi="fa-IR"/>
-        </w:rPr>
-        <w:t>بود .</w:t>
-      </w:r>
-      <w:proofErr w:type="gramEnd"/>
+        <w:t xml:space="preserve"> کنیم بیرون از کلاس در دسترس نخواهد بود .</w:t>
+      </w:r>
       <w:r>
         <w:rPr>
           <w:rFonts w:cs="B Nazanin" w:hint="cs"/>
@@ -2183,28 +2069,15 @@
           <w:lang w:bidi="fa-IR"/>
         </w:rPr>
       </w:pPr>
-      <w:proofErr w:type="gramStart"/>
-      <w:r>
-        <w:rPr>
-          <w:rFonts w:cs="B Nazanin"/>
-          <w:sz w:val="24"/>
-          <w:szCs w:val="24"/>
-          <w:lang w:bidi="fa-IR"/>
-        </w:rPr>
-        <w:t xml:space="preserve">Container  </w:t>
-      </w:r>
-      <w:proofErr w:type="spellStart"/>
-      <w:r>
-        <w:rPr>
-          <w:rFonts w:cs="B Nazanin"/>
-          <w:sz w:val="24"/>
-          <w:szCs w:val="24"/>
-          <w:lang w:bidi="fa-IR"/>
-        </w:rPr>
-        <w:t>Container</w:t>
-      </w:r>
-      <w:proofErr w:type="spellEnd"/>
-      <w:proofErr w:type="gramEnd"/>
+      <w:r>
+        <w:rPr>
+          <w:rFonts w:cs="B Nazanin"/>
+          <w:sz w:val="24"/>
+          <w:szCs w:val="24"/>
+          <w:lang w:bidi="fa-IR"/>
+        </w:rPr>
+        <w:t>Container  Container</w:t>
+      </w:r>
     </w:p>
     <w:p>
       <w:pPr>
@@ -2356,21 +2229,8 @@
           <w:szCs w:val="24"/>
           <w:lang w:bidi="fa-IR"/>
         </w:rPr>
-        <w:t>docker-</w:t>
-      </w:r>
-      <w:proofErr w:type="spellStart"/>
-      <w:r>
-        <w:rPr>
-          <w:rFonts w:cs="B Nazanin"/>
-          <w:b/>
-          <w:bCs/>
-          <w:sz w:val="24"/>
-          <w:szCs w:val="24"/>
-          <w:lang w:bidi="fa-IR"/>
-        </w:rPr>
-        <w:t>compose.yml</w:t>
-      </w:r>
-      <w:proofErr w:type="spellEnd"/>
+        <w:t>docker-compose.yml</w:t>
+      </w:r>
     </w:p>
     <w:p>
       <w:pPr>
@@ -2396,25 +2256,7 @@
           <w:sz w:val="24"/>
           <w:szCs w:val="24"/>
         </w:rPr>
-        <w:t>docker-</w:t>
-      </w:r>
-      <w:proofErr w:type="spellStart"/>
-      <w:r>
-        <w:rPr>
-          <w:rFonts w:cs="B Nazanin"/>
-          <w:sz w:val="24"/>
-          <w:szCs w:val="24"/>
-        </w:rPr>
-        <w:t>compose.yml</w:t>
-      </w:r>
-      <w:proofErr w:type="spellEnd"/>
-      <w:r>
-        <w:rPr>
-          <w:rFonts w:cs="B Nazanin"/>
-          <w:sz w:val="24"/>
-          <w:szCs w:val="24"/>
-        </w:rPr>
-        <w:t xml:space="preserve"> </w:t>
+        <w:t xml:space="preserve">docker-compose.yml </w:t>
       </w:r>
       <w:r>
         <w:rPr>
@@ -2565,19 +2407,48 @@
           <w:szCs w:val="24"/>
           <w:lang w:bidi="fa-IR"/>
         </w:rPr>
-        <w:t xml:space="preserve">  </w:t>
-      </w:r>
-      <w:proofErr w:type="spellStart"/>
-      <w:r>
-        <w:rPr>
-          <w:rFonts w:cs="B Nazanin"/>
-          <w:sz w:val="24"/>
-          <w:szCs w:val="24"/>
-          <w:lang w:bidi="fa-IR"/>
-        </w:rPr>
-        <w:t>sql</w:t>
-      </w:r>
-      <w:proofErr w:type="spellEnd"/>
+        <w:t xml:space="preserve">  sql:</w:t>
+      </w:r>
+    </w:p>
+    <w:p>
+      <w:pPr>
+        <w:bidi/>
+        <w:rPr>
+          <w:rFonts w:cs="B Nazanin"/>
+          <w:sz w:val="24"/>
+          <w:szCs w:val="24"/>
+          <w:lang w:bidi="fa-IR"/>
+        </w:rPr>
+      </w:pPr>
+      <w:r>
+        <w:rPr>
+          <w:rFonts w:cs="B Nazanin"/>
+          <w:sz w:val="24"/>
+          <w:szCs w:val="24"/>
+          <w:lang w:bidi="fa-IR"/>
+        </w:rPr>
+        <w:t xml:space="preserve">    image: mcr.microsoft.com/azure-sql-edge</w:t>
+      </w:r>
+    </w:p>
+    <w:p>
+      <w:pPr>
+        <w:bidi/>
+        <w:rPr>
+          <w:rFonts w:cs="B Nazanin"/>
+          <w:sz w:val="24"/>
+          <w:szCs w:val="24"/>
+          <w:lang w:bidi="fa-IR"/>
+        </w:rPr>
+      </w:pPr>
+      <w:r>
+        <w:rPr>
+          <w:rFonts w:cs="B Nazanin"/>
+          <w:sz w:val="24"/>
+          <w:szCs w:val="24"/>
+          <w:rtl/>
+        </w:rPr>
+        <w:t>یعنی</w:t>
+      </w:r>
       <w:r>
         <w:rPr>
           <w:rFonts w:cs="B Nazanin"/>
@@ -2603,49 +2474,128 @@
           <w:rFonts w:cs="B Nazanin"/>
           <w:sz w:val="24"/>
           <w:szCs w:val="24"/>
-          <w:lang w:bidi="fa-IR"/>
-        </w:rPr>
-        <w:t xml:space="preserve">    image: mcr.microsoft.com/azure-</w:t>
-      </w:r>
-      <w:proofErr w:type="spellStart"/>
-      <w:r>
-        <w:rPr>
-          <w:rFonts w:cs="B Nazanin"/>
-          <w:sz w:val="24"/>
-          <w:szCs w:val="24"/>
-          <w:lang w:bidi="fa-IR"/>
-        </w:rPr>
-        <w:t>sql</w:t>
-      </w:r>
-      <w:proofErr w:type="spellEnd"/>
-      <w:r>
-        <w:rPr>
-          <w:rFonts w:cs="B Nazanin"/>
-          <w:sz w:val="24"/>
-          <w:szCs w:val="24"/>
-          <w:lang w:bidi="fa-IR"/>
-        </w:rPr>
-        <w:t>-edge</w:t>
-      </w:r>
-    </w:p>
-    <w:p>
-      <w:pPr>
-        <w:bidi/>
-        <w:rPr>
-          <w:rFonts w:cs="B Nazanin"/>
-          <w:sz w:val="24"/>
-          <w:szCs w:val="24"/>
-          <w:lang w:bidi="fa-IR"/>
-        </w:rPr>
-      </w:pPr>
-      <w:r>
-        <w:rPr>
-          <w:rFonts w:cs="B Nazanin"/>
-          <w:sz w:val="24"/>
-          <w:szCs w:val="24"/>
-          <w:rtl/>
-        </w:rPr>
-        <w:t>یعنی</w:t>
+          <w:rtl/>
+        </w:rPr>
+        <w:t xml:space="preserve">برای سرویس </w:t>
+      </w:r>
+      <w:r>
+        <w:rPr>
+          <w:rFonts w:cs="B Nazanin"/>
+          <w:sz w:val="24"/>
+          <w:szCs w:val="24"/>
+          <w:lang w:bidi="fa-IR"/>
+        </w:rPr>
+        <w:t xml:space="preserve">sql </w:t>
+      </w:r>
+      <w:r>
+        <w:rPr>
+          <w:rFonts w:cs="B Nazanin"/>
+          <w:sz w:val="24"/>
+          <w:szCs w:val="24"/>
+          <w:rtl/>
+        </w:rPr>
+        <w:t>از</w:t>
+      </w:r>
+      <w:r>
+        <w:rPr>
+          <w:rFonts w:cs="B Nazanin"/>
+          <w:sz w:val="24"/>
+          <w:szCs w:val="24"/>
+          <w:lang w:bidi="fa-IR"/>
+        </w:rPr>
+        <w:t xml:space="preserve"> Image </w:t>
+      </w:r>
+      <w:r>
+        <w:rPr>
+          <w:rFonts w:cs="B Nazanin"/>
+          <w:sz w:val="24"/>
+          <w:szCs w:val="24"/>
+          <w:rtl/>
+        </w:rPr>
+        <w:t xml:space="preserve">با نام </w:t>
+      </w:r>
+      <w:r>
+        <w:rPr>
+          <w:rFonts w:cs="B Nazanin"/>
+          <w:sz w:val="24"/>
+          <w:szCs w:val="24"/>
+          <w:lang w:bidi="fa-IR"/>
+        </w:rPr>
+        <w:t xml:space="preserve">mcr.microsoft.com/azure-sql-edge </w:t>
+      </w:r>
+      <w:r>
+        <w:rPr>
+          <w:rFonts w:cs="B Nazanin"/>
+          <w:sz w:val="24"/>
+          <w:szCs w:val="24"/>
+          <w:rtl/>
+        </w:rPr>
+        <w:t>استفاده کن. اگر</w:t>
+      </w:r>
+      <w:r>
+        <w:rPr>
+          <w:rFonts w:cs="B Nazanin"/>
+          <w:sz w:val="24"/>
+          <w:szCs w:val="24"/>
+          <w:lang w:bidi="fa-IR"/>
+        </w:rPr>
+        <w:t xml:space="preserve"> Image </w:t>
+      </w:r>
+      <w:r>
+        <w:rPr>
+          <w:rFonts w:cs="B Nazanin"/>
+          <w:sz w:val="24"/>
+          <w:szCs w:val="24"/>
+          <w:rtl/>
+        </w:rPr>
+        <w:t xml:space="preserve">روی سیستم موجود نباشد، </w:t>
+      </w:r>
+      <w:r>
+        <w:rPr>
+          <w:rFonts w:cs="B Nazanin"/>
+          <w:sz w:val="24"/>
+          <w:szCs w:val="24"/>
+          <w:lang w:bidi="fa-IR"/>
+        </w:rPr>
+        <w:t xml:space="preserve">Docker </w:t>
+      </w:r>
+      <w:r>
+        <w:rPr>
+          <w:rFonts w:cs="B Nazanin"/>
+          <w:sz w:val="24"/>
+          <w:szCs w:val="24"/>
+          <w:rtl/>
+        </w:rPr>
+        <w:t>آن را دانلود می‌کند</w:t>
+      </w:r>
+      <w:r>
+        <w:rPr>
+          <w:rFonts w:cs="B Nazanin"/>
+          <w:sz w:val="24"/>
+          <w:szCs w:val="24"/>
+          <w:lang w:bidi="fa-IR"/>
+        </w:rPr>
+        <w:t>.</w:t>
+      </w:r>
+    </w:p>
+    <w:p>
+      <w:pPr>
+        <w:bidi/>
+        <w:rPr>
+          <w:rFonts w:cs="B Nazanin"/>
+          <w:sz w:val="24"/>
+          <w:szCs w:val="24"/>
+          <w:lang w:bidi="fa-IR"/>
+        </w:rPr>
+      </w:pPr>
+      <w:r>
+        <w:rPr>
+          <w:rFonts w:cs="B Nazanin"/>
+          <w:sz w:val="24"/>
+          <w:szCs w:val="24"/>
+          <w:rtl/>
+        </w:rPr>
+        <w:t>بنابراین</w:t>
       </w:r>
       <w:r>
         <w:rPr>
@@ -2672,208 +2622,9 @@
           <w:rFonts w:cs="B Nazanin"/>
           <w:sz w:val="24"/>
           <w:szCs w:val="24"/>
-          <w:rtl/>
-        </w:rPr>
-        <w:t xml:space="preserve">برای سرویس </w:t>
-      </w:r>
-      <w:proofErr w:type="spellStart"/>
-      <w:r>
-        <w:rPr>
-          <w:rFonts w:cs="B Nazanin"/>
-          <w:sz w:val="24"/>
-          <w:szCs w:val="24"/>
-          <w:lang w:bidi="fa-IR"/>
-        </w:rPr>
-        <w:t>sql</w:t>
-      </w:r>
-      <w:proofErr w:type="spellEnd"/>
-      <w:r>
-        <w:rPr>
-          <w:rFonts w:cs="B Nazanin"/>
-          <w:sz w:val="24"/>
-          <w:szCs w:val="24"/>
-          <w:lang w:bidi="fa-IR"/>
-        </w:rPr>
-        <w:t xml:space="preserve"> </w:t>
-      </w:r>
-      <w:r>
-        <w:rPr>
-          <w:rFonts w:cs="B Nazanin"/>
-          <w:sz w:val="24"/>
-          <w:szCs w:val="24"/>
-          <w:rtl/>
-        </w:rPr>
-        <w:t>از</w:t>
-      </w:r>
-      <w:r>
-        <w:rPr>
-          <w:rFonts w:cs="B Nazanin"/>
-          <w:sz w:val="24"/>
-          <w:szCs w:val="24"/>
-          <w:lang w:bidi="fa-IR"/>
-        </w:rPr>
-        <w:t xml:space="preserve"> Image </w:t>
-      </w:r>
-      <w:r>
-        <w:rPr>
-          <w:rFonts w:cs="B Nazanin"/>
-          <w:sz w:val="24"/>
-          <w:szCs w:val="24"/>
-          <w:rtl/>
-        </w:rPr>
-        <w:t xml:space="preserve">با نام </w:t>
-      </w:r>
-      <w:r>
-        <w:rPr>
-          <w:rFonts w:cs="B Nazanin"/>
-          <w:sz w:val="24"/>
-          <w:szCs w:val="24"/>
-          <w:lang w:bidi="fa-IR"/>
-        </w:rPr>
-        <w:t>mcr.microsoft.com/azure-</w:t>
-      </w:r>
-      <w:proofErr w:type="spellStart"/>
-      <w:r>
-        <w:rPr>
-          <w:rFonts w:cs="B Nazanin"/>
-          <w:sz w:val="24"/>
-          <w:szCs w:val="24"/>
-          <w:lang w:bidi="fa-IR"/>
-        </w:rPr>
-        <w:t>sql</w:t>
-      </w:r>
-      <w:proofErr w:type="spellEnd"/>
-      <w:r>
-        <w:rPr>
-          <w:rFonts w:cs="B Nazanin"/>
-          <w:sz w:val="24"/>
-          <w:szCs w:val="24"/>
-          <w:lang w:bidi="fa-IR"/>
-        </w:rPr>
-        <w:t xml:space="preserve">-edge </w:t>
-      </w:r>
-      <w:r>
-        <w:rPr>
-          <w:rFonts w:cs="B Nazanin"/>
-          <w:sz w:val="24"/>
-          <w:szCs w:val="24"/>
-          <w:rtl/>
-        </w:rPr>
-        <w:t>استفاده کن. اگر</w:t>
-      </w:r>
-      <w:r>
-        <w:rPr>
-          <w:rFonts w:cs="B Nazanin"/>
-          <w:sz w:val="24"/>
-          <w:szCs w:val="24"/>
-          <w:lang w:bidi="fa-IR"/>
-        </w:rPr>
-        <w:t xml:space="preserve"> Image </w:t>
-      </w:r>
-      <w:r>
-        <w:rPr>
-          <w:rFonts w:cs="B Nazanin"/>
-          <w:sz w:val="24"/>
-          <w:szCs w:val="24"/>
-          <w:rtl/>
-        </w:rPr>
-        <w:t xml:space="preserve">روی سیستم موجود نباشد، </w:t>
-      </w:r>
-      <w:r>
-        <w:rPr>
-          <w:rFonts w:cs="B Nazanin"/>
-          <w:sz w:val="24"/>
-          <w:szCs w:val="24"/>
-          <w:lang w:bidi="fa-IR"/>
-        </w:rPr>
-        <w:t xml:space="preserve">Docker </w:t>
-      </w:r>
-      <w:r>
-        <w:rPr>
-          <w:rFonts w:cs="B Nazanin"/>
-          <w:sz w:val="24"/>
-          <w:szCs w:val="24"/>
-          <w:rtl/>
-        </w:rPr>
-        <w:t>آن را دانلود می‌کند</w:t>
-      </w:r>
-      <w:r>
-        <w:rPr>
-          <w:rFonts w:cs="B Nazanin"/>
-          <w:sz w:val="24"/>
-          <w:szCs w:val="24"/>
-          <w:lang w:bidi="fa-IR"/>
-        </w:rPr>
-        <w:t>.</w:t>
-      </w:r>
-    </w:p>
-    <w:p>
-      <w:pPr>
-        <w:bidi/>
-        <w:rPr>
-          <w:rFonts w:cs="B Nazanin"/>
-          <w:sz w:val="24"/>
-          <w:szCs w:val="24"/>
-          <w:lang w:bidi="fa-IR"/>
-        </w:rPr>
-      </w:pPr>
-      <w:r>
-        <w:rPr>
-          <w:rFonts w:cs="B Nazanin"/>
-          <w:sz w:val="24"/>
-          <w:szCs w:val="24"/>
-          <w:rtl/>
-        </w:rPr>
-        <w:t>بنابراین</w:t>
-      </w:r>
-      <w:r>
-        <w:rPr>
-          <w:rFonts w:cs="B Nazanin"/>
-          <w:sz w:val="24"/>
-          <w:szCs w:val="24"/>
-          <w:lang w:bidi="fa-IR"/>
-        </w:rPr>
-        <w:t>:</w:t>
-      </w:r>
-    </w:p>
-    <w:p>
-      <w:pPr>
-        <w:bidi/>
-        <w:rPr>
-          <w:rFonts w:cs="B Nazanin"/>
-          <w:sz w:val="24"/>
-          <w:szCs w:val="24"/>
-          <w:lang w:bidi="fa-IR"/>
-        </w:rPr>
-      </w:pPr>
-      <w:r>
-        <w:rPr>
-          <w:rFonts w:cs="B Nazanin"/>
-          <w:sz w:val="24"/>
-          <w:szCs w:val="24"/>
-          <w:lang w:bidi="fa-IR"/>
-        </w:rPr>
-        <w:t>docker-</w:t>
-      </w:r>
-      <w:proofErr w:type="spellStart"/>
-      <w:r>
-        <w:rPr>
-          <w:rFonts w:cs="B Nazanin"/>
-          <w:sz w:val="24"/>
-          <w:szCs w:val="24"/>
-          <w:lang w:bidi="fa-IR"/>
-        </w:rPr>
-        <w:t>compose.yml</w:t>
-      </w:r>
-      <w:proofErr w:type="spellEnd"/>
-      <w:r>
-        <w:rPr>
-          <w:rFonts w:cs="B Nazanin"/>
-          <w:sz w:val="24"/>
-          <w:szCs w:val="24"/>
-          <w:lang w:bidi="fa-IR"/>
-        </w:rPr>
-        <w:t xml:space="preserve"> → </w:t>
+          <w:lang w:bidi="fa-IR"/>
+        </w:rPr>
+        <w:t xml:space="preserve">docker-compose.yml → </w:t>
       </w:r>
       <w:r>
         <w:rPr>
@@ -3026,21 +2777,8 @@
           <w:szCs w:val="24"/>
           <w:lang w:bidi="fa-IR"/>
         </w:rPr>
-        <w:t xml:space="preserve"> docker-</w:t>
-      </w:r>
-      <w:proofErr w:type="spellStart"/>
-      <w:r>
-        <w:rPr>
-          <w:rFonts w:cs="B Nazanin"/>
-          <w:b/>
-          <w:bCs/>
-          <w:sz w:val="24"/>
-          <w:szCs w:val="24"/>
-          <w:lang w:bidi="fa-IR"/>
-        </w:rPr>
-        <w:t>compose.yml</w:t>
-      </w:r>
-      <w:proofErr w:type="spellEnd"/>
+        <w:t xml:space="preserve"> docker-compose.yml</w:t>
+      </w:r>
     </w:p>
     <w:p>
       <w:pPr>
@@ -3068,27 +2806,7 @@
           <w:szCs w:val="24"/>
           <w:lang w:bidi="fa-IR"/>
         </w:rPr>
-        <w:t>docker-</w:t>
-      </w:r>
-      <w:proofErr w:type="spellStart"/>
-      <w:r>
-        <w:rPr>
-          <w:rFonts w:cs="B Nazanin"/>
-          <w:sz w:val="24"/>
-          <w:szCs w:val="24"/>
-          <w:lang w:bidi="fa-IR"/>
-        </w:rPr>
-        <w:t>compose.yml</w:t>
-      </w:r>
-      <w:proofErr w:type="spellEnd"/>
-      <w:r>
-        <w:rPr>
-          <w:rFonts w:cs="B Nazanin"/>
-          <w:sz w:val="24"/>
-          <w:szCs w:val="24"/>
-          <w:lang w:bidi="fa-IR"/>
-        </w:rPr>
-        <w:t xml:space="preserve"> </w:t>
+        <w:t xml:space="preserve">docker-compose.yml </w:t>
       </w:r>
       <w:r>
         <w:rPr>
@@ -3166,25 +2884,14 @@
           <w:lang w:bidi="fa-IR"/>
         </w:rPr>
       </w:pPr>
-      <w:proofErr w:type="spellStart"/>
-      <w:r>
-        <w:rPr>
-          <w:rFonts w:cs="B Nazanin"/>
-          <w:sz w:val="24"/>
-          <w:szCs w:val="24"/>
-          <w:lang w:bidi="fa-IR"/>
-        </w:rPr>
-        <w:t>MyProject</w:t>
-      </w:r>
-      <w:proofErr w:type="spellEnd"/>
-      <w:r>
-        <w:rPr>
-          <w:rFonts w:cs="B Nazanin"/>
-          <w:sz w:val="24"/>
-          <w:szCs w:val="24"/>
-          <w:lang w:bidi="fa-IR"/>
-        </w:rPr>
-        <w:t>/</w:t>
+      <w:r>
+        <w:rPr>
+          <w:rFonts w:cs="B Nazanin"/>
+          <w:sz w:val="24"/>
+          <w:szCs w:val="24"/>
+          <w:lang w:bidi="fa-IR"/>
+        </w:rPr>
+        <w:t>MyProject/</w:t>
       </w:r>
     </w:p>
     <w:p>
@@ -3242,19 +2949,8 @@
           <w:szCs w:val="24"/>
           <w:lang w:bidi="fa-IR"/>
         </w:rPr>
-        <w:t xml:space="preserve"> docker-</w:t>
-      </w:r>
-      <w:proofErr w:type="spellStart"/>
-      <w:r>
-        <w:rPr>
-          <w:rFonts w:cs="B Nazanin"/>
-          <w:sz w:val="24"/>
-          <w:szCs w:val="24"/>
-          <w:lang w:bidi="fa-IR"/>
-        </w:rPr>
-        <w:t>compose.yml</w:t>
-      </w:r>
-      <w:proofErr w:type="spellEnd"/>
+        <w:t xml:space="preserve"> docker-compose.yml</w:t>
+      </w:r>
     </w:p>
     <w:p>
       <w:pPr>
@@ -3396,19 +3092,8 @@
           <w:szCs w:val="24"/>
           <w:lang w:bidi="fa-IR"/>
         </w:rPr>
-        <w:t xml:space="preserve"> </w:t>
-      </w:r>
-      <w:proofErr w:type="spellStart"/>
-      <w:r>
-        <w:rPr>
-          <w:rFonts w:cs="B Nazanin"/>
-          <w:sz w:val="24"/>
-          <w:szCs w:val="24"/>
-          <w:lang w:bidi="fa-IR"/>
-        </w:rPr>
-        <w:t>Dockerfile</w:t>
-      </w:r>
-      <w:proofErr w:type="spellEnd"/>
+        <w:t xml:space="preserve"> Dockerfile</w:t>
+      </w:r>
     </w:p>
     <w:p>
       <w:pPr>
@@ -3593,19 +3278,8 @@
           <w:szCs w:val="24"/>
           <w:lang w:bidi="fa-IR"/>
         </w:rPr>
-        <w:t xml:space="preserve"> </w:t>
-      </w:r>
-      <w:proofErr w:type="spellStart"/>
-      <w:r>
-        <w:rPr>
-          <w:rFonts w:cs="B Nazanin"/>
-          <w:sz w:val="24"/>
-          <w:szCs w:val="24"/>
-          <w:lang w:bidi="fa-IR"/>
-        </w:rPr>
-        <w:t>Dockerfile</w:t>
-      </w:r>
-      <w:proofErr w:type="spellEnd"/>
+        <w:t xml:space="preserve"> Dockerfile</w:t>
+      </w:r>
     </w:p>
     <w:p>
       <w:pPr>
@@ -3653,27 +3327,7 @@
           <w:szCs w:val="24"/>
           <w:lang w:bidi="fa-IR"/>
         </w:rPr>
-        <w:t>docker-</w:t>
-      </w:r>
-      <w:proofErr w:type="spellStart"/>
-      <w:r>
-        <w:rPr>
-          <w:rFonts w:cs="B Nazanin"/>
-          <w:sz w:val="24"/>
-          <w:szCs w:val="24"/>
-          <w:lang w:bidi="fa-IR"/>
-        </w:rPr>
-        <w:t>compose.yml</w:t>
-      </w:r>
-      <w:proofErr w:type="spellEnd"/>
-      <w:r>
-        <w:rPr>
-          <w:rFonts w:cs="B Nazanin"/>
-          <w:sz w:val="24"/>
-          <w:szCs w:val="24"/>
-          <w:lang w:bidi="fa-IR"/>
-        </w:rPr>
-        <w:t xml:space="preserve"> </w:t>
+        <w:t xml:space="preserve">docker-compose.yml </w:t>
       </w:r>
       <w:r>
         <w:rPr>
@@ -3777,21 +3431,8 @@
           <w:szCs w:val="24"/>
           <w:lang w:bidi="fa-IR"/>
         </w:rPr>
-        <w:t xml:space="preserve"> docker-</w:t>
-      </w:r>
-      <w:proofErr w:type="spellStart"/>
-      <w:r>
-        <w:rPr>
-          <w:rFonts w:cs="B Nazanin"/>
-          <w:b/>
-          <w:bCs/>
-          <w:sz w:val="24"/>
-          <w:szCs w:val="24"/>
-          <w:lang w:bidi="fa-IR"/>
-        </w:rPr>
-        <w:t>compose.yml</w:t>
-      </w:r>
-      <w:proofErr w:type="spellEnd"/>
+        <w:t xml:space="preserve"> docker-compose.yml</w:t>
+      </w:r>
     </w:p>
     <w:p>
       <w:pPr>
@@ -3819,27 +3460,7 @@
           <w:szCs w:val="24"/>
           <w:lang w:bidi="fa-IR"/>
         </w:rPr>
-        <w:t>docker-</w:t>
-      </w:r>
-      <w:proofErr w:type="spellStart"/>
-      <w:r>
-        <w:rPr>
-          <w:rFonts w:cs="B Nazanin"/>
-          <w:sz w:val="24"/>
-          <w:szCs w:val="24"/>
-          <w:lang w:bidi="fa-IR"/>
-        </w:rPr>
-        <w:t>compose.yml</w:t>
-      </w:r>
-      <w:proofErr w:type="spellEnd"/>
-      <w:r>
-        <w:rPr>
-          <w:rFonts w:cs="B Nazanin"/>
-          <w:sz w:val="24"/>
-          <w:szCs w:val="24"/>
-          <w:lang w:bidi="fa-IR"/>
-        </w:rPr>
-        <w:t xml:space="preserve"> </w:t>
+        <w:t xml:space="preserve">docker-compose.yml </w:t>
       </w:r>
       <w:r>
         <w:rPr>
@@ -4019,21 +3640,8 @@
           <w:szCs w:val="24"/>
           <w:lang w:bidi="fa-IR"/>
         </w:rPr>
-        <w:t xml:space="preserve"> docker-</w:t>
-      </w:r>
-      <w:proofErr w:type="spellStart"/>
-      <w:r>
-        <w:rPr>
-          <w:rFonts w:cs="B Nazanin"/>
-          <w:b/>
-          <w:bCs/>
-          <w:sz w:val="24"/>
-          <w:szCs w:val="24"/>
-          <w:lang w:bidi="fa-IR"/>
-        </w:rPr>
-        <w:t>compose.yml</w:t>
-      </w:r>
-      <w:proofErr w:type="spellEnd"/>
+        <w:t xml:space="preserve"> docker-compose.yml</w:t>
+      </w:r>
     </w:p>
     <w:p>
       <w:pPr>
@@ -4072,67 +3680,27 @@
           <w:szCs w:val="24"/>
           <w:lang w:bidi="fa-IR"/>
         </w:rPr>
-        <w:t xml:space="preserve">  </w:t>
-      </w:r>
-      <w:proofErr w:type="spellStart"/>
-      <w:r>
-        <w:rPr>
-          <w:rFonts w:cs="B Nazanin"/>
-          <w:sz w:val="24"/>
-          <w:szCs w:val="24"/>
-          <w:lang w:bidi="fa-IR"/>
-        </w:rPr>
-        <w:t>sql</w:t>
-      </w:r>
-      <w:proofErr w:type="spellEnd"/>
-      <w:r>
-        <w:rPr>
-          <w:rFonts w:cs="B Nazanin"/>
-          <w:sz w:val="24"/>
-          <w:szCs w:val="24"/>
-          <w:lang w:bidi="fa-IR"/>
-        </w:rPr>
-        <w:t>:</w:t>
-      </w:r>
-    </w:p>
-    <w:p>
-      <w:pPr>
-        <w:bidi/>
-        <w:rPr>
-          <w:rFonts w:cs="B Nazanin"/>
-          <w:sz w:val="24"/>
-          <w:szCs w:val="24"/>
-          <w:lang w:bidi="fa-IR"/>
-        </w:rPr>
-      </w:pPr>
-      <w:r>
-        <w:rPr>
-          <w:rFonts w:cs="B Nazanin"/>
-          <w:sz w:val="24"/>
-          <w:szCs w:val="24"/>
-          <w:lang w:bidi="fa-IR"/>
-        </w:rPr>
-        <w:t xml:space="preserve">    image: mcr.microsoft.com/azure-</w:t>
-      </w:r>
-      <w:proofErr w:type="spellStart"/>
-      <w:r>
-        <w:rPr>
-          <w:rFonts w:cs="B Nazanin"/>
-          <w:sz w:val="24"/>
-          <w:szCs w:val="24"/>
-          <w:lang w:bidi="fa-IR"/>
-        </w:rPr>
-        <w:t>sql</w:t>
-      </w:r>
-      <w:proofErr w:type="spellEnd"/>
-      <w:r>
-        <w:rPr>
-          <w:rFonts w:cs="B Nazanin"/>
-          <w:sz w:val="24"/>
-          <w:szCs w:val="24"/>
-          <w:lang w:bidi="fa-IR"/>
-        </w:rPr>
-        <w:t>-edge</w:t>
+        <w:t xml:space="preserve">  sql:</w:t>
+      </w:r>
+    </w:p>
+    <w:p>
+      <w:pPr>
+        <w:bidi/>
+        <w:rPr>
+          <w:rFonts w:cs="B Nazanin"/>
+          <w:sz w:val="24"/>
+          <w:szCs w:val="24"/>
+          <w:lang w:bidi="fa-IR"/>
+        </w:rPr>
+      </w:pPr>
+      <w:r>
+        <w:rPr>
+          <w:rFonts w:cs="B Nazanin"/>
+          <w:sz w:val="24"/>
+          <w:szCs w:val="24"/>
+          <w:lang w:bidi="fa-IR"/>
+        </w:rPr>
+        <w:t xml:space="preserve">    image: mcr.microsoft.com/azure-sql-edge</w:t>
       </w:r>
     </w:p>
     <w:p>
@@ -4306,25 +3874,14 @@
         <w:lastRenderedPageBreak/>
         <w:t xml:space="preserve">یک سرویس به نام </w:t>
       </w:r>
-      <w:proofErr w:type="spellStart"/>
-      <w:r>
-        <w:rPr>
-          <w:rFonts w:cs="B Nazanin"/>
-          <w:sz w:val="24"/>
-          <w:szCs w:val="24"/>
-          <w:lang w:bidi="fa-IR"/>
-        </w:rPr>
-        <w:t>sql</w:t>
-      </w:r>
-      <w:proofErr w:type="spellEnd"/>
-      <w:r>
-        <w:rPr>
-          <w:rFonts w:cs="B Nazanin"/>
-          <w:sz w:val="24"/>
-          <w:szCs w:val="24"/>
-          <w:lang w:bidi="fa-IR"/>
-        </w:rPr>
-        <w:t xml:space="preserve"> </w:t>
+      <w:r>
+        <w:rPr>
+          <w:rFonts w:cs="B Nazanin"/>
+          <w:sz w:val="24"/>
+          <w:szCs w:val="24"/>
+          <w:lang w:bidi="fa-IR"/>
+        </w:rPr>
+        <w:t xml:space="preserve">sql </w:t>
       </w:r>
       <w:r>
         <w:rPr>
@@ -4360,27 +3917,7 @@
           <w:szCs w:val="24"/>
           <w:lang w:bidi="fa-IR"/>
         </w:rPr>
-        <w:t>mcr.microsoft.com/azure-</w:t>
-      </w:r>
-      <w:proofErr w:type="spellStart"/>
-      <w:r>
-        <w:rPr>
-          <w:rFonts w:cs="B Nazanin"/>
-          <w:sz w:val="24"/>
-          <w:szCs w:val="24"/>
-          <w:lang w:bidi="fa-IR"/>
-        </w:rPr>
-        <w:t>sql</w:t>
-      </w:r>
-      <w:proofErr w:type="spellEnd"/>
-      <w:r>
-        <w:rPr>
-          <w:rFonts w:cs="B Nazanin"/>
-          <w:sz w:val="24"/>
-          <w:szCs w:val="24"/>
-          <w:lang w:bidi="fa-IR"/>
-        </w:rPr>
-        <w:t xml:space="preserve">-edge </w:t>
+        <w:t xml:space="preserve">mcr.microsoft.com/azure-sql-edge </w:t>
       </w:r>
       <w:r>
         <w:rPr>
@@ -4926,29 +4463,7 @@
           <w:rtl/>
           <w:lang w:bidi="fa-IR"/>
         </w:rPr>
-        <w:t xml:space="preserve"> از سرویس با </w:t>
-      </w:r>
-      <w:proofErr w:type="spellStart"/>
-      <w:r>
-        <w:rPr>
-          <w:rFonts w:cs="B Nazanin" w:hint="cs"/>
-          <w:sz w:val="24"/>
-          <w:szCs w:val="24"/>
-          <w:rtl/>
-          <w:lang w:bidi="fa-IR"/>
-        </w:rPr>
-        <w:t>ورژن</w:t>
-      </w:r>
-      <w:proofErr w:type="spellEnd"/>
-      <w:r>
-        <w:rPr>
-          <w:rFonts w:cs="B Nazanin" w:hint="cs"/>
-          <w:sz w:val="24"/>
-          <w:szCs w:val="24"/>
-          <w:rtl/>
-          <w:lang w:bidi="fa-IR"/>
-        </w:rPr>
-        <w:t xml:space="preserve"> دلخواه را دانلود یا اجرا کنیم ؟ با دستور زیر :</w:t>
+        <w:t xml:space="preserve"> از سرویس با ورژن دلخواه را دانلود یا اجرا کنیم ؟ با دستور زیر :</w:t>
       </w:r>
     </w:p>
     <w:p>
@@ -4970,30 +4485,8 @@
           <w:szCs w:val="24"/>
           <w:lang w:bidi="fa-IR"/>
         </w:rPr>
-        <w:t xml:space="preserve">image: </w:t>
-      </w:r>
-      <w:proofErr w:type="spellStart"/>
-      <w:r>
-        <w:rPr>
-          <w:rFonts w:cs="Cambria"/>
-          <w:sz w:val="24"/>
-          <w:szCs w:val="24"/>
-          <w:lang w:bidi="fa-IR"/>
-        </w:rPr>
-        <w:t>some-</w:t>
-      </w:r>
-      <w:proofErr w:type="gramStart"/>
-      <w:r>
-        <w:rPr>
-          <w:rFonts w:cs="Cambria"/>
-          <w:sz w:val="24"/>
-          <w:szCs w:val="24"/>
-          <w:lang w:bidi="fa-IR"/>
-        </w:rPr>
-        <w:t>image:tag</w:t>
-      </w:r>
-      <w:proofErr w:type="spellEnd"/>
-      <w:proofErr w:type="gramEnd"/>
+        <w:t>image: some-image:tag</w:t>
+      </w:r>
     </w:p>
     <w:p>
       <w:pPr>
@@ -5626,27 +5119,7 @@
           <w:szCs w:val="24"/>
           <w:lang w:bidi="fa-IR"/>
         </w:rPr>
-        <w:t>PORT_ON_</w:t>
-      </w:r>
-      <w:proofErr w:type="gramStart"/>
-      <w:r>
-        <w:rPr>
-          <w:rFonts w:cs="B Nazanin"/>
-          <w:sz w:val="24"/>
-          <w:szCs w:val="24"/>
-          <w:lang w:bidi="fa-IR"/>
-        </w:rPr>
-        <w:t>HOST :</w:t>
-      </w:r>
-      <w:proofErr w:type="gramEnd"/>
-      <w:r>
-        <w:rPr>
-          <w:rFonts w:cs="B Nazanin"/>
-          <w:sz w:val="24"/>
-          <w:szCs w:val="24"/>
-          <w:lang w:bidi="fa-IR"/>
-        </w:rPr>
-        <w:t xml:space="preserve"> PORT_IN_CONTAINER</w:t>
+        <w:t>PORT_ON_HOST : PORT_IN_CONTAINER</w:t>
       </w:r>
     </w:p>
     <w:p>
@@ -5688,25 +5161,14 @@
           <w:lang w:bidi="fa-IR"/>
         </w:rPr>
       </w:pPr>
-      <w:proofErr w:type="gramStart"/>
-      <w:r>
-        <w:rPr>
-          <w:rFonts w:cs="B Nazanin"/>
-          <w:sz w:val="24"/>
-          <w:szCs w:val="24"/>
-          <w:lang w:bidi="fa-IR"/>
-        </w:rPr>
-        <w:t>1434 :</w:t>
-      </w:r>
-      <w:proofErr w:type="gramEnd"/>
-      <w:r>
-        <w:rPr>
-          <w:rFonts w:cs="B Nazanin"/>
-          <w:sz w:val="24"/>
-          <w:szCs w:val="24"/>
-          <w:lang w:bidi="fa-IR"/>
-        </w:rPr>
-        <w:t xml:space="preserve"> 1433</w:t>
+      <w:r>
+        <w:rPr>
+          <w:rFonts w:cs="B Nazanin"/>
+          <w:sz w:val="24"/>
+          <w:szCs w:val="24"/>
+          <w:lang w:bidi="fa-IR"/>
+        </w:rPr>
+        <w:t>1434 : 1433</w:t>
       </w:r>
     </w:p>
     <w:p>
@@ -6007,27 +5469,7 @@
           <w:szCs w:val="24"/>
           <w:lang w:bidi="fa-IR"/>
         </w:rPr>
-        <w:t xml:space="preserve">Windows / </w:t>
-      </w:r>
-      <w:proofErr w:type="gramStart"/>
-      <w:r>
-        <w:rPr>
-          <w:rFonts w:cs="B Nazanin"/>
-          <w:sz w:val="24"/>
-          <w:szCs w:val="24"/>
-          <w:lang w:bidi="fa-IR"/>
-        </w:rPr>
-        <w:t>Host :</w:t>
-      </w:r>
-      <w:proofErr w:type="gramEnd"/>
-      <w:r>
-        <w:rPr>
-          <w:rFonts w:cs="B Nazanin"/>
-          <w:sz w:val="24"/>
-          <w:szCs w:val="24"/>
-          <w:lang w:bidi="fa-IR"/>
-        </w:rPr>
-        <w:t xml:space="preserve"> 1434</w:t>
+        <w:t>Windows / Host : 1434</w:t>
       </w:r>
     </w:p>
     <w:p>
@@ -6109,7 +5551,6 @@
           <w:lang w:bidi="fa-IR"/>
         </w:rPr>
       </w:pPr>
-      <w:proofErr w:type="gramStart"/>
       <w:r>
         <w:rPr>
           <w:rFonts w:cs="B Nazanin"/>
@@ -6118,17 +5559,7 @@
           <w:lang w:bidi="fa-IR"/>
         </w:rPr>
         <w:lastRenderedPageBreak/>
-        <w:t>Container :</w:t>
-      </w:r>
-      <w:proofErr w:type="gramEnd"/>
-      <w:r>
-        <w:rPr>
-          <w:rFonts w:cs="B Nazanin"/>
-          <w:sz w:val="24"/>
-          <w:szCs w:val="24"/>
-          <w:lang w:bidi="fa-IR"/>
-        </w:rPr>
-        <w:t xml:space="preserve"> 1433</w:t>
+        <w:t>Container : 1433</w:t>
       </w:r>
     </w:p>
     <w:p>
@@ -7252,19 +6683,8 @@
           <w:szCs w:val="24"/>
           <w:lang w:bidi="fa-IR"/>
         </w:rPr>
-        <w:t>docker-</w:t>
-      </w:r>
-      <w:proofErr w:type="spellStart"/>
-      <w:r>
-        <w:rPr>
-          <w:rFonts w:cs="B Nazanin"/>
-          <w:sz w:val="24"/>
-          <w:szCs w:val="24"/>
-          <w:lang w:bidi="fa-IR"/>
-        </w:rPr>
-        <w:t>compose.yml</w:t>
-      </w:r>
-      <w:proofErr w:type="spellEnd"/>
+        <w:t>docker-compose.yml</w:t>
+      </w:r>
     </w:p>
     <w:p>
       <w:pPr>
@@ -7586,27 +7006,7 @@
           <w:szCs w:val="24"/>
           <w:lang w:bidi="fa-IR"/>
         </w:rPr>
-        <w:t>docker-</w:t>
-      </w:r>
-      <w:proofErr w:type="spellStart"/>
-      <w:r>
-        <w:rPr>
-          <w:rFonts w:cs="B Nazanin"/>
-          <w:sz w:val="24"/>
-          <w:szCs w:val="24"/>
-          <w:lang w:bidi="fa-IR"/>
-        </w:rPr>
-        <w:t>compose.yml</w:t>
-      </w:r>
-      <w:proofErr w:type="spellEnd"/>
-      <w:r>
-        <w:rPr>
-          <w:rFonts w:cs="B Nazanin"/>
-          <w:sz w:val="24"/>
-          <w:szCs w:val="24"/>
-          <w:lang w:bidi="fa-IR"/>
-        </w:rPr>
-        <w:t xml:space="preserve"> </w:t>
+        <w:t xml:space="preserve">docker-compose.yml </w:t>
       </w:r>
       <w:r>
         <w:rPr>
@@ -7884,13 +7284,31 @@
       <w:pPr>
         <w:bidi/>
         <w:rPr>
+          <w:rFonts w:cs="B Nazanin"/>
+          <w:sz w:val="24"/>
+          <w:szCs w:val="24"/>
+          <w:lang w:bidi="fa-IR"/>
+        </w:rPr>
+      </w:pPr>
+      <w:r>
+        <w:rPr>
           <w:rFonts w:cs="B Nazanin" w:hint="cs"/>
           <w:sz w:val="24"/>
           <w:szCs w:val="24"/>
           <w:rtl/>
           <w:lang w:bidi="fa-IR"/>
         </w:rPr>
-      </w:pPr>
+        <w:t xml:space="preserve">+++ در نهایت با در نظر گرفتن فایل  </w:t>
+      </w:r>
+      <w:r>
+        <w:rPr>
+          <w:rFonts w:cs="B Nazanin"/>
+          <w:sz w:val="24"/>
+          <w:szCs w:val="24"/>
+          <w:lang w:bidi="fa-IR"/>
+        </w:rPr>
+        <w:t>docker-compose.yml</w:t>
+      </w:r>
       <w:r>
         <w:rPr>
           <w:rFonts w:cs="B Nazanin" w:hint="cs"/>
@@ -7899,28 +7317,17 @@
           <w:rtl/>
           <w:lang w:bidi="fa-IR"/>
         </w:rPr>
-        <w:t xml:space="preserve">+++ در نهایت با در نظر گرفتن فایل  </w:t>
-      </w:r>
-      <w:r>
-        <w:rPr>
-          <w:rFonts w:cs="B Nazanin"/>
-          <w:sz w:val="24"/>
-          <w:szCs w:val="24"/>
-          <w:lang w:bidi="fa-IR"/>
-        </w:rPr>
-        <w:t>docker-</w:t>
-      </w:r>
-      <w:proofErr w:type="spellStart"/>
-      <w:r>
-        <w:rPr>
-          <w:rFonts w:cs="B Nazanin"/>
-          <w:sz w:val="24"/>
-          <w:szCs w:val="24"/>
-          <w:lang w:bidi="fa-IR"/>
-        </w:rPr>
-        <w:t>compose.yml</w:t>
-      </w:r>
-      <w:proofErr w:type="spellEnd"/>
+        <w:t xml:space="preserve"> می توانیم از طریق </w:t>
+      </w:r>
+      <w:r>
+        <w:rPr>
+          <w:rFonts w:cs="B Nazanin"/>
+          <w:sz w:val="24"/>
+          <w:szCs w:val="24"/>
+          <w:lang w:bidi="fa-IR"/>
+        </w:rPr>
+        <w:t>ssms</w:t>
+      </w:r>
       <w:r>
         <w:rPr>
           <w:rFonts w:cs="B Nazanin" w:hint="cs"/>
@@ -7929,19 +7336,17 @@
           <w:rtl/>
           <w:lang w:bidi="fa-IR"/>
         </w:rPr>
-        <w:t xml:space="preserve"> می توانیم از طریق </w:t>
-      </w:r>
-      <w:proofErr w:type="spellStart"/>
-      <w:r>
-        <w:rPr>
-          <w:rFonts w:cs="B Nazanin"/>
-          <w:sz w:val="24"/>
-          <w:szCs w:val="24"/>
-          <w:lang w:bidi="fa-IR"/>
-        </w:rPr>
-        <w:t>ssms</w:t>
-      </w:r>
-      <w:proofErr w:type="spellEnd"/>
+        <w:t xml:space="preserve"> به </w:t>
+      </w:r>
+      <w:r>
+        <w:rPr>
+          <w:rFonts w:cs="B Nazanin"/>
+          <w:sz w:val="24"/>
+          <w:szCs w:val="24"/>
+          <w:lang w:bidi="fa-IR"/>
+        </w:rPr>
+        <w:t>localhost,1434</w:t>
+      </w:r>
       <w:r>
         <w:rPr>
           <w:rFonts w:cs="B Nazanin" w:hint="cs"/>
@@ -7950,16 +7355,16 @@
           <w:rtl/>
           <w:lang w:bidi="fa-IR"/>
         </w:rPr>
-        <w:t xml:space="preserve"> به </w:t>
-      </w:r>
-      <w:r>
-        <w:rPr>
-          <w:rFonts w:cs="B Nazanin"/>
-          <w:sz w:val="24"/>
-          <w:szCs w:val="24"/>
-          <w:lang w:bidi="fa-IR"/>
-        </w:rPr>
-        <w:t>localhost,1434</w:t>
+        <w:t xml:space="preserve"> وصل شویم . (برای وصل شدن به سرور محلی از  </w:t>
+      </w:r>
+      <w:r>
+        <w:rPr>
+          <w:rFonts w:cs="B Nazanin"/>
+          <w:sz w:val="24"/>
+          <w:szCs w:val="24"/>
+          <w:lang w:bidi="fa-IR"/>
+        </w:rPr>
+        <w:t>localhost,1433</w:t>
       </w:r>
       <w:r>
         <w:rPr>
@@ -7969,16 +7374,7 @@
           <w:rtl/>
           <w:lang w:bidi="fa-IR"/>
         </w:rPr>
-        <w:t xml:space="preserve"> وصل شویم . (برای وصل شدن به سرور محلی از  </w:t>
-      </w:r>
-      <w:r>
-        <w:rPr>
-          <w:rFonts w:cs="B Nazanin"/>
-          <w:sz w:val="24"/>
-          <w:szCs w:val="24"/>
-          <w:lang w:bidi="fa-IR"/>
-        </w:rPr>
-        <w:t>localhost,1433</w:t>
+        <w:t xml:space="preserve">  استفاده </w:t>
       </w:r>
       <w:r>
         <w:rPr>
@@ -7988,7 +7384,7 @@
           <w:rtl/>
           <w:lang w:bidi="fa-IR"/>
         </w:rPr>
-        <w:t xml:space="preserve">  استفاده </w:t>
+        <w:t>می</w:t>
       </w:r>
       <w:r>
         <w:rPr>
@@ -7998,17 +7394,1286 @@
           <w:rtl/>
           <w:lang w:bidi="fa-IR"/>
         </w:rPr>
-        <w:t>می</w:t>
-      </w:r>
+        <w:t>کنیم .)</w:t>
+      </w:r>
+    </w:p>
+    <w:p>
+      <w:pPr>
+        <w:bidi/>
+        <w:rPr>
+          <w:rFonts w:cs="B Nazanin"/>
+          <w:sz w:val="24"/>
+          <w:szCs w:val="24"/>
+          <w:lang w:bidi="fa-IR"/>
+        </w:rPr>
+      </w:pPr>
+    </w:p>
+    <w:p>
+      <w:pPr>
+        <w:bidi/>
+        <w:rPr>
+          <w:rFonts w:cs="B Nazanin"/>
+          <w:b/>
+          <w:bCs/>
+          <w:sz w:val="36"/>
+          <w:szCs w:val="36"/>
+          <w:lang w:bidi="fa-IR"/>
+        </w:rPr>
+      </w:pPr>
       <w:r>
         <w:rPr>
           <w:rFonts w:cs="B Nazanin" w:hint="cs"/>
-          <w:sz w:val="24"/>
-          <w:szCs w:val="24"/>
-          <w:rtl/>
-          <w:lang w:bidi="fa-IR"/>
-        </w:rPr>
-        <w:t>کنیم .)</w:t>
+          <w:b/>
+          <w:bCs/>
+          <w:sz w:val="36"/>
+          <w:szCs w:val="36"/>
+          <w:rtl/>
+          <w:lang w:bidi="fa-IR"/>
+        </w:rPr>
+        <w:t>پیکربندی انتیتی ها برای مهاجرت</w:t>
+      </w:r>
+      <w:r>
+        <w:rPr>
+          <w:rFonts w:cs="B Nazanin" w:hint="cs"/>
+          <w:b/>
+          <w:bCs/>
+          <w:sz w:val="36"/>
+          <w:szCs w:val="36"/>
+          <w:rtl/>
+          <w:lang w:bidi="fa-IR"/>
+        </w:rPr>
+        <w:t xml:space="preserve"> -------------</w:t>
+      </w:r>
+    </w:p>
+    <w:p>
+      <w:pPr>
+        <w:bidi/>
+        <w:rPr>
+          <w:rFonts w:cs="B Nazanin"/>
+          <w:bCs/>
+          <w:sz w:val="32"/>
+          <w:szCs w:val="32"/>
+          <w:lang w:bidi="fa-IR"/>
+        </w:rPr>
+      </w:pPr>
+      <w:r>
+        <w:rPr>
+          <w:rFonts w:cs="B Nazanin"/>
+          <w:bCs/>
+          <w:sz w:val="32"/>
+          <w:szCs w:val="32"/>
+          <w:rtl/>
+        </w:rPr>
+        <w:t>نحوه تعیین نوع ستون در</w:t>
+      </w:r>
+      <w:r>
+        <w:rPr>
+          <w:rFonts w:cs="B Nazanin"/>
+          <w:bCs/>
+          <w:sz w:val="32"/>
+          <w:szCs w:val="32"/>
+          <w:lang w:bidi="fa-IR"/>
+        </w:rPr>
+        <w:t xml:space="preserve"> EF Core</w:t>
+      </w:r>
+    </w:p>
+    <w:p>
+      <w:pPr>
+        <w:bidi/>
+        <w:rPr>
+          <w:rFonts w:cs="B Nazanin"/>
+          <w:sz w:val="24"/>
+          <w:szCs w:val="24"/>
+          <w:lang w:bidi="fa-IR"/>
+        </w:rPr>
+      </w:pPr>
+      <w:r>
+        <w:rPr>
+          <w:rFonts w:cs="B Nazanin"/>
+          <w:sz w:val="24"/>
+          <w:szCs w:val="24"/>
+          <w:rtl/>
+        </w:rPr>
+        <w:t>چطور به</w:t>
+      </w:r>
+      <w:r>
+        <w:rPr>
+          <w:rFonts w:cs="B Nazanin"/>
+          <w:sz w:val="24"/>
+          <w:szCs w:val="24"/>
+          <w:lang w:bidi="fa-IR"/>
+        </w:rPr>
+        <w:t xml:space="preserve"> EF Core </w:t>
+      </w:r>
+      <w:r>
+        <w:rPr>
+          <w:rFonts w:cs="B Nazanin"/>
+          <w:sz w:val="24"/>
+          <w:szCs w:val="24"/>
+          <w:rtl/>
+        </w:rPr>
+        <w:t>بفهمانیم که مثلاً نوع یک ستون در</w:t>
+      </w:r>
+      <w:r>
+        <w:rPr>
+          <w:rFonts w:cs="B Nazanin"/>
+          <w:sz w:val="24"/>
+          <w:szCs w:val="24"/>
+          <w:lang w:bidi="fa-IR"/>
+        </w:rPr>
+        <w:t xml:space="preserve"> SQL Server </w:t>
+      </w:r>
+      <w:r>
+        <w:rPr>
+          <w:rFonts w:cs="B Nazanin"/>
+          <w:sz w:val="24"/>
+          <w:szCs w:val="24"/>
+          <w:rtl/>
+        </w:rPr>
+        <w:t xml:space="preserve">برابر با </w:t>
+      </w:r>
+      <w:r>
+        <w:rPr>
+          <w:rFonts w:cs="B Nazanin"/>
+          <w:sz w:val="24"/>
+          <w:szCs w:val="24"/>
+          <w:lang w:bidi="fa-IR"/>
+        </w:rPr>
+        <w:t xml:space="preserve">decimal(18,2) </w:t>
+      </w:r>
+      <w:r>
+        <w:rPr>
+          <w:rFonts w:cs="B Nazanin"/>
+          <w:sz w:val="24"/>
+          <w:szCs w:val="24"/>
+          <w:rtl/>
+        </w:rPr>
+        <w:t>باشد؟</w:t>
+      </w:r>
+    </w:p>
+    <w:p>
+      <w:pPr>
+        <w:bidi/>
+        <w:rPr>
+          <w:rFonts w:cs="B Nazanin"/>
+          <w:sz w:val="24"/>
+          <w:szCs w:val="24"/>
+          <w:lang w:bidi="fa-IR"/>
+        </w:rPr>
+      </w:pPr>
+      <w:r>
+        <w:rPr>
+          <w:rFonts w:cs="B Nazanin"/>
+          <w:sz w:val="24"/>
+          <w:szCs w:val="24"/>
+          <w:rtl/>
+        </w:rPr>
+        <w:t>ممکن است فکر کنیم می‌توانیم بنویسیم</w:t>
+      </w:r>
+      <w:r>
+        <w:rPr>
+          <w:rFonts w:cs="B Nazanin"/>
+          <w:sz w:val="24"/>
+          <w:szCs w:val="24"/>
+          <w:lang w:bidi="fa-IR"/>
+        </w:rPr>
+        <w:t>:</w:t>
+      </w:r>
+    </w:p>
+    <w:p>
+      <w:pPr>
+        <w:bidi/>
+        <w:jc w:val="right"/>
+        <w:rPr>
+          <w:rFonts w:cs="B Nazanin"/>
+          <w:sz w:val="24"/>
+          <w:szCs w:val="24"/>
+          <w:lang w:bidi="fa-IR"/>
+        </w:rPr>
+      </w:pPr>
+      <w:r>
+        <w:rPr>
+          <w:rFonts w:cs="B Nazanin"/>
+          <w:sz w:val="24"/>
+          <w:szCs w:val="24"/>
+          <w:lang w:bidi="fa-IR"/>
+        </w:rPr>
+        <w:t>public decimal(18,2) Price { get; set; }</w:t>
+      </w:r>
+    </w:p>
+    <w:p>
+      <w:pPr>
+        <w:bidi/>
+        <w:rPr>
+          <w:rFonts w:cs="B Nazanin"/>
+          <w:sz w:val="24"/>
+          <w:szCs w:val="24"/>
+          <w:lang w:bidi="fa-IR"/>
+        </w:rPr>
+      </w:pPr>
+      <w:r>
+        <w:rPr>
+          <w:rFonts w:cs="B Nazanin"/>
+          <w:sz w:val="24"/>
+          <w:szCs w:val="24"/>
+          <w:rtl/>
+        </w:rPr>
+        <w:t>اما چنین چیزی جزو</w:t>
+      </w:r>
+      <w:r>
+        <w:rPr>
+          <w:rFonts w:cs="B Nazanin"/>
+          <w:sz w:val="24"/>
+          <w:szCs w:val="24"/>
+          <w:lang w:bidi="fa-IR"/>
+        </w:rPr>
+        <w:t xml:space="preserve"> Syntax </w:t>
+      </w:r>
+      <w:r>
+        <w:rPr>
+          <w:rFonts w:cs="B Nazanin"/>
+          <w:sz w:val="24"/>
+          <w:szCs w:val="24"/>
+          <w:rtl/>
+        </w:rPr>
+        <w:t>زبان</w:t>
+      </w:r>
+      <w:r>
+        <w:rPr>
+          <w:rFonts w:cs="B Nazanin"/>
+          <w:sz w:val="24"/>
+          <w:szCs w:val="24"/>
+          <w:lang w:bidi="fa-IR"/>
+        </w:rPr>
+        <w:t xml:space="preserve"> C# </w:t>
+      </w:r>
+      <w:r>
+        <w:rPr>
+          <w:rFonts w:cs="B Nazanin"/>
+          <w:sz w:val="24"/>
+          <w:szCs w:val="24"/>
+          <w:rtl/>
+        </w:rPr>
+        <w:t>نیست</w:t>
+      </w:r>
+      <w:r>
+        <w:rPr>
+          <w:rFonts w:cs="B Nazanin"/>
+          <w:sz w:val="24"/>
+          <w:szCs w:val="24"/>
+          <w:lang w:bidi="fa-IR"/>
+        </w:rPr>
+        <w:t>.</w:t>
+      </w:r>
+    </w:p>
+    <w:p>
+      <w:pPr>
+        <w:bidi/>
+        <w:rPr>
+          <w:rFonts w:cs="B Nazanin"/>
+          <w:sz w:val="24"/>
+          <w:szCs w:val="24"/>
+          <w:lang w:bidi="fa-IR"/>
+        </w:rPr>
+      </w:pPr>
+      <w:r>
+        <w:rPr>
+          <w:rFonts w:cs="B Nazanin"/>
+          <w:sz w:val="24"/>
+          <w:szCs w:val="24"/>
+          <w:rtl/>
+        </w:rPr>
+        <w:t>در</w:t>
+      </w:r>
+      <w:r>
+        <w:rPr>
+          <w:rFonts w:cs="B Nazanin"/>
+          <w:sz w:val="24"/>
+          <w:szCs w:val="24"/>
+          <w:lang w:bidi="fa-IR"/>
+        </w:rPr>
+        <w:t xml:space="preserve"> C# </w:t>
+      </w:r>
+      <w:r>
+        <w:rPr>
+          <w:rFonts w:cs="B Nazanin"/>
+          <w:sz w:val="24"/>
+          <w:szCs w:val="24"/>
+          <w:rtl/>
+        </w:rPr>
+        <w:t>فقط نوع</w:t>
+      </w:r>
+      <w:r>
+        <w:rPr>
+          <w:rFonts w:cs="B Nazanin"/>
+          <w:sz w:val="24"/>
+          <w:szCs w:val="24"/>
+          <w:lang w:bidi="fa-IR"/>
+        </w:rPr>
+        <w:t xml:space="preserve"> property </w:t>
+      </w:r>
+      <w:r>
+        <w:rPr>
+          <w:rFonts w:cs="B Nazanin"/>
+          <w:sz w:val="24"/>
+          <w:szCs w:val="24"/>
+          <w:rtl/>
+        </w:rPr>
+        <w:t>را مشخص می‌کنیم</w:t>
+      </w:r>
+      <w:r>
+        <w:rPr>
+          <w:rFonts w:cs="B Nazanin"/>
+          <w:sz w:val="24"/>
+          <w:szCs w:val="24"/>
+          <w:lang w:bidi="fa-IR"/>
+        </w:rPr>
+        <w:t>:</w:t>
+      </w:r>
+    </w:p>
+    <w:p>
+      <w:pPr>
+        <w:bidi/>
+        <w:jc w:val="right"/>
+        <w:rPr>
+          <w:rFonts w:cs="B Nazanin"/>
+          <w:sz w:val="24"/>
+          <w:szCs w:val="24"/>
+          <w:lang w:bidi="fa-IR"/>
+        </w:rPr>
+      </w:pPr>
+      <w:r>
+        <w:rPr>
+          <w:rFonts w:cs="B Nazanin"/>
+          <w:sz w:val="24"/>
+          <w:szCs w:val="24"/>
+          <w:lang w:bidi="fa-IR"/>
+        </w:rPr>
+        <w:t>public decimal Price { get; set; }</w:t>
+      </w:r>
+    </w:p>
+    <w:p>
+      <w:pPr>
+        <w:bidi/>
+        <w:rPr>
+          <w:rFonts w:cs="B Nazanin"/>
+          <w:sz w:val="24"/>
+          <w:szCs w:val="24"/>
+          <w:lang w:bidi="fa-IR"/>
+        </w:rPr>
+      </w:pPr>
+      <w:r>
+        <w:rPr>
+          <w:rFonts w:cs="B Nazanin"/>
+          <w:sz w:val="24"/>
+          <w:szCs w:val="24"/>
+          <w:rtl/>
+        </w:rPr>
+        <w:t>سپس جزئیات مربوط به نحوه ذخیره شدن این</w:t>
+      </w:r>
+      <w:r>
+        <w:rPr>
+          <w:rFonts w:cs="B Nazanin"/>
+          <w:sz w:val="24"/>
+          <w:szCs w:val="24"/>
+          <w:lang w:bidi="fa-IR"/>
+        </w:rPr>
+        <w:t xml:space="preserve"> property </w:t>
+      </w:r>
+      <w:r>
+        <w:rPr>
+          <w:rFonts w:cs="B Nazanin"/>
+          <w:sz w:val="24"/>
+          <w:szCs w:val="24"/>
+          <w:rtl/>
+        </w:rPr>
+        <w:t>در دیتابیس را از طریق</w:t>
+      </w:r>
+      <w:r>
+        <w:rPr>
+          <w:rFonts w:cs="B Nazanin"/>
+          <w:sz w:val="24"/>
+          <w:szCs w:val="24"/>
+          <w:lang w:bidi="fa-IR"/>
+        </w:rPr>
+        <w:t xml:space="preserve"> EF Core </w:t>
+      </w:r>
+      <w:r>
+        <w:rPr>
+          <w:rFonts w:cs="B Nazanin"/>
+          <w:sz w:val="24"/>
+          <w:szCs w:val="24"/>
+          <w:rtl/>
+        </w:rPr>
+        <w:t>مشخص می‌کنیم</w:t>
+      </w:r>
+      <w:r>
+        <w:rPr>
+          <w:rFonts w:cs="B Nazanin"/>
+          <w:sz w:val="24"/>
+          <w:szCs w:val="24"/>
+          <w:lang w:bidi="fa-IR"/>
+        </w:rPr>
+        <w:t>:</w:t>
+      </w:r>
+    </w:p>
+    <w:p>
+      <w:pPr>
+        <w:bidi/>
+        <w:jc w:val="right"/>
+        <w:rPr>
+          <w:rFonts w:cs="B Nazanin"/>
+          <w:sz w:val="24"/>
+          <w:szCs w:val="24"/>
+          <w:lang w:bidi="fa-IR"/>
+        </w:rPr>
+      </w:pPr>
+      <w:r>
+        <w:rPr>
+          <w:rFonts w:cs="B Nazanin"/>
+          <w:sz w:val="24"/>
+          <w:szCs w:val="24"/>
+          <w:lang w:bidi="fa-IR"/>
+        </w:rPr>
+        <w:t>builder.Property(x =&gt; x.Price)</w:t>
+      </w:r>
+    </w:p>
+    <w:p>
+      <w:pPr>
+        <w:bidi/>
+        <w:jc w:val="right"/>
+        <w:rPr>
+          <w:rFonts w:cs="B Nazanin"/>
+          <w:sz w:val="24"/>
+          <w:szCs w:val="24"/>
+          <w:lang w:bidi="fa-IR"/>
+        </w:rPr>
+      </w:pPr>
+      <w:r>
+        <w:rPr>
+          <w:rFonts w:cs="B Nazanin"/>
+          <w:sz w:val="24"/>
+          <w:szCs w:val="24"/>
+          <w:lang w:bidi="fa-IR"/>
+        </w:rPr>
+        <w:t xml:space="preserve">       .HasColumnType("decimal(18,2)");</w:t>
+      </w:r>
+    </w:p>
+    <w:p>
+      <w:pPr>
+        <w:bidi/>
+        <w:rPr>
+          <w:rFonts w:cs="B Nazanin"/>
+          <w:sz w:val="24"/>
+          <w:szCs w:val="24"/>
+          <w:lang w:bidi="fa-IR"/>
+        </w:rPr>
+      </w:pPr>
+      <w:r>
+        <w:rPr>
+          <w:rFonts w:cs="B Nazanin"/>
+          <w:sz w:val="24"/>
+          <w:szCs w:val="24"/>
+          <w:rtl/>
+        </w:rPr>
+        <w:t>یا به شکل مناسب‌تر</w:t>
+      </w:r>
+      <w:r>
+        <w:rPr>
+          <w:rFonts w:cs="B Nazanin"/>
+          <w:sz w:val="24"/>
+          <w:szCs w:val="24"/>
+          <w:lang w:bidi="fa-IR"/>
+        </w:rPr>
+        <w:t>:</w:t>
+      </w:r>
+    </w:p>
+    <w:p>
+      <w:pPr>
+        <w:bidi/>
+        <w:jc w:val="right"/>
+        <w:rPr>
+          <w:rFonts w:cs="B Nazanin"/>
+          <w:sz w:val="24"/>
+          <w:szCs w:val="24"/>
+          <w:lang w:bidi="fa-IR"/>
+        </w:rPr>
+      </w:pPr>
+      <w:r>
+        <w:rPr>
+          <w:rFonts w:cs="B Nazanin"/>
+          <w:sz w:val="24"/>
+          <w:szCs w:val="24"/>
+          <w:lang w:bidi="fa-IR"/>
+        </w:rPr>
+        <w:t>builder.Property(x =&gt; x.Price)</w:t>
+      </w:r>
+    </w:p>
+    <w:p>
+      <w:pPr>
+        <w:bidi/>
+        <w:jc w:val="right"/>
+        <w:rPr>
+          <w:rFonts w:cs="B Nazanin"/>
+          <w:sz w:val="24"/>
+          <w:szCs w:val="24"/>
+          <w:lang w:bidi="fa-IR"/>
+        </w:rPr>
+      </w:pPr>
+      <w:r>
+        <w:rPr>
+          <w:rFonts w:cs="B Nazanin"/>
+          <w:sz w:val="24"/>
+          <w:szCs w:val="24"/>
+          <w:lang w:bidi="fa-IR"/>
+        </w:rPr>
+        <w:t xml:space="preserve">       .HasPrecision(18, 2);</w:t>
+      </w:r>
+    </w:p>
+    <w:p>
+      <w:pPr>
+        <w:bidi/>
+        <w:rPr>
+          <w:rFonts w:cs="B Nazanin"/>
+          <w:sz w:val="24"/>
+          <w:szCs w:val="24"/>
+          <w:lang w:bidi="fa-IR"/>
+        </w:rPr>
+      </w:pPr>
+      <w:r>
+        <w:rPr>
+          <w:rFonts w:cs="B Nazanin"/>
+          <w:sz w:val="24"/>
+          <w:szCs w:val="24"/>
+          <w:rtl/>
+        </w:rPr>
+        <w:t xml:space="preserve">بنابراین </w:t>
+      </w:r>
+      <w:r>
+        <w:rPr>
+          <w:rFonts w:cs="B Nazanin"/>
+          <w:sz w:val="24"/>
+          <w:szCs w:val="24"/>
+          <w:lang w:bidi="fa-IR"/>
+        </w:rPr>
+        <w:t xml:space="preserve">Configure </w:t>
+      </w:r>
+      <w:r>
+        <w:rPr>
+          <w:rFonts w:cs="B Nazanin"/>
+          <w:sz w:val="24"/>
+          <w:szCs w:val="24"/>
+          <w:rtl/>
+        </w:rPr>
+        <w:t>معمولاً محلی است که تنظیمات مربوط به</w:t>
+      </w:r>
+      <w:r>
+        <w:rPr>
+          <w:rFonts w:cs="B Nazanin"/>
+          <w:sz w:val="24"/>
+          <w:szCs w:val="24"/>
+          <w:lang w:bidi="fa-IR"/>
+        </w:rPr>
+        <w:t xml:space="preserve"> Entity </w:t>
+      </w:r>
+      <w:r>
+        <w:rPr>
+          <w:rFonts w:cs="B Nazanin"/>
+          <w:sz w:val="24"/>
+          <w:szCs w:val="24"/>
+          <w:rtl/>
+        </w:rPr>
+        <w:t>را در آن قرار می‌دهیم تا</w:t>
+      </w:r>
+      <w:r>
+        <w:rPr>
+          <w:rFonts w:cs="B Nazanin"/>
+          <w:sz w:val="24"/>
+          <w:szCs w:val="24"/>
+          <w:lang w:bidi="fa-IR"/>
+        </w:rPr>
+        <w:t xml:space="preserve"> EF Core </w:t>
+      </w:r>
+      <w:r>
+        <w:rPr>
+          <w:rFonts w:cs="B Nazanin"/>
+          <w:sz w:val="24"/>
+          <w:szCs w:val="24"/>
+          <w:rtl/>
+        </w:rPr>
+        <w:t>بداند</w:t>
+      </w:r>
+      <w:r>
+        <w:rPr>
+          <w:rFonts w:cs="B Nazanin"/>
+          <w:sz w:val="24"/>
+          <w:szCs w:val="24"/>
+          <w:lang w:bidi="fa-IR"/>
+        </w:rPr>
+        <w:t xml:space="preserve"> Entity </w:t>
+      </w:r>
+      <w:r>
+        <w:rPr>
+          <w:rFonts w:cs="B Nazanin"/>
+          <w:sz w:val="24"/>
+          <w:szCs w:val="24"/>
+          <w:rtl/>
+        </w:rPr>
+        <w:t>و</w:t>
+      </w:r>
+      <w:r>
+        <w:rPr>
+          <w:rFonts w:cs="B Nazanin"/>
+          <w:sz w:val="24"/>
+          <w:szCs w:val="24"/>
+          <w:lang w:bidi="fa-IR"/>
+        </w:rPr>
+        <w:t xml:space="preserve"> Property</w:t>
+      </w:r>
+      <w:r>
+        <w:rPr>
+          <w:rFonts w:cs="B Nazanin"/>
+          <w:sz w:val="24"/>
+          <w:szCs w:val="24"/>
+          <w:rtl/>
+        </w:rPr>
+        <w:t>های آن را چگونه در دیتابیس نگاشت</w:t>
+      </w:r>
+      <w:r>
+        <w:rPr>
+          <w:rFonts w:cs="B Nazanin"/>
+          <w:sz w:val="24"/>
+          <w:szCs w:val="24"/>
+          <w:lang w:bidi="fa-IR"/>
+        </w:rPr>
+        <w:t xml:space="preserve"> (Map) </w:t>
+      </w:r>
+      <w:r>
+        <w:rPr>
+          <w:rFonts w:cs="B Nazanin"/>
+          <w:sz w:val="24"/>
+          <w:szCs w:val="24"/>
+          <w:rtl/>
+        </w:rPr>
+        <w:t>کند</w:t>
+      </w:r>
+      <w:r>
+        <w:rPr>
+          <w:rFonts w:cs="B Nazanin"/>
+          <w:sz w:val="24"/>
+          <w:szCs w:val="24"/>
+          <w:lang w:bidi="fa-IR"/>
+        </w:rPr>
+        <w:t>.</w:t>
+      </w:r>
+    </w:p>
+    <w:p>
+      <w:pPr>
+        <w:bidi/>
+        <w:rPr>
+          <w:rFonts w:cs="B Nazanin"/>
+          <w:sz w:val="24"/>
+          <w:szCs w:val="24"/>
+        </w:rPr>
+      </w:pPr>
+      <w:r>
+        <w:rPr>
+          <w:rFonts w:cs="B Nazanin"/>
+          <w:sz w:val="24"/>
+          <w:szCs w:val="24"/>
+          <w:rtl/>
+        </w:rPr>
+        <w:lastRenderedPageBreak/>
+        <w:t>به مجموعه روش‌ها و</w:t>
+      </w:r>
+      <w:r>
+        <w:rPr>
+          <w:rFonts w:cs="B Nazanin"/>
+          <w:sz w:val="24"/>
+          <w:szCs w:val="24"/>
+          <w:lang w:bidi="fa-IR"/>
+        </w:rPr>
+        <w:t xml:space="preserve"> API</w:t>
+      </w:r>
+      <w:r>
+        <w:rPr>
+          <w:rFonts w:cs="B Nazanin"/>
+          <w:sz w:val="24"/>
+          <w:szCs w:val="24"/>
+          <w:rtl/>
+        </w:rPr>
+        <w:t>هایی که</w:t>
+      </w:r>
+      <w:r>
+        <w:rPr>
+          <w:rFonts w:cs="B Nazanin"/>
+          <w:sz w:val="24"/>
+          <w:szCs w:val="24"/>
+          <w:lang w:bidi="fa-IR"/>
+        </w:rPr>
+        <w:t xml:space="preserve"> EF Core </w:t>
+      </w:r>
+      <w:r>
+        <w:rPr>
+          <w:rFonts w:cs="B Nazanin"/>
+          <w:sz w:val="24"/>
+          <w:szCs w:val="24"/>
+          <w:rtl/>
+        </w:rPr>
+        <w:t xml:space="preserve">برای انجام این پیکربندی در اختیار برنامه‌نویس قرار می‌دهد، </w:t>
+      </w:r>
+      <w:r>
+        <w:rPr>
+          <w:rFonts w:cs="B Nazanin"/>
+          <w:b/>
+          <w:bCs/>
+          <w:sz w:val="24"/>
+          <w:szCs w:val="24"/>
+          <w:lang w:bidi="fa-IR"/>
+        </w:rPr>
+        <w:t>Fluent API</w:t>
+      </w:r>
+      <w:r>
+        <w:rPr>
+          <w:rFonts w:cs="B Nazanin"/>
+          <w:sz w:val="24"/>
+          <w:szCs w:val="24"/>
+          <w:lang w:bidi="fa-IR"/>
+        </w:rPr>
+        <w:t xml:space="preserve"> </w:t>
+      </w:r>
+      <w:r>
+        <w:rPr>
+          <w:rFonts w:cs="B Nazanin"/>
+          <w:sz w:val="24"/>
+          <w:szCs w:val="24"/>
+          <w:rtl/>
+        </w:rPr>
+        <w:t>می‌گوییم</w:t>
+      </w:r>
+      <w:r>
+        <w:rPr>
+          <w:rFonts w:cs="B Nazanin"/>
+          <w:sz w:val="24"/>
+          <w:szCs w:val="24"/>
+        </w:rPr>
+        <w:t>.</w:t>
+      </w:r>
+    </w:p>
+    <w:p>
+      <w:pPr>
+        <w:bidi/>
+        <w:rPr>
+          <w:rFonts w:cs="B Nazanin"/>
+          <w:sz w:val="24"/>
+          <w:szCs w:val="24"/>
+        </w:rPr>
+      </w:pPr>
+      <w:r>
+        <w:rPr>
+          <w:rFonts w:cs="B Nazanin"/>
+          <w:sz w:val="24"/>
+          <w:szCs w:val="24"/>
+          <w:rtl/>
+        </w:rPr>
+        <w:t xml:space="preserve">در اینجا </w:t>
+      </w:r>
+      <w:r>
+        <w:rPr>
+          <w:rFonts w:cs="B Nazanin"/>
+          <w:sz w:val="24"/>
+          <w:szCs w:val="24"/>
+        </w:rPr>
+        <w:t xml:space="preserve">API </w:t>
+      </w:r>
+      <w:r>
+        <w:rPr>
+          <w:rFonts w:cs="B Nazanin"/>
+          <w:sz w:val="24"/>
+          <w:szCs w:val="24"/>
+          <w:rtl/>
+        </w:rPr>
+        <w:t xml:space="preserve">به معنای </w:t>
+      </w:r>
+      <w:r>
+        <w:rPr>
+          <w:rFonts w:cs="B Nazanin"/>
+          <w:sz w:val="24"/>
+          <w:szCs w:val="24"/>
+        </w:rPr>
+        <w:t xml:space="preserve">Web API </w:t>
+      </w:r>
+      <w:r>
+        <w:rPr>
+          <w:rFonts w:cs="B Nazanin"/>
+          <w:sz w:val="24"/>
+          <w:szCs w:val="24"/>
+          <w:rtl/>
+        </w:rPr>
+        <w:t>نیست؛ بلکه به معنای رابط برنامه‌نویسی</w:t>
+      </w:r>
+      <w:r>
+        <w:rPr>
+          <w:rFonts w:cs="B Nazanin"/>
+          <w:sz w:val="24"/>
+          <w:szCs w:val="24"/>
+        </w:rPr>
+        <w:t xml:space="preserve"> (Application Programming Interface) </w:t>
+      </w:r>
+      <w:r>
+        <w:rPr>
+          <w:rFonts w:cs="B Nazanin"/>
+          <w:sz w:val="24"/>
+          <w:szCs w:val="24"/>
+          <w:rtl/>
+        </w:rPr>
+        <w:t>برای استفاده از قابلیت‌های</w:t>
+      </w:r>
+      <w:r>
+        <w:rPr>
+          <w:rFonts w:cs="B Nazanin"/>
+          <w:sz w:val="24"/>
+          <w:szCs w:val="24"/>
+        </w:rPr>
+        <w:t xml:space="preserve"> EF Core </w:t>
+      </w:r>
+      <w:r>
+        <w:rPr>
+          <w:rFonts w:cs="B Nazanin"/>
+          <w:sz w:val="24"/>
+          <w:szCs w:val="24"/>
+          <w:rtl/>
+        </w:rPr>
+        <w:t>است</w:t>
+      </w:r>
+      <w:r>
+        <w:rPr>
+          <w:rFonts w:cs="B Nazanin"/>
+          <w:sz w:val="24"/>
+          <w:szCs w:val="24"/>
+        </w:rPr>
+        <w:t>.</w:t>
+      </w:r>
+    </w:p>
+    <w:p>
+      <w:pPr>
+        <w:bidi/>
+        <w:rPr>
+          <w:rFonts w:cs="B Nazanin"/>
+          <w:sz w:val="24"/>
+          <w:szCs w:val="24"/>
+          <w:lang w:bidi="fa-IR"/>
+        </w:rPr>
+      </w:pPr>
+      <w:r>
+        <w:rPr>
+          <w:rFonts w:cs="B Nazanin"/>
+          <w:sz w:val="24"/>
+          <w:szCs w:val="24"/>
+          <w:rtl/>
+        </w:rPr>
+        <w:t>پس به‌صورت خلاصه</w:t>
+      </w:r>
+      <w:r>
+        <w:rPr>
+          <w:rFonts w:cs="B Nazanin"/>
+          <w:sz w:val="24"/>
+          <w:szCs w:val="24"/>
+          <w:lang w:bidi="fa-IR"/>
+        </w:rPr>
+        <w:t>:</w:t>
+      </w:r>
+    </w:p>
+    <w:p>
+      <w:pPr>
+        <w:bidi/>
+        <w:rPr>
+          <w:rFonts w:cs="B Nazanin"/>
+          <w:sz w:val="24"/>
+          <w:szCs w:val="24"/>
+          <w:lang w:bidi="fa-IR"/>
+        </w:rPr>
+      </w:pPr>
+      <w:r>
+        <w:rPr>
+          <w:rFonts w:cs="B Nazanin"/>
+          <w:sz w:val="24"/>
+          <w:szCs w:val="24"/>
+          <w:lang w:bidi="fa-IR"/>
+        </w:rPr>
+        <w:t>C# Entity</w:t>
+      </w:r>
+    </w:p>
+    <w:p>
+      <w:pPr>
+        <w:bidi/>
+        <w:rPr>
+          <w:rFonts w:cs="B Nazanin"/>
+          <w:sz w:val="24"/>
+          <w:szCs w:val="24"/>
+          <w:lang w:bidi="fa-IR"/>
+        </w:rPr>
+      </w:pPr>
+      <w:r>
+        <w:rPr>
+          <w:rFonts w:cs="B Nazanin"/>
+          <w:sz w:val="24"/>
+          <w:szCs w:val="24"/>
+          <w:lang w:bidi="fa-IR"/>
+        </w:rPr>
+        <w:t xml:space="preserve">    ↓</w:t>
+      </w:r>
+    </w:p>
+    <w:p>
+      <w:pPr>
+        <w:bidi/>
+        <w:rPr>
+          <w:rFonts w:cs="B Nazanin"/>
+          <w:sz w:val="24"/>
+          <w:szCs w:val="24"/>
+          <w:lang w:bidi="fa-IR"/>
+        </w:rPr>
+      </w:pPr>
+      <w:r>
+        <w:rPr>
+          <w:rFonts w:cs="B Nazanin"/>
+          <w:sz w:val="24"/>
+          <w:szCs w:val="24"/>
+          <w:lang w:bidi="fa-IR"/>
+        </w:rPr>
+        <w:t>public decimal Price</w:t>
+      </w:r>
+    </w:p>
+    <w:p>
+      <w:pPr>
+        <w:bidi/>
+        <w:rPr>
+          <w:rFonts w:cs="B Nazanin"/>
+          <w:sz w:val="24"/>
+          <w:szCs w:val="24"/>
+          <w:lang w:bidi="fa-IR"/>
+        </w:rPr>
+      </w:pPr>
+      <w:r>
+        <w:rPr>
+          <w:rFonts w:cs="B Nazanin"/>
+          <w:sz w:val="24"/>
+          <w:szCs w:val="24"/>
+          <w:lang w:bidi="fa-IR"/>
+        </w:rPr>
+        <w:t xml:space="preserve">    ↓</w:t>
+      </w:r>
+    </w:p>
+    <w:p>
+      <w:pPr>
+        <w:bidi/>
+        <w:rPr>
+          <w:rFonts w:cs="B Nazanin"/>
+          <w:sz w:val="24"/>
+          <w:szCs w:val="24"/>
+          <w:lang w:bidi="fa-IR"/>
+        </w:rPr>
+      </w:pPr>
+      <w:r>
+        <w:rPr>
+          <w:rFonts w:cs="B Nazanin"/>
+          <w:sz w:val="24"/>
+          <w:szCs w:val="24"/>
+          <w:lang w:bidi="fa-IR"/>
+        </w:rPr>
+        <w:t>EF Core Fluent API</w:t>
+      </w:r>
+    </w:p>
+    <w:p>
+      <w:pPr>
+        <w:bidi/>
+        <w:rPr>
+          <w:rFonts w:cs="B Nazanin"/>
+          <w:sz w:val="24"/>
+          <w:szCs w:val="24"/>
+          <w:lang w:bidi="fa-IR"/>
+        </w:rPr>
+      </w:pPr>
+      <w:r>
+        <w:rPr>
+          <w:rFonts w:cs="B Nazanin"/>
+          <w:sz w:val="24"/>
+          <w:szCs w:val="24"/>
+          <w:lang w:bidi="fa-IR"/>
+        </w:rPr>
+        <w:t xml:space="preserve">    ↓</w:t>
+      </w:r>
+    </w:p>
+    <w:p>
+      <w:pPr>
+        <w:bidi/>
+        <w:rPr>
+          <w:rFonts w:cs="B Nazanin"/>
+          <w:sz w:val="24"/>
+          <w:szCs w:val="24"/>
+          <w:lang w:bidi="fa-IR"/>
+        </w:rPr>
+      </w:pPr>
+      <w:r>
+        <w:rPr>
+          <w:rFonts w:cs="B Nazanin"/>
+          <w:sz w:val="24"/>
+          <w:szCs w:val="24"/>
+          <w:lang w:bidi="fa-IR"/>
+        </w:rPr>
+        <w:t>HasPrecision(18, 2)</w:t>
+      </w:r>
+    </w:p>
+    <w:p>
+      <w:pPr>
+        <w:bidi/>
+        <w:rPr>
+          <w:rFonts w:cs="B Nazanin"/>
+          <w:sz w:val="24"/>
+          <w:szCs w:val="24"/>
+          <w:lang w:bidi="fa-IR"/>
+        </w:rPr>
+      </w:pPr>
+      <w:r>
+        <w:rPr>
+          <w:rFonts w:cs="B Nazanin"/>
+          <w:sz w:val="24"/>
+          <w:szCs w:val="24"/>
+          <w:lang w:bidi="fa-IR"/>
+        </w:rPr>
+        <w:t xml:space="preserve">    ↓</w:t>
+      </w:r>
+    </w:p>
+    <w:p>
+      <w:pPr>
+        <w:bidi/>
+        <w:rPr>
+          <w:rFonts w:cs="B Nazanin"/>
+          <w:sz w:val="24"/>
+          <w:szCs w:val="24"/>
+          <w:lang w:bidi="fa-IR"/>
+        </w:rPr>
+      </w:pPr>
+      <w:r>
+        <w:rPr>
+          <w:rFonts w:cs="B Nazanin"/>
+          <w:sz w:val="24"/>
+          <w:szCs w:val="24"/>
+          <w:lang w:bidi="fa-IR"/>
+        </w:rPr>
+        <w:t>SQL Server</w:t>
+      </w:r>
+    </w:p>
+    <w:p>
+      <w:pPr>
+        <w:bidi/>
+        <w:rPr>
+          <w:rFonts w:cs="B Nazanin"/>
+          <w:sz w:val="24"/>
+          <w:szCs w:val="24"/>
+          <w:lang w:bidi="fa-IR"/>
+        </w:rPr>
+      </w:pPr>
+      <w:r>
+        <w:rPr>
+          <w:rFonts w:cs="B Nazanin"/>
+          <w:sz w:val="24"/>
+          <w:szCs w:val="24"/>
+          <w:lang w:bidi="fa-IR"/>
+        </w:rPr>
+        <w:t xml:space="preserve">    ↓</w:t>
+      </w:r>
+    </w:p>
+    <w:p>
+      <w:pPr>
+        <w:bidi/>
+        <w:rPr>
+          <w:rFonts w:cs="B Nazanin"/>
+          <w:sz w:val="24"/>
+          <w:szCs w:val="24"/>
+          <w:lang w:bidi="fa-IR"/>
+        </w:rPr>
+      </w:pPr>
+      <w:r>
+        <w:rPr>
+          <w:rFonts w:cs="B Nazanin"/>
+          <w:sz w:val="24"/>
+          <w:szCs w:val="24"/>
+          <w:lang w:bidi="fa-IR"/>
+        </w:rPr>
+        <w:t>decimal(18,2)</w:t>
+      </w:r>
+    </w:p>
+    <w:p>
+      <w:pPr>
+        <w:bidi/>
+        <w:rPr>
+          <w:rFonts w:cs="B Nazanin"/>
+          <w:sz w:val="24"/>
+          <w:szCs w:val="24"/>
+          <w:rtl/>
+          <w:lang w:bidi="fa-IR"/>
+        </w:rPr>
+      </w:pPr>
+      <w:r>
+        <w:rPr>
+          <w:rFonts w:cs="B Nazanin" w:hint="cs"/>
+          <w:sz w:val="24"/>
+          <w:szCs w:val="24"/>
+          <w:rtl/>
+          <w:lang w:bidi="fa-IR"/>
+        </w:rPr>
+        <w:t>پس یک نکته مهم داریم :</w:t>
+      </w:r>
+    </w:p>
+    <w:p>
+      <w:pPr>
+        <w:bidi/>
+        <w:rPr>
+          <w:rFonts w:cs="B Nazanin" w:hint="cs"/>
+          <w:sz w:val="24"/>
+          <w:szCs w:val="24"/>
+          <w:lang w:bidi="fa-IR"/>
+        </w:rPr>
+      </w:pPr>
+      <w:r>
+        <w:rPr>
+          <w:rFonts w:cs="B Nazanin"/>
+          <w:sz w:val="24"/>
+          <w:szCs w:val="24"/>
+          <w:lang w:bidi="fa-IR"/>
+        </w:rPr>
+        <w:t xml:space="preserve">Configure </w:t>
+      </w:r>
+      <w:r>
+        <w:rPr>
+          <w:rFonts w:cs="B Nazanin" w:hint="cs"/>
+          <w:sz w:val="24"/>
+          <w:szCs w:val="24"/>
+          <w:rtl/>
+          <w:lang w:bidi="fa-IR"/>
+        </w:rPr>
+        <w:t>=</w:t>
+      </w:r>
+      <w:r>
+        <w:rPr>
+          <w:rFonts w:cs="B Nazanin"/>
+          <w:sz w:val="24"/>
+          <w:szCs w:val="24"/>
+          <w:rtl/>
+        </w:rPr>
+        <w:t>محل نوشتن تنظیمات</w:t>
+      </w:r>
+      <w:r>
+        <w:rPr>
+          <w:rFonts w:cs="B Nazanin" w:hint="cs"/>
+          <w:sz w:val="24"/>
+          <w:szCs w:val="24"/>
+          <w:rtl/>
+        </w:rPr>
+        <w:t xml:space="preserve"> و </w:t>
+      </w:r>
+      <w:r>
+        <w:rPr>
+          <w:rFonts w:cs="B Nazanin"/>
+          <w:sz w:val="24"/>
+          <w:szCs w:val="24"/>
+          <w:rtl/>
+        </w:rPr>
+        <w:t xml:space="preserve"> </w:t>
+      </w:r>
+      <w:r>
+        <w:rPr>
+          <w:rFonts w:cs="B Nazanin"/>
+          <w:sz w:val="24"/>
+          <w:szCs w:val="24"/>
+          <w:lang w:bidi="fa-IR"/>
+        </w:rPr>
+        <w:t xml:space="preserve">Fluent API </w:t>
+      </w:r>
+      <w:r>
+        <w:rPr>
+          <w:rFonts w:cs="B Nazanin" w:hint="cs"/>
+          <w:sz w:val="24"/>
+          <w:szCs w:val="24"/>
+          <w:rtl/>
+          <w:lang w:bidi="fa-IR"/>
+        </w:rPr>
+        <w:t xml:space="preserve"> = </w:t>
+      </w:r>
+      <w:r>
+        <w:rPr>
+          <w:rFonts w:cs="B Nazanin"/>
+          <w:sz w:val="24"/>
+          <w:szCs w:val="24"/>
+          <w:rtl/>
+        </w:rPr>
+        <w:t>روشی</w:t>
+      </w:r>
+      <w:r>
+        <w:rPr>
+          <w:rFonts w:cs="B Nazanin" w:hint="cs"/>
+          <w:sz w:val="24"/>
+          <w:szCs w:val="24"/>
+          <w:rtl/>
+          <w:lang w:bidi="fa-IR"/>
+        </w:rPr>
+        <w:t>/</w:t>
+      </w:r>
+      <w:r>
+        <w:rPr>
+          <w:rFonts w:cs="B Nazanin" w:hint="cs"/>
+          <w:sz w:val="24"/>
+          <w:szCs w:val="24"/>
+          <w:rtl/>
+          <w:lang w:bidi="fa-IR"/>
+        </w:rPr>
+        <w:t xml:space="preserve"> </w:t>
+      </w:r>
+      <w:r>
+        <w:rPr>
+          <w:rFonts w:cs="B Nazanin"/>
+          <w:sz w:val="24"/>
+          <w:szCs w:val="24"/>
+          <w:lang w:bidi="fa-IR"/>
+        </w:rPr>
+        <w:t xml:space="preserve">API </w:t>
+      </w:r>
+      <w:r>
+        <w:rPr>
+          <w:rFonts w:cs="B Nazanin"/>
+          <w:sz w:val="24"/>
+          <w:szCs w:val="24"/>
+          <w:rtl/>
+        </w:rPr>
+        <w:t>که با آن تنظیمات</w:t>
+      </w:r>
+      <w:r>
+        <w:rPr>
+          <w:rFonts w:cs="B Nazanin"/>
+          <w:sz w:val="24"/>
+          <w:szCs w:val="24"/>
+          <w:lang w:bidi="fa-IR"/>
+        </w:rPr>
+        <w:t xml:space="preserve"> EF Core </w:t>
+      </w:r>
+      <w:r>
+        <w:rPr>
+          <w:rFonts w:cs="B Nazanin"/>
+          <w:sz w:val="24"/>
+          <w:szCs w:val="24"/>
+          <w:rtl/>
+        </w:rPr>
+        <w:t>را انجام می‌دهیم</w:t>
+      </w:r>
+      <w:r>
+        <w:rPr>
+          <w:rFonts w:cs="B Nazanin"/>
+          <w:sz w:val="24"/>
+          <w:szCs w:val="24"/>
+          <w:lang w:bidi="fa-IR"/>
+        </w:rPr>
+        <w:t>.</w:t>
       </w:r>
     </w:p>
     <w:sectPr>
@@ -8469,7 +9134,7 @@
   <w:style w:type="paragraph" w:default="1" w:styleId="Normal">
     <w:name w:val="Normal"/>
     <w:qFormat/>
-    <w:rsid w:val="00477796"/>
+    <w:rsid w:val="008C1F40"/>
   </w:style>
   <w:style w:type="character" w:default="1" w:styleId="DefaultParagraphFont">
     <w:name w:val="Default Paragraph Font"/>

</xml_diff>

<commit_message>
Add Generic Repo To Products API
</commit_message>
<xml_diff>
--- a/ECommerce By Neil Cummings.docx
+++ b/ECommerce By Neil Cummings.docx
@@ -230,6 +230,7 @@
         </w:rPr>
         <w:t xml:space="preserve"> ی که داخل </w:t>
       </w:r>
+      <w:proofErr w:type="spellStart"/>
       <w:r>
         <w:rPr>
           <w:rFonts w:cs="B Nazanin"/>
@@ -239,16 +240,29 @@
         </w:rPr>
         <w:t>LaunchSettings</w:t>
       </w:r>
-      <w:r>
-        <w:rPr>
-          <w:rFonts w:cs="B Nazanin" w:hint="cs"/>
-          <w:sz w:val="24"/>
-          <w:szCs w:val="24"/>
-          <w:rtl/>
-          <w:lang w:bidi="fa-IR"/>
-        </w:rPr>
-        <w:t xml:space="preserve"> برای اجرای برنامه تولید می شود تصادفی است .</w:t>
-      </w:r>
+      <w:proofErr w:type="spellEnd"/>
+      <w:r>
+        <w:rPr>
+          <w:rFonts w:cs="B Nazanin" w:hint="cs"/>
+          <w:sz w:val="24"/>
+          <w:szCs w:val="24"/>
+          <w:rtl/>
+          <w:lang w:bidi="fa-IR"/>
+        </w:rPr>
+        <w:t xml:space="preserve"> برای اجرای برنامه تولید می شود تصادفی </w:t>
+      </w:r>
+      <w:proofErr w:type="gramStart"/>
+      <w:r>
+        <w:rPr>
+          <w:rFonts w:cs="B Nazanin" w:hint="cs"/>
+          <w:sz w:val="24"/>
+          <w:szCs w:val="24"/>
+          <w:rtl/>
+          <w:lang w:bidi="fa-IR"/>
+        </w:rPr>
+        <w:t>است .</w:t>
+      </w:r>
+      <w:proofErr w:type="gramEnd"/>
     </w:p>
     <w:p>
       <w:pPr>
@@ -273,6 +287,7 @@
           <w:lang w:bidi="fa-IR"/>
         </w:rPr>
       </w:pPr>
+      <w:proofErr w:type="spellStart"/>
       <w:r>
         <w:rPr>
           <w:rFonts w:cs="B Nazanin"/>
@@ -284,6 +299,7 @@
         </w:rPr>
         <w:t>Program.cs</w:t>
       </w:r>
+      <w:proofErr w:type="spellEnd"/>
     </w:p>
     <w:p>
       <w:pPr>
@@ -379,20 +395,21 @@
           <w:szCs w:val="24"/>
           <w:lang w:bidi="fa-IR"/>
         </w:rPr>
-        <w:t>var app=builder.Build()</w:t>
-      </w:r>
-      <w:r>
-        <w:rPr>
-          <w:rFonts w:cs="B Nazanin" w:hint="cs"/>
+        <w:t>var app=</w:t>
+      </w:r>
+      <w:proofErr w:type="spellStart"/>
+      <w:r>
+        <w:rPr>
+          <w:rFonts w:cs="B Nazanin"/>
           <w:b/>
           <w:bCs/>
           <w:sz w:val="24"/>
           <w:szCs w:val="24"/>
-          <w:rtl/>
-          <w:lang w:bidi="fa-IR"/>
-        </w:rPr>
-        <w:t xml:space="preserve"> بیاد جزو </w:t>
-      </w:r>
+          <w:lang w:bidi="fa-IR"/>
+        </w:rPr>
+        <w:t>builder.Build</w:t>
+      </w:r>
+      <w:proofErr w:type="spellEnd"/>
       <w:r>
         <w:rPr>
           <w:rFonts w:cs="B Nazanin"/>
@@ -402,7 +419,7 @@
           <w:szCs w:val="24"/>
           <w:lang w:bidi="fa-IR"/>
         </w:rPr>
-        <w:t>Service</w:t>
+        <w:t>()</w:t>
       </w:r>
       <w:r>
         <w:rPr>
@@ -414,7 +431,7 @@
           <w:rtl/>
           <w:lang w:bidi="fa-IR"/>
         </w:rPr>
-        <w:t xml:space="preserve"> و هرچی بعد از آن بیاد </w:t>
+        <w:t xml:space="preserve"> بیاد جزو </w:t>
       </w:r>
       <w:r>
         <w:rPr>
@@ -425,7 +442,7 @@
           <w:szCs w:val="24"/>
           <w:lang w:bidi="fa-IR"/>
         </w:rPr>
-        <w:t>middleware</w:t>
+        <w:t>Service</w:t>
       </w:r>
       <w:r>
         <w:rPr>
@@ -437,6 +454,55 @@
           <w:rtl/>
           <w:lang w:bidi="fa-IR"/>
         </w:rPr>
+        <w:t xml:space="preserve"> و </w:t>
+      </w:r>
+      <w:proofErr w:type="spellStart"/>
+      <w:r>
+        <w:rPr>
+          <w:rFonts w:cs="B Nazanin" w:hint="cs"/>
+          <w:b/>
+          <w:bCs/>
+          <w:sz w:val="24"/>
+          <w:szCs w:val="24"/>
+          <w:rtl/>
+          <w:lang w:bidi="fa-IR"/>
+        </w:rPr>
+        <w:t>هرچی</w:t>
+      </w:r>
+      <w:proofErr w:type="spellEnd"/>
+      <w:r>
+        <w:rPr>
+          <w:rFonts w:cs="B Nazanin" w:hint="cs"/>
+          <w:b/>
+          <w:bCs/>
+          <w:sz w:val="24"/>
+          <w:szCs w:val="24"/>
+          <w:rtl/>
+          <w:lang w:bidi="fa-IR"/>
+        </w:rPr>
+        <w:t xml:space="preserve"> بعد از آن بیاد </w:t>
+      </w:r>
+      <w:r>
+        <w:rPr>
+          <w:rFonts w:cs="B Nazanin"/>
+          <w:b/>
+          <w:bCs/>
+          <w:sz w:val="24"/>
+          <w:szCs w:val="24"/>
+          <w:lang w:bidi="fa-IR"/>
+        </w:rPr>
+        <w:t>middleware</w:t>
+      </w:r>
+      <w:r>
+        <w:rPr>
+          <w:rFonts w:cs="B Nazanin" w:hint="cs"/>
+          <w:b/>
+          <w:bCs/>
+          <w:sz w:val="24"/>
+          <w:szCs w:val="24"/>
+          <w:rtl/>
+          <w:lang w:bidi="fa-IR"/>
+        </w:rPr>
         <w:t xml:space="preserve"> هست .</w:t>
       </w:r>
     </w:p>
@@ -459,7 +525,29 @@
           <w:rtl/>
           <w:lang w:bidi="fa-IR"/>
         </w:rPr>
-        <w:t>سرویس ها چیز هایی هستند که ما در داخل برنامه خود به کلاس های دیگر تزریق می کنیم .</w:t>
+        <w:t xml:space="preserve">سرویس ها چیز </w:t>
+      </w:r>
+      <w:proofErr w:type="spellStart"/>
+      <w:r>
+        <w:rPr>
+          <w:rFonts w:cs="B Nazanin" w:hint="cs"/>
+          <w:sz w:val="24"/>
+          <w:szCs w:val="24"/>
+          <w:rtl/>
+          <w:lang w:bidi="fa-IR"/>
+        </w:rPr>
+        <w:t>هایی</w:t>
+      </w:r>
+      <w:proofErr w:type="spellEnd"/>
+      <w:r>
+        <w:rPr>
+          <w:rFonts w:cs="B Nazanin" w:hint="cs"/>
+          <w:sz w:val="24"/>
+          <w:szCs w:val="24"/>
+          <w:rtl/>
+          <w:lang w:bidi="fa-IR"/>
+        </w:rPr>
+        <w:t xml:space="preserve"> هستند که ما در داخل برنامه خود به کلاس های دیگر تزریق می کنیم .</w:t>
       </w:r>
     </w:p>
     <w:p>
@@ -492,7 +580,23 @@
           <w:rFonts w:cs="B Nazanin"/>
           <w:lang w:bidi="fa-IR"/>
         </w:rPr>
-        <w:t xml:space="preserve"> Program.cs </w:t>
+        <w:t xml:space="preserve"> </w:t>
+      </w:r>
+      <w:proofErr w:type="spellStart"/>
+      <w:r>
+        <w:rPr>
+          <w:rFonts w:cs="B Nazanin"/>
+          <w:lang w:bidi="fa-IR"/>
+        </w:rPr>
+        <w:t>Program.cs</w:t>
+      </w:r>
+      <w:proofErr w:type="spellEnd"/>
+      <w:r>
+        <w:rPr>
+          <w:rFonts w:cs="B Nazanin"/>
+          <w:lang w:bidi="fa-IR"/>
+        </w:rPr>
+        <w:t xml:space="preserve"> </w:t>
       </w:r>
       <w:r>
         <w:rPr>
@@ -681,6 +785,7 @@
           <w:lang w:bidi="fa-IR"/>
         </w:rPr>
       </w:pPr>
+      <w:proofErr w:type="spellStart"/>
       <w:r>
         <w:rPr>
           <w:rFonts w:cs="B Nazanin"/>
@@ -690,6 +795,7 @@
         </w:rPr>
         <w:t>Appsetting.Json</w:t>
       </w:r>
+      <w:proofErr w:type="spellEnd"/>
       <w:r>
         <w:rPr>
           <w:rFonts w:cs="B Nazanin" w:hint="cs"/>
@@ -700,6 +806,8 @@
         </w:rPr>
         <w:t xml:space="preserve"> در همه حالات خوانده میشود ولی </w:t>
       </w:r>
+      <w:proofErr w:type="spellStart"/>
+      <w:proofErr w:type="gramStart"/>
       <w:r>
         <w:rPr>
           <w:rFonts w:cs="B Nazanin"/>
@@ -709,6 +817,8 @@
         </w:rPr>
         <w:t>Appsettings.Development.Json</w:t>
       </w:r>
+      <w:proofErr w:type="spellEnd"/>
+      <w:proofErr w:type="gramEnd"/>
       <w:r>
         <w:rPr>
           <w:rFonts w:cs="B Nazanin" w:hint="cs"/>
@@ -767,8 +877,20 @@
           <w:rtl/>
           <w:lang w:bidi="fa-IR"/>
         </w:rPr>
-        <w:t xml:space="preserve"> کنیم بیرون از کلاس در دسترس نخواهد بود .</w:t>
-      </w:r>
+        <w:t xml:space="preserve"> کنیم بیرون از کلاس در دسترس نخواهد </w:t>
+      </w:r>
+      <w:proofErr w:type="gramStart"/>
+      <w:r>
+        <w:rPr>
+          <w:rFonts w:cs="B Nazanin" w:hint="cs"/>
+          <w:sz w:val="24"/>
+          <w:szCs w:val="24"/>
+          <w:rtl/>
+          <w:lang w:bidi="fa-IR"/>
+        </w:rPr>
+        <w:t>بود .</w:t>
+      </w:r>
+      <w:proofErr w:type="gramEnd"/>
       <w:r>
         <w:rPr>
           <w:rFonts w:cs="B Nazanin" w:hint="cs"/>
@@ -1247,7 +1369,27 @@
           <w:szCs w:val="24"/>
           <w:lang w:bidi="fa-IR"/>
         </w:rPr>
-        <w:t xml:space="preserve"> private readonly field </w:t>
+        <w:t xml:space="preserve"> private </w:t>
+      </w:r>
+      <w:proofErr w:type="spellStart"/>
+      <w:r>
+        <w:rPr>
+          <w:rFonts w:cs="B Nazanin"/>
+          <w:sz w:val="24"/>
+          <w:szCs w:val="24"/>
+          <w:lang w:bidi="fa-IR"/>
+        </w:rPr>
+        <w:t>readonly</w:t>
+      </w:r>
+      <w:proofErr w:type="spellEnd"/>
+      <w:r>
+        <w:rPr>
+          <w:rFonts w:cs="B Nazanin"/>
+          <w:sz w:val="24"/>
+          <w:szCs w:val="24"/>
+          <w:lang w:bidi="fa-IR"/>
+        </w:rPr>
+        <w:t xml:space="preserve"> field </w:t>
       </w:r>
       <w:r>
         <w:rPr>
@@ -1324,6 +1466,7 @@
         </w:rPr>
         <w:t xml:space="preserve"> capture </w:t>
       </w:r>
+      <w:proofErr w:type="gramStart"/>
       <w:r>
         <w:rPr>
           <w:rFonts w:cs="B Nazanin"/>
@@ -1341,7 +1484,18 @@
           <w:rtl/>
           <w:lang w:bidi="fa-IR"/>
         </w:rPr>
-        <w:t xml:space="preserve">  و صرفا نیاز نیست که برای </w:t>
+        <w:t xml:space="preserve">  و</w:t>
+      </w:r>
+      <w:proofErr w:type="gramEnd"/>
+      <w:r>
+        <w:rPr>
+          <w:rFonts w:cs="B Nazanin" w:hint="cs"/>
+          <w:sz w:val="24"/>
+          <w:szCs w:val="24"/>
+          <w:rtl/>
+          <w:lang w:bidi="fa-IR"/>
+        </w:rPr>
+        <w:t xml:space="preserve"> صرفا نیاز نیست که برای </w:t>
       </w:r>
       <w:r>
         <w:rPr>
@@ -1369,8 +1523,19 @@
           <w:szCs w:val="24"/>
           <w:lang w:bidi="fa-IR"/>
         </w:rPr>
-        <w:t>private readonly</w:t>
-      </w:r>
+        <w:t xml:space="preserve">private </w:t>
+      </w:r>
+      <w:proofErr w:type="spellStart"/>
+      <w:r>
+        <w:rPr>
+          <w:rFonts w:cs="B Nazanin"/>
+          <w:sz w:val="24"/>
+          <w:szCs w:val="24"/>
+          <w:lang w:bidi="fa-IR"/>
+        </w:rPr>
+        <w:t>readonly</w:t>
+      </w:r>
+      <w:proofErr w:type="spellEnd"/>
       <w:r>
         <w:rPr>
           <w:rFonts w:cs="B Nazanin" w:hint="cs"/>
@@ -2263,15 +2428,28 @@
           <w:lang w:bidi="fa-IR"/>
         </w:rPr>
       </w:pPr>
-      <w:r>
-        <w:rPr>
-          <w:rFonts w:cs="B Nazanin"/>
-          <w:sz w:val="24"/>
-          <w:szCs w:val="24"/>
-          <w:lang w:bidi="fa-IR"/>
-        </w:rPr>
-        <w:t>Container  Container</w:t>
-      </w:r>
+      <w:proofErr w:type="gramStart"/>
+      <w:r>
+        <w:rPr>
+          <w:rFonts w:cs="B Nazanin"/>
+          <w:sz w:val="24"/>
+          <w:szCs w:val="24"/>
+          <w:lang w:bidi="fa-IR"/>
+        </w:rPr>
+        <w:t xml:space="preserve">Container  </w:t>
+      </w:r>
+      <w:proofErr w:type="spellStart"/>
+      <w:r>
+        <w:rPr>
+          <w:rFonts w:cs="B Nazanin"/>
+          <w:sz w:val="24"/>
+          <w:szCs w:val="24"/>
+          <w:lang w:bidi="fa-IR"/>
+        </w:rPr>
+        <w:t>Container</w:t>
+      </w:r>
+      <w:proofErr w:type="spellEnd"/>
+      <w:proofErr w:type="gramEnd"/>
     </w:p>
     <w:p>
       <w:pPr>
@@ -2424,8 +2602,21 @@
           <w:szCs w:val="24"/>
           <w:lang w:bidi="fa-IR"/>
         </w:rPr>
-        <w:t>docker-compose.yml</w:t>
-      </w:r>
+        <w:t>docker-</w:t>
+      </w:r>
+      <w:proofErr w:type="spellStart"/>
+      <w:r>
+        <w:rPr>
+          <w:rFonts w:cs="B Nazanin"/>
+          <w:b/>
+          <w:bCs/>
+          <w:sz w:val="24"/>
+          <w:szCs w:val="24"/>
+          <w:lang w:bidi="fa-IR"/>
+        </w:rPr>
+        <w:t>compose.yml</w:t>
+      </w:r>
+      <w:proofErr w:type="spellEnd"/>
     </w:p>
     <w:p>
       <w:pPr>
@@ -2451,7 +2642,25 @@
           <w:sz w:val="24"/>
           <w:szCs w:val="24"/>
         </w:rPr>
-        <w:t xml:space="preserve">docker-compose.yml </w:t>
+        <w:t>docker-</w:t>
+      </w:r>
+      <w:proofErr w:type="spellStart"/>
+      <w:r>
+        <w:rPr>
+          <w:rFonts w:cs="B Nazanin"/>
+          <w:sz w:val="24"/>
+          <w:szCs w:val="24"/>
+        </w:rPr>
+        <w:t>compose.yml</w:t>
+      </w:r>
+      <w:proofErr w:type="spellEnd"/>
+      <w:r>
+        <w:rPr>
+          <w:rFonts w:cs="B Nazanin"/>
+          <w:sz w:val="24"/>
+          <w:szCs w:val="24"/>
+        </w:rPr>
+        <w:t xml:space="preserve"> </w:t>
       </w:r>
       <w:r>
         <w:rPr>
@@ -2601,27 +2810,67 @@
           <w:szCs w:val="24"/>
           <w:lang w:bidi="fa-IR"/>
         </w:rPr>
-        <w:t xml:space="preserve">  sql:</w:t>
-      </w:r>
-    </w:p>
-    <w:p>
-      <w:pPr>
-        <w:bidi/>
-        <w:rPr>
-          <w:rFonts w:cs="B Nazanin"/>
-          <w:sz w:val="24"/>
-          <w:szCs w:val="24"/>
-          <w:lang w:bidi="fa-IR"/>
-        </w:rPr>
-      </w:pPr>
-      <w:r>
-        <w:rPr>
-          <w:rFonts w:cs="B Nazanin"/>
-          <w:sz w:val="24"/>
-          <w:szCs w:val="24"/>
-          <w:lang w:bidi="fa-IR"/>
-        </w:rPr>
-        <w:t xml:space="preserve">    image: mcr.microsoft.com/azure-sql-edge</w:t>
+        <w:t xml:space="preserve">  </w:t>
+      </w:r>
+      <w:proofErr w:type="spellStart"/>
+      <w:r>
+        <w:rPr>
+          <w:rFonts w:cs="B Nazanin"/>
+          <w:sz w:val="24"/>
+          <w:szCs w:val="24"/>
+          <w:lang w:bidi="fa-IR"/>
+        </w:rPr>
+        <w:t>sql</w:t>
+      </w:r>
+      <w:proofErr w:type="spellEnd"/>
+      <w:r>
+        <w:rPr>
+          <w:rFonts w:cs="B Nazanin"/>
+          <w:sz w:val="24"/>
+          <w:szCs w:val="24"/>
+          <w:lang w:bidi="fa-IR"/>
+        </w:rPr>
+        <w:t>:</w:t>
+      </w:r>
+    </w:p>
+    <w:p>
+      <w:pPr>
+        <w:bidi/>
+        <w:rPr>
+          <w:rFonts w:cs="B Nazanin"/>
+          <w:sz w:val="24"/>
+          <w:szCs w:val="24"/>
+          <w:lang w:bidi="fa-IR"/>
+        </w:rPr>
+      </w:pPr>
+      <w:r>
+        <w:rPr>
+          <w:rFonts w:cs="B Nazanin"/>
+          <w:sz w:val="24"/>
+          <w:szCs w:val="24"/>
+          <w:lang w:bidi="fa-IR"/>
+        </w:rPr>
+        <w:t xml:space="preserve">    image: mcr.microsoft.com/azure-</w:t>
+      </w:r>
+      <w:proofErr w:type="spellStart"/>
+      <w:r>
+        <w:rPr>
+          <w:rFonts w:cs="B Nazanin"/>
+          <w:sz w:val="24"/>
+          <w:szCs w:val="24"/>
+          <w:lang w:bidi="fa-IR"/>
+        </w:rPr>
+        <w:t>sql</w:t>
+      </w:r>
+      <w:proofErr w:type="spellEnd"/>
+      <w:r>
+        <w:rPr>
+          <w:rFonts w:cs="B Nazanin"/>
+          <w:sz w:val="24"/>
+          <w:szCs w:val="24"/>
+          <w:lang w:bidi="fa-IR"/>
+        </w:rPr>
+        <w:t>-edge</w:t>
       </w:r>
     </w:p>
     <w:p>
@@ -2672,14 +2921,25 @@
         </w:rPr>
         <w:t xml:space="preserve">برای سرویس </w:t>
       </w:r>
-      <w:r>
-        <w:rPr>
-          <w:rFonts w:cs="B Nazanin"/>
-          <w:sz w:val="24"/>
-          <w:szCs w:val="24"/>
-          <w:lang w:bidi="fa-IR"/>
-        </w:rPr>
-        <w:t xml:space="preserve">sql </w:t>
+      <w:proofErr w:type="spellStart"/>
+      <w:r>
+        <w:rPr>
+          <w:rFonts w:cs="B Nazanin"/>
+          <w:sz w:val="24"/>
+          <w:szCs w:val="24"/>
+          <w:lang w:bidi="fa-IR"/>
+        </w:rPr>
+        <w:t>sql</w:t>
+      </w:r>
+      <w:proofErr w:type="spellEnd"/>
+      <w:r>
+        <w:rPr>
+          <w:rFonts w:cs="B Nazanin"/>
+          <w:sz w:val="24"/>
+          <w:szCs w:val="24"/>
+          <w:lang w:bidi="fa-IR"/>
+        </w:rPr>
+        <w:t xml:space="preserve"> </w:t>
       </w:r>
       <w:r>
         <w:rPr>
@@ -2715,7 +2975,27 @@
           <w:szCs w:val="24"/>
           <w:lang w:bidi="fa-IR"/>
         </w:rPr>
-        <w:t xml:space="preserve">mcr.microsoft.com/azure-sql-edge </w:t>
+        <w:t>mcr.microsoft.com/azure-</w:t>
+      </w:r>
+      <w:proofErr w:type="spellStart"/>
+      <w:r>
+        <w:rPr>
+          <w:rFonts w:cs="B Nazanin"/>
+          <w:sz w:val="24"/>
+          <w:szCs w:val="24"/>
+          <w:lang w:bidi="fa-IR"/>
+        </w:rPr>
+        <w:t>sql</w:t>
+      </w:r>
+      <w:proofErr w:type="spellEnd"/>
+      <w:r>
+        <w:rPr>
+          <w:rFonts w:cs="B Nazanin"/>
+          <w:sz w:val="24"/>
+          <w:szCs w:val="24"/>
+          <w:lang w:bidi="fa-IR"/>
+        </w:rPr>
+        <w:t xml:space="preserve">-edge </w:t>
       </w:r>
       <w:r>
         <w:rPr>
@@ -2818,7 +3098,27 @@
           <w:szCs w:val="24"/>
           <w:lang w:bidi="fa-IR"/>
         </w:rPr>
-        <w:t xml:space="preserve">docker-compose.yml → </w:t>
+        <w:t>docker-</w:t>
+      </w:r>
+      <w:proofErr w:type="spellStart"/>
+      <w:r>
+        <w:rPr>
+          <w:rFonts w:cs="B Nazanin"/>
+          <w:sz w:val="24"/>
+          <w:szCs w:val="24"/>
+          <w:lang w:bidi="fa-IR"/>
+        </w:rPr>
+        <w:t>compose.yml</w:t>
+      </w:r>
+      <w:proofErr w:type="spellEnd"/>
+      <w:r>
+        <w:rPr>
+          <w:rFonts w:cs="B Nazanin"/>
+          <w:sz w:val="24"/>
+          <w:szCs w:val="24"/>
+          <w:lang w:bidi="fa-IR"/>
+        </w:rPr>
+        <w:t xml:space="preserve"> → </w:t>
       </w:r>
       <w:r>
         <w:rPr>
@@ -2971,8 +3271,21 @@
           <w:szCs w:val="24"/>
           <w:lang w:bidi="fa-IR"/>
         </w:rPr>
-        <w:t xml:space="preserve"> docker-compose.yml</w:t>
-      </w:r>
+        <w:t xml:space="preserve"> docker-</w:t>
+      </w:r>
+      <w:proofErr w:type="spellStart"/>
+      <w:r>
+        <w:rPr>
+          <w:rFonts w:cs="B Nazanin"/>
+          <w:b/>
+          <w:bCs/>
+          <w:sz w:val="24"/>
+          <w:szCs w:val="24"/>
+          <w:lang w:bidi="fa-IR"/>
+        </w:rPr>
+        <w:t>compose.yml</w:t>
+      </w:r>
+      <w:proofErr w:type="spellEnd"/>
     </w:p>
     <w:p>
       <w:pPr>
@@ -3000,7 +3313,27 @@
           <w:szCs w:val="24"/>
           <w:lang w:bidi="fa-IR"/>
         </w:rPr>
-        <w:t xml:space="preserve">docker-compose.yml </w:t>
+        <w:t>docker-</w:t>
+      </w:r>
+      <w:proofErr w:type="spellStart"/>
+      <w:r>
+        <w:rPr>
+          <w:rFonts w:cs="B Nazanin"/>
+          <w:sz w:val="24"/>
+          <w:szCs w:val="24"/>
+          <w:lang w:bidi="fa-IR"/>
+        </w:rPr>
+        <w:t>compose.yml</w:t>
+      </w:r>
+      <w:proofErr w:type="spellEnd"/>
+      <w:r>
+        <w:rPr>
+          <w:rFonts w:cs="B Nazanin"/>
+          <w:sz w:val="24"/>
+          <w:szCs w:val="24"/>
+          <w:lang w:bidi="fa-IR"/>
+        </w:rPr>
+        <w:t xml:space="preserve"> </w:t>
       </w:r>
       <w:r>
         <w:rPr>
@@ -3078,14 +3411,25 @@
           <w:lang w:bidi="fa-IR"/>
         </w:rPr>
       </w:pPr>
-      <w:r>
-        <w:rPr>
-          <w:rFonts w:cs="B Nazanin"/>
-          <w:sz w:val="24"/>
-          <w:szCs w:val="24"/>
-          <w:lang w:bidi="fa-IR"/>
-        </w:rPr>
-        <w:t>MyProject/</w:t>
+      <w:proofErr w:type="spellStart"/>
+      <w:r>
+        <w:rPr>
+          <w:rFonts w:cs="B Nazanin"/>
+          <w:sz w:val="24"/>
+          <w:szCs w:val="24"/>
+          <w:lang w:bidi="fa-IR"/>
+        </w:rPr>
+        <w:t>MyProject</w:t>
+      </w:r>
+      <w:proofErr w:type="spellEnd"/>
+      <w:r>
+        <w:rPr>
+          <w:rFonts w:cs="B Nazanin"/>
+          <w:sz w:val="24"/>
+          <w:szCs w:val="24"/>
+          <w:lang w:bidi="fa-IR"/>
+        </w:rPr>
+        <w:t>/</w:t>
       </w:r>
     </w:p>
     <w:p>
@@ -3143,8 +3487,19 @@
           <w:szCs w:val="24"/>
           <w:lang w:bidi="fa-IR"/>
         </w:rPr>
-        <w:t xml:space="preserve"> docker-compose.yml</w:t>
-      </w:r>
+        <w:t xml:space="preserve"> docker-</w:t>
+      </w:r>
+      <w:proofErr w:type="spellStart"/>
+      <w:r>
+        <w:rPr>
+          <w:rFonts w:cs="B Nazanin"/>
+          <w:sz w:val="24"/>
+          <w:szCs w:val="24"/>
+          <w:lang w:bidi="fa-IR"/>
+        </w:rPr>
+        <w:t>compose.yml</w:t>
+      </w:r>
+      <w:proofErr w:type="spellEnd"/>
     </w:p>
     <w:p>
       <w:pPr>
@@ -3287,8 +3642,19 @@
           <w:szCs w:val="24"/>
           <w:lang w:bidi="fa-IR"/>
         </w:rPr>
-        <w:t xml:space="preserve"> Dockerfile</w:t>
-      </w:r>
+        <w:t xml:space="preserve"> </w:t>
+      </w:r>
+      <w:proofErr w:type="spellStart"/>
+      <w:r>
+        <w:rPr>
+          <w:rFonts w:cs="B Nazanin"/>
+          <w:sz w:val="24"/>
+          <w:szCs w:val="24"/>
+          <w:lang w:bidi="fa-IR"/>
+        </w:rPr>
+        <w:t>Dockerfile</w:t>
+      </w:r>
+      <w:proofErr w:type="spellEnd"/>
     </w:p>
     <w:p>
       <w:pPr>
@@ -3472,8 +3838,19 @@
           <w:szCs w:val="24"/>
           <w:lang w:bidi="fa-IR"/>
         </w:rPr>
-        <w:t xml:space="preserve"> Dockerfile</w:t>
-      </w:r>
+        <w:t xml:space="preserve"> </w:t>
+      </w:r>
+      <w:proofErr w:type="spellStart"/>
+      <w:r>
+        <w:rPr>
+          <w:rFonts w:cs="B Nazanin"/>
+          <w:sz w:val="24"/>
+          <w:szCs w:val="24"/>
+          <w:lang w:bidi="fa-IR"/>
+        </w:rPr>
+        <w:t>Dockerfile</w:t>
+      </w:r>
+      <w:proofErr w:type="spellEnd"/>
     </w:p>
     <w:p>
       <w:pPr>
@@ -3521,7 +3898,27 @@
           <w:szCs w:val="24"/>
           <w:lang w:bidi="fa-IR"/>
         </w:rPr>
-        <w:t xml:space="preserve">docker-compose.yml </w:t>
+        <w:t>docker-</w:t>
+      </w:r>
+      <w:proofErr w:type="spellStart"/>
+      <w:r>
+        <w:rPr>
+          <w:rFonts w:cs="B Nazanin"/>
+          <w:sz w:val="24"/>
+          <w:szCs w:val="24"/>
+          <w:lang w:bidi="fa-IR"/>
+        </w:rPr>
+        <w:t>compose.yml</w:t>
+      </w:r>
+      <w:proofErr w:type="spellEnd"/>
+      <w:r>
+        <w:rPr>
+          <w:rFonts w:cs="B Nazanin"/>
+          <w:sz w:val="24"/>
+          <w:szCs w:val="24"/>
+          <w:lang w:bidi="fa-IR"/>
+        </w:rPr>
+        <w:t xml:space="preserve"> </w:t>
       </w:r>
       <w:r>
         <w:rPr>
@@ -3625,8 +4022,21 @@
           <w:szCs w:val="24"/>
           <w:lang w:bidi="fa-IR"/>
         </w:rPr>
-        <w:t xml:space="preserve"> docker-compose.yml</w:t>
-      </w:r>
+        <w:t xml:space="preserve"> docker-</w:t>
+      </w:r>
+      <w:proofErr w:type="spellStart"/>
+      <w:r>
+        <w:rPr>
+          <w:rFonts w:cs="B Nazanin"/>
+          <w:b/>
+          <w:bCs/>
+          <w:sz w:val="24"/>
+          <w:szCs w:val="24"/>
+          <w:lang w:bidi="fa-IR"/>
+        </w:rPr>
+        <w:t>compose.yml</w:t>
+      </w:r>
+      <w:proofErr w:type="spellEnd"/>
     </w:p>
     <w:p>
       <w:pPr>
@@ -3654,7 +4064,27 @@
           <w:szCs w:val="24"/>
           <w:lang w:bidi="fa-IR"/>
         </w:rPr>
-        <w:t xml:space="preserve">docker-compose.yml </w:t>
+        <w:t>docker-</w:t>
+      </w:r>
+      <w:proofErr w:type="spellStart"/>
+      <w:r>
+        <w:rPr>
+          <w:rFonts w:cs="B Nazanin"/>
+          <w:sz w:val="24"/>
+          <w:szCs w:val="24"/>
+          <w:lang w:bidi="fa-IR"/>
+        </w:rPr>
+        <w:t>compose.yml</w:t>
+      </w:r>
+      <w:proofErr w:type="spellEnd"/>
+      <w:r>
+        <w:rPr>
+          <w:rFonts w:cs="B Nazanin"/>
+          <w:sz w:val="24"/>
+          <w:szCs w:val="24"/>
+          <w:lang w:bidi="fa-IR"/>
+        </w:rPr>
+        <w:t xml:space="preserve"> </w:t>
       </w:r>
       <w:r>
         <w:rPr>
@@ -3834,8 +4264,21 @@
           <w:szCs w:val="24"/>
           <w:lang w:bidi="fa-IR"/>
         </w:rPr>
-        <w:t xml:space="preserve"> docker-compose.yml</w:t>
-      </w:r>
+        <w:t xml:space="preserve"> docker-</w:t>
+      </w:r>
+      <w:proofErr w:type="spellStart"/>
+      <w:r>
+        <w:rPr>
+          <w:rFonts w:cs="B Nazanin"/>
+          <w:b/>
+          <w:bCs/>
+          <w:sz w:val="24"/>
+          <w:szCs w:val="24"/>
+          <w:lang w:bidi="fa-IR"/>
+        </w:rPr>
+        <w:t>compose.yml</w:t>
+      </w:r>
+      <w:proofErr w:type="spellEnd"/>
     </w:p>
     <w:p>
       <w:pPr>
@@ -3874,27 +4317,67 @@
           <w:szCs w:val="24"/>
           <w:lang w:bidi="fa-IR"/>
         </w:rPr>
-        <w:t xml:space="preserve">  sql:</w:t>
-      </w:r>
-    </w:p>
-    <w:p>
-      <w:pPr>
-        <w:bidi/>
-        <w:rPr>
-          <w:rFonts w:cs="B Nazanin"/>
-          <w:sz w:val="24"/>
-          <w:szCs w:val="24"/>
-          <w:lang w:bidi="fa-IR"/>
-        </w:rPr>
-      </w:pPr>
-      <w:r>
-        <w:rPr>
-          <w:rFonts w:cs="B Nazanin"/>
-          <w:sz w:val="24"/>
-          <w:szCs w:val="24"/>
-          <w:lang w:bidi="fa-IR"/>
-        </w:rPr>
-        <w:t xml:space="preserve">    image: mcr.microsoft.com/azure-sql-edge</w:t>
+        <w:t xml:space="preserve">  </w:t>
+      </w:r>
+      <w:proofErr w:type="spellStart"/>
+      <w:r>
+        <w:rPr>
+          <w:rFonts w:cs="B Nazanin"/>
+          <w:sz w:val="24"/>
+          <w:szCs w:val="24"/>
+          <w:lang w:bidi="fa-IR"/>
+        </w:rPr>
+        <w:t>sql</w:t>
+      </w:r>
+      <w:proofErr w:type="spellEnd"/>
+      <w:r>
+        <w:rPr>
+          <w:rFonts w:cs="B Nazanin"/>
+          <w:sz w:val="24"/>
+          <w:szCs w:val="24"/>
+          <w:lang w:bidi="fa-IR"/>
+        </w:rPr>
+        <w:t>:</w:t>
+      </w:r>
+    </w:p>
+    <w:p>
+      <w:pPr>
+        <w:bidi/>
+        <w:rPr>
+          <w:rFonts w:cs="B Nazanin"/>
+          <w:sz w:val="24"/>
+          <w:szCs w:val="24"/>
+          <w:lang w:bidi="fa-IR"/>
+        </w:rPr>
+      </w:pPr>
+      <w:r>
+        <w:rPr>
+          <w:rFonts w:cs="B Nazanin"/>
+          <w:sz w:val="24"/>
+          <w:szCs w:val="24"/>
+          <w:lang w:bidi="fa-IR"/>
+        </w:rPr>
+        <w:t xml:space="preserve">    image: mcr.microsoft.com/azure-</w:t>
+      </w:r>
+      <w:proofErr w:type="spellStart"/>
+      <w:r>
+        <w:rPr>
+          <w:rFonts w:cs="B Nazanin"/>
+          <w:sz w:val="24"/>
+          <w:szCs w:val="24"/>
+          <w:lang w:bidi="fa-IR"/>
+        </w:rPr>
+        <w:t>sql</w:t>
+      </w:r>
+      <w:proofErr w:type="spellEnd"/>
+      <w:r>
+        <w:rPr>
+          <w:rFonts w:cs="B Nazanin"/>
+          <w:sz w:val="24"/>
+          <w:szCs w:val="24"/>
+          <w:lang w:bidi="fa-IR"/>
+        </w:rPr>
+        <w:t>-edge</w:t>
       </w:r>
     </w:p>
     <w:p>
@@ -4067,14 +4550,25 @@
         </w:rPr>
         <w:t xml:space="preserve">یک سرویس به نام </w:t>
       </w:r>
-      <w:r>
-        <w:rPr>
-          <w:rFonts w:cs="B Nazanin"/>
-          <w:sz w:val="24"/>
-          <w:szCs w:val="24"/>
-          <w:lang w:bidi="fa-IR"/>
-        </w:rPr>
-        <w:t xml:space="preserve">sql </w:t>
+      <w:proofErr w:type="spellStart"/>
+      <w:r>
+        <w:rPr>
+          <w:rFonts w:cs="B Nazanin"/>
+          <w:sz w:val="24"/>
+          <w:szCs w:val="24"/>
+          <w:lang w:bidi="fa-IR"/>
+        </w:rPr>
+        <w:t>sql</w:t>
+      </w:r>
+      <w:proofErr w:type="spellEnd"/>
+      <w:r>
+        <w:rPr>
+          <w:rFonts w:cs="B Nazanin"/>
+          <w:sz w:val="24"/>
+          <w:szCs w:val="24"/>
+          <w:lang w:bidi="fa-IR"/>
+        </w:rPr>
+        <w:t xml:space="preserve"> </w:t>
       </w:r>
       <w:r>
         <w:rPr>
@@ -4110,7 +4604,27 @@
           <w:szCs w:val="24"/>
           <w:lang w:bidi="fa-IR"/>
         </w:rPr>
-        <w:t xml:space="preserve">mcr.microsoft.com/azure-sql-edge </w:t>
+        <w:t>mcr.microsoft.com/azure-</w:t>
+      </w:r>
+      <w:proofErr w:type="spellStart"/>
+      <w:r>
+        <w:rPr>
+          <w:rFonts w:cs="B Nazanin"/>
+          <w:sz w:val="24"/>
+          <w:szCs w:val="24"/>
+          <w:lang w:bidi="fa-IR"/>
+        </w:rPr>
+        <w:t>sql</w:t>
+      </w:r>
+      <w:proofErr w:type="spellEnd"/>
+      <w:r>
+        <w:rPr>
+          <w:rFonts w:cs="B Nazanin"/>
+          <w:sz w:val="24"/>
+          <w:szCs w:val="24"/>
+          <w:lang w:bidi="fa-IR"/>
+        </w:rPr>
+        <w:t xml:space="preserve">-edge </w:t>
       </w:r>
       <w:r>
         <w:rPr>
@@ -4656,7 +5170,29 @@
           <w:rtl/>
           <w:lang w:bidi="fa-IR"/>
         </w:rPr>
-        <w:t xml:space="preserve"> از سرویس با ورژن دلخواه را دانلود یا اجرا کنیم ؟ با دستور زیر :</w:t>
+        <w:t xml:space="preserve"> از سرویس با </w:t>
+      </w:r>
+      <w:proofErr w:type="spellStart"/>
+      <w:r>
+        <w:rPr>
+          <w:rFonts w:cs="B Nazanin" w:hint="cs"/>
+          <w:sz w:val="24"/>
+          <w:szCs w:val="24"/>
+          <w:rtl/>
+          <w:lang w:bidi="fa-IR"/>
+        </w:rPr>
+        <w:t>ورژن</w:t>
+      </w:r>
+      <w:proofErr w:type="spellEnd"/>
+      <w:r>
+        <w:rPr>
+          <w:rFonts w:cs="B Nazanin" w:hint="cs"/>
+          <w:sz w:val="24"/>
+          <w:szCs w:val="24"/>
+          <w:rtl/>
+          <w:lang w:bidi="fa-IR"/>
+        </w:rPr>
+        <w:t xml:space="preserve"> دلخواه را دانلود یا اجرا کنیم ؟ با دستور زیر :</w:t>
       </w:r>
     </w:p>
     <w:p>
@@ -4678,8 +5214,30 @@
           <w:szCs w:val="24"/>
           <w:lang w:bidi="fa-IR"/>
         </w:rPr>
-        <w:t>image: some-image:tag</w:t>
-      </w:r>
+        <w:t xml:space="preserve">image: </w:t>
+      </w:r>
+      <w:proofErr w:type="spellStart"/>
+      <w:r>
+        <w:rPr>
+          <w:rFonts w:cs="Cambria"/>
+          <w:sz w:val="24"/>
+          <w:szCs w:val="24"/>
+          <w:lang w:bidi="fa-IR"/>
+        </w:rPr>
+        <w:t>some-</w:t>
+      </w:r>
+      <w:proofErr w:type="gramStart"/>
+      <w:r>
+        <w:rPr>
+          <w:rFonts w:cs="Cambria"/>
+          <w:sz w:val="24"/>
+          <w:szCs w:val="24"/>
+          <w:lang w:bidi="fa-IR"/>
+        </w:rPr>
+        <w:t>image:tag</w:t>
+      </w:r>
+      <w:proofErr w:type="spellEnd"/>
+      <w:proofErr w:type="gramEnd"/>
     </w:p>
     <w:p>
       <w:pPr>
@@ -5312,7 +5870,27 @@
           <w:szCs w:val="24"/>
           <w:lang w:bidi="fa-IR"/>
         </w:rPr>
-        <w:t>PORT_ON_HOST : PORT_IN_CONTAINER</w:t>
+        <w:t>PORT_ON_</w:t>
+      </w:r>
+      <w:proofErr w:type="gramStart"/>
+      <w:r>
+        <w:rPr>
+          <w:rFonts w:cs="B Nazanin"/>
+          <w:sz w:val="24"/>
+          <w:szCs w:val="24"/>
+          <w:lang w:bidi="fa-IR"/>
+        </w:rPr>
+        <w:t>HOST :</w:t>
+      </w:r>
+      <w:proofErr w:type="gramEnd"/>
+      <w:r>
+        <w:rPr>
+          <w:rFonts w:cs="B Nazanin"/>
+          <w:sz w:val="24"/>
+          <w:szCs w:val="24"/>
+          <w:lang w:bidi="fa-IR"/>
+        </w:rPr>
+        <w:t xml:space="preserve"> PORT_IN_CONTAINER</w:t>
       </w:r>
     </w:p>
     <w:p>
@@ -5354,14 +5932,25 @@
           <w:lang w:bidi="fa-IR"/>
         </w:rPr>
       </w:pPr>
-      <w:r>
-        <w:rPr>
-          <w:rFonts w:cs="B Nazanin"/>
-          <w:sz w:val="24"/>
-          <w:szCs w:val="24"/>
-          <w:lang w:bidi="fa-IR"/>
-        </w:rPr>
-        <w:t>1434 : 1433</w:t>
+      <w:proofErr w:type="gramStart"/>
+      <w:r>
+        <w:rPr>
+          <w:rFonts w:cs="B Nazanin"/>
+          <w:sz w:val="24"/>
+          <w:szCs w:val="24"/>
+          <w:lang w:bidi="fa-IR"/>
+        </w:rPr>
+        <w:t>1434 :</w:t>
+      </w:r>
+      <w:proofErr w:type="gramEnd"/>
+      <w:r>
+        <w:rPr>
+          <w:rFonts w:cs="B Nazanin"/>
+          <w:sz w:val="24"/>
+          <w:szCs w:val="24"/>
+          <w:lang w:bidi="fa-IR"/>
+        </w:rPr>
+        <w:t xml:space="preserve"> 1433</w:t>
       </w:r>
     </w:p>
     <w:p>
@@ -5663,7 +6252,27 @@
           <w:lang w:bidi="fa-IR"/>
         </w:rPr>
         <w:lastRenderedPageBreak/>
-        <w:t>Windows / Host : 1434</w:t>
+        <w:t xml:space="preserve">Windows / </w:t>
+      </w:r>
+      <w:proofErr w:type="gramStart"/>
+      <w:r>
+        <w:rPr>
+          <w:rFonts w:cs="B Nazanin"/>
+          <w:sz w:val="24"/>
+          <w:szCs w:val="24"/>
+          <w:lang w:bidi="fa-IR"/>
+        </w:rPr>
+        <w:t>Host :</w:t>
+      </w:r>
+      <w:proofErr w:type="gramEnd"/>
+      <w:r>
+        <w:rPr>
+          <w:rFonts w:cs="B Nazanin"/>
+          <w:sz w:val="24"/>
+          <w:szCs w:val="24"/>
+          <w:lang w:bidi="fa-IR"/>
+        </w:rPr>
+        <w:t xml:space="preserve"> 1434</w:t>
       </w:r>
     </w:p>
     <w:p>
@@ -5745,14 +6354,25 @@
           <w:lang w:bidi="fa-IR"/>
         </w:rPr>
       </w:pPr>
-      <w:r>
-        <w:rPr>
-          <w:rFonts w:cs="B Nazanin"/>
-          <w:sz w:val="24"/>
-          <w:szCs w:val="24"/>
-          <w:lang w:bidi="fa-IR"/>
-        </w:rPr>
-        <w:t>Container : 1433</w:t>
+      <w:proofErr w:type="gramStart"/>
+      <w:r>
+        <w:rPr>
+          <w:rFonts w:cs="B Nazanin"/>
+          <w:sz w:val="24"/>
+          <w:szCs w:val="24"/>
+          <w:lang w:bidi="fa-IR"/>
+        </w:rPr>
+        <w:t>Container :</w:t>
+      </w:r>
+      <w:proofErr w:type="gramEnd"/>
+      <w:r>
+        <w:rPr>
+          <w:rFonts w:cs="B Nazanin"/>
+          <w:sz w:val="24"/>
+          <w:szCs w:val="24"/>
+          <w:lang w:bidi="fa-IR"/>
+        </w:rPr>
+        <w:t xml:space="preserve"> 1433</w:t>
       </w:r>
     </w:p>
     <w:p>
@@ -6876,8 +7496,19 @@
           <w:szCs w:val="24"/>
           <w:lang w:bidi="fa-IR"/>
         </w:rPr>
-        <w:t>docker-compose.yml</w:t>
-      </w:r>
+        <w:t>docker-</w:t>
+      </w:r>
+      <w:proofErr w:type="spellStart"/>
+      <w:r>
+        <w:rPr>
+          <w:rFonts w:cs="B Nazanin"/>
+          <w:sz w:val="24"/>
+          <w:szCs w:val="24"/>
+          <w:lang w:bidi="fa-IR"/>
+        </w:rPr>
+        <w:t>compose.yml</w:t>
+      </w:r>
+      <w:proofErr w:type="spellEnd"/>
     </w:p>
     <w:p>
       <w:pPr>
@@ -7200,7 +7831,27 @@
           <w:szCs w:val="24"/>
           <w:lang w:bidi="fa-IR"/>
         </w:rPr>
-        <w:t xml:space="preserve">docker-compose.yml </w:t>
+        <w:t>docker-</w:t>
+      </w:r>
+      <w:proofErr w:type="spellStart"/>
+      <w:r>
+        <w:rPr>
+          <w:rFonts w:cs="B Nazanin"/>
+          <w:sz w:val="24"/>
+          <w:szCs w:val="24"/>
+          <w:lang w:bidi="fa-IR"/>
+        </w:rPr>
+        <w:t>compose.yml</w:t>
+      </w:r>
+      <w:proofErr w:type="spellEnd"/>
+      <w:r>
+        <w:rPr>
+          <w:rFonts w:cs="B Nazanin"/>
+          <w:sz w:val="24"/>
+          <w:szCs w:val="24"/>
+          <w:lang w:bidi="fa-IR"/>
+        </w:rPr>
+        <w:t xml:space="preserve"> </w:t>
       </w:r>
       <w:r>
         <w:rPr>
@@ -7500,8 +8151,19 @@
           <w:szCs w:val="24"/>
           <w:lang w:bidi="fa-IR"/>
         </w:rPr>
-        <w:t>docker-compose.yml</w:t>
-      </w:r>
+        <w:t>docker-</w:t>
+      </w:r>
+      <w:proofErr w:type="spellStart"/>
+      <w:r>
+        <w:rPr>
+          <w:rFonts w:cs="B Nazanin"/>
+          <w:sz w:val="24"/>
+          <w:szCs w:val="24"/>
+          <w:lang w:bidi="fa-IR"/>
+        </w:rPr>
+        <w:t>compose.yml</w:t>
+      </w:r>
+      <w:proofErr w:type="spellEnd"/>
       <w:r>
         <w:rPr>
           <w:rFonts w:cs="B Nazanin" w:hint="cs"/>
@@ -7512,6 +8174,7 @@
         </w:rPr>
         <w:t xml:space="preserve"> می توانیم از طریق </w:t>
       </w:r>
+      <w:proofErr w:type="spellStart"/>
       <w:r>
         <w:rPr>
           <w:rFonts w:cs="B Nazanin"/>
@@ -7521,6 +8184,7 @@
         </w:rPr>
         <w:t>ssms</w:t>
       </w:r>
+      <w:proofErr w:type="spellEnd"/>
       <w:r>
         <w:rPr>
           <w:rFonts w:cs="B Nazanin" w:hint="cs"/>
@@ -7613,6 +8277,7 @@
           <w:lang w:bidi="fa-IR"/>
         </w:rPr>
       </w:pPr>
+      <w:proofErr w:type="spellStart"/>
       <w:r>
         <w:rPr>
           <w:rFonts w:cs="B Nazanin" w:hint="cs"/>
@@ -7623,7 +8288,46 @@
           <w:rtl/>
           <w:lang w:bidi="fa-IR"/>
         </w:rPr>
-        <w:t>پیکربندی انتیتی ها برای مهاجرت -------------</w:t>
+        <w:t>پیکربندی</w:t>
+      </w:r>
+      <w:proofErr w:type="spellEnd"/>
+      <w:r>
+        <w:rPr>
+          <w:rFonts w:cs="B Nazanin" w:hint="cs"/>
+          <w:b/>
+          <w:bCs/>
+          <w:sz w:val="36"/>
+          <w:szCs w:val="36"/>
+          <w:rtl/>
+          <w:lang w:bidi="fa-IR"/>
+        </w:rPr>
+        <w:t xml:space="preserve"> </w:t>
+      </w:r>
+      <w:proofErr w:type="spellStart"/>
+      <w:r>
+        <w:rPr>
+          <w:rFonts w:cs="B Nazanin" w:hint="cs"/>
+          <w:b/>
+          <w:bCs/>
+          <w:sz w:val="36"/>
+          <w:szCs w:val="36"/>
+          <w:rtl/>
+          <w:lang w:bidi="fa-IR"/>
+        </w:rPr>
+        <w:t>انتیتی</w:t>
+      </w:r>
+      <w:proofErr w:type="spellEnd"/>
+      <w:r>
+        <w:rPr>
+          <w:rFonts w:cs="B Nazanin" w:hint="cs"/>
+          <w:b/>
+          <w:bCs/>
+          <w:sz w:val="36"/>
+          <w:szCs w:val="36"/>
+          <w:rtl/>
+          <w:lang w:bidi="fa-IR"/>
+        </w:rPr>
+        <w:t xml:space="preserve"> ها برای مهاجرت -------------</w:t>
       </w:r>
     </w:p>
     <w:p>
@@ -7779,7 +8483,27 @@
           <w:szCs w:val="24"/>
           <w:lang w:bidi="fa-IR"/>
         </w:rPr>
-        <w:t>public decimal(18,2) Price { get; set; }</w:t>
+        <w:t xml:space="preserve">public </w:t>
+      </w:r>
+      <w:proofErr w:type="gramStart"/>
+      <w:r>
+        <w:rPr>
+          <w:rFonts w:cs="B Nazanin"/>
+          <w:sz w:val="24"/>
+          <w:szCs w:val="24"/>
+          <w:lang w:bidi="fa-IR"/>
+        </w:rPr>
+        <w:t>decimal(</w:t>
+      </w:r>
+      <w:proofErr w:type="gramEnd"/>
+      <w:r>
+        <w:rPr>
+          <w:rFonts w:cs="B Nazanin"/>
+          <w:sz w:val="24"/>
+          <w:szCs w:val="24"/>
+          <w:lang w:bidi="fa-IR"/>
+        </w:rPr>
+        <w:t>18,2) Price { get; set; }</w:t>
       </w:r>
     </w:p>
     <w:p>
@@ -7930,7 +8654,27 @@
           <w:szCs w:val="24"/>
           <w:lang w:bidi="fa-IR"/>
         </w:rPr>
-        <w:t>public decimal Price { get; set; }</w:t>
+        <w:t xml:space="preserve">public decimal Price </w:t>
+      </w:r>
+      <w:proofErr w:type="gramStart"/>
+      <w:r>
+        <w:rPr>
+          <w:rFonts w:cs="B Nazanin"/>
+          <w:sz w:val="24"/>
+          <w:szCs w:val="24"/>
+          <w:lang w:bidi="fa-IR"/>
+        </w:rPr>
+        <w:t>{ get</w:t>
+      </w:r>
+      <w:proofErr w:type="gramEnd"/>
+      <w:r>
+        <w:rPr>
+          <w:rFonts w:cs="B Nazanin"/>
+          <w:sz w:val="24"/>
+          <w:szCs w:val="24"/>
+          <w:lang w:bidi="fa-IR"/>
+        </w:rPr>
+        <w:t>; set; }</w:t>
       </w:r>
     </w:p>
     <w:p>
@@ -8009,14 +8753,47 @@
           <w:lang w:bidi="fa-IR"/>
         </w:rPr>
       </w:pPr>
-      <w:r>
-        <w:rPr>
-          <w:rFonts w:cs="B Nazanin"/>
-          <w:sz w:val="24"/>
-          <w:szCs w:val="24"/>
-          <w:lang w:bidi="fa-IR"/>
-        </w:rPr>
-        <w:t>builder.Property(x =&gt; x.Price)</w:t>
+      <w:proofErr w:type="spellStart"/>
+      <w:proofErr w:type="gramStart"/>
+      <w:r>
+        <w:rPr>
+          <w:rFonts w:cs="B Nazanin"/>
+          <w:sz w:val="24"/>
+          <w:szCs w:val="24"/>
+          <w:lang w:bidi="fa-IR"/>
+        </w:rPr>
+        <w:t>builder.Property</w:t>
+      </w:r>
+      <w:proofErr w:type="spellEnd"/>
+      <w:proofErr w:type="gramEnd"/>
+      <w:r>
+        <w:rPr>
+          <w:rFonts w:cs="B Nazanin"/>
+          <w:sz w:val="24"/>
+          <w:szCs w:val="24"/>
+          <w:lang w:bidi="fa-IR"/>
+        </w:rPr>
+        <w:t xml:space="preserve">(x =&gt; </w:t>
+      </w:r>
+      <w:proofErr w:type="spellStart"/>
+      <w:r>
+        <w:rPr>
+          <w:rFonts w:cs="B Nazanin"/>
+          <w:sz w:val="24"/>
+          <w:szCs w:val="24"/>
+          <w:lang w:bidi="fa-IR"/>
+        </w:rPr>
+        <w:t>x.Price</w:t>
+      </w:r>
+      <w:proofErr w:type="spellEnd"/>
+      <w:r>
+        <w:rPr>
+          <w:rFonts w:cs="B Nazanin"/>
+          <w:sz w:val="24"/>
+          <w:szCs w:val="24"/>
+          <w:lang w:bidi="fa-IR"/>
+        </w:rPr>
+        <w:t>)</w:t>
       </w:r>
     </w:p>
     <w:p>
@@ -8037,7 +8814,38 @@
           <w:szCs w:val="24"/>
           <w:lang w:bidi="fa-IR"/>
         </w:rPr>
-        <w:t xml:space="preserve">       .HasColumnType("decimal(18,2)");</w:t>
+        <w:t xml:space="preserve">       </w:t>
+      </w:r>
+      <w:proofErr w:type="gramStart"/>
+      <w:r>
+        <w:rPr>
+          <w:rFonts w:cs="B Nazanin"/>
+          <w:sz w:val="24"/>
+          <w:szCs w:val="24"/>
+          <w:lang w:bidi="fa-IR"/>
+        </w:rPr>
+        <w:t>.</w:t>
+      </w:r>
+      <w:proofErr w:type="spellStart"/>
+      <w:r>
+        <w:rPr>
+          <w:rFonts w:cs="B Nazanin"/>
+          <w:sz w:val="24"/>
+          <w:szCs w:val="24"/>
+          <w:lang w:bidi="fa-IR"/>
+        </w:rPr>
+        <w:t>HasColumnType</w:t>
+      </w:r>
+      <w:proofErr w:type="spellEnd"/>
+      <w:proofErr w:type="gramEnd"/>
+      <w:r>
+        <w:rPr>
+          <w:rFonts w:cs="B Nazanin"/>
+          <w:sz w:val="24"/>
+          <w:szCs w:val="24"/>
+          <w:lang w:bidi="fa-IR"/>
+        </w:rPr>
+        <w:t>("decimal(18,2)");</w:t>
       </w:r>
     </w:p>
     <w:p>
@@ -8081,14 +8889,47 @@
           <w:lang w:bidi="fa-IR"/>
         </w:rPr>
       </w:pPr>
-      <w:r>
-        <w:rPr>
-          <w:rFonts w:cs="B Nazanin"/>
-          <w:sz w:val="24"/>
-          <w:szCs w:val="24"/>
-          <w:lang w:bidi="fa-IR"/>
-        </w:rPr>
-        <w:t>builder.Property(x =&gt; x.Price)</w:t>
+      <w:proofErr w:type="spellStart"/>
+      <w:proofErr w:type="gramStart"/>
+      <w:r>
+        <w:rPr>
+          <w:rFonts w:cs="B Nazanin"/>
+          <w:sz w:val="24"/>
+          <w:szCs w:val="24"/>
+          <w:lang w:bidi="fa-IR"/>
+        </w:rPr>
+        <w:t>builder.Property</w:t>
+      </w:r>
+      <w:proofErr w:type="spellEnd"/>
+      <w:proofErr w:type="gramEnd"/>
+      <w:r>
+        <w:rPr>
+          <w:rFonts w:cs="B Nazanin"/>
+          <w:sz w:val="24"/>
+          <w:szCs w:val="24"/>
+          <w:lang w:bidi="fa-IR"/>
+        </w:rPr>
+        <w:t xml:space="preserve">(x =&gt; </w:t>
+      </w:r>
+      <w:proofErr w:type="spellStart"/>
+      <w:r>
+        <w:rPr>
+          <w:rFonts w:cs="B Nazanin"/>
+          <w:sz w:val="24"/>
+          <w:szCs w:val="24"/>
+          <w:lang w:bidi="fa-IR"/>
+        </w:rPr>
+        <w:t>x.Price</w:t>
+      </w:r>
+      <w:proofErr w:type="spellEnd"/>
+      <w:r>
+        <w:rPr>
+          <w:rFonts w:cs="B Nazanin"/>
+          <w:sz w:val="24"/>
+          <w:szCs w:val="24"/>
+          <w:lang w:bidi="fa-IR"/>
+        </w:rPr>
+        <w:t>)</w:t>
       </w:r>
     </w:p>
     <w:p>
@@ -8109,7 +8950,38 @@
           <w:szCs w:val="24"/>
           <w:lang w:bidi="fa-IR"/>
         </w:rPr>
-        <w:t xml:space="preserve">       .HasPrecision(18, 2);</w:t>
+        <w:t xml:space="preserve">       </w:t>
+      </w:r>
+      <w:proofErr w:type="gramStart"/>
+      <w:r>
+        <w:rPr>
+          <w:rFonts w:cs="B Nazanin"/>
+          <w:sz w:val="24"/>
+          <w:szCs w:val="24"/>
+          <w:lang w:bidi="fa-IR"/>
+        </w:rPr>
+        <w:t>.</w:t>
+      </w:r>
+      <w:proofErr w:type="spellStart"/>
+      <w:r>
+        <w:rPr>
+          <w:rFonts w:cs="B Nazanin"/>
+          <w:sz w:val="24"/>
+          <w:szCs w:val="24"/>
+          <w:lang w:bidi="fa-IR"/>
+        </w:rPr>
+        <w:t>HasPrecision</w:t>
+      </w:r>
+      <w:proofErr w:type="spellEnd"/>
+      <w:proofErr w:type="gramEnd"/>
+      <w:r>
+        <w:rPr>
+          <w:rFonts w:cs="B Nazanin"/>
+          <w:sz w:val="24"/>
+          <w:szCs w:val="24"/>
+          <w:lang w:bidi="fa-IR"/>
+        </w:rPr>
+        <w:t>(18, 2);</w:t>
       </w:r>
     </w:p>
     <w:p>
@@ -8618,14 +9490,36 @@
           <w:lang w:bidi="fa-IR"/>
         </w:rPr>
       </w:pPr>
-      <w:r>
-        <w:rPr>
-          <w:rFonts w:cs="B Nazanin"/>
-          <w:sz w:val="24"/>
-          <w:szCs w:val="24"/>
-          <w:lang w:bidi="fa-IR"/>
-        </w:rPr>
-        <w:t>HasPrecision(18, 2)</w:t>
+      <w:proofErr w:type="spellStart"/>
+      <w:proofErr w:type="gramStart"/>
+      <w:r>
+        <w:rPr>
+          <w:rFonts w:cs="B Nazanin"/>
+          <w:sz w:val="24"/>
+          <w:szCs w:val="24"/>
+          <w:lang w:bidi="fa-IR"/>
+        </w:rPr>
+        <w:t>HasPrecision</w:t>
+      </w:r>
+      <w:proofErr w:type="spellEnd"/>
+      <w:r>
+        <w:rPr>
+          <w:rFonts w:cs="B Nazanin"/>
+          <w:sz w:val="24"/>
+          <w:szCs w:val="24"/>
+          <w:lang w:bidi="fa-IR"/>
+        </w:rPr>
+        <w:t>(</w:t>
+      </w:r>
+      <w:proofErr w:type="gramEnd"/>
+      <w:r>
+        <w:rPr>
+          <w:rFonts w:cs="B Nazanin"/>
+          <w:sz w:val="24"/>
+          <w:szCs w:val="24"/>
+          <w:lang w:bidi="fa-IR"/>
+        </w:rPr>
+        <w:t>18, 2)</w:t>
       </w:r>
     </w:p>
     <w:p>
@@ -8698,14 +9592,25 @@
           <w:lang w:bidi="fa-IR"/>
         </w:rPr>
       </w:pPr>
-      <w:r>
-        <w:rPr>
-          <w:rFonts w:cs="B Nazanin"/>
-          <w:sz w:val="24"/>
-          <w:szCs w:val="24"/>
-          <w:lang w:bidi="fa-IR"/>
-        </w:rPr>
-        <w:t>decimal(18,2)</w:t>
+      <w:proofErr w:type="gramStart"/>
+      <w:r>
+        <w:rPr>
+          <w:rFonts w:cs="B Nazanin"/>
+          <w:sz w:val="24"/>
+          <w:szCs w:val="24"/>
+          <w:lang w:bidi="fa-IR"/>
+        </w:rPr>
+        <w:t>decimal(</w:t>
+      </w:r>
+      <w:proofErr w:type="gramEnd"/>
+      <w:r>
+        <w:rPr>
+          <w:rFonts w:cs="B Nazanin"/>
+          <w:sz w:val="24"/>
+          <w:szCs w:val="24"/>
+          <w:lang w:bidi="fa-IR"/>
+        </w:rPr>
+        <w:t>18,2)</w:t>
       </w:r>
     </w:p>
     <w:p>
@@ -8776,25 +9681,45 @@
           <w:szCs w:val="24"/>
           <w:rtl/>
         </w:rPr>
-        <w:t xml:space="preserve"> و </w:t>
-      </w:r>
-      <w:r>
-        <w:rPr>
-          <w:rFonts w:cs="B Nazanin"/>
-          <w:sz w:val="24"/>
-          <w:szCs w:val="24"/>
-          <w:rtl/>
-        </w:rPr>
         <w:t xml:space="preserve"> </w:t>
       </w:r>
-      <w:r>
-        <w:rPr>
-          <w:rFonts w:cs="B Nazanin"/>
-          <w:sz w:val="24"/>
-          <w:szCs w:val="24"/>
-          <w:lang w:bidi="fa-IR"/>
-        </w:rPr>
-        <w:t xml:space="preserve">Fluent API </w:t>
+      <w:proofErr w:type="gramStart"/>
+      <w:r>
+        <w:rPr>
+          <w:rFonts w:cs="B Nazanin" w:hint="cs"/>
+          <w:sz w:val="24"/>
+          <w:szCs w:val="24"/>
+          <w:rtl/>
+        </w:rPr>
+        <w:t xml:space="preserve">و </w:t>
+      </w:r>
+      <w:r>
+        <w:rPr>
+          <w:rFonts w:cs="B Nazanin"/>
+          <w:sz w:val="24"/>
+          <w:szCs w:val="24"/>
+          <w:rtl/>
+        </w:rPr>
+        <w:t xml:space="preserve"> </w:t>
+      </w:r>
+      <w:r>
+        <w:rPr>
+          <w:rFonts w:cs="B Nazanin"/>
+          <w:sz w:val="24"/>
+          <w:szCs w:val="24"/>
+          <w:lang w:bidi="fa-IR"/>
+        </w:rPr>
+        <w:t>Fluent</w:t>
+      </w:r>
+      <w:proofErr w:type="gramEnd"/>
+      <w:r>
+        <w:rPr>
+          <w:rFonts w:cs="B Nazanin"/>
+          <w:sz w:val="24"/>
+          <w:szCs w:val="24"/>
+          <w:lang w:bidi="fa-IR"/>
+        </w:rPr>
+        <w:t xml:space="preserve"> API </w:t>
       </w:r>
       <w:r>
         <w:rPr>
@@ -9004,7 +9929,29 @@
           <w:rtl/>
           <w:lang w:bidi="fa-IR"/>
         </w:rPr>
-        <w:t xml:space="preserve">. یعنی برای تست و بررسی برنامه بهتر است از درج دستی داده برای حفظ زمان پرهیز شود و یک مجموعه داده تستی داخل جداول قرار گیرند . مراحل آن به شرح ذیل است </w:t>
+        <w:t xml:space="preserve">. یعنی برای تست و بررسی برنامه بهتر است از درج دستی داده برای حفظ زمان پرهیز شود و یک مجموعه داده </w:t>
+      </w:r>
+      <w:proofErr w:type="spellStart"/>
+      <w:r>
+        <w:rPr>
+          <w:rFonts w:cs="B Nazanin" w:hint="cs"/>
+          <w:sz w:val="24"/>
+          <w:szCs w:val="24"/>
+          <w:rtl/>
+          <w:lang w:bidi="fa-IR"/>
+        </w:rPr>
+        <w:t>تستی</w:t>
+      </w:r>
+      <w:proofErr w:type="spellEnd"/>
+      <w:r>
+        <w:rPr>
+          <w:rFonts w:cs="B Nazanin" w:hint="cs"/>
+          <w:sz w:val="24"/>
+          <w:szCs w:val="24"/>
+          <w:rtl/>
+          <w:lang w:bidi="fa-IR"/>
+        </w:rPr>
+        <w:t xml:space="preserve"> داخل جداول قرار گیرند . مراحل آن به شرح ذیل است </w:t>
       </w:r>
       <w:r>
         <w:rPr>
@@ -9162,7 +10109,29 @@
           <w:rtl/>
           <w:lang w:bidi="fa-IR"/>
         </w:rPr>
-        <w:t>که عملیات درج این فایل در دیتابیس را انجام دهد</w:t>
+        <w:t xml:space="preserve">که عملیات درج این فایل در </w:t>
+      </w:r>
+      <w:proofErr w:type="spellStart"/>
+      <w:r>
+        <w:rPr>
+          <w:rFonts w:cs="B Nazanin" w:hint="cs"/>
+          <w:sz w:val="24"/>
+          <w:szCs w:val="24"/>
+          <w:rtl/>
+          <w:lang w:bidi="fa-IR"/>
+        </w:rPr>
+        <w:t>دیتابیس</w:t>
+      </w:r>
+      <w:proofErr w:type="spellEnd"/>
+      <w:r>
+        <w:rPr>
+          <w:rFonts w:cs="B Nazanin" w:hint="cs"/>
+          <w:sz w:val="24"/>
+          <w:szCs w:val="24"/>
+          <w:rtl/>
+          <w:lang w:bidi="fa-IR"/>
+        </w:rPr>
+        <w:t xml:space="preserve"> را انجام دهد</w:t>
       </w:r>
       <w:r>
         <w:rPr>
@@ -9184,6 +10153,7 @@
         </w:rPr>
         <w:t xml:space="preserve"> اینجا </w:t>
       </w:r>
+      <w:proofErr w:type="spellStart"/>
       <w:r>
         <w:rPr>
           <w:rFonts w:cs="B Nazanin"/>
@@ -9193,6 +10163,7 @@
         </w:rPr>
         <w:t>program.cs</w:t>
       </w:r>
+      <w:proofErr w:type="spellEnd"/>
       <w:r>
         <w:rPr>
           <w:rFonts w:cs="B Nazanin" w:hint="cs"/>
@@ -9229,6 +10200,7 @@
         </w:rPr>
         <w:t xml:space="preserve">حال در </w:t>
       </w:r>
+      <w:proofErr w:type="spellStart"/>
       <w:r>
         <w:rPr>
           <w:rFonts w:cs="B Nazanin"/>
@@ -9238,6 +10210,7 @@
         </w:rPr>
         <w:t>Program.cs</w:t>
       </w:r>
+      <w:proofErr w:type="spellEnd"/>
       <w:r>
         <w:rPr>
           <w:rFonts w:cs="B Nazanin" w:hint="cs"/>
@@ -9337,14 +10310,25 @@
         </w:rPr>
         <w:t xml:space="preserve"> و قبل از </w:t>
       </w:r>
-      <w:r>
-        <w:rPr>
-          <w:rFonts w:cs="B Nazanin"/>
-          <w:sz w:val="24"/>
-          <w:szCs w:val="24"/>
-          <w:lang w:bidi="fa-IR"/>
-        </w:rPr>
-        <w:t>app.run()</w:t>
+      <w:proofErr w:type="spellStart"/>
+      <w:r>
+        <w:rPr>
+          <w:rFonts w:cs="B Nazanin"/>
+          <w:sz w:val="24"/>
+          <w:szCs w:val="24"/>
+          <w:lang w:bidi="fa-IR"/>
+        </w:rPr>
+        <w:t>app.run</w:t>
+      </w:r>
+      <w:proofErr w:type="spellEnd"/>
+      <w:r>
+        <w:rPr>
+          <w:rFonts w:cs="B Nazanin"/>
+          <w:sz w:val="24"/>
+          <w:szCs w:val="24"/>
+          <w:lang w:bidi="fa-IR"/>
+        </w:rPr>
+        <w:t>()</w:t>
       </w:r>
       <w:r>
         <w:rPr>
@@ -9446,206 +10430,11 @@
           <w:szCs w:val="19"/>
           <w:highlight w:val="white"/>
         </w:rPr>
-        <w:t xml:space="preserve"> context.Database.MigrateAsync();</w:t>
-      </w:r>
-    </w:p>
-    <w:p>
-      <w:pPr>
-        <w:bidi/>
-        <w:rPr>
-          <w:rFonts w:cs="B Nazanin" w:hint="cs"/>
-          <w:sz w:val="24"/>
-          <w:szCs w:val="24"/>
-          <w:rtl/>
-          <w:lang w:bidi="fa-IR"/>
-        </w:rPr>
-      </w:pPr>
-      <w:r>
-        <w:rPr>
-          <w:rFonts w:cs="B Nazanin" w:hint="cs"/>
-          <w:sz w:val="24"/>
-          <w:szCs w:val="24"/>
-          <w:rtl/>
-          <w:lang w:bidi="fa-IR"/>
-        </w:rPr>
-        <w:t>این یعنی</w:t>
-      </w:r>
-      <w:r>
-        <w:rPr>
-          <w:rFonts w:cs="B Nazanin" w:hint="cs"/>
-          <w:sz w:val="24"/>
-          <w:szCs w:val="24"/>
-          <w:rtl/>
-          <w:lang w:bidi="fa-IR"/>
-        </w:rPr>
-        <w:t xml:space="preserve"> در هر بار </w:t>
-      </w:r>
-      <w:r>
-        <w:rPr>
-          <w:rFonts w:cs="B Nazanin"/>
-          <w:sz w:val="24"/>
-          <w:szCs w:val="24"/>
-          <w:lang w:bidi="fa-IR"/>
-        </w:rPr>
-        <w:t>Run</w:t>
-      </w:r>
-      <w:r>
-        <w:rPr>
-          <w:rFonts w:cs="B Nazanin" w:hint="cs"/>
-          <w:sz w:val="24"/>
-          <w:szCs w:val="24"/>
-          <w:rtl/>
-          <w:lang w:bidi="fa-IR"/>
-        </w:rPr>
-        <w:t xml:space="preserve"> از برنامه </w:t>
-      </w:r>
-      <w:r>
-        <w:rPr>
-          <w:rFonts w:cs="B Nazanin"/>
-          <w:sz w:val="24"/>
-          <w:szCs w:val="24"/>
-          <w:lang w:bidi="fa-IR"/>
-        </w:rPr>
-        <w:t xml:space="preserve">Database </w:t>
-      </w:r>
-      <w:r>
-        <w:rPr>
-          <w:rFonts w:cs="B Nazanin" w:hint="cs"/>
-          <w:sz w:val="24"/>
-          <w:szCs w:val="24"/>
-          <w:rtl/>
-          <w:lang w:bidi="fa-IR"/>
-        </w:rPr>
         <w:t xml:space="preserve"> </w:t>
       </w:r>
-      <w:r>
-        <w:rPr>
-          <w:rFonts w:cs="B Nazanin"/>
-          <w:sz w:val="24"/>
-          <w:szCs w:val="24"/>
-          <w:rtl/>
-        </w:rPr>
-        <w:t>را بررسی کن و</w:t>
-      </w:r>
-      <w:r>
-        <w:rPr>
-          <w:rFonts w:cs="B Nazanin"/>
-          <w:sz w:val="24"/>
-          <w:szCs w:val="24"/>
-          <w:lang w:bidi="fa-IR"/>
-        </w:rPr>
-        <w:t xml:space="preserve"> Migration</w:t>
-      </w:r>
-      <w:r>
-        <w:rPr>
-          <w:rFonts w:cs="B Nazanin"/>
-          <w:sz w:val="24"/>
-          <w:szCs w:val="24"/>
-          <w:rtl/>
-        </w:rPr>
-        <w:t>های اعمال‌نشده را اعمال کن</w:t>
-      </w:r>
-      <w:r>
-        <w:rPr>
-          <w:rFonts w:cs="B Nazanin"/>
-          <w:sz w:val="24"/>
-          <w:szCs w:val="24"/>
-          <w:lang w:bidi="fa-IR"/>
-        </w:rPr>
-        <w:t>.</w:t>
-      </w:r>
-      <w:r>
-        <w:rPr>
-          <w:rFonts w:cs="B Nazanin" w:hint="cs"/>
-          <w:sz w:val="24"/>
-          <w:szCs w:val="24"/>
-          <w:rtl/>
-          <w:lang w:bidi="fa-IR"/>
-        </w:rPr>
-        <w:t xml:space="preserve"> دقت کن که </w:t>
-      </w:r>
-      <w:r>
-        <w:rPr>
-          <w:rFonts w:cs="B Nazanin"/>
-          <w:sz w:val="24"/>
-          <w:szCs w:val="24"/>
-          <w:lang w:bidi="fa-IR"/>
-        </w:rPr>
-        <w:t>migration</w:t>
-      </w:r>
-      <w:r>
-        <w:rPr>
-          <w:rFonts w:cs="B Nazanin" w:hint="cs"/>
-          <w:sz w:val="24"/>
-          <w:szCs w:val="24"/>
-          <w:rtl/>
-          <w:lang w:bidi="fa-IR"/>
-        </w:rPr>
-        <w:t xml:space="preserve"> های اعمال شده را دیگر اعمال نمی کند .</w:t>
-      </w:r>
-    </w:p>
-    <w:p>
-      <w:pPr>
-        <w:bidi/>
-        <w:rPr>
-          <w:rFonts w:cs="B Nazanin"/>
-          <w:sz w:val="24"/>
-          <w:szCs w:val="24"/>
-          <w:rtl/>
-          <w:lang w:bidi="fa-IR"/>
-        </w:rPr>
-      </w:pPr>
-    </w:p>
-    <w:p>
-      <w:pPr>
-        <w:bidi/>
-        <w:rPr>
-          <w:rFonts w:cs="B Nazanin"/>
-          <w:b/>
-          <w:bCs/>
-          <w:sz w:val="32"/>
-          <w:szCs w:val="32"/>
-          <w:rtl/>
-        </w:rPr>
-      </w:pPr>
-      <w:r>
-        <w:rPr>
-          <w:rFonts w:cs="B Nazanin"/>
-          <w:b/>
-          <w:bCs/>
-          <w:sz w:val="32"/>
-          <w:szCs w:val="32"/>
-        </w:rPr>
-        <w:t>Generic Constraint</w:t>
-      </w:r>
-    </w:p>
-    <w:p>
-      <w:pPr>
-        <w:bidi/>
-        <w:rPr>
-          <w:rFonts w:cs="B Nazanin"/>
-          <w:sz w:val="24"/>
-          <w:szCs w:val="24"/>
-          <w:lang w:bidi="fa-IR"/>
-        </w:rPr>
-      </w:pPr>
-      <w:r>
-        <w:rPr>
-          <w:rFonts w:cs="B Nazanin" w:hint="cs"/>
-          <w:sz w:val="24"/>
-          <w:szCs w:val="24"/>
-          <w:rtl/>
-          <w:lang w:bidi="fa-IR"/>
-        </w:rPr>
-        <w:t>تفسیر دقیق در کد زیر آورده شده است :</w:t>
-      </w:r>
-    </w:p>
-    <w:p>
-      <w:pPr>
-        <w:autoSpaceDE w:val="0"/>
-        <w:autoSpaceDN w:val="0"/>
-        <w:adjustRightInd w:val="0"/>
-        <w:spacing w:after="0" w:line="240" w:lineRule="auto"/>
+      <w:proofErr w:type="spellStart"/>
+      <w:proofErr w:type="gramStart"/>
+      <w:r>
         <w:rPr>
           <w:rFonts w:ascii="Cascadia Mono" w:hAnsi="Cascadia Mono" w:cs="Cascadia Mono"/>
           <w:color w:val="000000"/>
@@ -9653,7 +10442,10 @@
           <w:szCs w:val="19"/>
           <w:highlight w:val="white"/>
         </w:rPr>
-      </w:pPr>
+        <w:t>context.Database.MigrateAsync</w:t>
+      </w:r>
+      <w:proofErr w:type="spellEnd"/>
+      <w:proofErr w:type="gramEnd"/>
       <w:r>
         <w:rPr>
           <w:rFonts w:ascii="Cascadia Mono" w:hAnsi="Cascadia Mono" w:cs="Cascadia Mono"/>
@@ -9662,6 +10454,244 @@
           <w:szCs w:val="19"/>
           <w:highlight w:val="white"/>
         </w:rPr>
+        <w:t>();</w:t>
+      </w:r>
+    </w:p>
+    <w:p>
+      <w:pPr>
+        <w:bidi/>
+        <w:rPr>
+          <w:rFonts w:cs="B Nazanin" w:hint="cs"/>
+          <w:sz w:val="24"/>
+          <w:szCs w:val="24"/>
+          <w:rtl/>
+          <w:lang w:bidi="fa-IR"/>
+        </w:rPr>
+      </w:pPr>
+      <w:r>
+        <w:rPr>
+          <w:rFonts w:cs="B Nazanin" w:hint="cs"/>
+          <w:sz w:val="24"/>
+          <w:szCs w:val="24"/>
+          <w:rtl/>
+          <w:lang w:bidi="fa-IR"/>
+        </w:rPr>
+        <w:t>این یعنی</w:t>
+      </w:r>
+      <w:r>
+        <w:rPr>
+          <w:rFonts w:cs="B Nazanin" w:hint="cs"/>
+          <w:sz w:val="24"/>
+          <w:szCs w:val="24"/>
+          <w:rtl/>
+          <w:lang w:bidi="fa-IR"/>
+        </w:rPr>
+        <w:t xml:space="preserve"> در هر بار </w:t>
+      </w:r>
+      <w:r>
+        <w:rPr>
+          <w:rFonts w:cs="B Nazanin"/>
+          <w:sz w:val="24"/>
+          <w:szCs w:val="24"/>
+          <w:lang w:bidi="fa-IR"/>
+        </w:rPr>
+        <w:t>Run</w:t>
+      </w:r>
+      <w:r>
+        <w:rPr>
+          <w:rFonts w:cs="B Nazanin" w:hint="cs"/>
+          <w:sz w:val="24"/>
+          <w:szCs w:val="24"/>
+          <w:rtl/>
+          <w:lang w:bidi="fa-IR"/>
+        </w:rPr>
+        <w:t xml:space="preserve"> از برنامه </w:t>
+      </w:r>
+      <w:r>
+        <w:rPr>
+          <w:rFonts w:cs="B Nazanin"/>
+          <w:sz w:val="24"/>
+          <w:szCs w:val="24"/>
+          <w:lang w:bidi="fa-IR"/>
+        </w:rPr>
+        <w:t xml:space="preserve">Database </w:t>
+      </w:r>
+      <w:r>
+        <w:rPr>
+          <w:rFonts w:cs="B Nazanin" w:hint="cs"/>
+          <w:sz w:val="24"/>
+          <w:szCs w:val="24"/>
+          <w:rtl/>
+          <w:lang w:bidi="fa-IR"/>
+        </w:rPr>
+        <w:t xml:space="preserve"> </w:t>
+      </w:r>
+      <w:r>
+        <w:rPr>
+          <w:rFonts w:cs="B Nazanin"/>
+          <w:sz w:val="24"/>
+          <w:szCs w:val="24"/>
+          <w:rtl/>
+        </w:rPr>
+        <w:t>را بررسی کن و</w:t>
+      </w:r>
+      <w:r>
+        <w:rPr>
+          <w:rFonts w:cs="B Nazanin"/>
+          <w:sz w:val="24"/>
+          <w:szCs w:val="24"/>
+          <w:lang w:bidi="fa-IR"/>
+        </w:rPr>
+        <w:t xml:space="preserve"> Migration</w:t>
+      </w:r>
+      <w:r>
+        <w:rPr>
+          <w:rFonts w:cs="B Nazanin"/>
+          <w:sz w:val="24"/>
+          <w:szCs w:val="24"/>
+          <w:rtl/>
+        </w:rPr>
+        <w:t>های اعمال‌نشده را اعمال کن</w:t>
+      </w:r>
+      <w:r>
+        <w:rPr>
+          <w:rFonts w:cs="B Nazanin"/>
+          <w:sz w:val="24"/>
+          <w:szCs w:val="24"/>
+          <w:lang w:bidi="fa-IR"/>
+        </w:rPr>
+        <w:t>.</w:t>
+      </w:r>
+      <w:r>
+        <w:rPr>
+          <w:rFonts w:cs="B Nazanin" w:hint="cs"/>
+          <w:sz w:val="24"/>
+          <w:szCs w:val="24"/>
+          <w:rtl/>
+          <w:lang w:bidi="fa-IR"/>
+        </w:rPr>
+        <w:t xml:space="preserve"> دقت کن که </w:t>
+      </w:r>
+      <w:r>
+        <w:rPr>
+          <w:rFonts w:cs="B Nazanin"/>
+          <w:sz w:val="24"/>
+          <w:szCs w:val="24"/>
+          <w:lang w:bidi="fa-IR"/>
+        </w:rPr>
+        <w:t>migration</w:t>
+      </w:r>
+      <w:r>
+        <w:rPr>
+          <w:rFonts w:cs="B Nazanin" w:hint="cs"/>
+          <w:sz w:val="24"/>
+          <w:szCs w:val="24"/>
+          <w:rtl/>
+          <w:lang w:bidi="fa-IR"/>
+        </w:rPr>
+        <w:t xml:space="preserve"> های اعمال شده را دیگر اعمال </w:t>
+      </w:r>
+      <w:proofErr w:type="spellStart"/>
+      <w:r>
+        <w:rPr>
+          <w:rFonts w:cs="B Nazanin" w:hint="cs"/>
+          <w:sz w:val="24"/>
+          <w:szCs w:val="24"/>
+          <w:rtl/>
+          <w:lang w:bidi="fa-IR"/>
+        </w:rPr>
+        <w:t>نمی</w:t>
+      </w:r>
+      <w:proofErr w:type="spellEnd"/>
+      <w:r>
+        <w:rPr>
+          <w:rFonts w:cs="B Nazanin" w:hint="cs"/>
+          <w:sz w:val="24"/>
+          <w:szCs w:val="24"/>
+          <w:rtl/>
+          <w:lang w:bidi="fa-IR"/>
+        </w:rPr>
+        <w:t xml:space="preserve"> کند .</w:t>
+      </w:r>
+    </w:p>
+    <w:p>
+      <w:pPr>
+        <w:bidi/>
+        <w:rPr>
+          <w:rFonts w:cs="B Nazanin"/>
+          <w:sz w:val="24"/>
+          <w:szCs w:val="24"/>
+          <w:rtl/>
+          <w:lang w:bidi="fa-IR"/>
+        </w:rPr>
+      </w:pPr>
+    </w:p>
+    <w:p>
+      <w:pPr>
+        <w:bidi/>
+        <w:rPr>
+          <w:rFonts w:cs="B Nazanin"/>
+          <w:b/>
+          <w:bCs/>
+          <w:sz w:val="32"/>
+          <w:szCs w:val="32"/>
+          <w:rtl/>
+        </w:rPr>
+      </w:pPr>
+      <w:r>
+        <w:rPr>
+          <w:rFonts w:cs="B Nazanin"/>
+          <w:b/>
+          <w:bCs/>
+          <w:sz w:val="32"/>
+          <w:szCs w:val="32"/>
+        </w:rPr>
+        <w:t>Generic Constraint</w:t>
+      </w:r>
+    </w:p>
+    <w:p>
+      <w:pPr>
+        <w:bidi/>
+        <w:rPr>
+          <w:rFonts w:cs="B Nazanin"/>
+          <w:sz w:val="24"/>
+          <w:szCs w:val="24"/>
+          <w:lang w:bidi="fa-IR"/>
+        </w:rPr>
+      </w:pPr>
+      <w:r>
+        <w:rPr>
+          <w:rFonts w:cs="B Nazanin" w:hint="cs"/>
+          <w:sz w:val="24"/>
+          <w:szCs w:val="24"/>
+          <w:rtl/>
+          <w:lang w:bidi="fa-IR"/>
+        </w:rPr>
+        <w:t>تفسیر دقیق در کد زیر آورده شده است :</w:t>
+      </w:r>
+    </w:p>
+    <w:p>
+      <w:pPr>
+        <w:autoSpaceDE w:val="0"/>
+        <w:autoSpaceDN w:val="0"/>
+        <w:adjustRightInd w:val="0"/>
+        <w:spacing w:after="0" w:line="240" w:lineRule="auto"/>
+        <w:rPr>
+          <w:rFonts w:ascii="Cascadia Mono" w:hAnsi="Cascadia Mono" w:cs="Cascadia Mono"/>
+          <w:color w:val="000000"/>
+          <w:sz w:val="19"/>
+          <w:szCs w:val="19"/>
+          <w:highlight w:val="white"/>
+        </w:rPr>
+      </w:pPr>
+      <w:r>
+        <w:rPr>
+          <w:rFonts w:ascii="Cascadia Mono" w:hAnsi="Cascadia Mono" w:cs="Cascadia Mono"/>
+          <w:color w:val="000000"/>
+          <w:sz w:val="19"/>
+          <w:szCs w:val="19"/>
+          <w:highlight w:val="white"/>
+        </w:rPr>
         <w:t xml:space="preserve">    </w:t>
       </w:r>
       <w:r>
@@ -9704,6 +10734,7 @@
         </w:rPr>
         <w:t xml:space="preserve"> </w:t>
       </w:r>
+      <w:proofErr w:type="spellStart"/>
       <w:r>
         <w:rPr>
           <w:rFonts w:ascii="Cascadia Mono" w:hAnsi="Cascadia Mono" w:cs="Cascadia Mono"/>
@@ -9714,6 +10745,7 @@
         </w:rPr>
         <w:t>IGenericRepository</w:t>
       </w:r>
+      <w:proofErr w:type="spellEnd"/>
       <w:r>
         <w:rPr>
           <w:rFonts w:ascii="Cascadia Mono" w:hAnsi="Cascadia Mono" w:cs="Cascadia Mono"/>
@@ -9785,6 +10817,7 @@
         </w:rPr>
         <w:t xml:space="preserve"> </w:t>
       </w:r>
+      <w:proofErr w:type="gramStart"/>
       <w:r>
         <w:rPr>
           <w:rFonts w:ascii="Cascadia Mono" w:hAnsi="Cascadia Mono" w:cs="Cascadia Mono"/>
@@ -9803,8 +10836,20 @@
           <w:szCs w:val="19"/>
           <w:highlight w:val="white"/>
         </w:rPr>
-        <w:t xml:space="preserve"> : </w:t>
-      </w:r>
+        <w:t xml:space="preserve"> :</w:t>
+      </w:r>
+      <w:proofErr w:type="gramEnd"/>
+      <w:r>
+        <w:rPr>
+          <w:rFonts w:ascii="Cascadia Mono" w:hAnsi="Cascadia Mono" w:cs="Cascadia Mono"/>
+          <w:color w:val="000000"/>
+          <w:sz w:val="19"/>
+          <w:szCs w:val="19"/>
+          <w:highlight w:val="white"/>
+        </w:rPr>
+        <w:t xml:space="preserve"> </w:t>
+      </w:r>
+      <w:proofErr w:type="spellStart"/>
       <w:r>
         <w:rPr>
           <w:rFonts w:ascii="Cascadia Mono" w:hAnsi="Cascadia Mono" w:cs="Cascadia Mono"/>
@@ -9815,6 +10860,7 @@
         </w:rPr>
         <w:t>BaseEntity</w:t>
       </w:r>
+      <w:proofErr w:type="spellEnd"/>
     </w:p>
     <w:p>
       <w:pPr>
@@ -9831,7 +10877,7 @@
       <w:pPr>
         <w:bidi/>
         <w:rPr>
-          <w:rFonts w:cs="B Nazanin" w:hint="cs"/>
+          <w:rFonts w:cs="B Nazanin"/>
           <w:sz w:val="24"/>
           <w:szCs w:val="24"/>
           <w:rtl/>
@@ -9877,6 +10923,7 @@
         </w:rPr>
         <w:t xml:space="preserve"> به شرط آن که حتما یا </w:t>
       </w:r>
+      <w:proofErr w:type="spellStart"/>
       <w:r>
         <w:rPr>
           <w:rFonts w:cs="B Nazanin"/>
@@ -9886,6 +10933,7 @@
         </w:rPr>
         <w:t>baseEntity</w:t>
       </w:r>
+      <w:proofErr w:type="spellEnd"/>
       <w:r>
         <w:rPr>
           <w:rFonts w:cs="B Nazanin" w:hint="cs"/>
@@ -9904,7 +10952,354 @@
           <w:rtl/>
           <w:lang w:bidi="fa-IR"/>
         </w:rPr>
-        <w:t>م</w:t>
+        <w:t>.</w:t>
+      </w:r>
+    </w:p>
+    <w:p>
+      <w:pPr>
+        <w:bidi/>
+        <w:rPr>
+          <w:rFonts w:cs="B Nazanin"/>
+          <w:sz w:val="24"/>
+          <w:szCs w:val="24"/>
+          <w:lang w:bidi="fa-IR"/>
+        </w:rPr>
+      </w:pPr>
+      <w:r>
+        <w:rPr>
+          <w:rFonts w:cs="B Nazanin" w:hint="cs"/>
+          <w:sz w:val="24"/>
+          <w:szCs w:val="24"/>
+          <w:rtl/>
+          <w:lang w:bidi="fa-IR"/>
+        </w:rPr>
+        <w:t xml:space="preserve">چرا در کد مربوط به پیاده سازی </w:t>
+      </w:r>
+      <w:r>
+        <w:rPr>
+          <w:rFonts w:cs="B Nazanin"/>
+          <w:sz w:val="24"/>
+          <w:szCs w:val="24"/>
+          <w:lang w:bidi="fa-IR"/>
+        </w:rPr>
+        <w:t>Generic Repository</w:t>
+      </w:r>
+      <w:r>
+        <w:rPr>
+          <w:rFonts w:cs="B Nazanin" w:hint="cs"/>
+          <w:sz w:val="24"/>
+          <w:szCs w:val="24"/>
+          <w:rtl/>
+          <w:lang w:bidi="fa-IR"/>
+        </w:rPr>
+        <w:t xml:space="preserve"> ما از </w:t>
+      </w:r>
+      <w:r>
+        <w:rPr>
+          <w:rFonts w:cs="B Nazanin"/>
+          <w:sz w:val="24"/>
+          <w:szCs w:val="24"/>
+          <w:lang w:bidi="fa-IR"/>
+        </w:rPr>
+        <w:t>Set&lt;T&gt;</w:t>
+      </w:r>
+      <w:r>
+        <w:rPr>
+          <w:rFonts w:cs="B Nazanin" w:hint="cs"/>
+          <w:sz w:val="24"/>
+          <w:szCs w:val="24"/>
+          <w:rtl/>
+          <w:lang w:bidi="fa-IR"/>
+        </w:rPr>
+        <w:t xml:space="preserve"> استفاده می کنیم :</w:t>
+      </w:r>
+    </w:p>
+    <w:p>
+      <w:pPr>
+        <w:autoSpaceDE w:val="0"/>
+        <w:autoSpaceDN w:val="0"/>
+        <w:adjustRightInd w:val="0"/>
+        <w:spacing w:after="0" w:line="240" w:lineRule="auto"/>
+        <w:rPr>
+          <w:rFonts w:ascii="Cascadia Mono" w:hAnsi="Cascadia Mono" w:cs="Cascadia Mono"/>
+          <w:color w:val="000000"/>
+          <w:sz w:val="19"/>
+          <w:szCs w:val="19"/>
+          <w:highlight w:val="white"/>
+        </w:rPr>
+      </w:pPr>
+      <w:r>
+        <w:rPr>
+          <w:rFonts w:ascii="Cascadia Mono" w:hAnsi="Cascadia Mono" w:cs="Cascadia Mono"/>
+          <w:color w:val="000000"/>
+          <w:sz w:val="19"/>
+          <w:szCs w:val="19"/>
+          <w:highlight w:val="white"/>
+        </w:rPr>
+        <w:t xml:space="preserve">     </w:t>
+      </w:r>
+      <w:r>
+        <w:rPr>
+          <w:rFonts w:ascii="Cascadia Mono" w:hAnsi="Cascadia Mono" w:cs="Cascadia Mono"/>
+          <w:color w:val="0000FF"/>
+          <w:sz w:val="19"/>
+          <w:szCs w:val="19"/>
+          <w:highlight w:val="white"/>
+        </w:rPr>
+        <w:t>public</w:t>
+      </w:r>
+      <w:r>
+        <w:rPr>
+          <w:rFonts w:ascii="Cascadia Mono" w:hAnsi="Cascadia Mono" w:cs="Cascadia Mono"/>
+          <w:color w:val="000000"/>
+          <w:sz w:val="19"/>
+          <w:szCs w:val="19"/>
+          <w:highlight w:val="white"/>
+        </w:rPr>
+        <w:t xml:space="preserve"> </w:t>
+      </w:r>
+      <w:r>
+        <w:rPr>
+          <w:rFonts w:ascii="Cascadia Mono" w:hAnsi="Cascadia Mono" w:cs="Cascadia Mono"/>
+          <w:color w:val="0000FF"/>
+          <w:sz w:val="19"/>
+          <w:szCs w:val="19"/>
+          <w:highlight w:val="white"/>
+        </w:rPr>
+        <w:t>void</w:t>
+      </w:r>
+      <w:r>
+        <w:rPr>
+          <w:rFonts w:ascii="Cascadia Mono" w:hAnsi="Cascadia Mono" w:cs="Cascadia Mono"/>
+          <w:color w:val="000000"/>
+          <w:sz w:val="19"/>
+          <w:szCs w:val="19"/>
+          <w:highlight w:val="white"/>
+        </w:rPr>
+        <w:t xml:space="preserve"> </w:t>
+      </w:r>
+      <w:proofErr w:type="gramStart"/>
+      <w:r>
+        <w:rPr>
+          <w:rFonts w:ascii="Cascadia Mono" w:hAnsi="Cascadia Mono" w:cs="Cascadia Mono"/>
+          <w:color w:val="000000"/>
+          <w:sz w:val="19"/>
+          <w:szCs w:val="19"/>
+          <w:highlight w:val="white"/>
+        </w:rPr>
+        <w:t>Add(</w:t>
+      </w:r>
+      <w:proofErr w:type="gramEnd"/>
+      <w:r>
+        <w:rPr>
+          <w:rFonts w:ascii="Cascadia Mono" w:hAnsi="Cascadia Mono" w:cs="Cascadia Mono"/>
+          <w:color w:val="2B91AF"/>
+          <w:sz w:val="19"/>
+          <w:szCs w:val="19"/>
+          <w:highlight w:val="white"/>
+        </w:rPr>
+        <w:t>T</w:t>
+      </w:r>
+      <w:r>
+        <w:rPr>
+          <w:rFonts w:ascii="Cascadia Mono" w:hAnsi="Cascadia Mono" w:cs="Cascadia Mono"/>
+          <w:color w:val="000000"/>
+          <w:sz w:val="19"/>
+          <w:szCs w:val="19"/>
+          <w:highlight w:val="white"/>
+        </w:rPr>
+        <w:t xml:space="preserve"> entity)</w:t>
+      </w:r>
+    </w:p>
+    <w:p>
+      <w:pPr>
+        <w:autoSpaceDE w:val="0"/>
+        <w:autoSpaceDN w:val="0"/>
+        <w:adjustRightInd w:val="0"/>
+        <w:spacing w:after="0" w:line="240" w:lineRule="auto"/>
+        <w:rPr>
+          <w:rFonts w:ascii="Cascadia Mono" w:hAnsi="Cascadia Mono" w:cs="Cascadia Mono"/>
+          <w:color w:val="000000"/>
+          <w:sz w:val="19"/>
+          <w:szCs w:val="19"/>
+          <w:highlight w:val="white"/>
+        </w:rPr>
+      </w:pPr>
+      <w:r>
+        <w:rPr>
+          <w:rFonts w:ascii="Cascadia Mono" w:hAnsi="Cascadia Mono" w:cs="Cascadia Mono"/>
+          <w:color w:val="000000"/>
+          <w:sz w:val="19"/>
+          <w:szCs w:val="19"/>
+          <w:highlight w:val="white"/>
+        </w:rPr>
+        <w:t xml:space="preserve">     {</w:t>
+      </w:r>
+    </w:p>
+    <w:p>
+      <w:pPr>
+        <w:autoSpaceDE w:val="0"/>
+        <w:autoSpaceDN w:val="0"/>
+        <w:adjustRightInd w:val="0"/>
+        <w:spacing w:after="0" w:line="240" w:lineRule="auto"/>
+        <w:rPr>
+          <w:rFonts w:ascii="Cascadia Mono" w:hAnsi="Cascadia Mono" w:cs="Cascadia Mono"/>
+          <w:color w:val="000000"/>
+          <w:sz w:val="19"/>
+          <w:szCs w:val="19"/>
+          <w:highlight w:val="white"/>
+        </w:rPr>
+      </w:pPr>
+      <w:r>
+        <w:rPr>
+          <w:rFonts w:ascii="Cascadia Mono" w:hAnsi="Cascadia Mono" w:cs="Cascadia Mono"/>
+          <w:color w:val="000000"/>
+          <w:sz w:val="19"/>
+          <w:szCs w:val="19"/>
+          <w:highlight w:val="white"/>
+        </w:rPr>
+        <w:t xml:space="preserve">        </w:t>
+      </w:r>
+      <w:proofErr w:type="spellStart"/>
+      <w:proofErr w:type="gramStart"/>
+      <w:r>
+        <w:rPr>
+          <w:rFonts w:ascii="Cascadia Mono" w:hAnsi="Cascadia Mono" w:cs="Cascadia Mono"/>
+          <w:color w:val="000000"/>
+          <w:sz w:val="19"/>
+          <w:szCs w:val="19"/>
+          <w:highlight w:val="white"/>
+        </w:rPr>
+        <w:t>context.Set</w:t>
+      </w:r>
+      <w:proofErr w:type="spellEnd"/>
+      <w:proofErr w:type="gramEnd"/>
+      <w:r>
+        <w:rPr>
+          <w:rFonts w:ascii="Cascadia Mono" w:hAnsi="Cascadia Mono" w:cs="Cascadia Mono"/>
+          <w:color w:val="000000"/>
+          <w:sz w:val="19"/>
+          <w:szCs w:val="19"/>
+          <w:highlight w:val="white"/>
+        </w:rPr>
+        <w:t>&lt;</w:t>
+      </w:r>
+      <w:r>
+        <w:rPr>
+          <w:rFonts w:ascii="Cascadia Mono" w:hAnsi="Cascadia Mono" w:cs="Cascadia Mono"/>
+          <w:color w:val="2B91AF"/>
+          <w:sz w:val="19"/>
+          <w:szCs w:val="19"/>
+          <w:highlight w:val="white"/>
+        </w:rPr>
+        <w:t>T</w:t>
+      </w:r>
+      <w:r>
+        <w:rPr>
+          <w:rFonts w:ascii="Cascadia Mono" w:hAnsi="Cascadia Mono" w:cs="Cascadia Mono"/>
+          <w:color w:val="000000"/>
+          <w:sz w:val="19"/>
+          <w:szCs w:val="19"/>
+          <w:highlight w:val="white"/>
+        </w:rPr>
+        <w:t>&gt;().Add(entity);</w:t>
+      </w:r>
+    </w:p>
+    <w:p>
+      <w:pPr>
+        <w:autoSpaceDE w:val="0"/>
+        <w:autoSpaceDN w:val="0"/>
+        <w:adjustRightInd w:val="0"/>
+        <w:spacing w:after="0" w:line="240" w:lineRule="auto"/>
+        <w:rPr>
+          <w:rFonts w:ascii="Cascadia Mono" w:hAnsi="Cascadia Mono" w:cs="Cascadia Mono"/>
+          <w:color w:val="000000"/>
+          <w:sz w:val="19"/>
+          <w:szCs w:val="19"/>
+          <w:highlight w:val="white"/>
+        </w:rPr>
+      </w:pPr>
+      <w:r>
+        <w:rPr>
+          <w:rFonts w:ascii="Cascadia Mono" w:hAnsi="Cascadia Mono" w:cs="Cascadia Mono"/>
+          <w:color w:val="000000"/>
+          <w:sz w:val="19"/>
+          <w:szCs w:val="19"/>
+          <w:highlight w:val="white"/>
+        </w:rPr>
+        <w:t xml:space="preserve">     }</w:t>
+      </w:r>
+    </w:p>
+    <w:p>
+      <w:pPr>
+        <w:bidi/>
+        <w:rPr>
+          <w:rFonts w:cs="B Nazanin"/>
+          <w:sz w:val="24"/>
+          <w:szCs w:val="24"/>
+          <w:lang w:bidi="fa-IR"/>
+        </w:rPr>
+      </w:pPr>
+    </w:p>
+    <w:p>
+      <w:pPr>
+        <w:bidi/>
+        <w:rPr>
+          <w:rFonts w:cs="B Nazanin" w:hint="cs"/>
+          <w:sz w:val="24"/>
+          <w:szCs w:val="24"/>
+          <w:lang w:bidi="fa-IR"/>
+        </w:rPr>
+      </w:pPr>
+      <w:r>
+        <w:rPr>
+          <w:rFonts w:cs="B Nazanin" w:hint="cs"/>
+          <w:sz w:val="24"/>
+          <w:szCs w:val="24"/>
+          <w:rtl/>
+          <w:lang w:bidi="fa-IR"/>
+        </w:rPr>
+        <w:t xml:space="preserve">هر جا </w:t>
+      </w:r>
+      <w:r>
+        <w:rPr>
+          <w:rFonts w:cs="B Nazanin"/>
+          <w:sz w:val="24"/>
+          <w:szCs w:val="24"/>
+          <w:lang w:bidi="fa-IR"/>
+        </w:rPr>
+        <w:t>Set</w:t>
+      </w:r>
+      <w:r>
+        <w:rPr>
+          <w:rFonts w:cs="B Nazanin" w:hint="cs"/>
+          <w:sz w:val="24"/>
+          <w:szCs w:val="24"/>
+          <w:rtl/>
+          <w:lang w:bidi="fa-IR"/>
+        </w:rPr>
+        <w:t xml:space="preserve"> دیدیم یعنی </w:t>
+      </w:r>
+      <w:proofErr w:type="spellStart"/>
+      <w:r>
+        <w:rPr>
+          <w:rFonts w:cs="B Nazanin"/>
+          <w:sz w:val="24"/>
+          <w:szCs w:val="24"/>
+          <w:lang w:bidi="fa-IR"/>
+        </w:rPr>
+        <w:t>dbset</w:t>
+      </w:r>
+      <w:proofErr w:type="spellEnd"/>
+      <w:r>
+        <w:rPr>
+          <w:rFonts w:cs="B Nazanin" w:hint="cs"/>
+          <w:sz w:val="24"/>
+          <w:szCs w:val="24"/>
+          <w:rtl/>
+          <w:lang w:bidi="fa-IR"/>
+        </w:rPr>
+        <w:t xml:space="preserve"> مربوط به آن موجودیت را به من بده . </w:t>
       </w:r>
     </w:p>
     <w:p>
@@ -9941,6 +11336,7 @@
           <w:rtl/>
           <w:lang w:bidi="fa-IR"/>
         </w:rPr>
+        <w:lastRenderedPageBreak/>
         <w:t xml:space="preserve">سوالات </w:t>
       </w:r>
     </w:p>
@@ -9981,7 +11377,6 @@
           <w:rtl/>
           <w:lang w:bidi="fa-IR"/>
         </w:rPr>
-        <w:lastRenderedPageBreak/>
         <w:t xml:space="preserve">اگر </w:t>
       </w:r>
       <w:r>
@@ -10022,6 +11417,7 @@
         </w:rPr>
         <w:t xml:space="preserve"> باشد و ما در </w:t>
       </w:r>
+      <w:proofErr w:type="spellStart"/>
       <w:r>
         <w:rPr>
           <w:rFonts w:cs="B Nazanin"/>
@@ -10031,6 +11427,7 @@
         </w:rPr>
         <w:t>api</w:t>
       </w:r>
+      <w:proofErr w:type="spellEnd"/>
       <w:r>
         <w:rPr>
           <w:rFonts w:cs="B Nazanin" w:hint="cs"/>
@@ -10307,7 +11704,6 @@
           <w:rtl/>
           <w:lang w:bidi="fa-IR"/>
         </w:rPr>
-        <w:lastRenderedPageBreak/>
         <w:t>نه، اگر برای</w:t>
       </w:r>
       <w:r>
@@ -10365,7 +11761,29 @@
           <w:rtl/>
           <w:lang w:bidi="fa-IR"/>
         </w:rPr>
-        <w:t>هم می‌تواند کاملاً با آن کار کند</w:t>
+        <w:t xml:space="preserve">هم </w:t>
+      </w:r>
+      <w:proofErr w:type="spellStart"/>
+      <w:r>
+        <w:rPr>
+          <w:rFonts w:cs="B Nazanin"/>
+          <w:sz w:val="24"/>
+          <w:szCs w:val="24"/>
+          <w:rtl/>
+          <w:lang w:bidi="fa-IR"/>
+        </w:rPr>
+        <w:t>می‌تواند</w:t>
+      </w:r>
+      <w:proofErr w:type="spellEnd"/>
+      <w:r>
+        <w:rPr>
+          <w:rFonts w:cs="B Nazanin"/>
+          <w:sz w:val="24"/>
+          <w:szCs w:val="24"/>
+          <w:rtl/>
+          <w:lang w:bidi="fa-IR"/>
+        </w:rPr>
+        <w:t xml:space="preserve"> کاملاً با آن کار کند</w:t>
       </w:r>
       <w:r>
         <w:rPr>

</xml_diff>

<commit_message>
Add OrderBy To Spec
</commit_message>
<xml_diff>
--- a/ECommerce By Neil Cummings.docx
+++ b/ECommerce By Neil Cummings.docx
@@ -11167,6 +11167,7 @@
           <w:rFonts w:cs="B Nazanin"/>
           <w:sz w:val="24"/>
           <w:szCs w:val="24"/>
+          <w:rtl/>
           <w:lang w:bidi="fa-IR"/>
         </w:rPr>
       </w:pPr>
@@ -11228,7 +11229,113 @@
           <w:rtl/>
           <w:lang w:bidi="fa-IR"/>
         </w:rPr>
-        <w:t xml:space="preserve"> برای آشنا شدن با این الگو باید با یک سری پیش زمینه ها آشنا شویم :</w:t>
+        <w:t xml:space="preserve"> پس با مقوله الگوی مشخصات آشنا می شویم :</w:t>
+      </w:r>
+    </w:p>
+    <w:p>
+      <w:pPr>
+        <w:bidi/>
+        <w:rPr>
+          <w:rFonts w:cs="B Nazanin"/>
+          <w:sz w:val="24"/>
+          <w:szCs w:val="24"/>
+          <w:rtl/>
+          <w:lang w:bidi="fa-IR"/>
+        </w:rPr>
+      </w:pPr>
+      <w:r>
+        <w:rPr>
+          <w:rFonts w:cs="B Nazanin"/>
+          <w:sz w:val="24"/>
+          <w:szCs w:val="24"/>
+          <w:lang w:bidi="fa-IR"/>
+        </w:rPr>
+        <w:t xml:space="preserve">Specification Pattern </w:t>
+      </w:r>
+      <w:r>
+        <w:rPr>
+          <w:rFonts w:cs="B Nazanin"/>
+          <w:sz w:val="24"/>
+          <w:szCs w:val="24"/>
+          <w:rtl/>
+        </w:rPr>
+        <w:t>یعنی شرطِ اینکه «چه داده‌ای می‌خواهم؟» را از</w:t>
+      </w:r>
+      <w:r>
+        <w:rPr>
+          <w:rFonts w:cs="B Nazanin"/>
+          <w:sz w:val="24"/>
+          <w:szCs w:val="24"/>
+          <w:lang w:bidi="fa-IR"/>
+        </w:rPr>
+        <w:t xml:space="preserve"> Repository </w:t>
+      </w:r>
+      <w:r>
+        <w:rPr>
+          <w:rFonts w:cs="B Nazanin"/>
+          <w:sz w:val="24"/>
+          <w:szCs w:val="24"/>
+          <w:rtl/>
+        </w:rPr>
+        <w:t>جدا کنیم و داخل یک کلاس</w:t>
+      </w:r>
+      <w:r>
+        <w:rPr>
+          <w:rFonts w:cs="B Nazanin"/>
+          <w:sz w:val="24"/>
+          <w:szCs w:val="24"/>
+          <w:lang w:bidi="fa-IR"/>
+        </w:rPr>
+        <w:t xml:space="preserve"> Specification </w:t>
+      </w:r>
+      <w:r>
+        <w:rPr>
+          <w:rFonts w:cs="B Nazanin"/>
+          <w:sz w:val="24"/>
+          <w:szCs w:val="24"/>
+          <w:rtl/>
+        </w:rPr>
+        <w:t>قرار دهیم</w:t>
+      </w:r>
+      <w:r>
+        <w:rPr>
+          <w:rFonts w:cs="B Nazanin"/>
+          <w:sz w:val="24"/>
+          <w:szCs w:val="24"/>
+          <w:lang w:bidi="fa-IR"/>
+        </w:rPr>
+        <w:t>.</w:t>
+      </w:r>
+    </w:p>
+    <w:p>
+      <w:pPr>
+        <w:bidi/>
+        <w:rPr>
+          <w:rFonts w:cs="B Nazanin"/>
+          <w:sz w:val="24"/>
+          <w:szCs w:val="24"/>
+          <w:lang w:bidi="fa-IR"/>
+        </w:rPr>
+      </w:pPr>
+      <w:r>
+        <w:rPr>
+          <w:rFonts w:cs="B Nazanin" w:hint="cs"/>
+          <w:sz w:val="24"/>
+          <w:szCs w:val="24"/>
+          <w:rtl/>
+          <w:lang w:bidi="fa-IR"/>
+        </w:rPr>
+        <w:t xml:space="preserve"> برای آشنا شدن با این الگو باید با یک سری پیش زمینه ها آشنا شویم </w:t>
+      </w:r>
+      <w:r>
+        <w:rPr>
+          <w:rFonts w:cs="B Nazanin" w:hint="cs"/>
+          <w:sz w:val="24"/>
+          <w:szCs w:val="24"/>
+          <w:rtl/>
+          <w:lang w:bidi="fa-IR"/>
+        </w:rPr>
+        <w:t xml:space="preserve">. </w:t>
       </w:r>
     </w:p>
     <w:p>
@@ -11515,7 +11622,7 @@
     <w:p>
       <w:pPr>
         <w:rPr>
-          <w:rFonts w:cs="B Nazanin" w:hint="cs"/>
+          <w:rFonts w:cs="B Nazanin"/>
           <w:sz w:val="24"/>
           <w:szCs w:val="24"/>
           <w:lang w:bidi="fa-IR"/>
@@ -11964,7 +12071,7 @@
       <w:pPr>
         <w:bidi/>
         <w:rPr>
-          <w:rFonts w:cs="B Nazanin" w:hint="cs"/>
+          <w:rFonts w:cs="B Nazanin"/>
           <w:sz w:val="24"/>
           <w:szCs w:val="24"/>
           <w:rtl/>
@@ -12316,6 +12423,7 @@
         <w:rPr>
           <w:noProof/>
         </w:rPr>
+        <w:lastRenderedPageBreak/>
         <w:drawing>
           <wp:inline distT="0" distB="0" distL="0" distR="0" wp14:anchorId="61374A00" wp14:editId="02107822">
             <wp:extent cx="5943600" cy="4927600"/>
@@ -12830,6 +12938,808 @@
     <w:p>
       <w:pPr>
         <w:bidi/>
+        <w:ind w:left="360"/>
+        <w:rPr>
+          <w:rFonts w:cs="B Nazanin"/>
+          <w:sz w:val="24"/>
+          <w:szCs w:val="24"/>
+          <w:lang w:bidi="fa-IR"/>
+        </w:rPr>
+      </w:pPr>
+    </w:p>
+    <w:p>
+      <w:pPr>
+        <w:bidi/>
+        <w:ind w:left="360"/>
+        <w:rPr>
+          <w:rFonts w:cs="B Nazanin"/>
+          <w:sz w:val="24"/>
+          <w:szCs w:val="24"/>
+          <w:lang w:bidi="fa-IR"/>
+        </w:rPr>
+      </w:pPr>
+    </w:p>
+    <w:p>
+      <w:pPr>
+        <w:bidi/>
+        <w:ind w:left="360"/>
+        <w:rPr>
+          <w:rFonts w:cs="B Nazanin"/>
+          <w:sz w:val="24"/>
+          <w:szCs w:val="24"/>
+          <w:lang w:bidi="fa-IR"/>
+        </w:rPr>
+      </w:pPr>
+    </w:p>
+    <w:p>
+      <w:pPr>
+        <w:bidi/>
+        <w:ind w:left="360"/>
+        <w:rPr>
+          <w:rFonts w:cs="B Nazanin"/>
+          <w:sz w:val="24"/>
+          <w:szCs w:val="24"/>
+          <w:lang w:bidi="fa-IR"/>
+        </w:rPr>
+      </w:pPr>
+    </w:p>
+    <w:p>
+      <w:pPr>
+        <w:bidi/>
+        <w:ind w:left="360"/>
+        <w:rPr>
+          <w:rFonts w:cs="B Nazanin"/>
+          <w:sz w:val="24"/>
+          <w:szCs w:val="24"/>
+          <w:lang w:bidi="fa-IR"/>
+        </w:rPr>
+      </w:pPr>
+    </w:p>
+    <w:p>
+      <w:pPr>
+        <w:bidi/>
+        <w:ind w:left="360"/>
+        <w:rPr>
+          <w:rFonts w:cs="B Nazanin"/>
+          <w:sz w:val="24"/>
+          <w:szCs w:val="24"/>
+          <w:lang w:bidi="fa-IR"/>
+        </w:rPr>
+      </w:pPr>
+    </w:p>
+    <w:p>
+      <w:pPr>
+        <w:bidi/>
+        <w:ind w:left="360"/>
+        <w:rPr>
+          <w:rFonts w:cs="B Nazanin"/>
+          <w:sz w:val="24"/>
+          <w:szCs w:val="24"/>
+          <w:lang w:bidi="fa-IR"/>
+        </w:rPr>
+      </w:pPr>
+    </w:p>
+    <w:p>
+      <w:pPr>
+        <w:bidi/>
+        <w:ind w:left="360"/>
+        <w:rPr>
+          <w:rFonts w:cs="B Nazanin"/>
+          <w:sz w:val="24"/>
+          <w:szCs w:val="24"/>
+          <w:rtl/>
+          <w:lang w:bidi="fa-IR"/>
+        </w:rPr>
+      </w:pPr>
+    </w:p>
+    <w:p>
+      <w:pPr>
+        <w:pStyle w:val="ListParagraph"/>
+        <w:numPr>
+          <w:ilvl w:val="0"/>
+          <w:numId w:val="1"/>
+        </w:numPr>
+        <w:bidi/>
+        <w:rPr>
+          <w:rFonts w:cs="B Nazanin"/>
+          <w:sz w:val="24"/>
+          <w:szCs w:val="24"/>
+          <w:lang w:bidi="fa-IR"/>
+        </w:rPr>
+      </w:pPr>
+      <w:r>
+        <w:rPr>
+          <w:rFonts w:cs="B Nazanin" w:hint="cs"/>
+          <w:sz w:val="24"/>
+          <w:szCs w:val="24"/>
+          <w:rtl/>
+          <w:lang w:bidi="fa-IR"/>
+        </w:rPr>
+        <w:t xml:space="preserve">در کل عبارت دو نقطه یا  : چه کاربرد </w:t>
+      </w:r>
+      <w:proofErr w:type="spellStart"/>
+      <w:r>
+        <w:rPr>
+          <w:rFonts w:cs="B Nazanin" w:hint="cs"/>
+          <w:sz w:val="24"/>
+          <w:szCs w:val="24"/>
+          <w:rtl/>
+          <w:lang w:bidi="fa-IR"/>
+        </w:rPr>
+        <w:t>هایی</w:t>
+      </w:r>
+      <w:proofErr w:type="spellEnd"/>
+      <w:r>
+        <w:rPr>
+          <w:rFonts w:cs="B Nazanin" w:hint="cs"/>
+          <w:sz w:val="24"/>
+          <w:szCs w:val="24"/>
+          <w:rtl/>
+          <w:lang w:bidi="fa-IR"/>
+        </w:rPr>
+        <w:t xml:space="preserve"> در </w:t>
+      </w:r>
+      <w:r>
+        <w:rPr>
+          <w:rFonts w:cs="B Nazanin"/>
+          <w:sz w:val="24"/>
+          <w:szCs w:val="24"/>
+          <w:lang w:bidi="fa-IR"/>
+        </w:rPr>
+        <w:t>C#</w:t>
+      </w:r>
+      <w:r>
+        <w:rPr>
+          <w:rFonts w:cs="B Nazanin" w:hint="cs"/>
+          <w:sz w:val="24"/>
+          <w:szCs w:val="24"/>
+          <w:rtl/>
+          <w:lang w:bidi="fa-IR"/>
+        </w:rPr>
+        <w:t xml:space="preserve"> دارد ؟</w:t>
+      </w:r>
+      <w:r>
+        <w:rPr>
+          <w:rFonts w:cs="B Nazanin" w:hint="cs"/>
+          <w:sz w:val="24"/>
+          <w:szCs w:val="24"/>
+          <w:rtl/>
+          <w:lang w:bidi="fa-IR"/>
+        </w:rPr>
+        <w:t xml:space="preserve"> در کل این عبارت 4 کاربرد دارد :</w:t>
+      </w:r>
+    </w:p>
+    <w:p>
+      <w:pPr>
+        <w:bidi/>
+        <w:rPr>
+          <w:rFonts w:cs="B Nazanin"/>
+          <w:sz w:val="24"/>
+          <w:szCs w:val="24"/>
+          <w:lang w:bidi="fa-IR"/>
+        </w:rPr>
+      </w:pPr>
+    </w:p>
+    <w:p>
+      <w:pPr>
+        <w:pStyle w:val="ListParagraph"/>
+        <w:numPr>
+          <w:ilvl w:val="2"/>
+          <w:numId w:val="7"/>
+        </w:numPr>
+        <w:bidi/>
+        <w:rPr>
+          <w:rFonts w:cs="B Nazanin"/>
+          <w:sz w:val="24"/>
+          <w:szCs w:val="24"/>
+          <w:lang w:bidi="fa-IR"/>
+        </w:rPr>
+      </w:pPr>
+      <w:proofErr w:type="spellStart"/>
+      <w:r>
+        <w:rPr>
+          <w:rFonts w:cs="B Nazanin"/>
+          <w:sz w:val="24"/>
+          <w:szCs w:val="24"/>
+          <w:rtl/>
+          <w:lang w:bidi="fa-IR"/>
+        </w:rPr>
+        <w:t>ارث‌بری</w:t>
+      </w:r>
+      <w:proofErr w:type="spellEnd"/>
+      <w:r>
+        <w:rPr>
+          <w:rFonts w:cs="B Nazanin"/>
+          <w:sz w:val="24"/>
+          <w:szCs w:val="24"/>
+          <w:rtl/>
+          <w:lang w:bidi="fa-IR"/>
+        </w:rPr>
+        <w:t xml:space="preserve"> از کلاس </w:t>
+      </w:r>
+    </w:p>
+    <w:p>
+      <w:pPr>
+        <w:bidi/>
+        <w:ind w:left="360"/>
+        <w:jc w:val="right"/>
+        <w:rPr>
+          <w:rFonts w:cs="B Nazanin"/>
+          <w:sz w:val="24"/>
+          <w:szCs w:val="24"/>
+          <w:lang w:bidi="fa-IR"/>
+        </w:rPr>
+      </w:pPr>
+      <w:r>
+        <w:rPr>
+          <w:rFonts w:cs="B Nazanin"/>
+          <w:sz w:val="24"/>
+          <w:szCs w:val="24"/>
+          <w:lang w:bidi="fa-IR"/>
+        </w:rPr>
+        <w:t>class Dog : Animal</w:t>
+      </w:r>
+      <w:r>
+        <w:rPr>
+          <w:rFonts w:cs="B Nazanin"/>
+          <w:sz w:val="24"/>
+          <w:szCs w:val="24"/>
+          <w:lang w:bidi="fa-IR"/>
+        </w:rPr>
+        <w:tab/>
+      </w:r>
+    </w:p>
+    <w:p>
+      <w:pPr>
+        <w:bidi/>
+        <w:ind w:left="360"/>
+        <w:rPr>
+          <w:rFonts w:cs="B Nazanin"/>
+          <w:sz w:val="24"/>
+          <w:szCs w:val="24"/>
+          <w:lang w:bidi="fa-IR"/>
+        </w:rPr>
+      </w:pPr>
+      <w:r>
+        <w:rPr>
+          <w:rFonts w:cs="B Nazanin"/>
+          <w:sz w:val="24"/>
+          <w:szCs w:val="24"/>
+          <w:rtl/>
+          <w:lang w:bidi="fa-IR"/>
+        </w:rPr>
+        <w:t xml:space="preserve">یعنی </w:t>
+      </w:r>
+      <w:r>
+        <w:rPr>
+          <w:rFonts w:cs="B Nazanin"/>
+          <w:sz w:val="24"/>
+          <w:szCs w:val="24"/>
+          <w:lang w:bidi="fa-IR"/>
+        </w:rPr>
+        <w:t xml:space="preserve">Dog </w:t>
+      </w:r>
+      <w:r>
+        <w:rPr>
+          <w:rFonts w:cs="B Nazanin"/>
+          <w:sz w:val="24"/>
+          <w:szCs w:val="24"/>
+          <w:rtl/>
+          <w:lang w:bidi="fa-IR"/>
+        </w:rPr>
+        <w:t xml:space="preserve">از </w:t>
+      </w:r>
+      <w:r>
+        <w:rPr>
+          <w:rFonts w:cs="B Nazanin"/>
+          <w:sz w:val="24"/>
+          <w:szCs w:val="24"/>
+          <w:lang w:bidi="fa-IR"/>
+        </w:rPr>
+        <w:t xml:space="preserve">Animal </w:t>
+      </w:r>
+      <w:r>
+        <w:rPr>
+          <w:rFonts w:cs="B Nazanin"/>
+          <w:sz w:val="24"/>
+          <w:szCs w:val="24"/>
+          <w:rtl/>
+          <w:lang w:bidi="fa-IR"/>
+        </w:rPr>
+        <w:t>ارث می‌برد</w:t>
+      </w:r>
+      <w:r>
+        <w:rPr>
+          <w:rFonts w:cs="B Nazanin"/>
+          <w:sz w:val="24"/>
+          <w:szCs w:val="24"/>
+          <w:lang w:bidi="fa-IR"/>
+        </w:rPr>
+        <w:t>.</w:t>
+      </w:r>
+    </w:p>
+    <w:p>
+      <w:pPr>
+        <w:bidi/>
+        <w:ind w:left="360"/>
+        <w:rPr>
+          <w:rFonts w:cs="B Nazanin"/>
+          <w:sz w:val="24"/>
+          <w:szCs w:val="24"/>
+          <w:lang w:bidi="fa-IR"/>
+        </w:rPr>
+      </w:pPr>
+      <w:r>
+        <w:rPr>
+          <w:rFonts w:cs="B Nazanin"/>
+          <w:sz w:val="24"/>
+          <w:szCs w:val="24"/>
+          <w:lang w:bidi="fa-IR"/>
+        </w:rPr>
+        <w:t xml:space="preserve"> (ii      </w:t>
+      </w:r>
+      <w:proofErr w:type="spellStart"/>
+      <w:r>
+        <w:rPr>
+          <w:rFonts w:cs="B Nazanin"/>
+          <w:sz w:val="24"/>
+          <w:szCs w:val="24"/>
+          <w:rtl/>
+          <w:lang w:bidi="fa-IR"/>
+        </w:rPr>
+        <w:t>پیاده‌سازی</w:t>
+      </w:r>
+      <w:proofErr w:type="spellEnd"/>
+      <w:r>
+        <w:rPr>
+          <w:rFonts w:cs="B Nazanin"/>
+          <w:sz w:val="24"/>
+          <w:szCs w:val="24"/>
+          <w:lang w:bidi="fa-IR"/>
+        </w:rPr>
+        <w:t xml:space="preserve"> Interface </w:t>
+      </w:r>
+    </w:p>
+    <w:p>
+      <w:pPr>
+        <w:rPr>
+          <w:rFonts w:cs="B Nazanin"/>
+          <w:sz w:val="24"/>
+          <w:szCs w:val="24"/>
+          <w:lang w:bidi="fa-IR"/>
+        </w:rPr>
+      </w:pPr>
+      <w:r>
+        <w:rPr>
+          <w:rFonts w:cs="B Nazanin"/>
+          <w:sz w:val="24"/>
+          <w:szCs w:val="24"/>
+          <w:lang w:bidi="fa-IR"/>
+        </w:rPr>
+        <w:t xml:space="preserve">class Product : </w:t>
+      </w:r>
+      <w:proofErr w:type="spellStart"/>
+      <w:r>
+        <w:rPr>
+          <w:rFonts w:cs="B Nazanin"/>
+          <w:sz w:val="24"/>
+          <w:szCs w:val="24"/>
+          <w:lang w:bidi="fa-IR"/>
+        </w:rPr>
+        <w:t>IProduct</w:t>
+      </w:r>
+      <w:proofErr w:type="spellEnd"/>
+    </w:p>
+    <w:p>
+      <w:pPr>
+        <w:bidi/>
+        <w:ind w:left="360"/>
+        <w:rPr>
+          <w:rFonts w:cs="B Nazanin"/>
+          <w:sz w:val="24"/>
+          <w:szCs w:val="24"/>
+          <w:lang w:bidi="fa-IR"/>
+        </w:rPr>
+      </w:pPr>
+      <w:r>
+        <w:rPr>
+          <w:rFonts w:cs="B Nazanin"/>
+          <w:sz w:val="24"/>
+          <w:szCs w:val="24"/>
+          <w:rtl/>
+          <w:lang w:bidi="fa-IR"/>
+        </w:rPr>
+        <w:t xml:space="preserve">یعنی </w:t>
+      </w:r>
+      <w:r>
+        <w:rPr>
+          <w:rFonts w:cs="B Nazanin"/>
+          <w:sz w:val="24"/>
+          <w:szCs w:val="24"/>
+          <w:lang w:bidi="fa-IR"/>
+        </w:rPr>
+        <w:t>Product</w:t>
+      </w:r>
+      <w:r>
+        <w:rPr>
+          <w:rFonts w:cs="B Nazanin"/>
+          <w:sz w:val="24"/>
+          <w:szCs w:val="24"/>
+          <w:rtl/>
+          <w:lang w:bidi="fa-IR"/>
+        </w:rPr>
+        <w:t xml:space="preserve">، </w:t>
+      </w:r>
+      <w:proofErr w:type="spellStart"/>
+      <w:r>
+        <w:rPr>
+          <w:rFonts w:cs="B Nazanin"/>
+          <w:sz w:val="24"/>
+          <w:szCs w:val="24"/>
+          <w:lang w:bidi="fa-IR"/>
+        </w:rPr>
+        <w:t>IProduct</w:t>
+      </w:r>
+      <w:proofErr w:type="spellEnd"/>
+      <w:r>
+        <w:rPr>
+          <w:rFonts w:cs="B Nazanin"/>
+          <w:sz w:val="24"/>
+          <w:szCs w:val="24"/>
+          <w:lang w:bidi="fa-IR"/>
+        </w:rPr>
+        <w:t xml:space="preserve"> </w:t>
+      </w:r>
+      <w:r>
+        <w:rPr>
+          <w:rFonts w:cs="B Nazanin"/>
+          <w:sz w:val="24"/>
+          <w:szCs w:val="24"/>
+          <w:rtl/>
+          <w:lang w:bidi="fa-IR"/>
+        </w:rPr>
+        <w:t xml:space="preserve">را </w:t>
+      </w:r>
+      <w:proofErr w:type="spellStart"/>
+      <w:r>
+        <w:rPr>
+          <w:rFonts w:cs="B Nazanin"/>
+          <w:sz w:val="24"/>
+          <w:szCs w:val="24"/>
+          <w:rtl/>
+          <w:lang w:bidi="fa-IR"/>
+        </w:rPr>
+        <w:t>پیاده‌سازی</w:t>
+      </w:r>
+      <w:proofErr w:type="spellEnd"/>
+      <w:r>
+        <w:rPr>
+          <w:rFonts w:cs="B Nazanin"/>
+          <w:sz w:val="24"/>
+          <w:szCs w:val="24"/>
+          <w:rtl/>
+          <w:lang w:bidi="fa-IR"/>
+        </w:rPr>
+        <w:t xml:space="preserve"> </w:t>
+      </w:r>
+      <w:proofErr w:type="spellStart"/>
+      <w:r>
+        <w:rPr>
+          <w:rFonts w:cs="B Nazanin"/>
+          <w:sz w:val="24"/>
+          <w:szCs w:val="24"/>
+          <w:rtl/>
+          <w:lang w:bidi="fa-IR"/>
+        </w:rPr>
+        <w:t>می‌کند</w:t>
+      </w:r>
+      <w:proofErr w:type="spellEnd"/>
+      <w:r>
+        <w:rPr>
+          <w:rFonts w:cs="B Nazanin"/>
+          <w:sz w:val="24"/>
+          <w:szCs w:val="24"/>
+          <w:lang w:bidi="fa-IR"/>
+        </w:rPr>
+        <w:t>.</w:t>
+      </w:r>
+    </w:p>
+    <w:p>
+      <w:pPr>
+        <w:bidi/>
+        <w:ind w:left="360"/>
+        <w:rPr>
+          <w:rFonts w:cs="B Nazanin"/>
+          <w:sz w:val="24"/>
+          <w:szCs w:val="24"/>
+          <w:lang w:bidi="fa-IR"/>
+        </w:rPr>
+      </w:pPr>
+      <w:r>
+        <w:rPr>
+          <w:rFonts w:cs="B Nazanin" w:hint="cs"/>
+          <w:sz w:val="24"/>
+          <w:szCs w:val="24"/>
+          <w:rtl/>
+          <w:lang w:bidi="fa-IR"/>
+        </w:rPr>
+        <w:t xml:space="preserve">      </w:t>
+      </w:r>
+      <w:r>
+        <w:rPr>
+          <w:rFonts w:cs="B Nazanin"/>
+          <w:sz w:val="24"/>
+          <w:szCs w:val="24"/>
+          <w:lang w:bidi="fa-IR"/>
+        </w:rPr>
+        <w:t>(iii</w:t>
+      </w:r>
+      <w:r>
+        <w:rPr>
+          <w:rFonts w:cs="B Nazanin"/>
+          <w:sz w:val="24"/>
+          <w:szCs w:val="24"/>
+          <w:rtl/>
+          <w:lang w:bidi="fa-IR"/>
+        </w:rPr>
+        <w:t>صدا زدن</w:t>
+      </w:r>
+      <w:r>
+        <w:rPr>
+          <w:rFonts w:cs="B Nazanin"/>
+          <w:sz w:val="24"/>
+          <w:szCs w:val="24"/>
+          <w:lang w:bidi="fa-IR"/>
+        </w:rPr>
+        <w:t xml:space="preserve"> Constructor </w:t>
+      </w:r>
+      <w:r>
+        <w:rPr>
+          <w:rFonts w:cs="B Nazanin"/>
+          <w:sz w:val="24"/>
+          <w:szCs w:val="24"/>
+          <w:rtl/>
+          <w:lang w:bidi="fa-IR"/>
+        </w:rPr>
+        <w:t xml:space="preserve">پدر </w:t>
+      </w:r>
+    </w:p>
+    <w:p>
+      <w:pPr>
+        <w:bidi/>
+        <w:ind w:left="360"/>
+        <w:jc w:val="right"/>
+        <w:rPr>
+          <w:rFonts w:cs="B Nazanin"/>
+          <w:sz w:val="24"/>
+          <w:szCs w:val="24"/>
+          <w:lang w:bidi="fa-IR"/>
+        </w:rPr>
+      </w:pPr>
+      <w:r>
+        <w:rPr>
+          <w:rFonts w:cs="B Nazanin"/>
+          <w:sz w:val="24"/>
+          <w:szCs w:val="24"/>
+          <w:lang w:bidi="fa-IR"/>
+        </w:rPr>
+        <w:lastRenderedPageBreak/>
+        <w:t>Product() : base(...)</w:t>
+      </w:r>
+    </w:p>
+    <w:p>
+      <w:pPr>
+        <w:bidi/>
+        <w:ind w:left="360"/>
+        <w:rPr>
+          <w:rFonts w:cs="B Nazanin"/>
+          <w:sz w:val="24"/>
+          <w:szCs w:val="24"/>
+          <w:lang w:bidi="fa-IR"/>
+        </w:rPr>
+      </w:pPr>
+      <w:r>
+        <w:rPr>
+          <w:rFonts w:cs="B Nazanin"/>
+          <w:sz w:val="24"/>
+          <w:szCs w:val="24"/>
+          <w:rtl/>
+          <w:lang w:bidi="fa-IR"/>
+        </w:rPr>
+        <w:t>یعنی</w:t>
+      </w:r>
+      <w:r>
+        <w:rPr>
+          <w:rFonts w:cs="B Nazanin"/>
+          <w:sz w:val="24"/>
+          <w:szCs w:val="24"/>
+          <w:lang w:bidi="fa-IR"/>
+        </w:rPr>
+        <w:t xml:space="preserve"> Constructor </w:t>
+      </w:r>
+      <w:r>
+        <w:rPr>
+          <w:rFonts w:cs="B Nazanin"/>
+          <w:sz w:val="24"/>
+          <w:szCs w:val="24"/>
+          <w:rtl/>
+          <w:lang w:bidi="fa-IR"/>
+        </w:rPr>
+        <w:t>کلاس پدر را صدا بزن</w:t>
+      </w:r>
+      <w:r>
+        <w:rPr>
+          <w:rFonts w:cs="B Nazanin"/>
+          <w:sz w:val="24"/>
+          <w:szCs w:val="24"/>
+          <w:lang w:bidi="fa-IR"/>
+        </w:rPr>
+        <w:t>.</w:t>
+      </w:r>
+    </w:p>
+    <w:p>
+      <w:pPr>
+        <w:bidi/>
+        <w:ind w:left="360"/>
+        <w:rPr>
+          <w:rFonts w:cs="B Nazanin"/>
+          <w:sz w:val="24"/>
+          <w:szCs w:val="24"/>
+          <w:lang w:bidi="fa-IR"/>
+        </w:rPr>
+      </w:pPr>
+      <w:r>
+        <w:rPr>
+          <w:rFonts w:cs="B Nazanin" w:hint="cs"/>
+          <w:sz w:val="24"/>
+          <w:szCs w:val="24"/>
+          <w:rtl/>
+          <w:lang w:bidi="fa-IR"/>
+        </w:rPr>
+        <w:t xml:space="preserve"> </w:t>
+      </w:r>
+      <w:r>
+        <w:rPr>
+          <w:rFonts w:cs="B Nazanin"/>
+          <w:sz w:val="24"/>
+          <w:szCs w:val="24"/>
+          <w:lang w:bidi="fa-IR"/>
+        </w:rPr>
+        <w:t xml:space="preserve"> (</w:t>
+      </w:r>
+      <w:r>
+        <w:rPr>
+          <w:rFonts w:cs="B Nazanin"/>
+          <w:sz w:val="24"/>
+          <w:szCs w:val="24"/>
+          <w:lang w:bidi="fa-IR"/>
+        </w:rPr>
+        <w:t>iv</w:t>
+      </w:r>
+      <w:r>
+        <w:rPr>
+          <w:rFonts w:cs="B Nazanin"/>
+          <w:sz w:val="24"/>
+          <w:szCs w:val="24"/>
+          <w:rtl/>
+          <w:lang w:bidi="fa-IR"/>
+        </w:rPr>
+        <w:t xml:space="preserve"> زدن</w:t>
+      </w:r>
+      <w:r>
+        <w:rPr>
+          <w:rFonts w:cs="B Nazanin"/>
+          <w:sz w:val="24"/>
+          <w:szCs w:val="24"/>
+          <w:lang w:bidi="fa-IR"/>
+        </w:rPr>
+        <w:t xml:space="preserve"> Constructor </w:t>
+      </w:r>
+      <w:r>
+        <w:rPr>
+          <w:rFonts w:cs="B Nazanin"/>
+          <w:sz w:val="24"/>
+          <w:szCs w:val="24"/>
+          <w:rtl/>
+          <w:lang w:bidi="fa-IR"/>
+        </w:rPr>
+        <w:t xml:space="preserve">دیگر همین کلاس </w:t>
+      </w:r>
+    </w:p>
+    <w:p>
+      <w:pPr>
+        <w:bidi/>
+        <w:ind w:left="360"/>
+        <w:jc w:val="right"/>
+        <w:rPr>
+          <w:rFonts w:cs="B Nazanin"/>
+          <w:sz w:val="24"/>
+          <w:szCs w:val="24"/>
+          <w:lang w:bidi="fa-IR"/>
+        </w:rPr>
+      </w:pPr>
+      <w:r>
+        <w:rPr>
+          <w:rFonts w:cs="B Nazanin"/>
+          <w:sz w:val="24"/>
+          <w:szCs w:val="24"/>
+          <w:lang w:bidi="fa-IR"/>
+        </w:rPr>
+        <w:t>Product() : this(...)</w:t>
+      </w:r>
+    </w:p>
+    <w:p>
+      <w:pPr>
+        <w:bidi/>
+        <w:rPr>
+          <w:rFonts w:cs="B Nazanin"/>
+          <w:sz w:val="24"/>
+          <w:szCs w:val="24"/>
+          <w:lang w:bidi="fa-IR"/>
+        </w:rPr>
+      </w:pPr>
+      <w:r>
+        <w:rPr>
+          <w:rFonts w:cs="B Nazanin"/>
+          <w:sz w:val="24"/>
+          <w:szCs w:val="24"/>
+          <w:lang w:bidi="fa-IR"/>
+        </w:rPr>
+        <w:t xml:space="preserve">   </w:t>
+      </w:r>
+      <w:r>
+        <w:rPr>
+          <w:rFonts w:cs="B Nazanin"/>
+          <w:sz w:val="24"/>
+          <w:szCs w:val="24"/>
+          <w:rtl/>
+          <w:lang w:bidi="fa-IR"/>
+        </w:rPr>
+        <w:t>یعنی</w:t>
+      </w:r>
+      <w:r>
+        <w:rPr>
+          <w:rFonts w:cs="B Nazanin"/>
+          <w:sz w:val="24"/>
+          <w:szCs w:val="24"/>
+          <w:lang w:bidi="fa-IR"/>
+        </w:rPr>
+        <w:t xml:space="preserve"> Constructor </w:t>
+      </w:r>
+      <w:r>
+        <w:rPr>
+          <w:rFonts w:cs="B Nazanin"/>
+          <w:sz w:val="24"/>
+          <w:szCs w:val="24"/>
+          <w:rtl/>
+          <w:lang w:bidi="fa-IR"/>
+        </w:rPr>
+        <w:t>دیگری از همین کلاس را صدا بزن</w:t>
+      </w:r>
+      <w:r>
+        <w:rPr>
+          <w:rFonts w:cs="B Nazanin"/>
+          <w:sz w:val="24"/>
+          <w:szCs w:val="24"/>
+          <w:lang w:bidi="fa-IR"/>
+        </w:rPr>
+        <w:t>.</w:t>
+      </w:r>
+    </w:p>
+    <w:p>
+      <w:pPr>
+        <w:bidi/>
+        <w:rPr>
+          <w:rFonts w:cs="B Nazanin"/>
+          <w:sz w:val="24"/>
+          <w:szCs w:val="24"/>
+          <w:lang w:bidi="fa-IR"/>
+        </w:rPr>
+      </w:pPr>
+    </w:p>
+    <w:p>
+      <w:pPr>
+        <w:bidi/>
         <w:rPr>
           <w:rFonts w:cs="B Nazanin"/>
           <w:sz w:val="24"/>
@@ -12925,6 +13835,232 @@
 <file path=word/numbering.xml><?xml version="1.0" encoding="utf-8"?>
 <w:numbering xmlns:wpc="http://schemas.microsoft.com/office/word/2010/wordprocessingCanvas" xmlns:cx="http://schemas.microsoft.com/office/drawing/2014/chartex" xmlns:cx1="http://schemas.microsoft.com/office/drawing/2015/9/8/chartex" xmlns:cx2="http://schemas.microsoft.com/office/drawing/2015/10/21/chartex" xmlns:cx3="http://schemas.microsoft.com/office/drawing/2016/5/9/chartex" xmlns:cx4="http://schemas.microsoft.com/office/drawing/2016/5/10/chartex" xmlns:cx5="http://schemas.microsoft.com/office/drawing/2016/5/11/chartex" xmlns:cx6="http://schemas.microsoft.com/office/drawing/2016/5/12/chartex" xmlns:cx7="http://schemas.microsoft.com/office/drawing/2016/5/13/chartex" xmlns:cx8="http://schemas.microsoft.com/office/drawing/2016/5/14/chartex" xmlns:mc="http://schemas.openxmlformats.org/markup-compatibility/2006" xmlns:aink="http://schemas.microsoft.com/office/drawing/2016/ink" xmlns:am3d="http://schemas.microsoft.com/office/drawing/2017/model3d" xmlns:o="urn:schemas-microsoft-com:office:office" xmlns:r="http://schemas.openxmlformats.org/officeDocument/2006/relationships" xmlns:m="http://schemas.openxmlformats.org/officeDocument/2006/math" xmlns:v="urn:schemas-microsoft-com:vml" xmlns:wp14="http://schemas.microsoft.com/office/word/2010/wordprocessingDrawing" xmlns:wp="http://schemas.openxmlformats.org/drawingml/2006/wordprocessingDrawing" xmlns:w10="urn:schemas-microsoft-com:office:word" xmlns:w="http://schemas.openxmlformats.org/wordprocessingml/2006/main" xmlns:w14="http://schemas.microsoft.com/office/word/2010/wordml" xmlns:w15="http://schemas.microsoft.com/office/word/2012/wordml" xmlns:w16cex="http://schemas.microsoft.com/office/word/2018/wordml/cex" xmlns:w16cid="http://schemas.microsoft.com/office/word/2016/wordml/cid" xmlns:w16="http://schemas.microsoft.com/office/word/2018/wordml" xmlns:w16sdtdh="http://schemas.microsoft.com/office/word/2020/wordml/sdtdatahash" xmlns:w16se="http://schemas.microsoft.com/office/word/2015/wordml/symex" xmlns:wpg="http://schemas.microsoft.com/office/word/2010/wordprocessingGroup" xmlns:wpi="http://schemas.microsoft.com/office/word/2010/wordprocessingInk" xmlns:wne="http://schemas.microsoft.com/office/word/2006/wordml" xmlns:wps="http://schemas.microsoft.com/office/word/2010/wordprocessingShape" mc:Ignorable="w14 w15 w16se w16cid w16 w16cex w16sdtdh wp14">
   <w:abstractNum w:abstractNumId="0" w15:restartNumberingAfterBreak="0">
+    <w:nsid w:val="0BC701F1"/>
+    <w:multiLevelType w:val="multilevel"/>
+    <w:tmpl w:val="47C0E8CC"/>
+    <w:lvl w:ilvl="0">
+      <w:start w:val="3"/>
+      <w:numFmt w:val="decimal"/>
+      <w:lvlText w:val="%1."/>
+      <w:lvlJc w:val="left"/>
+      <w:pPr>
+        <w:tabs>
+          <w:tab w:val="num" w:pos="720"/>
+        </w:tabs>
+        <w:ind w:left="720" w:hanging="360"/>
+      </w:pPr>
+    </w:lvl>
+    <w:lvl w:ilvl="1" w:tentative="1">
+      <w:start w:val="1"/>
+      <w:numFmt w:val="decimal"/>
+      <w:lvlText w:val="%2."/>
+      <w:lvlJc w:val="left"/>
+      <w:pPr>
+        <w:tabs>
+          <w:tab w:val="num" w:pos="1440"/>
+        </w:tabs>
+        <w:ind w:left="1440" w:hanging="360"/>
+      </w:pPr>
+    </w:lvl>
+    <w:lvl w:ilvl="2" w:tentative="1">
+      <w:start w:val="1"/>
+      <w:numFmt w:val="decimal"/>
+      <w:lvlText w:val="%3."/>
+      <w:lvlJc w:val="left"/>
+      <w:pPr>
+        <w:tabs>
+          <w:tab w:val="num" w:pos="2160"/>
+        </w:tabs>
+        <w:ind w:left="2160" w:hanging="360"/>
+      </w:pPr>
+    </w:lvl>
+    <w:lvl w:ilvl="3" w:tentative="1">
+      <w:start w:val="1"/>
+      <w:numFmt w:val="decimal"/>
+      <w:lvlText w:val="%4."/>
+      <w:lvlJc w:val="left"/>
+      <w:pPr>
+        <w:tabs>
+          <w:tab w:val="num" w:pos="2880"/>
+        </w:tabs>
+        <w:ind w:left="2880" w:hanging="360"/>
+      </w:pPr>
+    </w:lvl>
+    <w:lvl w:ilvl="4" w:tentative="1">
+      <w:start w:val="1"/>
+      <w:numFmt w:val="decimal"/>
+      <w:lvlText w:val="%5."/>
+      <w:lvlJc w:val="left"/>
+      <w:pPr>
+        <w:tabs>
+          <w:tab w:val="num" w:pos="3600"/>
+        </w:tabs>
+        <w:ind w:left="3600" w:hanging="360"/>
+      </w:pPr>
+    </w:lvl>
+    <w:lvl w:ilvl="5" w:tentative="1">
+      <w:start w:val="1"/>
+      <w:numFmt w:val="decimal"/>
+      <w:lvlText w:val="%6."/>
+      <w:lvlJc w:val="left"/>
+      <w:pPr>
+        <w:tabs>
+          <w:tab w:val="num" w:pos="4320"/>
+        </w:tabs>
+        <w:ind w:left="4320" w:hanging="360"/>
+      </w:pPr>
+    </w:lvl>
+    <w:lvl w:ilvl="6" w:tentative="1">
+      <w:start w:val="1"/>
+      <w:numFmt w:val="decimal"/>
+      <w:lvlText w:val="%7."/>
+      <w:lvlJc w:val="left"/>
+      <w:pPr>
+        <w:tabs>
+          <w:tab w:val="num" w:pos="5040"/>
+        </w:tabs>
+        <w:ind w:left="5040" w:hanging="360"/>
+      </w:pPr>
+    </w:lvl>
+    <w:lvl w:ilvl="7" w:tentative="1">
+      <w:start w:val="1"/>
+      <w:numFmt w:val="decimal"/>
+      <w:lvlText w:val="%8."/>
+      <w:lvlJc w:val="left"/>
+      <w:pPr>
+        <w:tabs>
+          <w:tab w:val="num" w:pos="5760"/>
+        </w:tabs>
+        <w:ind w:left="5760" w:hanging="360"/>
+      </w:pPr>
+    </w:lvl>
+    <w:lvl w:ilvl="8" w:tentative="1">
+      <w:start w:val="1"/>
+      <w:numFmt w:val="decimal"/>
+      <w:lvlText w:val="%9."/>
+      <w:lvlJc w:val="left"/>
+      <w:pPr>
+        <w:tabs>
+          <w:tab w:val="num" w:pos="6480"/>
+        </w:tabs>
+        <w:ind w:left="6480" w:hanging="360"/>
+      </w:pPr>
+    </w:lvl>
+  </w:abstractNum>
+  <w:abstractNum w:abstractNumId="1" w15:restartNumberingAfterBreak="0">
+    <w:nsid w:val="245C1995"/>
+    <w:multiLevelType w:val="multilevel"/>
+    <w:tmpl w:val="565EEFA2"/>
+    <w:lvl w:ilvl="0">
+      <w:start w:val="4"/>
+      <w:numFmt w:val="decimal"/>
+      <w:lvlText w:val="%1."/>
+      <w:lvlJc w:val="left"/>
+      <w:pPr>
+        <w:tabs>
+          <w:tab w:val="num" w:pos="720"/>
+        </w:tabs>
+        <w:ind w:left="720" w:hanging="360"/>
+      </w:pPr>
+    </w:lvl>
+    <w:lvl w:ilvl="1" w:tentative="1">
+      <w:start w:val="1"/>
+      <w:numFmt w:val="decimal"/>
+      <w:lvlText w:val="%2."/>
+      <w:lvlJc w:val="left"/>
+      <w:pPr>
+        <w:tabs>
+          <w:tab w:val="num" w:pos="1440"/>
+        </w:tabs>
+        <w:ind w:left="1440" w:hanging="360"/>
+      </w:pPr>
+    </w:lvl>
+    <w:lvl w:ilvl="2" w:tentative="1">
+      <w:start w:val="1"/>
+      <w:numFmt w:val="decimal"/>
+      <w:lvlText w:val="%3."/>
+      <w:lvlJc w:val="left"/>
+      <w:pPr>
+        <w:tabs>
+          <w:tab w:val="num" w:pos="2160"/>
+        </w:tabs>
+        <w:ind w:left="2160" w:hanging="360"/>
+      </w:pPr>
+    </w:lvl>
+    <w:lvl w:ilvl="3" w:tentative="1">
+      <w:start w:val="1"/>
+      <w:numFmt w:val="decimal"/>
+      <w:lvlText w:val="%4."/>
+      <w:lvlJc w:val="left"/>
+      <w:pPr>
+        <w:tabs>
+          <w:tab w:val="num" w:pos="2880"/>
+        </w:tabs>
+        <w:ind w:left="2880" w:hanging="360"/>
+      </w:pPr>
+    </w:lvl>
+    <w:lvl w:ilvl="4" w:tentative="1">
+      <w:start w:val="1"/>
+      <w:numFmt w:val="decimal"/>
+      <w:lvlText w:val="%5."/>
+      <w:lvlJc w:val="left"/>
+      <w:pPr>
+        <w:tabs>
+          <w:tab w:val="num" w:pos="3600"/>
+        </w:tabs>
+        <w:ind w:left="3600" w:hanging="360"/>
+      </w:pPr>
+    </w:lvl>
+    <w:lvl w:ilvl="5" w:tentative="1">
+      <w:start w:val="1"/>
+      <w:numFmt w:val="decimal"/>
+      <w:lvlText w:val="%6."/>
+      <w:lvlJc w:val="left"/>
+      <w:pPr>
+        <w:tabs>
+          <w:tab w:val="num" w:pos="4320"/>
+        </w:tabs>
+        <w:ind w:left="4320" w:hanging="360"/>
+      </w:pPr>
+    </w:lvl>
+    <w:lvl w:ilvl="6" w:tentative="1">
+      <w:start w:val="1"/>
+      <w:numFmt w:val="decimal"/>
+      <w:lvlText w:val="%7."/>
+      <w:lvlJc w:val="left"/>
+      <w:pPr>
+        <w:tabs>
+          <w:tab w:val="num" w:pos="5040"/>
+        </w:tabs>
+        <w:ind w:left="5040" w:hanging="360"/>
+      </w:pPr>
+    </w:lvl>
+    <w:lvl w:ilvl="7" w:tentative="1">
+      <w:start w:val="1"/>
+      <w:numFmt w:val="decimal"/>
+      <w:lvlText w:val="%8."/>
+      <w:lvlJc w:val="left"/>
+      <w:pPr>
+        <w:tabs>
+          <w:tab w:val="num" w:pos="5760"/>
+        </w:tabs>
+        <w:ind w:left="5760" w:hanging="360"/>
+      </w:pPr>
+    </w:lvl>
+    <w:lvl w:ilvl="8" w:tentative="1">
+      <w:start w:val="1"/>
+      <w:numFmt w:val="decimal"/>
+      <w:lvlText w:val="%9."/>
+      <w:lvlJc w:val="left"/>
+      <w:pPr>
+        <w:tabs>
+          <w:tab w:val="num" w:pos="6480"/>
+        </w:tabs>
+        <w:ind w:left="6480" w:hanging="360"/>
+      </w:pPr>
+    </w:lvl>
+  </w:abstractNum>
+  <w:abstractNum w:abstractNumId="2" w15:restartNumberingAfterBreak="0">
     <w:nsid w:val="33C8462F"/>
     <w:multiLevelType w:val="hybridMultilevel"/>
     <w:tmpl w:val="F85A157C"/>
@@ -13013,7 +14149,206 @@
       </w:pPr>
     </w:lvl>
   </w:abstractNum>
-  <w:abstractNum w:abstractNumId="1" w15:restartNumberingAfterBreak="0">
+  <w:abstractNum w:abstractNumId="3" w15:restartNumberingAfterBreak="0">
+    <w:nsid w:val="554D2A37"/>
+    <w:multiLevelType w:val="multilevel"/>
+    <w:tmpl w:val="945C24F2"/>
+    <w:lvl w:ilvl="0">
+      <w:start w:val="1"/>
+      <w:numFmt w:val="decimal"/>
+      <w:lvlText w:val="%1."/>
+      <w:lvlJc w:val="left"/>
+      <w:pPr>
+        <w:tabs>
+          <w:tab w:val="num" w:pos="720"/>
+        </w:tabs>
+        <w:ind w:left="720" w:hanging="360"/>
+      </w:pPr>
+    </w:lvl>
+    <w:lvl w:ilvl="1" w:tentative="1">
+      <w:start w:val="1"/>
+      <w:numFmt w:val="decimal"/>
+      <w:lvlText w:val="%2."/>
+      <w:lvlJc w:val="left"/>
+      <w:pPr>
+        <w:tabs>
+          <w:tab w:val="num" w:pos="1440"/>
+        </w:tabs>
+        <w:ind w:left="1440" w:hanging="360"/>
+      </w:pPr>
+    </w:lvl>
+    <w:lvl w:ilvl="2" w:tentative="1">
+      <w:start w:val="1"/>
+      <w:numFmt w:val="decimal"/>
+      <w:lvlText w:val="%3."/>
+      <w:lvlJc w:val="left"/>
+      <w:pPr>
+        <w:tabs>
+          <w:tab w:val="num" w:pos="2160"/>
+        </w:tabs>
+        <w:ind w:left="2160" w:hanging="360"/>
+      </w:pPr>
+    </w:lvl>
+    <w:lvl w:ilvl="3" w:tentative="1">
+      <w:start w:val="1"/>
+      <w:numFmt w:val="decimal"/>
+      <w:lvlText w:val="%4."/>
+      <w:lvlJc w:val="left"/>
+      <w:pPr>
+        <w:tabs>
+          <w:tab w:val="num" w:pos="2880"/>
+        </w:tabs>
+        <w:ind w:left="2880" w:hanging="360"/>
+      </w:pPr>
+    </w:lvl>
+    <w:lvl w:ilvl="4" w:tentative="1">
+      <w:start w:val="1"/>
+      <w:numFmt w:val="decimal"/>
+      <w:lvlText w:val="%5."/>
+      <w:lvlJc w:val="left"/>
+      <w:pPr>
+        <w:tabs>
+          <w:tab w:val="num" w:pos="3600"/>
+        </w:tabs>
+        <w:ind w:left="3600" w:hanging="360"/>
+      </w:pPr>
+    </w:lvl>
+    <w:lvl w:ilvl="5" w:tentative="1">
+      <w:start w:val="1"/>
+      <w:numFmt w:val="decimal"/>
+      <w:lvlText w:val="%6."/>
+      <w:lvlJc w:val="left"/>
+      <w:pPr>
+        <w:tabs>
+          <w:tab w:val="num" w:pos="4320"/>
+        </w:tabs>
+        <w:ind w:left="4320" w:hanging="360"/>
+      </w:pPr>
+    </w:lvl>
+    <w:lvl w:ilvl="6" w:tentative="1">
+      <w:start w:val="1"/>
+      <w:numFmt w:val="decimal"/>
+      <w:lvlText w:val="%7."/>
+      <w:lvlJc w:val="left"/>
+      <w:pPr>
+        <w:tabs>
+          <w:tab w:val="num" w:pos="5040"/>
+        </w:tabs>
+        <w:ind w:left="5040" w:hanging="360"/>
+      </w:pPr>
+    </w:lvl>
+    <w:lvl w:ilvl="7" w:tentative="1">
+      <w:start w:val="1"/>
+      <w:numFmt w:val="decimal"/>
+      <w:lvlText w:val="%8."/>
+      <w:lvlJc w:val="left"/>
+      <w:pPr>
+        <w:tabs>
+          <w:tab w:val="num" w:pos="5760"/>
+        </w:tabs>
+        <w:ind w:left="5760" w:hanging="360"/>
+      </w:pPr>
+    </w:lvl>
+    <w:lvl w:ilvl="8" w:tentative="1">
+      <w:start w:val="1"/>
+      <w:numFmt w:val="decimal"/>
+      <w:lvlText w:val="%9."/>
+      <w:lvlJc w:val="left"/>
+      <w:pPr>
+        <w:tabs>
+          <w:tab w:val="num" w:pos="6480"/>
+        </w:tabs>
+        <w:ind w:left="6480" w:hanging="360"/>
+      </w:pPr>
+    </w:lvl>
+  </w:abstractNum>
+  <w:abstractNum w:abstractNumId="4" w15:restartNumberingAfterBreak="0">
+    <w:nsid w:val="56F832EC"/>
+    <w:multiLevelType w:val="multilevel"/>
+    <w:tmpl w:val="0409001D"/>
+    <w:lvl w:ilvl="0">
+      <w:start w:val="1"/>
+      <w:numFmt w:val="decimal"/>
+      <w:lvlText w:val="%1)"/>
+      <w:lvlJc w:val="left"/>
+      <w:pPr>
+        <w:ind w:left="360" w:hanging="360"/>
+      </w:pPr>
+    </w:lvl>
+    <w:lvl w:ilvl="1">
+      <w:start w:val="1"/>
+      <w:numFmt w:val="lowerLetter"/>
+      <w:lvlText w:val="%2)"/>
+      <w:lvlJc w:val="left"/>
+      <w:pPr>
+        <w:ind w:left="720" w:hanging="360"/>
+      </w:pPr>
+    </w:lvl>
+    <w:lvl w:ilvl="2">
+      <w:start w:val="1"/>
+      <w:numFmt w:val="lowerRoman"/>
+      <w:lvlText w:val="%3)"/>
+      <w:lvlJc w:val="left"/>
+      <w:pPr>
+        <w:ind w:left="1080" w:hanging="360"/>
+      </w:pPr>
+    </w:lvl>
+    <w:lvl w:ilvl="3">
+      <w:start w:val="1"/>
+      <w:numFmt w:val="decimal"/>
+      <w:lvlText w:val="(%4)"/>
+      <w:lvlJc w:val="left"/>
+      <w:pPr>
+        <w:ind w:left="1440" w:hanging="360"/>
+      </w:pPr>
+    </w:lvl>
+    <w:lvl w:ilvl="4">
+      <w:start w:val="1"/>
+      <w:numFmt w:val="lowerLetter"/>
+      <w:lvlText w:val="(%5)"/>
+      <w:lvlJc w:val="left"/>
+      <w:pPr>
+        <w:ind w:left="1800" w:hanging="360"/>
+      </w:pPr>
+    </w:lvl>
+    <w:lvl w:ilvl="5">
+      <w:start w:val="1"/>
+      <w:numFmt w:val="lowerRoman"/>
+      <w:lvlText w:val="(%6)"/>
+      <w:lvlJc w:val="left"/>
+      <w:pPr>
+        <w:ind w:left="2160" w:hanging="360"/>
+      </w:pPr>
+    </w:lvl>
+    <w:lvl w:ilvl="6">
+      <w:start w:val="1"/>
+      <w:numFmt w:val="decimal"/>
+      <w:lvlText w:val="%7."/>
+      <w:lvlJc w:val="left"/>
+      <w:pPr>
+        <w:ind w:left="2520" w:hanging="360"/>
+      </w:pPr>
+    </w:lvl>
+    <w:lvl w:ilvl="7">
+      <w:start w:val="1"/>
+      <w:numFmt w:val="lowerLetter"/>
+      <w:lvlText w:val="%8."/>
+      <w:lvlJc w:val="left"/>
+      <w:pPr>
+        <w:ind w:left="2880" w:hanging="360"/>
+      </w:pPr>
+    </w:lvl>
+    <w:lvl w:ilvl="8">
+      <w:start w:val="1"/>
+      <w:numFmt w:val="lowerRoman"/>
+      <w:lvlText w:val="%9."/>
+      <w:lvlJc w:val="left"/>
+      <w:pPr>
+        <w:ind w:left="3240" w:hanging="360"/>
+      </w:pPr>
+    </w:lvl>
+  </w:abstractNum>
+  <w:abstractNum w:abstractNumId="5" w15:restartNumberingAfterBreak="0">
     <w:nsid w:val="68901ECE"/>
     <w:multiLevelType w:val="hybridMultilevel"/>
     <w:tmpl w:val="518C031A"/>
@@ -13102,11 +14437,139 @@
       </w:pPr>
     </w:lvl>
   </w:abstractNum>
+  <w:abstractNum w:abstractNumId="6" w15:restartNumberingAfterBreak="0">
+    <w:nsid w:val="792B48E0"/>
+    <w:multiLevelType w:val="multilevel"/>
+    <w:tmpl w:val="0C58ECD8"/>
+    <w:lvl w:ilvl="0">
+      <w:start w:val="2"/>
+      <w:numFmt w:val="decimal"/>
+      <w:lvlText w:val="%1."/>
+      <w:lvlJc w:val="left"/>
+      <w:pPr>
+        <w:tabs>
+          <w:tab w:val="num" w:pos="720"/>
+        </w:tabs>
+        <w:ind w:left="720" w:hanging="360"/>
+      </w:pPr>
+    </w:lvl>
+    <w:lvl w:ilvl="1" w:tentative="1">
+      <w:start w:val="1"/>
+      <w:numFmt w:val="decimal"/>
+      <w:lvlText w:val="%2."/>
+      <w:lvlJc w:val="left"/>
+      <w:pPr>
+        <w:tabs>
+          <w:tab w:val="num" w:pos="1440"/>
+        </w:tabs>
+        <w:ind w:left="1440" w:hanging="360"/>
+      </w:pPr>
+    </w:lvl>
+    <w:lvl w:ilvl="2" w:tentative="1">
+      <w:start w:val="1"/>
+      <w:numFmt w:val="decimal"/>
+      <w:lvlText w:val="%3."/>
+      <w:lvlJc w:val="left"/>
+      <w:pPr>
+        <w:tabs>
+          <w:tab w:val="num" w:pos="2160"/>
+        </w:tabs>
+        <w:ind w:left="2160" w:hanging="360"/>
+      </w:pPr>
+    </w:lvl>
+    <w:lvl w:ilvl="3" w:tentative="1">
+      <w:start w:val="1"/>
+      <w:numFmt w:val="decimal"/>
+      <w:lvlText w:val="%4."/>
+      <w:lvlJc w:val="left"/>
+      <w:pPr>
+        <w:tabs>
+          <w:tab w:val="num" w:pos="2880"/>
+        </w:tabs>
+        <w:ind w:left="2880" w:hanging="360"/>
+      </w:pPr>
+    </w:lvl>
+    <w:lvl w:ilvl="4" w:tentative="1">
+      <w:start w:val="1"/>
+      <w:numFmt w:val="decimal"/>
+      <w:lvlText w:val="%5."/>
+      <w:lvlJc w:val="left"/>
+      <w:pPr>
+        <w:tabs>
+          <w:tab w:val="num" w:pos="3600"/>
+        </w:tabs>
+        <w:ind w:left="3600" w:hanging="360"/>
+      </w:pPr>
+    </w:lvl>
+    <w:lvl w:ilvl="5" w:tentative="1">
+      <w:start w:val="1"/>
+      <w:numFmt w:val="decimal"/>
+      <w:lvlText w:val="%6."/>
+      <w:lvlJc w:val="left"/>
+      <w:pPr>
+        <w:tabs>
+          <w:tab w:val="num" w:pos="4320"/>
+        </w:tabs>
+        <w:ind w:left="4320" w:hanging="360"/>
+      </w:pPr>
+    </w:lvl>
+    <w:lvl w:ilvl="6" w:tentative="1">
+      <w:start w:val="1"/>
+      <w:numFmt w:val="decimal"/>
+      <w:lvlText w:val="%7."/>
+      <w:lvlJc w:val="left"/>
+      <w:pPr>
+        <w:tabs>
+          <w:tab w:val="num" w:pos="5040"/>
+        </w:tabs>
+        <w:ind w:left="5040" w:hanging="360"/>
+      </w:pPr>
+    </w:lvl>
+    <w:lvl w:ilvl="7" w:tentative="1">
+      <w:start w:val="1"/>
+      <w:numFmt w:val="decimal"/>
+      <w:lvlText w:val="%8."/>
+      <w:lvlJc w:val="left"/>
+      <w:pPr>
+        <w:tabs>
+          <w:tab w:val="num" w:pos="5760"/>
+        </w:tabs>
+        <w:ind w:left="5760" w:hanging="360"/>
+      </w:pPr>
+    </w:lvl>
+    <w:lvl w:ilvl="8" w:tentative="1">
+      <w:start w:val="1"/>
+      <w:numFmt w:val="decimal"/>
+      <w:lvlText w:val="%9."/>
+      <w:lvlJc w:val="left"/>
+      <w:pPr>
+        <w:tabs>
+          <w:tab w:val="num" w:pos="6480"/>
+        </w:tabs>
+        <w:ind w:left="6480" w:hanging="360"/>
+      </w:pPr>
+    </w:lvl>
+  </w:abstractNum>
   <w:num w:numId="1">
+    <w:abstractNumId w:val="2"/>
+  </w:num>
+  <w:num w:numId="2">
+    <w:abstractNumId w:val="5"/>
+  </w:num>
+  <w:num w:numId="3">
+    <w:abstractNumId w:val="3"/>
+  </w:num>
+  <w:num w:numId="4">
+    <w:abstractNumId w:val="6"/>
+  </w:num>
+  <w:num w:numId="5">
     <w:abstractNumId w:val="0"/>
   </w:num>
-  <w:num w:numId="2">
+  <w:num w:numId="6">
     <w:abstractNumId w:val="1"/>
+  </w:num>
+  <w:num w:numId="7">
+    <w:abstractNumId w:val="4"/>
   </w:num>
 </w:numbering>
 </file>

</xml_diff>

<commit_message>
Add BuggyContoller For Http Codes
</commit_message>
<xml_diff>
--- a/ECommerce By Neil Cummings.docx
+++ b/ECommerce By Neil Cummings.docx
@@ -230,6 +230,7 @@
         </w:rPr>
         <w:t xml:space="preserve"> ی که داخل </w:t>
       </w:r>
+      <w:proofErr w:type="spellStart"/>
       <w:r>
         <w:rPr>
           <w:rFonts w:cs="B Nazanin"/>
@@ -239,6 +240,7 @@
         </w:rPr>
         <w:t>LaunchSettings</w:t>
       </w:r>
+      <w:proofErr w:type="spellEnd"/>
       <w:r>
         <w:rPr>
           <w:rFonts w:cs="B Nazanin" w:hint="cs"/>
@@ -273,6 +275,7 @@
           <w:lang w:bidi="fa-IR"/>
         </w:rPr>
       </w:pPr>
+      <w:proofErr w:type="spellStart"/>
       <w:r>
         <w:rPr>
           <w:rFonts w:cs="B Nazanin"/>
@@ -284,6 +287,7 @@
         </w:rPr>
         <w:t>Program.cs</w:t>
       </w:r>
+      <w:proofErr w:type="spellEnd"/>
     </w:p>
     <w:p>
       <w:pPr>
@@ -379,20 +383,21 @@
           <w:szCs w:val="24"/>
           <w:lang w:bidi="fa-IR"/>
         </w:rPr>
-        <w:t>var app=builder.Build()</w:t>
-      </w:r>
-      <w:r>
-        <w:rPr>
-          <w:rFonts w:cs="B Nazanin" w:hint="cs"/>
+        <w:t>var app=</w:t>
+      </w:r>
+      <w:proofErr w:type="spellStart"/>
+      <w:r>
+        <w:rPr>
+          <w:rFonts w:cs="B Nazanin"/>
           <w:b/>
           <w:bCs/>
           <w:sz w:val="24"/>
           <w:szCs w:val="24"/>
-          <w:rtl/>
-          <w:lang w:bidi="fa-IR"/>
-        </w:rPr>
-        <w:t xml:space="preserve"> بیاد جزو </w:t>
-      </w:r>
+          <w:lang w:bidi="fa-IR"/>
+        </w:rPr>
+        <w:t>builder.Build</w:t>
+      </w:r>
+      <w:proofErr w:type="spellEnd"/>
       <w:r>
         <w:rPr>
           <w:rFonts w:cs="B Nazanin"/>
@@ -402,7 +407,7 @@
           <w:szCs w:val="24"/>
           <w:lang w:bidi="fa-IR"/>
         </w:rPr>
-        <w:t>Service</w:t>
+        <w:t>()</w:t>
       </w:r>
       <w:r>
         <w:rPr>
@@ -414,7 +419,7 @@
           <w:rtl/>
           <w:lang w:bidi="fa-IR"/>
         </w:rPr>
-        <w:t xml:space="preserve"> و هرچی بعد از آن بیاد </w:t>
+        <w:t xml:space="preserve"> بیاد جزو </w:t>
       </w:r>
       <w:r>
         <w:rPr>
@@ -425,7 +430,7 @@
           <w:szCs w:val="24"/>
           <w:lang w:bidi="fa-IR"/>
         </w:rPr>
-        <w:t>middleware</w:t>
+        <w:t>Service</w:t>
       </w:r>
       <w:r>
         <w:rPr>
@@ -437,6 +442,55 @@
           <w:rtl/>
           <w:lang w:bidi="fa-IR"/>
         </w:rPr>
+        <w:t xml:space="preserve"> و </w:t>
+      </w:r>
+      <w:proofErr w:type="spellStart"/>
+      <w:r>
+        <w:rPr>
+          <w:rFonts w:cs="B Nazanin" w:hint="cs"/>
+          <w:b/>
+          <w:bCs/>
+          <w:sz w:val="24"/>
+          <w:szCs w:val="24"/>
+          <w:rtl/>
+          <w:lang w:bidi="fa-IR"/>
+        </w:rPr>
+        <w:t>هرچی</w:t>
+      </w:r>
+      <w:proofErr w:type="spellEnd"/>
+      <w:r>
+        <w:rPr>
+          <w:rFonts w:cs="B Nazanin" w:hint="cs"/>
+          <w:b/>
+          <w:bCs/>
+          <w:sz w:val="24"/>
+          <w:szCs w:val="24"/>
+          <w:rtl/>
+          <w:lang w:bidi="fa-IR"/>
+        </w:rPr>
+        <w:t xml:space="preserve"> بعد از آن بیاد </w:t>
+      </w:r>
+      <w:r>
+        <w:rPr>
+          <w:rFonts w:cs="B Nazanin"/>
+          <w:b/>
+          <w:bCs/>
+          <w:sz w:val="24"/>
+          <w:szCs w:val="24"/>
+          <w:lang w:bidi="fa-IR"/>
+        </w:rPr>
+        <w:t>middleware</w:t>
+      </w:r>
+      <w:r>
+        <w:rPr>
+          <w:rFonts w:cs="B Nazanin" w:hint="cs"/>
+          <w:b/>
+          <w:bCs/>
+          <w:sz w:val="24"/>
+          <w:szCs w:val="24"/>
+          <w:rtl/>
+          <w:lang w:bidi="fa-IR"/>
+        </w:rPr>
         <w:t xml:space="preserve"> هست .</w:t>
       </w:r>
     </w:p>
@@ -459,7 +513,29 @@
           <w:rtl/>
           <w:lang w:bidi="fa-IR"/>
         </w:rPr>
-        <w:t>سرویس ها چیز هایی هستند که ما در داخل برنامه خود به کلاس های دیگر تزریق می کنیم .</w:t>
+        <w:t xml:space="preserve">سرویس ها چیز </w:t>
+      </w:r>
+      <w:proofErr w:type="spellStart"/>
+      <w:r>
+        <w:rPr>
+          <w:rFonts w:cs="B Nazanin" w:hint="cs"/>
+          <w:sz w:val="24"/>
+          <w:szCs w:val="24"/>
+          <w:rtl/>
+          <w:lang w:bidi="fa-IR"/>
+        </w:rPr>
+        <w:t>هایی</w:t>
+      </w:r>
+      <w:proofErr w:type="spellEnd"/>
+      <w:r>
+        <w:rPr>
+          <w:rFonts w:cs="B Nazanin" w:hint="cs"/>
+          <w:sz w:val="24"/>
+          <w:szCs w:val="24"/>
+          <w:rtl/>
+          <w:lang w:bidi="fa-IR"/>
+        </w:rPr>
+        <w:t xml:space="preserve"> هستند که ما در داخل برنامه خود به کلاس های دیگر تزریق می کنیم .</w:t>
       </w:r>
     </w:p>
     <w:p>
@@ -492,7 +568,23 @@
           <w:rFonts w:cs="B Nazanin"/>
           <w:lang w:bidi="fa-IR"/>
         </w:rPr>
-        <w:t xml:space="preserve"> Program.cs </w:t>
+        <w:t xml:space="preserve"> </w:t>
+      </w:r>
+      <w:proofErr w:type="spellStart"/>
+      <w:r>
+        <w:rPr>
+          <w:rFonts w:cs="B Nazanin"/>
+          <w:lang w:bidi="fa-IR"/>
+        </w:rPr>
+        <w:t>Program.cs</w:t>
+      </w:r>
+      <w:proofErr w:type="spellEnd"/>
+      <w:r>
+        <w:rPr>
+          <w:rFonts w:cs="B Nazanin"/>
+          <w:lang w:bidi="fa-IR"/>
+        </w:rPr>
+        <w:t xml:space="preserve"> </w:t>
       </w:r>
       <w:r>
         <w:rPr>
@@ -681,6 +773,7 @@
           <w:lang w:bidi="fa-IR"/>
         </w:rPr>
       </w:pPr>
+      <w:proofErr w:type="spellStart"/>
       <w:r>
         <w:rPr>
           <w:rFonts w:cs="B Nazanin"/>
@@ -690,6 +783,7 @@
         </w:rPr>
         <w:t>Appsetting.Json</w:t>
       </w:r>
+      <w:proofErr w:type="spellEnd"/>
       <w:r>
         <w:rPr>
           <w:rFonts w:cs="B Nazanin" w:hint="cs"/>
@@ -700,6 +794,7 @@
         </w:rPr>
         <w:t xml:space="preserve"> در همه حالات خوانده میشود ولی </w:t>
       </w:r>
+      <w:proofErr w:type="spellStart"/>
       <w:r>
         <w:rPr>
           <w:rFonts w:cs="B Nazanin"/>
@@ -709,6 +804,7 @@
         </w:rPr>
         <w:t>Appsettings.Development.Json</w:t>
       </w:r>
+      <w:proofErr w:type="spellEnd"/>
       <w:r>
         <w:rPr>
           <w:rFonts w:cs="B Nazanin" w:hint="cs"/>
@@ -1247,7 +1343,27 @@
           <w:szCs w:val="24"/>
           <w:lang w:bidi="fa-IR"/>
         </w:rPr>
-        <w:t xml:space="preserve"> private readonly field </w:t>
+        <w:t xml:space="preserve"> private </w:t>
+      </w:r>
+      <w:proofErr w:type="spellStart"/>
+      <w:r>
+        <w:rPr>
+          <w:rFonts w:cs="B Nazanin"/>
+          <w:sz w:val="24"/>
+          <w:szCs w:val="24"/>
+          <w:lang w:bidi="fa-IR"/>
+        </w:rPr>
+        <w:t>readonly</w:t>
+      </w:r>
+      <w:proofErr w:type="spellEnd"/>
+      <w:r>
+        <w:rPr>
+          <w:rFonts w:cs="B Nazanin"/>
+          <w:sz w:val="24"/>
+          <w:szCs w:val="24"/>
+          <w:lang w:bidi="fa-IR"/>
+        </w:rPr>
+        <w:t xml:space="preserve"> field </w:t>
       </w:r>
       <w:r>
         <w:rPr>
@@ -1369,8 +1485,19 @@
           <w:szCs w:val="24"/>
           <w:lang w:bidi="fa-IR"/>
         </w:rPr>
-        <w:t>private readonly</w:t>
-      </w:r>
+        <w:t xml:space="preserve">private </w:t>
+      </w:r>
+      <w:proofErr w:type="spellStart"/>
+      <w:r>
+        <w:rPr>
+          <w:rFonts w:cs="B Nazanin"/>
+          <w:sz w:val="24"/>
+          <w:szCs w:val="24"/>
+          <w:lang w:bidi="fa-IR"/>
+        </w:rPr>
+        <w:t>readonly</w:t>
+      </w:r>
+      <w:proofErr w:type="spellEnd"/>
       <w:r>
         <w:rPr>
           <w:rFonts w:cs="B Nazanin" w:hint="cs"/>
@@ -2270,8 +2397,19 @@
           <w:szCs w:val="24"/>
           <w:lang w:bidi="fa-IR"/>
         </w:rPr>
-        <w:t>Container  Container</w:t>
-      </w:r>
+        <w:t xml:space="preserve">Container  </w:t>
+      </w:r>
+      <w:proofErr w:type="spellStart"/>
+      <w:r>
+        <w:rPr>
+          <w:rFonts w:cs="B Nazanin"/>
+          <w:sz w:val="24"/>
+          <w:szCs w:val="24"/>
+          <w:lang w:bidi="fa-IR"/>
+        </w:rPr>
+        <w:t>Container</w:t>
+      </w:r>
+      <w:proofErr w:type="spellEnd"/>
     </w:p>
     <w:p>
       <w:pPr>
@@ -2424,8 +2562,21 @@
           <w:szCs w:val="24"/>
           <w:lang w:bidi="fa-IR"/>
         </w:rPr>
-        <w:t>docker-compose.yml</w:t>
-      </w:r>
+        <w:t>docker-</w:t>
+      </w:r>
+      <w:proofErr w:type="spellStart"/>
+      <w:r>
+        <w:rPr>
+          <w:rFonts w:cs="B Nazanin"/>
+          <w:b/>
+          <w:bCs/>
+          <w:sz w:val="24"/>
+          <w:szCs w:val="24"/>
+          <w:lang w:bidi="fa-IR"/>
+        </w:rPr>
+        <w:t>compose.yml</w:t>
+      </w:r>
+      <w:proofErr w:type="spellEnd"/>
     </w:p>
     <w:p>
       <w:pPr>
@@ -2451,7 +2602,25 @@
           <w:sz w:val="24"/>
           <w:szCs w:val="24"/>
         </w:rPr>
-        <w:t xml:space="preserve">docker-compose.yml </w:t>
+        <w:t>docker-</w:t>
+      </w:r>
+      <w:proofErr w:type="spellStart"/>
+      <w:r>
+        <w:rPr>
+          <w:rFonts w:cs="B Nazanin"/>
+          <w:sz w:val="24"/>
+          <w:szCs w:val="24"/>
+        </w:rPr>
+        <w:t>compose.yml</w:t>
+      </w:r>
+      <w:proofErr w:type="spellEnd"/>
+      <w:r>
+        <w:rPr>
+          <w:rFonts w:cs="B Nazanin"/>
+          <w:sz w:val="24"/>
+          <w:szCs w:val="24"/>
+        </w:rPr>
+        <w:t xml:space="preserve"> </w:t>
       </w:r>
       <w:r>
         <w:rPr>
@@ -2601,27 +2770,67 @@
           <w:szCs w:val="24"/>
           <w:lang w:bidi="fa-IR"/>
         </w:rPr>
-        <w:t xml:space="preserve">  sql:</w:t>
-      </w:r>
-    </w:p>
-    <w:p>
-      <w:pPr>
-        <w:bidi/>
-        <w:rPr>
-          <w:rFonts w:cs="B Nazanin"/>
-          <w:sz w:val="24"/>
-          <w:szCs w:val="24"/>
-          <w:lang w:bidi="fa-IR"/>
-        </w:rPr>
-      </w:pPr>
-      <w:r>
-        <w:rPr>
-          <w:rFonts w:cs="B Nazanin"/>
-          <w:sz w:val="24"/>
-          <w:szCs w:val="24"/>
-          <w:lang w:bidi="fa-IR"/>
-        </w:rPr>
-        <w:t xml:space="preserve">    image: mcr.microsoft.com/azure-sql-edge</w:t>
+        <w:t xml:space="preserve">  </w:t>
+      </w:r>
+      <w:proofErr w:type="spellStart"/>
+      <w:r>
+        <w:rPr>
+          <w:rFonts w:cs="B Nazanin"/>
+          <w:sz w:val="24"/>
+          <w:szCs w:val="24"/>
+          <w:lang w:bidi="fa-IR"/>
+        </w:rPr>
+        <w:t>sql</w:t>
+      </w:r>
+      <w:proofErr w:type="spellEnd"/>
+      <w:r>
+        <w:rPr>
+          <w:rFonts w:cs="B Nazanin"/>
+          <w:sz w:val="24"/>
+          <w:szCs w:val="24"/>
+          <w:lang w:bidi="fa-IR"/>
+        </w:rPr>
+        <w:t>:</w:t>
+      </w:r>
+    </w:p>
+    <w:p>
+      <w:pPr>
+        <w:bidi/>
+        <w:rPr>
+          <w:rFonts w:cs="B Nazanin"/>
+          <w:sz w:val="24"/>
+          <w:szCs w:val="24"/>
+          <w:lang w:bidi="fa-IR"/>
+        </w:rPr>
+      </w:pPr>
+      <w:r>
+        <w:rPr>
+          <w:rFonts w:cs="B Nazanin"/>
+          <w:sz w:val="24"/>
+          <w:szCs w:val="24"/>
+          <w:lang w:bidi="fa-IR"/>
+        </w:rPr>
+        <w:t xml:space="preserve">    image: mcr.microsoft.com/azure-</w:t>
+      </w:r>
+      <w:proofErr w:type="spellStart"/>
+      <w:r>
+        <w:rPr>
+          <w:rFonts w:cs="B Nazanin"/>
+          <w:sz w:val="24"/>
+          <w:szCs w:val="24"/>
+          <w:lang w:bidi="fa-IR"/>
+        </w:rPr>
+        <w:t>sql</w:t>
+      </w:r>
+      <w:proofErr w:type="spellEnd"/>
+      <w:r>
+        <w:rPr>
+          <w:rFonts w:cs="B Nazanin"/>
+          <w:sz w:val="24"/>
+          <w:szCs w:val="24"/>
+          <w:lang w:bidi="fa-IR"/>
+        </w:rPr>
+        <w:t>-edge</w:t>
       </w:r>
     </w:p>
     <w:p>
@@ -2672,14 +2881,25 @@
         </w:rPr>
         <w:t xml:space="preserve">برای سرویس </w:t>
       </w:r>
-      <w:r>
-        <w:rPr>
-          <w:rFonts w:cs="B Nazanin"/>
-          <w:sz w:val="24"/>
-          <w:szCs w:val="24"/>
-          <w:lang w:bidi="fa-IR"/>
-        </w:rPr>
-        <w:t xml:space="preserve">sql </w:t>
+      <w:proofErr w:type="spellStart"/>
+      <w:r>
+        <w:rPr>
+          <w:rFonts w:cs="B Nazanin"/>
+          <w:sz w:val="24"/>
+          <w:szCs w:val="24"/>
+          <w:lang w:bidi="fa-IR"/>
+        </w:rPr>
+        <w:t>sql</w:t>
+      </w:r>
+      <w:proofErr w:type="spellEnd"/>
+      <w:r>
+        <w:rPr>
+          <w:rFonts w:cs="B Nazanin"/>
+          <w:sz w:val="24"/>
+          <w:szCs w:val="24"/>
+          <w:lang w:bidi="fa-IR"/>
+        </w:rPr>
+        <w:t xml:space="preserve"> </w:t>
       </w:r>
       <w:r>
         <w:rPr>
@@ -2715,7 +2935,27 @@
           <w:szCs w:val="24"/>
           <w:lang w:bidi="fa-IR"/>
         </w:rPr>
-        <w:t xml:space="preserve">mcr.microsoft.com/azure-sql-edge </w:t>
+        <w:t>mcr.microsoft.com/azure-</w:t>
+      </w:r>
+      <w:proofErr w:type="spellStart"/>
+      <w:r>
+        <w:rPr>
+          <w:rFonts w:cs="B Nazanin"/>
+          <w:sz w:val="24"/>
+          <w:szCs w:val="24"/>
+          <w:lang w:bidi="fa-IR"/>
+        </w:rPr>
+        <w:t>sql</w:t>
+      </w:r>
+      <w:proofErr w:type="spellEnd"/>
+      <w:r>
+        <w:rPr>
+          <w:rFonts w:cs="B Nazanin"/>
+          <w:sz w:val="24"/>
+          <w:szCs w:val="24"/>
+          <w:lang w:bidi="fa-IR"/>
+        </w:rPr>
+        <w:t xml:space="preserve">-edge </w:t>
       </w:r>
       <w:r>
         <w:rPr>
@@ -2818,7 +3058,27 @@
           <w:szCs w:val="24"/>
           <w:lang w:bidi="fa-IR"/>
         </w:rPr>
-        <w:t xml:space="preserve">docker-compose.yml → </w:t>
+        <w:t>docker-</w:t>
+      </w:r>
+      <w:proofErr w:type="spellStart"/>
+      <w:r>
+        <w:rPr>
+          <w:rFonts w:cs="B Nazanin"/>
+          <w:sz w:val="24"/>
+          <w:szCs w:val="24"/>
+          <w:lang w:bidi="fa-IR"/>
+        </w:rPr>
+        <w:t>compose.yml</w:t>
+      </w:r>
+      <w:proofErr w:type="spellEnd"/>
+      <w:r>
+        <w:rPr>
+          <w:rFonts w:cs="B Nazanin"/>
+          <w:sz w:val="24"/>
+          <w:szCs w:val="24"/>
+          <w:lang w:bidi="fa-IR"/>
+        </w:rPr>
+        <w:t xml:space="preserve"> → </w:t>
       </w:r>
       <w:r>
         <w:rPr>
@@ -2971,8 +3231,21 @@
           <w:szCs w:val="24"/>
           <w:lang w:bidi="fa-IR"/>
         </w:rPr>
-        <w:t xml:space="preserve"> docker-compose.yml</w:t>
-      </w:r>
+        <w:t xml:space="preserve"> docker-</w:t>
+      </w:r>
+      <w:proofErr w:type="spellStart"/>
+      <w:r>
+        <w:rPr>
+          <w:rFonts w:cs="B Nazanin"/>
+          <w:b/>
+          <w:bCs/>
+          <w:sz w:val="24"/>
+          <w:szCs w:val="24"/>
+          <w:lang w:bidi="fa-IR"/>
+        </w:rPr>
+        <w:t>compose.yml</w:t>
+      </w:r>
+      <w:proofErr w:type="spellEnd"/>
     </w:p>
     <w:p>
       <w:pPr>
@@ -3000,7 +3273,27 @@
           <w:szCs w:val="24"/>
           <w:lang w:bidi="fa-IR"/>
         </w:rPr>
-        <w:t xml:space="preserve">docker-compose.yml </w:t>
+        <w:t>docker-</w:t>
+      </w:r>
+      <w:proofErr w:type="spellStart"/>
+      <w:r>
+        <w:rPr>
+          <w:rFonts w:cs="B Nazanin"/>
+          <w:sz w:val="24"/>
+          <w:szCs w:val="24"/>
+          <w:lang w:bidi="fa-IR"/>
+        </w:rPr>
+        <w:t>compose.yml</w:t>
+      </w:r>
+      <w:proofErr w:type="spellEnd"/>
+      <w:r>
+        <w:rPr>
+          <w:rFonts w:cs="B Nazanin"/>
+          <w:sz w:val="24"/>
+          <w:szCs w:val="24"/>
+          <w:lang w:bidi="fa-IR"/>
+        </w:rPr>
+        <w:t xml:space="preserve"> </w:t>
       </w:r>
       <w:r>
         <w:rPr>
@@ -3078,14 +3371,25 @@
           <w:lang w:bidi="fa-IR"/>
         </w:rPr>
       </w:pPr>
-      <w:r>
-        <w:rPr>
-          <w:rFonts w:cs="B Nazanin"/>
-          <w:sz w:val="24"/>
-          <w:szCs w:val="24"/>
-          <w:lang w:bidi="fa-IR"/>
-        </w:rPr>
-        <w:t>MyProject/</w:t>
+      <w:proofErr w:type="spellStart"/>
+      <w:r>
+        <w:rPr>
+          <w:rFonts w:cs="B Nazanin"/>
+          <w:sz w:val="24"/>
+          <w:szCs w:val="24"/>
+          <w:lang w:bidi="fa-IR"/>
+        </w:rPr>
+        <w:t>MyProject</w:t>
+      </w:r>
+      <w:proofErr w:type="spellEnd"/>
+      <w:r>
+        <w:rPr>
+          <w:rFonts w:cs="B Nazanin"/>
+          <w:sz w:val="24"/>
+          <w:szCs w:val="24"/>
+          <w:lang w:bidi="fa-IR"/>
+        </w:rPr>
+        <w:t>/</w:t>
       </w:r>
     </w:p>
     <w:p>
@@ -3143,8 +3447,19 @@
           <w:szCs w:val="24"/>
           <w:lang w:bidi="fa-IR"/>
         </w:rPr>
-        <w:t xml:space="preserve"> docker-compose.yml</w:t>
-      </w:r>
+        <w:t xml:space="preserve"> docker-</w:t>
+      </w:r>
+      <w:proofErr w:type="spellStart"/>
+      <w:r>
+        <w:rPr>
+          <w:rFonts w:cs="B Nazanin"/>
+          <w:sz w:val="24"/>
+          <w:szCs w:val="24"/>
+          <w:lang w:bidi="fa-IR"/>
+        </w:rPr>
+        <w:t>compose.yml</w:t>
+      </w:r>
+      <w:proofErr w:type="spellEnd"/>
     </w:p>
     <w:p>
       <w:pPr>
@@ -3287,8 +3602,19 @@
           <w:szCs w:val="24"/>
           <w:lang w:bidi="fa-IR"/>
         </w:rPr>
-        <w:t xml:space="preserve"> Dockerfile</w:t>
-      </w:r>
+        <w:t xml:space="preserve"> </w:t>
+      </w:r>
+      <w:proofErr w:type="spellStart"/>
+      <w:r>
+        <w:rPr>
+          <w:rFonts w:cs="B Nazanin"/>
+          <w:sz w:val="24"/>
+          <w:szCs w:val="24"/>
+          <w:lang w:bidi="fa-IR"/>
+        </w:rPr>
+        <w:t>Dockerfile</w:t>
+      </w:r>
+      <w:proofErr w:type="spellEnd"/>
     </w:p>
     <w:p>
       <w:pPr>
@@ -3472,8 +3798,19 @@
           <w:szCs w:val="24"/>
           <w:lang w:bidi="fa-IR"/>
         </w:rPr>
-        <w:t xml:space="preserve"> Dockerfile</w:t>
-      </w:r>
+        <w:t xml:space="preserve"> </w:t>
+      </w:r>
+      <w:proofErr w:type="spellStart"/>
+      <w:r>
+        <w:rPr>
+          <w:rFonts w:cs="B Nazanin"/>
+          <w:sz w:val="24"/>
+          <w:szCs w:val="24"/>
+          <w:lang w:bidi="fa-IR"/>
+        </w:rPr>
+        <w:t>Dockerfile</w:t>
+      </w:r>
+      <w:proofErr w:type="spellEnd"/>
     </w:p>
     <w:p>
       <w:pPr>
@@ -3521,7 +3858,27 @@
           <w:szCs w:val="24"/>
           <w:lang w:bidi="fa-IR"/>
         </w:rPr>
-        <w:t xml:space="preserve">docker-compose.yml </w:t>
+        <w:t>docker-</w:t>
+      </w:r>
+      <w:proofErr w:type="spellStart"/>
+      <w:r>
+        <w:rPr>
+          <w:rFonts w:cs="B Nazanin"/>
+          <w:sz w:val="24"/>
+          <w:szCs w:val="24"/>
+          <w:lang w:bidi="fa-IR"/>
+        </w:rPr>
+        <w:t>compose.yml</w:t>
+      </w:r>
+      <w:proofErr w:type="spellEnd"/>
+      <w:r>
+        <w:rPr>
+          <w:rFonts w:cs="B Nazanin"/>
+          <w:sz w:val="24"/>
+          <w:szCs w:val="24"/>
+          <w:lang w:bidi="fa-IR"/>
+        </w:rPr>
+        <w:t xml:space="preserve"> </w:t>
       </w:r>
       <w:r>
         <w:rPr>
@@ -3625,8 +3982,21 @@
           <w:szCs w:val="24"/>
           <w:lang w:bidi="fa-IR"/>
         </w:rPr>
-        <w:t xml:space="preserve"> docker-compose.yml</w:t>
-      </w:r>
+        <w:t xml:space="preserve"> docker-</w:t>
+      </w:r>
+      <w:proofErr w:type="spellStart"/>
+      <w:r>
+        <w:rPr>
+          <w:rFonts w:cs="B Nazanin"/>
+          <w:b/>
+          <w:bCs/>
+          <w:sz w:val="24"/>
+          <w:szCs w:val="24"/>
+          <w:lang w:bidi="fa-IR"/>
+        </w:rPr>
+        <w:t>compose.yml</w:t>
+      </w:r>
+      <w:proofErr w:type="spellEnd"/>
     </w:p>
     <w:p>
       <w:pPr>
@@ -3654,7 +4024,27 @@
           <w:szCs w:val="24"/>
           <w:lang w:bidi="fa-IR"/>
         </w:rPr>
-        <w:t xml:space="preserve">docker-compose.yml </w:t>
+        <w:t>docker-</w:t>
+      </w:r>
+      <w:proofErr w:type="spellStart"/>
+      <w:r>
+        <w:rPr>
+          <w:rFonts w:cs="B Nazanin"/>
+          <w:sz w:val="24"/>
+          <w:szCs w:val="24"/>
+          <w:lang w:bidi="fa-IR"/>
+        </w:rPr>
+        <w:t>compose.yml</w:t>
+      </w:r>
+      <w:proofErr w:type="spellEnd"/>
+      <w:r>
+        <w:rPr>
+          <w:rFonts w:cs="B Nazanin"/>
+          <w:sz w:val="24"/>
+          <w:szCs w:val="24"/>
+          <w:lang w:bidi="fa-IR"/>
+        </w:rPr>
+        <w:t xml:space="preserve"> </w:t>
       </w:r>
       <w:r>
         <w:rPr>
@@ -3834,8 +4224,21 @@
           <w:szCs w:val="24"/>
           <w:lang w:bidi="fa-IR"/>
         </w:rPr>
-        <w:t xml:space="preserve"> docker-compose.yml</w:t>
-      </w:r>
+        <w:t xml:space="preserve"> docker-</w:t>
+      </w:r>
+      <w:proofErr w:type="spellStart"/>
+      <w:r>
+        <w:rPr>
+          <w:rFonts w:cs="B Nazanin"/>
+          <w:b/>
+          <w:bCs/>
+          <w:sz w:val="24"/>
+          <w:szCs w:val="24"/>
+          <w:lang w:bidi="fa-IR"/>
+        </w:rPr>
+        <w:t>compose.yml</w:t>
+      </w:r>
+      <w:proofErr w:type="spellEnd"/>
     </w:p>
     <w:p>
       <w:pPr>
@@ -3874,27 +4277,67 @@
           <w:szCs w:val="24"/>
           <w:lang w:bidi="fa-IR"/>
         </w:rPr>
-        <w:t xml:space="preserve">  sql:</w:t>
-      </w:r>
-    </w:p>
-    <w:p>
-      <w:pPr>
-        <w:bidi/>
-        <w:rPr>
-          <w:rFonts w:cs="B Nazanin"/>
-          <w:sz w:val="24"/>
-          <w:szCs w:val="24"/>
-          <w:lang w:bidi="fa-IR"/>
-        </w:rPr>
-      </w:pPr>
-      <w:r>
-        <w:rPr>
-          <w:rFonts w:cs="B Nazanin"/>
-          <w:sz w:val="24"/>
-          <w:szCs w:val="24"/>
-          <w:lang w:bidi="fa-IR"/>
-        </w:rPr>
-        <w:t xml:space="preserve">    image: mcr.microsoft.com/azure-sql-edge</w:t>
+        <w:t xml:space="preserve">  </w:t>
+      </w:r>
+      <w:proofErr w:type="spellStart"/>
+      <w:r>
+        <w:rPr>
+          <w:rFonts w:cs="B Nazanin"/>
+          <w:sz w:val="24"/>
+          <w:szCs w:val="24"/>
+          <w:lang w:bidi="fa-IR"/>
+        </w:rPr>
+        <w:t>sql</w:t>
+      </w:r>
+      <w:proofErr w:type="spellEnd"/>
+      <w:r>
+        <w:rPr>
+          <w:rFonts w:cs="B Nazanin"/>
+          <w:sz w:val="24"/>
+          <w:szCs w:val="24"/>
+          <w:lang w:bidi="fa-IR"/>
+        </w:rPr>
+        <w:t>:</w:t>
+      </w:r>
+    </w:p>
+    <w:p>
+      <w:pPr>
+        <w:bidi/>
+        <w:rPr>
+          <w:rFonts w:cs="B Nazanin"/>
+          <w:sz w:val="24"/>
+          <w:szCs w:val="24"/>
+          <w:lang w:bidi="fa-IR"/>
+        </w:rPr>
+      </w:pPr>
+      <w:r>
+        <w:rPr>
+          <w:rFonts w:cs="B Nazanin"/>
+          <w:sz w:val="24"/>
+          <w:szCs w:val="24"/>
+          <w:lang w:bidi="fa-IR"/>
+        </w:rPr>
+        <w:t xml:space="preserve">    image: mcr.microsoft.com/azure-</w:t>
+      </w:r>
+      <w:proofErr w:type="spellStart"/>
+      <w:r>
+        <w:rPr>
+          <w:rFonts w:cs="B Nazanin"/>
+          <w:sz w:val="24"/>
+          <w:szCs w:val="24"/>
+          <w:lang w:bidi="fa-IR"/>
+        </w:rPr>
+        <w:t>sql</w:t>
+      </w:r>
+      <w:proofErr w:type="spellEnd"/>
+      <w:r>
+        <w:rPr>
+          <w:rFonts w:cs="B Nazanin"/>
+          <w:sz w:val="24"/>
+          <w:szCs w:val="24"/>
+          <w:lang w:bidi="fa-IR"/>
+        </w:rPr>
+        <w:t>-edge</w:t>
       </w:r>
     </w:p>
     <w:p>
@@ -4067,14 +4510,25 @@
         </w:rPr>
         <w:t xml:space="preserve">یک سرویس به نام </w:t>
       </w:r>
-      <w:r>
-        <w:rPr>
-          <w:rFonts w:cs="B Nazanin"/>
-          <w:sz w:val="24"/>
-          <w:szCs w:val="24"/>
-          <w:lang w:bidi="fa-IR"/>
-        </w:rPr>
-        <w:t xml:space="preserve">sql </w:t>
+      <w:proofErr w:type="spellStart"/>
+      <w:r>
+        <w:rPr>
+          <w:rFonts w:cs="B Nazanin"/>
+          <w:sz w:val="24"/>
+          <w:szCs w:val="24"/>
+          <w:lang w:bidi="fa-IR"/>
+        </w:rPr>
+        <w:t>sql</w:t>
+      </w:r>
+      <w:proofErr w:type="spellEnd"/>
+      <w:r>
+        <w:rPr>
+          <w:rFonts w:cs="B Nazanin"/>
+          <w:sz w:val="24"/>
+          <w:szCs w:val="24"/>
+          <w:lang w:bidi="fa-IR"/>
+        </w:rPr>
+        <w:t xml:space="preserve"> </w:t>
       </w:r>
       <w:r>
         <w:rPr>
@@ -4110,7 +4564,27 @@
           <w:szCs w:val="24"/>
           <w:lang w:bidi="fa-IR"/>
         </w:rPr>
-        <w:t xml:space="preserve">mcr.microsoft.com/azure-sql-edge </w:t>
+        <w:t>mcr.microsoft.com/azure-</w:t>
+      </w:r>
+      <w:proofErr w:type="spellStart"/>
+      <w:r>
+        <w:rPr>
+          <w:rFonts w:cs="B Nazanin"/>
+          <w:sz w:val="24"/>
+          <w:szCs w:val="24"/>
+          <w:lang w:bidi="fa-IR"/>
+        </w:rPr>
+        <w:t>sql</w:t>
+      </w:r>
+      <w:proofErr w:type="spellEnd"/>
+      <w:r>
+        <w:rPr>
+          <w:rFonts w:cs="B Nazanin"/>
+          <w:sz w:val="24"/>
+          <w:szCs w:val="24"/>
+          <w:lang w:bidi="fa-IR"/>
+        </w:rPr>
+        <w:t xml:space="preserve">-edge </w:t>
       </w:r>
       <w:r>
         <w:rPr>
@@ -4656,7 +5130,29 @@
           <w:rtl/>
           <w:lang w:bidi="fa-IR"/>
         </w:rPr>
-        <w:t xml:space="preserve"> از سرویس با ورژن دلخواه را دانلود یا اجرا کنیم ؟ با دستور زیر :</w:t>
+        <w:t xml:space="preserve"> از سرویس با </w:t>
+      </w:r>
+      <w:proofErr w:type="spellStart"/>
+      <w:r>
+        <w:rPr>
+          <w:rFonts w:cs="B Nazanin" w:hint="cs"/>
+          <w:sz w:val="24"/>
+          <w:szCs w:val="24"/>
+          <w:rtl/>
+          <w:lang w:bidi="fa-IR"/>
+        </w:rPr>
+        <w:t>ورژن</w:t>
+      </w:r>
+      <w:proofErr w:type="spellEnd"/>
+      <w:r>
+        <w:rPr>
+          <w:rFonts w:cs="B Nazanin" w:hint="cs"/>
+          <w:sz w:val="24"/>
+          <w:szCs w:val="24"/>
+          <w:rtl/>
+          <w:lang w:bidi="fa-IR"/>
+        </w:rPr>
+        <w:t xml:space="preserve"> دلخواه را دانلود یا اجرا کنیم ؟ با دستور زیر :</w:t>
       </w:r>
     </w:p>
     <w:p>
@@ -4678,8 +5174,19 @@
           <w:szCs w:val="24"/>
           <w:lang w:bidi="fa-IR"/>
         </w:rPr>
-        <w:t>image: some-image:tag</w:t>
-      </w:r>
+        <w:t xml:space="preserve">image: </w:t>
+      </w:r>
+      <w:proofErr w:type="spellStart"/>
+      <w:r>
+        <w:rPr>
+          <w:rFonts w:cs="Cambria"/>
+          <w:sz w:val="24"/>
+          <w:szCs w:val="24"/>
+          <w:lang w:bidi="fa-IR"/>
+        </w:rPr>
+        <w:t>some-image:tag</w:t>
+      </w:r>
+      <w:proofErr w:type="spellEnd"/>
     </w:p>
     <w:p>
       <w:pPr>
@@ -6876,8 +7383,19 @@
           <w:szCs w:val="24"/>
           <w:lang w:bidi="fa-IR"/>
         </w:rPr>
-        <w:t>docker-compose.yml</w:t>
-      </w:r>
+        <w:t>docker-</w:t>
+      </w:r>
+      <w:proofErr w:type="spellStart"/>
+      <w:r>
+        <w:rPr>
+          <w:rFonts w:cs="B Nazanin"/>
+          <w:sz w:val="24"/>
+          <w:szCs w:val="24"/>
+          <w:lang w:bidi="fa-IR"/>
+        </w:rPr>
+        <w:t>compose.yml</w:t>
+      </w:r>
+      <w:proofErr w:type="spellEnd"/>
     </w:p>
     <w:p>
       <w:pPr>
@@ -7200,7 +7718,27 @@
           <w:szCs w:val="24"/>
           <w:lang w:bidi="fa-IR"/>
         </w:rPr>
-        <w:t xml:space="preserve">docker-compose.yml </w:t>
+        <w:t>docker-</w:t>
+      </w:r>
+      <w:proofErr w:type="spellStart"/>
+      <w:r>
+        <w:rPr>
+          <w:rFonts w:cs="B Nazanin"/>
+          <w:sz w:val="24"/>
+          <w:szCs w:val="24"/>
+          <w:lang w:bidi="fa-IR"/>
+        </w:rPr>
+        <w:t>compose.yml</w:t>
+      </w:r>
+      <w:proofErr w:type="spellEnd"/>
+      <w:r>
+        <w:rPr>
+          <w:rFonts w:cs="B Nazanin"/>
+          <w:sz w:val="24"/>
+          <w:szCs w:val="24"/>
+          <w:lang w:bidi="fa-IR"/>
+        </w:rPr>
+        <w:t xml:space="preserve"> </w:t>
       </w:r>
       <w:r>
         <w:rPr>
@@ -7500,8 +8038,19 @@
           <w:szCs w:val="24"/>
           <w:lang w:bidi="fa-IR"/>
         </w:rPr>
-        <w:t>docker-compose.yml</w:t>
-      </w:r>
+        <w:t>docker-</w:t>
+      </w:r>
+      <w:proofErr w:type="spellStart"/>
+      <w:r>
+        <w:rPr>
+          <w:rFonts w:cs="B Nazanin"/>
+          <w:sz w:val="24"/>
+          <w:szCs w:val="24"/>
+          <w:lang w:bidi="fa-IR"/>
+        </w:rPr>
+        <w:t>compose.yml</w:t>
+      </w:r>
+      <w:proofErr w:type="spellEnd"/>
       <w:r>
         <w:rPr>
           <w:rFonts w:cs="B Nazanin" w:hint="cs"/>
@@ -7512,6 +8061,7 @@
         </w:rPr>
         <w:t xml:space="preserve"> می توانیم از طریق </w:t>
       </w:r>
+      <w:proofErr w:type="spellStart"/>
       <w:r>
         <w:rPr>
           <w:rFonts w:cs="B Nazanin"/>
@@ -7521,6 +8071,7 @@
         </w:rPr>
         <w:t>ssms</w:t>
       </w:r>
+      <w:proofErr w:type="spellEnd"/>
       <w:r>
         <w:rPr>
           <w:rFonts w:cs="B Nazanin" w:hint="cs"/>
@@ -7613,6 +8164,7 @@
           <w:lang w:bidi="fa-IR"/>
         </w:rPr>
       </w:pPr>
+      <w:proofErr w:type="spellStart"/>
       <w:r>
         <w:rPr>
           <w:rFonts w:cs="B Nazanin" w:hint="cs"/>
@@ -7623,7 +8175,46 @@
           <w:rtl/>
           <w:lang w:bidi="fa-IR"/>
         </w:rPr>
-        <w:t>پیکربندی انتیتی ها برای مهاجرت -------------</w:t>
+        <w:t>پیکربندی</w:t>
+      </w:r>
+      <w:proofErr w:type="spellEnd"/>
+      <w:r>
+        <w:rPr>
+          <w:rFonts w:cs="B Nazanin" w:hint="cs"/>
+          <w:b/>
+          <w:bCs/>
+          <w:sz w:val="36"/>
+          <w:szCs w:val="36"/>
+          <w:rtl/>
+          <w:lang w:bidi="fa-IR"/>
+        </w:rPr>
+        <w:t xml:space="preserve"> </w:t>
+      </w:r>
+      <w:proofErr w:type="spellStart"/>
+      <w:r>
+        <w:rPr>
+          <w:rFonts w:cs="B Nazanin" w:hint="cs"/>
+          <w:b/>
+          <w:bCs/>
+          <w:sz w:val="36"/>
+          <w:szCs w:val="36"/>
+          <w:rtl/>
+          <w:lang w:bidi="fa-IR"/>
+        </w:rPr>
+        <w:t>انتیتی</w:t>
+      </w:r>
+      <w:proofErr w:type="spellEnd"/>
+      <w:r>
+        <w:rPr>
+          <w:rFonts w:cs="B Nazanin" w:hint="cs"/>
+          <w:b/>
+          <w:bCs/>
+          <w:sz w:val="36"/>
+          <w:szCs w:val="36"/>
+          <w:rtl/>
+          <w:lang w:bidi="fa-IR"/>
+        </w:rPr>
+        <w:t xml:space="preserve"> ها برای مهاجرت -------------</w:t>
       </w:r>
     </w:p>
     <w:p>
@@ -8009,14 +8600,45 @@
           <w:lang w:bidi="fa-IR"/>
         </w:rPr>
       </w:pPr>
-      <w:r>
-        <w:rPr>
-          <w:rFonts w:cs="B Nazanin"/>
-          <w:sz w:val="24"/>
-          <w:szCs w:val="24"/>
-          <w:lang w:bidi="fa-IR"/>
-        </w:rPr>
-        <w:t>builder.Property(x =&gt; x.Price)</w:t>
+      <w:proofErr w:type="spellStart"/>
+      <w:r>
+        <w:rPr>
+          <w:rFonts w:cs="B Nazanin"/>
+          <w:sz w:val="24"/>
+          <w:szCs w:val="24"/>
+          <w:lang w:bidi="fa-IR"/>
+        </w:rPr>
+        <w:t>builder.Property</w:t>
+      </w:r>
+      <w:proofErr w:type="spellEnd"/>
+      <w:r>
+        <w:rPr>
+          <w:rFonts w:cs="B Nazanin"/>
+          <w:sz w:val="24"/>
+          <w:szCs w:val="24"/>
+          <w:lang w:bidi="fa-IR"/>
+        </w:rPr>
+        <w:t xml:space="preserve">(x =&gt; </w:t>
+      </w:r>
+      <w:proofErr w:type="spellStart"/>
+      <w:r>
+        <w:rPr>
+          <w:rFonts w:cs="B Nazanin"/>
+          <w:sz w:val="24"/>
+          <w:szCs w:val="24"/>
+          <w:lang w:bidi="fa-IR"/>
+        </w:rPr>
+        <w:t>x.Price</w:t>
+      </w:r>
+      <w:proofErr w:type="spellEnd"/>
+      <w:r>
+        <w:rPr>
+          <w:rFonts w:cs="B Nazanin"/>
+          <w:sz w:val="24"/>
+          <w:szCs w:val="24"/>
+          <w:lang w:bidi="fa-IR"/>
+        </w:rPr>
+        <w:t>)</w:t>
       </w:r>
     </w:p>
     <w:p>
@@ -8037,7 +8659,27 @@
           <w:szCs w:val="24"/>
           <w:lang w:bidi="fa-IR"/>
         </w:rPr>
-        <w:t xml:space="preserve">       .HasColumnType("decimal(18,2)");</w:t>
+        <w:t xml:space="preserve">       .</w:t>
+      </w:r>
+      <w:proofErr w:type="spellStart"/>
+      <w:r>
+        <w:rPr>
+          <w:rFonts w:cs="B Nazanin"/>
+          <w:sz w:val="24"/>
+          <w:szCs w:val="24"/>
+          <w:lang w:bidi="fa-IR"/>
+        </w:rPr>
+        <w:t>HasColumnType</w:t>
+      </w:r>
+      <w:proofErr w:type="spellEnd"/>
+      <w:r>
+        <w:rPr>
+          <w:rFonts w:cs="B Nazanin"/>
+          <w:sz w:val="24"/>
+          <w:szCs w:val="24"/>
+          <w:lang w:bidi="fa-IR"/>
+        </w:rPr>
+        <w:t>("decimal(18,2)");</w:t>
       </w:r>
     </w:p>
     <w:p>
@@ -8081,14 +8723,45 @@
           <w:lang w:bidi="fa-IR"/>
         </w:rPr>
       </w:pPr>
-      <w:r>
-        <w:rPr>
-          <w:rFonts w:cs="B Nazanin"/>
-          <w:sz w:val="24"/>
-          <w:szCs w:val="24"/>
-          <w:lang w:bidi="fa-IR"/>
-        </w:rPr>
-        <w:t>builder.Property(x =&gt; x.Price)</w:t>
+      <w:proofErr w:type="spellStart"/>
+      <w:r>
+        <w:rPr>
+          <w:rFonts w:cs="B Nazanin"/>
+          <w:sz w:val="24"/>
+          <w:szCs w:val="24"/>
+          <w:lang w:bidi="fa-IR"/>
+        </w:rPr>
+        <w:t>builder.Property</w:t>
+      </w:r>
+      <w:proofErr w:type="spellEnd"/>
+      <w:r>
+        <w:rPr>
+          <w:rFonts w:cs="B Nazanin"/>
+          <w:sz w:val="24"/>
+          <w:szCs w:val="24"/>
+          <w:lang w:bidi="fa-IR"/>
+        </w:rPr>
+        <w:t xml:space="preserve">(x =&gt; </w:t>
+      </w:r>
+      <w:proofErr w:type="spellStart"/>
+      <w:r>
+        <w:rPr>
+          <w:rFonts w:cs="B Nazanin"/>
+          <w:sz w:val="24"/>
+          <w:szCs w:val="24"/>
+          <w:lang w:bidi="fa-IR"/>
+        </w:rPr>
+        <w:t>x.Price</w:t>
+      </w:r>
+      <w:proofErr w:type="spellEnd"/>
+      <w:r>
+        <w:rPr>
+          <w:rFonts w:cs="B Nazanin"/>
+          <w:sz w:val="24"/>
+          <w:szCs w:val="24"/>
+          <w:lang w:bidi="fa-IR"/>
+        </w:rPr>
+        <w:t>)</w:t>
       </w:r>
     </w:p>
     <w:p>
@@ -8109,7 +8782,27 @@
           <w:szCs w:val="24"/>
           <w:lang w:bidi="fa-IR"/>
         </w:rPr>
-        <w:t xml:space="preserve">       .HasPrecision(18, 2);</w:t>
+        <w:t xml:space="preserve">       .</w:t>
+      </w:r>
+      <w:proofErr w:type="spellStart"/>
+      <w:r>
+        <w:rPr>
+          <w:rFonts w:cs="B Nazanin"/>
+          <w:sz w:val="24"/>
+          <w:szCs w:val="24"/>
+          <w:lang w:bidi="fa-IR"/>
+        </w:rPr>
+        <w:t>HasPrecision</w:t>
+      </w:r>
+      <w:proofErr w:type="spellEnd"/>
+      <w:r>
+        <w:rPr>
+          <w:rFonts w:cs="B Nazanin"/>
+          <w:sz w:val="24"/>
+          <w:szCs w:val="24"/>
+          <w:lang w:bidi="fa-IR"/>
+        </w:rPr>
+        <w:t>(18, 2);</w:t>
       </w:r>
     </w:p>
     <w:p>
@@ -8618,14 +9311,25 @@
           <w:lang w:bidi="fa-IR"/>
         </w:rPr>
       </w:pPr>
-      <w:r>
-        <w:rPr>
-          <w:rFonts w:cs="B Nazanin"/>
-          <w:sz w:val="24"/>
-          <w:szCs w:val="24"/>
-          <w:lang w:bidi="fa-IR"/>
-        </w:rPr>
-        <w:t>HasPrecision(18, 2)</w:t>
+      <w:proofErr w:type="spellStart"/>
+      <w:r>
+        <w:rPr>
+          <w:rFonts w:cs="B Nazanin"/>
+          <w:sz w:val="24"/>
+          <w:szCs w:val="24"/>
+          <w:lang w:bidi="fa-IR"/>
+        </w:rPr>
+        <w:t>HasPrecision</w:t>
+      </w:r>
+      <w:proofErr w:type="spellEnd"/>
+      <w:r>
+        <w:rPr>
+          <w:rFonts w:cs="B Nazanin"/>
+          <w:sz w:val="24"/>
+          <w:szCs w:val="24"/>
+          <w:lang w:bidi="fa-IR"/>
+        </w:rPr>
+        <w:t>(18, 2)</w:t>
       </w:r>
     </w:p>
     <w:p>
@@ -9004,7 +9708,29 @@
           <w:rtl/>
           <w:lang w:bidi="fa-IR"/>
         </w:rPr>
-        <w:t xml:space="preserve">. یعنی برای تست و بررسی برنامه بهتر است از درج دستی داده برای حفظ زمان پرهیز شود و یک مجموعه داده تستی داخل جداول قرار گیرند . مراحل آن به شرح ذیل است </w:t>
+        <w:t xml:space="preserve">. یعنی برای تست و بررسی برنامه بهتر است از درج دستی داده برای حفظ زمان پرهیز شود و یک مجموعه داده </w:t>
+      </w:r>
+      <w:proofErr w:type="spellStart"/>
+      <w:r>
+        <w:rPr>
+          <w:rFonts w:cs="B Nazanin" w:hint="cs"/>
+          <w:sz w:val="24"/>
+          <w:szCs w:val="24"/>
+          <w:rtl/>
+          <w:lang w:bidi="fa-IR"/>
+        </w:rPr>
+        <w:t>تستی</w:t>
+      </w:r>
+      <w:proofErr w:type="spellEnd"/>
+      <w:r>
+        <w:rPr>
+          <w:rFonts w:cs="B Nazanin" w:hint="cs"/>
+          <w:sz w:val="24"/>
+          <w:szCs w:val="24"/>
+          <w:rtl/>
+          <w:lang w:bidi="fa-IR"/>
+        </w:rPr>
+        <w:t xml:space="preserve"> داخل جداول قرار گیرند . مراحل آن به شرح ذیل است </w:t>
       </w:r>
       <w:r>
         <w:rPr>
@@ -9162,7 +9888,29 @@
           <w:rtl/>
           <w:lang w:bidi="fa-IR"/>
         </w:rPr>
-        <w:t>که عملیات درج این فایل در دیتابیس را انجام دهد</w:t>
+        <w:t xml:space="preserve">که عملیات درج این فایل در </w:t>
+      </w:r>
+      <w:proofErr w:type="spellStart"/>
+      <w:r>
+        <w:rPr>
+          <w:rFonts w:cs="B Nazanin" w:hint="cs"/>
+          <w:sz w:val="24"/>
+          <w:szCs w:val="24"/>
+          <w:rtl/>
+          <w:lang w:bidi="fa-IR"/>
+        </w:rPr>
+        <w:t>دیتابیس</w:t>
+      </w:r>
+      <w:proofErr w:type="spellEnd"/>
+      <w:r>
+        <w:rPr>
+          <w:rFonts w:cs="B Nazanin" w:hint="cs"/>
+          <w:sz w:val="24"/>
+          <w:szCs w:val="24"/>
+          <w:rtl/>
+          <w:lang w:bidi="fa-IR"/>
+        </w:rPr>
+        <w:t xml:space="preserve"> را انجام دهد</w:t>
       </w:r>
       <w:r>
         <w:rPr>
@@ -9184,6 +9932,7 @@
         </w:rPr>
         <w:t xml:space="preserve"> اینجا </w:t>
       </w:r>
+      <w:proofErr w:type="spellStart"/>
       <w:r>
         <w:rPr>
           <w:rFonts w:cs="B Nazanin"/>
@@ -9193,6 +9942,7 @@
         </w:rPr>
         <w:t>program.cs</w:t>
       </w:r>
+      <w:proofErr w:type="spellEnd"/>
       <w:r>
         <w:rPr>
           <w:rFonts w:cs="B Nazanin" w:hint="cs"/>
@@ -9229,6 +9979,7 @@
         </w:rPr>
         <w:t xml:space="preserve">حال در </w:t>
       </w:r>
+      <w:proofErr w:type="spellStart"/>
       <w:r>
         <w:rPr>
           <w:rFonts w:cs="B Nazanin"/>
@@ -9238,6 +9989,7 @@
         </w:rPr>
         <w:t>Program.cs</w:t>
       </w:r>
+      <w:proofErr w:type="spellEnd"/>
       <w:r>
         <w:rPr>
           <w:rFonts w:cs="B Nazanin" w:hint="cs"/>
@@ -9337,14 +10089,25 @@
         </w:rPr>
         <w:t xml:space="preserve"> و قبل از </w:t>
       </w:r>
-      <w:r>
-        <w:rPr>
-          <w:rFonts w:cs="B Nazanin"/>
-          <w:sz w:val="24"/>
-          <w:szCs w:val="24"/>
-          <w:lang w:bidi="fa-IR"/>
-        </w:rPr>
-        <w:t>app.run()</w:t>
+      <w:proofErr w:type="spellStart"/>
+      <w:r>
+        <w:rPr>
+          <w:rFonts w:cs="B Nazanin"/>
+          <w:sz w:val="24"/>
+          <w:szCs w:val="24"/>
+          <w:lang w:bidi="fa-IR"/>
+        </w:rPr>
+        <w:t>app.run</w:t>
+      </w:r>
+      <w:proofErr w:type="spellEnd"/>
+      <w:r>
+        <w:rPr>
+          <w:rFonts w:cs="B Nazanin"/>
+          <w:sz w:val="24"/>
+          <w:szCs w:val="24"/>
+          <w:lang w:bidi="fa-IR"/>
+        </w:rPr>
+        <w:t>()</w:t>
       </w:r>
       <w:r>
         <w:rPr>
@@ -9446,206 +10209,10 @@
           <w:szCs w:val="19"/>
           <w:highlight w:val="white"/>
         </w:rPr>
-        <w:t xml:space="preserve"> context.Database.MigrateAsync();</w:t>
-      </w:r>
-    </w:p>
-    <w:p>
-      <w:pPr>
-        <w:bidi/>
-        <w:rPr>
-          <w:rFonts w:cs="B Nazanin"/>
-          <w:sz w:val="24"/>
-          <w:szCs w:val="24"/>
-          <w:rtl/>
-          <w:lang w:bidi="fa-IR"/>
-        </w:rPr>
-      </w:pPr>
-      <w:r>
-        <w:rPr>
-          <w:rFonts w:cs="B Nazanin" w:hint="cs"/>
-          <w:sz w:val="24"/>
-          <w:szCs w:val="24"/>
-          <w:rtl/>
-          <w:lang w:bidi="fa-IR"/>
-        </w:rPr>
-        <w:t>این یعنی</w:t>
-      </w:r>
-      <w:r>
-        <w:rPr>
-          <w:rFonts w:cs="B Nazanin" w:hint="cs"/>
-          <w:sz w:val="24"/>
-          <w:szCs w:val="24"/>
-          <w:rtl/>
-          <w:lang w:bidi="fa-IR"/>
-        </w:rPr>
-        <w:t xml:space="preserve"> در هر بار </w:t>
-      </w:r>
-      <w:r>
-        <w:rPr>
-          <w:rFonts w:cs="B Nazanin"/>
-          <w:sz w:val="24"/>
-          <w:szCs w:val="24"/>
-          <w:lang w:bidi="fa-IR"/>
-        </w:rPr>
-        <w:t>Run</w:t>
-      </w:r>
-      <w:r>
-        <w:rPr>
-          <w:rFonts w:cs="B Nazanin" w:hint="cs"/>
-          <w:sz w:val="24"/>
-          <w:szCs w:val="24"/>
-          <w:rtl/>
-          <w:lang w:bidi="fa-IR"/>
-        </w:rPr>
-        <w:t xml:space="preserve"> از برنامه </w:t>
-      </w:r>
-      <w:r>
-        <w:rPr>
-          <w:rFonts w:cs="B Nazanin"/>
-          <w:sz w:val="24"/>
-          <w:szCs w:val="24"/>
-          <w:lang w:bidi="fa-IR"/>
-        </w:rPr>
-        <w:t xml:space="preserve">Database </w:t>
-      </w:r>
-      <w:r>
-        <w:rPr>
-          <w:rFonts w:cs="B Nazanin" w:hint="cs"/>
-          <w:sz w:val="24"/>
-          <w:szCs w:val="24"/>
-          <w:rtl/>
-          <w:lang w:bidi="fa-IR"/>
-        </w:rPr>
         <w:t xml:space="preserve"> </w:t>
       </w:r>
-      <w:r>
-        <w:rPr>
-          <w:rFonts w:cs="B Nazanin"/>
-          <w:sz w:val="24"/>
-          <w:szCs w:val="24"/>
-          <w:rtl/>
-        </w:rPr>
-        <w:t>را بررسی کن و</w:t>
-      </w:r>
-      <w:r>
-        <w:rPr>
-          <w:rFonts w:cs="B Nazanin"/>
-          <w:sz w:val="24"/>
-          <w:szCs w:val="24"/>
-          <w:lang w:bidi="fa-IR"/>
-        </w:rPr>
-        <w:t xml:space="preserve"> Migration</w:t>
-      </w:r>
-      <w:r>
-        <w:rPr>
-          <w:rFonts w:cs="B Nazanin"/>
-          <w:sz w:val="24"/>
-          <w:szCs w:val="24"/>
-          <w:rtl/>
-        </w:rPr>
-        <w:t>های اعمال‌نشده را اعمال کن</w:t>
-      </w:r>
-      <w:r>
-        <w:rPr>
-          <w:rFonts w:cs="B Nazanin"/>
-          <w:sz w:val="24"/>
-          <w:szCs w:val="24"/>
-          <w:lang w:bidi="fa-IR"/>
-        </w:rPr>
-        <w:t>.</w:t>
-      </w:r>
-      <w:r>
-        <w:rPr>
-          <w:rFonts w:cs="B Nazanin" w:hint="cs"/>
-          <w:sz w:val="24"/>
-          <w:szCs w:val="24"/>
-          <w:rtl/>
-          <w:lang w:bidi="fa-IR"/>
-        </w:rPr>
-        <w:t xml:space="preserve"> دقت کن که </w:t>
-      </w:r>
-      <w:r>
-        <w:rPr>
-          <w:rFonts w:cs="B Nazanin"/>
-          <w:sz w:val="24"/>
-          <w:szCs w:val="24"/>
-          <w:lang w:bidi="fa-IR"/>
-        </w:rPr>
-        <w:t>migration</w:t>
-      </w:r>
-      <w:r>
-        <w:rPr>
-          <w:rFonts w:cs="B Nazanin" w:hint="cs"/>
-          <w:sz w:val="24"/>
-          <w:szCs w:val="24"/>
-          <w:rtl/>
-          <w:lang w:bidi="fa-IR"/>
-        </w:rPr>
-        <w:t xml:space="preserve"> های اعمال شده را دیگر اعمال نمی کند .</w:t>
-      </w:r>
-    </w:p>
-    <w:p>
-      <w:pPr>
-        <w:bidi/>
-        <w:rPr>
-          <w:rFonts w:cs="B Nazanin"/>
-          <w:sz w:val="24"/>
-          <w:szCs w:val="24"/>
-          <w:rtl/>
-          <w:lang w:bidi="fa-IR"/>
-        </w:rPr>
-      </w:pPr>
-    </w:p>
-    <w:p>
-      <w:pPr>
-        <w:bidi/>
-        <w:rPr>
-          <w:rFonts w:cs="B Nazanin"/>
-          <w:b/>
-          <w:bCs/>
-          <w:sz w:val="32"/>
-          <w:szCs w:val="32"/>
-          <w:rtl/>
-        </w:rPr>
-      </w:pPr>
-      <w:r>
-        <w:rPr>
-          <w:rFonts w:cs="B Nazanin"/>
-          <w:b/>
-          <w:bCs/>
-          <w:sz w:val="32"/>
-          <w:szCs w:val="32"/>
-        </w:rPr>
-        <w:t>Generic Constraint</w:t>
-      </w:r>
-    </w:p>
-    <w:p>
-      <w:pPr>
-        <w:bidi/>
-        <w:rPr>
-          <w:rFonts w:cs="B Nazanin"/>
-          <w:sz w:val="24"/>
-          <w:szCs w:val="24"/>
-          <w:lang w:bidi="fa-IR"/>
-        </w:rPr>
-      </w:pPr>
-      <w:r>
-        <w:rPr>
-          <w:rFonts w:cs="B Nazanin" w:hint="cs"/>
-          <w:sz w:val="24"/>
-          <w:szCs w:val="24"/>
-          <w:rtl/>
-          <w:lang w:bidi="fa-IR"/>
-        </w:rPr>
-        <w:t>تفسیر دقیق در کد زیر آورده شده است :</w:t>
-      </w:r>
-    </w:p>
-    <w:p>
-      <w:pPr>
-        <w:autoSpaceDE w:val="0"/>
-        <w:autoSpaceDN w:val="0"/>
-        <w:adjustRightInd w:val="0"/>
-        <w:spacing w:after="0" w:line="240" w:lineRule="auto"/>
+      <w:proofErr w:type="spellStart"/>
+      <w:r>
         <w:rPr>
           <w:rFonts w:ascii="Cascadia Mono" w:hAnsi="Cascadia Mono" w:cs="Cascadia Mono"/>
           <w:color w:val="000000"/>
@@ -9653,7 +10220,9 @@
           <w:szCs w:val="19"/>
           <w:highlight w:val="white"/>
         </w:rPr>
-      </w:pPr>
+        <w:t>context.Database.MigrateAsync</w:t>
+      </w:r>
+      <w:proofErr w:type="spellEnd"/>
       <w:r>
         <w:rPr>
           <w:rFonts w:ascii="Cascadia Mono" w:hAnsi="Cascadia Mono" w:cs="Cascadia Mono"/>
@@ -9662,6 +10231,244 @@
           <w:szCs w:val="19"/>
           <w:highlight w:val="white"/>
         </w:rPr>
+        <w:t>();</w:t>
+      </w:r>
+    </w:p>
+    <w:p>
+      <w:pPr>
+        <w:bidi/>
+        <w:rPr>
+          <w:rFonts w:cs="B Nazanin"/>
+          <w:sz w:val="24"/>
+          <w:szCs w:val="24"/>
+          <w:rtl/>
+          <w:lang w:bidi="fa-IR"/>
+        </w:rPr>
+      </w:pPr>
+      <w:r>
+        <w:rPr>
+          <w:rFonts w:cs="B Nazanin" w:hint="cs"/>
+          <w:sz w:val="24"/>
+          <w:szCs w:val="24"/>
+          <w:rtl/>
+          <w:lang w:bidi="fa-IR"/>
+        </w:rPr>
+        <w:t>این یعنی</w:t>
+      </w:r>
+      <w:r>
+        <w:rPr>
+          <w:rFonts w:cs="B Nazanin" w:hint="cs"/>
+          <w:sz w:val="24"/>
+          <w:szCs w:val="24"/>
+          <w:rtl/>
+          <w:lang w:bidi="fa-IR"/>
+        </w:rPr>
+        <w:t xml:space="preserve"> در هر بار </w:t>
+      </w:r>
+      <w:r>
+        <w:rPr>
+          <w:rFonts w:cs="B Nazanin"/>
+          <w:sz w:val="24"/>
+          <w:szCs w:val="24"/>
+          <w:lang w:bidi="fa-IR"/>
+        </w:rPr>
+        <w:t>Run</w:t>
+      </w:r>
+      <w:r>
+        <w:rPr>
+          <w:rFonts w:cs="B Nazanin" w:hint="cs"/>
+          <w:sz w:val="24"/>
+          <w:szCs w:val="24"/>
+          <w:rtl/>
+          <w:lang w:bidi="fa-IR"/>
+        </w:rPr>
+        <w:t xml:space="preserve"> از برنامه </w:t>
+      </w:r>
+      <w:r>
+        <w:rPr>
+          <w:rFonts w:cs="B Nazanin"/>
+          <w:sz w:val="24"/>
+          <w:szCs w:val="24"/>
+          <w:lang w:bidi="fa-IR"/>
+        </w:rPr>
+        <w:t xml:space="preserve">Database </w:t>
+      </w:r>
+      <w:r>
+        <w:rPr>
+          <w:rFonts w:cs="B Nazanin" w:hint="cs"/>
+          <w:sz w:val="24"/>
+          <w:szCs w:val="24"/>
+          <w:rtl/>
+          <w:lang w:bidi="fa-IR"/>
+        </w:rPr>
+        <w:t xml:space="preserve"> </w:t>
+      </w:r>
+      <w:r>
+        <w:rPr>
+          <w:rFonts w:cs="B Nazanin"/>
+          <w:sz w:val="24"/>
+          <w:szCs w:val="24"/>
+          <w:rtl/>
+        </w:rPr>
+        <w:t>را بررسی کن و</w:t>
+      </w:r>
+      <w:r>
+        <w:rPr>
+          <w:rFonts w:cs="B Nazanin"/>
+          <w:sz w:val="24"/>
+          <w:szCs w:val="24"/>
+          <w:lang w:bidi="fa-IR"/>
+        </w:rPr>
+        <w:t xml:space="preserve"> Migration</w:t>
+      </w:r>
+      <w:r>
+        <w:rPr>
+          <w:rFonts w:cs="B Nazanin"/>
+          <w:sz w:val="24"/>
+          <w:szCs w:val="24"/>
+          <w:rtl/>
+        </w:rPr>
+        <w:t>های اعمال‌نشده را اعمال کن</w:t>
+      </w:r>
+      <w:r>
+        <w:rPr>
+          <w:rFonts w:cs="B Nazanin"/>
+          <w:sz w:val="24"/>
+          <w:szCs w:val="24"/>
+          <w:lang w:bidi="fa-IR"/>
+        </w:rPr>
+        <w:t>.</w:t>
+      </w:r>
+      <w:r>
+        <w:rPr>
+          <w:rFonts w:cs="B Nazanin" w:hint="cs"/>
+          <w:sz w:val="24"/>
+          <w:szCs w:val="24"/>
+          <w:rtl/>
+          <w:lang w:bidi="fa-IR"/>
+        </w:rPr>
+        <w:t xml:space="preserve"> دقت کن که </w:t>
+      </w:r>
+      <w:r>
+        <w:rPr>
+          <w:rFonts w:cs="B Nazanin"/>
+          <w:sz w:val="24"/>
+          <w:szCs w:val="24"/>
+          <w:lang w:bidi="fa-IR"/>
+        </w:rPr>
+        <w:t>migration</w:t>
+      </w:r>
+      <w:r>
+        <w:rPr>
+          <w:rFonts w:cs="B Nazanin" w:hint="cs"/>
+          <w:sz w:val="24"/>
+          <w:szCs w:val="24"/>
+          <w:rtl/>
+          <w:lang w:bidi="fa-IR"/>
+        </w:rPr>
+        <w:t xml:space="preserve"> های اعمال شده را دیگر اعمال </w:t>
+      </w:r>
+      <w:proofErr w:type="spellStart"/>
+      <w:r>
+        <w:rPr>
+          <w:rFonts w:cs="B Nazanin" w:hint="cs"/>
+          <w:sz w:val="24"/>
+          <w:szCs w:val="24"/>
+          <w:rtl/>
+          <w:lang w:bidi="fa-IR"/>
+        </w:rPr>
+        <w:t>نمی</w:t>
+      </w:r>
+      <w:proofErr w:type="spellEnd"/>
+      <w:r>
+        <w:rPr>
+          <w:rFonts w:cs="B Nazanin" w:hint="cs"/>
+          <w:sz w:val="24"/>
+          <w:szCs w:val="24"/>
+          <w:rtl/>
+          <w:lang w:bidi="fa-IR"/>
+        </w:rPr>
+        <w:t xml:space="preserve"> کند .</w:t>
+      </w:r>
+    </w:p>
+    <w:p>
+      <w:pPr>
+        <w:bidi/>
+        <w:rPr>
+          <w:rFonts w:cs="B Nazanin"/>
+          <w:sz w:val="24"/>
+          <w:szCs w:val="24"/>
+          <w:rtl/>
+          <w:lang w:bidi="fa-IR"/>
+        </w:rPr>
+      </w:pPr>
+    </w:p>
+    <w:p>
+      <w:pPr>
+        <w:bidi/>
+        <w:rPr>
+          <w:rFonts w:cs="B Nazanin"/>
+          <w:b/>
+          <w:bCs/>
+          <w:sz w:val="32"/>
+          <w:szCs w:val="32"/>
+          <w:rtl/>
+        </w:rPr>
+      </w:pPr>
+      <w:r>
+        <w:rPr>
+          <w:rFonts w:cs="B Nazanin"/>
+          <w:b/>
+          <w:bCs/>
+          <w:sz w:val="32"/>
+          <w:szCs w:val="32"/>
+        </w:rPr>
+        <w:t>Generic Constraint</w:t>
+      </w:r>
+    </w:p>
+    <w:p>
+      <w:pPr>
+        <w:bidi/>
+        <w:rPr>
+          <w:rFonts w:cs="B Nazanin"/>
+          <w:sz w:val="24"/>
+          <w:szCs w:val="24"/>
+          <w:lang w:bidi="fa-IR"/>
+        </w:rPr>
+      </w:pPr>
+      <w:r>
+        <w:rPr>
+          <w:rFonts w:cs="B Nazanin" w:hint="cs"/>
+          <w:sz w:val="24"/>
+          <w:szCs w:val="24"/>
+          <w:rtl/>
+          <w:lang w:bidi="fa-IR"/>
+        </w:rPr>
+        <w:t>تفسیر دقیق در کد زیر آورده شده است :</w:t>
+      </w:r>
+    </w:p>
+    <w:p>
+      <w:pPr>
+        <w:autoSpaceDE w:val="0"/>
+        <w:autoSpaceDN w:val="0"/>
+        <w:adjustRightInd w:val="0"/>
+        <w:spacing w:after="0" w:line="240" w:lineRule="auto"/>
+        <w:rPr>
+          <w:rFonts w:ascii="Cascadia Mono" w:hAnsi="Cascadia Mono" w:cs="Cascadia Mono"/>
+          <w:color w:val="000000"/>
+          <w:sz w:val="19"/>
+          <w:szCs w:val="19"/>
+          <w:highlight w:val="white"/>
+        </w:rPr>
+      </w:pPr>
+      <w:r>
+        <w:rPr>
+          <w:rFonts w:ascii="Cascadia Mono" w:hAnsi="Cascadia Mono" w:cs="Cascadia Mono"/>
+          <w:color w:val="000000"/>
+          <w:sz w:val="19"/>
+          <w:szCs w:val="19"/>
+          <w:highlight w:val="white"/>
+        </w:rPr>
         <w:t xml:space="preserve">    </w:t>
       </w:r>
       <w:r>
@@ -9704,6 +10511,7 @@
         </w:rPr>
         <w:t xml:space="preserve"> </w:t>
       </w:r>
+      <w:proofErr w:type="spellStart"/>
       <w:r>
         <w:rPr>
           <w:rFonts w:ascii="Cascadia Mono" w:hAnsi="Cascadia Mono" w:cs="Cascadia Mono"/>
@@ -9714,6 +10522,7 @@
         </w:rPr>
         <w:t>IGenericRepository</w:t>
       </w:r>
+      <w:proofErr w:type="spellEnd"/>
       <w:r>
         <w:rPr>
           <w:rFonts w:ascii="Cascadia Mono" w:hAnsi="Cascadia Mono" w:cs="Cascadia Mono"/>
@@ -9805,6 +10614,7 @@
         </w:rPr>
         <w:t xml:space="preserve"> : </w:t>
       </w:r>
+      <w:proofErr w:type="spellStart"/>
       <w:r>
         <w:rPr>
           <w:rFonts w:ascii="Cascadia Mono" w:hAnsi="Cascadia Mono" w:cs="Cascadia Mono"/>
@@ -9815,6 +10625,7 @@
         </w:rPr>
         <w:t>BaseEntity</w:t>
       </w:r>
+      <w:proofErr w:type="spellEnd"/>
     </w:p>
     <w:p>
       <w:pPr>
@@ -9877,6 +10688,7 @@
         </w:rPr>
         <w:t xml:space="preserve"> به شرط آن که حتما یا </w:t>
       </w:r>
+      <w:proofErr w:type="spellStart"/>
       <w:r>
         <w:rPr>
           <w:rFonts w:cs="B Nazanin"/>
@@ -9886,6 +10698,7 @@
         </w:rPr>
         <w:t>baseEntity</w:t>
       </w:r>
+      <w:proofErr w:type="spellEnd"/>
       <w:r>
         <w:rPr>
           <w:rFonts w:cs="B Nazanin" w:hint="cs"/>
@@ -9916,6 +10729,7 @@
         </w:rPr>
         <w:t xml:space="preserve"> مثلا در مثال بالا چه کلاسی از </w:t>
       </w:r>
+      <w:proofErr w:type="spellStart"/>
       <w:r>
         <w:rPr>
           <w:rFonts w:cs="B Nazanin"/>
@@ -9925,6 +10739,7 @@
         </w:rPr>
         <w:t>baseentity</w:t>
       </w:r>
+      <w:proofErr w:type="spellEnd"/>
       <w:r>
         <w:rPr>
           <w:rFonts w:cs="B Nazanin" w:hint="cs"/>
@@ -10146,7 +10961,29 @@
           <w:szCs w:val="19"/>
           <w:highlight w:val="white"/>
         </w:rPr>
-        <w:t xml:space="preserve">        context.Set&lt;</w:t>
+        <w:t xml:space="preserve">        </w:t>
+      </w:r>
+      <w:proofErr w:type="spellStart"/>
+      <w:r>
+        <w:rPr>
+          <w:rFonts w:ascii="Cascadia Mono" w:hAnsi="Cascadia Mono" w:cs="Cascadia Mono"/>
+          <w:color w:val="000000"/>
+          <w:sz w:val="19"/>
+          <w:szCs w:val="19"/>
+          <w:highlight w:val="white"/>
+        </w:rPr>
+        <w:t>context.Set</w:t>
+      </w:r>
+      <w:proofErr w:type="spellEnd"/>
+      <w:r>
+        <w:rPr>
+          <w:rFonts w:ascii="Cascadia Mono" w:hAnsi="Cascadia Mono" w:cs="Cascadia Mono"/>
+          <w:color w:val="000000"/>
+          <w:sz w:val="19"/>
+          <w:szCs w:val="19"/>
+          <w:highlight w:val="white"/>
+        </w:rPr>
+        <w:t>&lt;</w:t>
       </w:r>
       <w:r>
         <w:rPr>
@@ -10245,6 +11082,7 @@
         </w:rPr>
         <w:t xml:space="preserve"> دیدیم یعنی </w:t>
       </w:r>
+      <w:proofErr w:type="spellStart"/>
       <w:r>
         <w:rPr>
           <w:rFonts w:cs="B Nazanin"/>
@@ -10254,6 +11092,7 @@
         </w:rPr>
         <w:t>dbset</w:t>
       </w:r>
+      <w:proofErr w:type="spellEnd"/>
       <w:r>
         <w:rPr>
           <w:rFonts w:cs="B Nazanin" w:hint="cs"/>
@@ -10361,6 +11200,7 @@
         </w:rPr>
         <w:t xml:space="preserve"> به عنوان یک </w:t>
       </w:r>
+      <w:proofErr w:type="spellStart"/>
       <w:r>
         <w:rPr>
           <w:rFonts w:cs="B Nazanin"/>
@@ -10370,6 +11210,7 @@
         </w:rPr>
         <w:t>anti pattern</w:t>
       </w:r>
+      <w:proofErr w:type="spellEnd"/>
       <w:r>
         <w:rPr>
           <w:rFonts w:cs="B Nazanin" w:hint="cs"/>
@@ -10519,6 +11360,7 @@
           <w:lang w:bidi="fa-IR"/>
         </w:rPr>
       </w:pPr>
+      <w:proofErr w:type="spellStart"/>
       <w:r>
         <w:rPr>
           <w:rFonts w:cs="B Nazanin"/>
@@ -10528,6 +11370,7 @@
         </w:rPr>
         <w:t>Func</w:t>
       </w:r>
+      <w:proofErr w:type="spellEnd"/>
     </w:p>
     <w:p>
       <w:pPr>
@@ -10550,30 +11393,32 @@
         </w:rPr>
         <w:t>در واقع</w:t>
       </w:r>
-      <w:r>
-        <w:rPr>
-          <w:rFonts w:cs="B Nazanin"/>
-          <w:sz w:val="24"/>
-          <w:szCs w:val="24"/>
-          <w:lang w:bidi="fa-IR"/>
-        </w:rPr>
-        <w:t xml:space="preserve">Func </w:t>
-      </w:r>
-      <w:r>
-        <w:rPr>
-          <w:rFonts w:cs="B Nazanin" w:hint="cs"/>
-          <w:sz w:val="24"/>
-          <w:szCs w:val="24"/>
-          <w:rtl/>
+      <w:proofErr w:type="spellStart"/>
+      <w:r>
+        <w:rPr>
+          <w:rFonts w:cs="B Nazanin"/>
+          <w:sz w:val="24"/>
+          <w:szCs w:val="24"/>
+          <w:lang w:bidi="fa-IR"/>
+        </w:rPr>
+        <w:t>Func</w:t>
+      </w:r>
+      <w:proofErr w:type="spellEnd"/>
+      <w:r>
+        <w:rPr>
+          <w:rFonts w:cs="B Nazanin"/>
+          <w:sz w:val="24"/>
+          <w:szCs w:val="24"/>
           <w:lang w:bidi="fa-IR"/>
         </w:rPr>
         <w:t xml:space="preserve"> </w:t>
       </w:r>
       <w:r>
         <w:rPr>
-          <w:rFonts w:cs="B Nazanin"/>
-          <w:sz w:val="24"/>
-          <w:szCs w:val="24"/>
+          <w:rFonts w:cs="B Nazanin" w:hint="cs"/>
+          <w:sz w:val="24"/>
+          <w:szCs w:val="24"/>
+          <w:rtl/>
           <w:lang w:bidi="fa-IR"/>
         </w:rPr>
         <w:t xml:space="preserve"> </w:t>
@@ -10583,6 +11428,15 @@
           <w:rFonts w:cs="B Nazanin"/>
           <w:sz w:val="24"/>
           <w:szCs w:val="24"/>
+          <w:lang w:bidi="fa-IR"/>
+        </w:rPr>
+        <w:t xml:space="preserve"> </w:t>
+      </w:r>
+      <w:r>
+        <w:rPr>
+          <w:rFonts w:cs="B Nazanin"/>
+          <w:sz w:val="24"/>
+          <w:szCs w:val="24"/>
           <w:rtl/>
           <w:lang w:bidi="fa-IR"/>
         </w:rPr>
@@ -10643,8 +11497,86 @@
           <w:rtl/>
           <w:lang w:bidi="fa-IR"/>
         </w:rPr>
-        <w:t>است که برای نگه‌داشتن تابع‌هایی استفاده می‌شود که مقدار برمی‌گردانند</w:t>
-      </w:r>
+        <w:t xml:space="preserve">است که برای </w:t>
+      </w:r>
+      <w:proofErr w:type="spellStart"/>
+      <w:r>
+        <w:rPr>
+          <w:rFonts w:cs="B Nazanin"/>
+          <w:sz w:val="24"/>
+          <w:szCs w:val="24"/>
+          <w:rtl/>
+          <w:lang w:bidi="fa-IR"/>
+        </w:rPr>
+        <w:t>نگه‌داشتن</w:t>
+      </w:r>
+      <w:proofErr w:type="spellEnd"/>
+      <w:r>
+        <w:rPr>
+          <w:rFonts w:cs="B Nazanin"/>
+          <w:sz w:val="24"/>
+          <w:szCs w:val="24"/>
+          <w:rtl/>
+          <w:lang w:bidi="fa-IR"/>
+        </w:rPr>
+        <w:t xml:space="preserve"> </w:t>
+      </w:r>
+      <w:proofErr w:type="spellStart"/>
+      <w:r>
+        <w:rPr>
+          <w:rFonts w:cs="B Nazanin"/>
+          <w:sz w:val="24"/>
+          <w:szCs w:val="24"/>
+          <w:rtl/>
+          <w:lang w:bidi="fa-IR"/>
+        </w:rPr>
+        <w:t>تابع‌هایی</w:t>
+      </w:r>
+      <w:proofErr w:type="spellEnd"/>
+      <w:r>
+        <w:rPr>
+          <w:rFonts w:cs="B Nazanin"/>
+          <w:sz w:val="24"/>
+          <w:szCs w:val="24"/>
+          <w:rtl/>
+          <w:lang w:bidi="fa-IR"/>
+        </w:rPr>
+        <w:t xml:space="preserve"> استفاده </w:t>
+      </w:r>
+      <w:proofErr w:type="spellStart"/>
+      <w:r>
+        <w:rPr>
+          <w:rFonts w:cs="B Nazanin"/>
+          <w:sz w:val="24"/>
+          <w:szCs w:val="24"/>
+          <w:rtl/>
+          <w:lang w:bidi="fa-IR"/>
+        </w:rPr>
+        <w:t>می‌شود</w:t>
+      </w:r>
+      <w:proofErr w:type="spellEnd"/>
+      <w:r>
+        <w:rPr>
+          <w:rFonts w:cs="B Nazanin"/>
+          <w:sz w:val="24"/>
+          <w:szCs w:val="24"/>
+          <w:rtl/>
+          <w:lang w:bidi="fa-IR"/>
+        </w:rPr>
+        <w:t xml:space="preserve"> که مقدار </w:t>
+      </w:r>
+      <w:proofErr w:type="spellStart"/>
+      <w:r>
+        <w:rPr>
+          <w:rFonts w:cs="B Nazanin"/>
+          <w:sz w:val="24"/>
+          <w:szCs w:val="24"/>
+          <w:rtl/>
+          <w:lang w:bidi="fa-IR"/>
+        </w:rPr>
+        <w:t>برمی‌گردانند</w:t>
+      </w:r>
+      <w:proofErr w:type="spellEnd"/>
       <w:r>
         <w:rPr>
           <w:rFonts w:cs="B Nazanin"/>
@@ -10662,26 +11594,59 @@
           <w:rtl/>
           <w:lang w:bidi="fa-IR"/>
         </w:rPr>
-        <w:t xml:space="preserve"> سینتکس آن به شرح ذیل است :</w:t>
-      </w:r>
-    </w:p>
-    <w:p>
-      <w:pPr>
-        <w:rPr>
-          <w:rFonts w:cs="B Nazanin"/>
-          <w:sz w:val="24"/>
-          <w:szCs w:val="24"/>
-          <w:lang w:bidi="fa-IR"/>
-        </w:rPr>
-      </w:pPr>
-      <w:r>
-        <w:rPr>
-          <w:rFonts w:cs="B Nazanin"/>
-          <w:sz w:val="24"/>
-          <w:szCs w:val="24"/>
-          <w:lang w:bidi="fa-IR"/>
-        </w:rPr>
-        <w:t>Func&lt;input 1 , input 2 , …. , Output&gt; name = lambda expression</w:t>
+        <w:t xml:space="preserve"> </w:t>
+      </w:r>
+      <w:proofErr w:type="spellStart"/>
+      <w:r>
+        <w:rPr>
+          <w:rFonts w:cs="B Nazanin" w:hint="cs"/>
+          <w:sz w:val="24"/>
+          <w:szCs w:val="24"/>
+          <w:rtl/>
+          <w:lang w:bidi="fa-IR"/>
+        </w:rPr>
+        <w:t>سینتکس</w:t>
+      </w:r>
+      <w:proofErr w:type="spellEnd"/>
+      <w:r>
+        <w:rPr>
+          <w:rFonts w:cs="B Nazanin" w:hint="cs"/>
+          <w:sz w:val="24"/>
+          <w:szCs w:val="24"/>
+          <w:rtl/>
+          <w:lang w:bidi="fa-IR"/>
+        </w:rPr>
+        <w:t xml:space="preserve"> آن به شرح ذیل است :</w:t>
+      </w:r>
+    </w:p>
+    <w:p>
+      <w:pPr>
+        <w:rPr>
+          <w:rFonts w:cs="B Nazanin"/>
+          <w:sz w:val="24"/>
+          <w:szCs w:val="24"/>
+          <w:lang w:bidi="fa-IR"/>
+        </w:rPr>
+      </w:pPr>
+      <w:proofErr w:type="spellStart"/>
+      <w:r>
+        <w:rPr>
+          <w:rFonts w:cs="B Nazanin"/>
+          <w:sz w:val="24"/>
+          <w:szCs w:val="24"/>
+          <w:lang w:bidi="fa-IR"/>
+        </w:rPr>
+        <w:t>Func</w:t>
+      </w:r>
+      <w:proofErr w:type="spellEnd"/>
+      <w:r>
+        <w:rPr>
+          <w:rFonts w:cs="B Nazanin"/>
+          <w:sz w:val="24"/>
+          <w:szCs w:val="24"/>
+          <w:lang w:bidi="fa-IR"/>
+        </w:rPr>
+        <w:t>&lt;input 1 , input 2 , …. , Output&gt; name = lambda expression</w:t>
       </w:r>
     </w:p>
     <w:p>
@@ -10722,14 +11687,25 @@
           <w:lang w:bidi="fa-IR"/>
         </w:rPr>
       </w:pPr>
-      <w:r>
-        <w:rPr>
-          <w:rFonts w:cs="B Nazanin"/>
-          <w:sz w:val="24"/>
-          <w:szCs w:val="24"/>
-          <w:lang w:bidi="fa-IR"/>
-        </w:rPr>
-        <w:t xml:space="preserve">Func&lt;int, bool&gt; condition = x =&gt; x &gt; 1000; </w:t>
+      <w:proofErr w:type="spellStart"/>
+      <w:r>
+        <w:rPr>
+          <w:rFonts w:cs="B Nazanin"/>
+          <w:sz w:val="24"/>
+          <w:szCs w:val="24"/>
+          <w:lang w:bidi="fa-IR"/>
+        </w:rPr>
+        <w:t>Func</w:t>
+      </w:r>
+      <w:proofErr w:type="spellEnd"/>
+      <w:r>
+        <w:rPr>
+          <w:rFonts w:cs="B Nazanin"/>
+          <w:sz w:val="24"/>
+          <w:szCs w:val="24"/>
+          <w:lang w:bidi="fa-IR"/>
+        </w:rPr>
+        <w:t xml:space="preserve">&lt;int, bool&gt; condition = x =&gt; x &gt; 1000; </w:t>
       </w:r>
       <w:r>
         <w:rPr>
@@ -10844,7 +11820,27 @@
           <w:szCs w:val="24"/>
           <w:lang w:bidi="fa-IR"/>
         </w:rPr>
-        <w:t>Expression&lt;Func&gt;</w:t>
+        <w:t>Expression&lt;</w:t>
+      </w:r>
+      <w:proofErr w:type="spellStart"/>
+      <w:r>
+        <w:rPr>
+          <w:rFonts w:cs="B Nazanin"/>
+          <w:sz w:val="24"/>
+          <w:szCs w:val="24"/>
+          <w:lang w:bidi="fa-IR"/>
+        </w:rPr>
+        <w:t>Func</w:t>
+      </w:r>
+      <w:proofErr w:type="spellEnd"/>
+      <w:r>
+        <w:rPr>
+          <w:rFonts w:cs="B Nazanin"/>
+          <w:sz w:val="24"/>
+          <w:szCs w:val="24"/>
+          <w:lang w:bidi="fa-IR"/>
+        </w:rPr>
+        <w:t>&gt;</w:t>
       </w:r>
     </w:p>
     <w:p>
@@ -10961,7 +11957,27 @@
           <w:szCs w:val="24"/>
           <w:lang w:bidi="fa-IR"/>
         </w:rPr>
-        <w:t>Expression&lt;Func&lt;int, bool&gt;&gt; expression = x =&gt; x &gt; 1000;</w:t>
+        <w:t>Expression&lt;</w:t>
+      </w:r>
+      <w:proofErr w:type="spellStart"/>
+      <w:r>
+        <w:rPr>
+          <w:rFonts w:cs="B Nazanin"/>
+          <w:sz w:val="24"/>
+          <w:szCs w:val="24"/>
+          <w:lang w:bidi="fa-IR"/>
+        </w:rPr>
+        <w:t>Func</w:t>
+      </w:r>
+      <w:proofErr w:type="spellEnd"/>
+      <w:r>
+        <w:rPr>
+          <w:rFonts w:cs="B Nazanin"/>
+          <w:sz w:val="24"/>
+          <w:szCs w:val="24"/>
+          <w:lang w:bidi="fa-IR"/>
+        </w:rPr>
+        <w:t>&lt;int, bool&gt;&gt; expression = x =&gt; x &gt; 1000;</w:t>
       </w:r>
     </w:p>
     <w:p>
@@ -11089,7 +12105,29 @@
           <w:rtl/>
           <w:lang w:bidi="fa-IR"/>
         </w:rPr>
-        <w:t xml:space="preserve"> این ساختار را بررسی می کند و آن را تبدیل به یک کوئری </w:t>
+        <w:t xml:space="preserve"> این ساختار را بررسی می کند و آن را تبدیل به یک </w:t>
+      </w:r>
+      <w:proofErr w:type="spellStart"/>
+      <w:r>
+        <w:rPr>
+          <w:rFonts w:cs="B Nazanin" w:hint="cs"/>
+          <w:sz w:val="24"/>
+          <w:szCs w:val="24"/>
+          <w:rtl/>
+          <w:lang w:bidi="fa-IR"/>
+        </w:rPr>
+        <w:t>کوئری</w:t>
+      </w:r>
+      <w:proofErr w:type="spellEnd"/>
+      <w:r>
+        <w:rPr>
+          <w:rFonts w:cs="B Nazanin" w:hint="cs"/>
+          <w:sz w:val="24"/>
+          <w:szCs w:val="24"/>
+          <w:rtl/>
+          <w:lang w:bidi="fa-IR"/>
+        </w:rPr>
+        <w:t xml:space="preserve"> </w:t>
       </w:r>
       <w:r>
         <w:rPr>
@@ -11261,7 +12299,29 @@
           <w:rtl/>
           <w:lang w:bidi="fa-IR"/>
         </w:rPr>
-        <w:t xml:space="preserve"> انجام می شود . ما می توانیم تمام 10000 رکورد دیتابیس خود را (مثلا برای محصولات) برای کاربر ارسال کنیم ولی تاخیر شبکه بسیار بالا می رود .</w:t>
+        <w:t xml:space="preserve"> انجام می شود . ما می توانیم تمام 10000 رکورد </w:t>
+      </w:r>
+      <w:proofErr w:type="spellStart"/>
+      <w:r>
+        <w:rPr>
+          <w:rFonts w:cs="B Nazanin" w:hint="cs"/>
+          <w:sz w:val="24"/>
+          <w:szCs w:val="24"/>
+          <w:rtl/>
+          <w:lang w:bidi="fa-IR"/>
+        </w:rPr>
+        <w:t>دیتابیس</w:t>
+      </w:r>
+      <w:proofErr w:type="spellEnd"/>
+      <w:r>
+        <w:rPr>
+          <w:rFonts w:cs="B Nazanin" w:hint="cs"/>
+          <w:sz w:val="24"/>
+          <w:szCs w:val="24"/>
+          <w:rtl/>
+          <w:lang w:bidi="fa-IR"/>
+        </w:rPr>
+        <w:t xml:space="preserve"> خود را (مثلا برای محصولات) برای کاربر ارسال کنیم ولی تاخیر شبکه بسیار بالا می رود .</w:t>
       </w:r>
     </w:p>
     <w:p>
@@ -11309,10 +12369,9 @@
       <w:pPr>
         <w:bidi/>
         <w:rPr>
-          <w:rFonts w:cs="B Nazanin" w:hint="cs"/>
-          <w:sz w:val="24"/>
-          <w:szCs w:val="24"/>
-          <w:rtl/>
+          <w:rFonts w:cs="B Nazanin"/>
+          <w:sz w:val="24"/>
+          <w:szCs w:val="24"/>
           <w:lang w:bidi="fa-IR"/>
         </w:rPr>
       </w:pPr>
@@ -11326,6 +12385,7 @@
         </w:rPr>
         <w:t xml:space="preserve">مفاهیم </w:t>
       </w:r>
+      <w:proofErr w:type="spellStart"/>
       <w:r>
         <w:rPr>
           <w:rFonts w:cs="B Nazanin"/>
@@ -11335,6 +12395,7 @@
         </w:rPr>
         <w:t>PageSize</w:t>
       </w:r>
+      <w:proofErr w:type="spellEnd"/>
       <w:r>
         <w:rPr>
           <w:rFonts w:cs="B Nazanin" w:hint="cs"/>
@@ -11345,6 +12406,7 @@
         </w:rPr>
         <w:t xml:space="preserve"> و </w:t>
       </w:r>
+      <w:proofErr w:type="spellStart"/>
       <w:r>
         <w:rPr>
           <w:rFonts w:cs="B Nazanin"/>
@@ -11354,6 +12416,7 @@
         </w:rPr>
         <w:t>PageNumber</w:t>
       </w:r>
+      <w:proofErr w:type="spellEnd"/>
       <w:r>
         <w:rPr>
           <w:rFonts w:cs="B Nazanin" w:hint="cs"/>
@@ -11364,6 +12427,7 @@
         </w:rPr>
         <w:t xml:space="preserve"> در اینجا کاربردی هستند . مثلا اگر </w:t>
       </w:r>
+      <w:proofErr w:type="spellStart"/>
       <w:r>
         <w:rPr>
           <w:rFonts w:cs="B Nazanin"/>
@@ -11373,6 +12437,7 @@
         </w:rPr>
         <w:t>PageSize</w:t>
       </w:r>
+      <w:proofErr w:type="spellEnd"/>
       <w:r>
         <w:rPr>
           <w:rFonts w:cs="B Nazanin"/>
@@ -11392,6 +12457,7 @@
         </w:rPr>
         <w:t xml:space="preserve"> باشد و </w:t>
       </w:r>
+      <w:proofErr w:type="spellStart"/>
       <w:r>
         <w:rPr>
           <w:rFonts w:cs="B Nazanin"/>
@@ -11401,6 +12467,7 @@
         </w:rPr>
         <w:t>PageNumber</w:t>
       </w:r>
+      <w:proofErr w:type="spellEnd"/>
       <w:r>
         <w:rPr>
           <w:rFonts w:cs="B Nazanin"/>
@@ -11450,179 +12517,381 @@
           <w:rFonts w:cs="B Nazanin"/>
           <w:sz w:val="24"/>
           <w:szCs w:val="24"/>
-          <w:rtl/>
-          <w:lang w:bidi="fa-IR"/>
-        </w:rPr>
-      </w:pPr>
-    </w:p>
-    <w:p>
-      <w:pPr>
-        <w:bidi/>
+          <w:lang w:bidi="fa-IR"/>
+        </w:rPr>
+      </w:pPr>
+    </w:p>
+    <w:p>
+      <w:pPr>
+        <w:bidi/>
+        <w:rPr>
+          <w:rFonts w:cs="B Nazanin"/>
+          <w:sz w:val="24"/>
+          <w:szCs w:val="24"/>
+          <w:lang w:bidi="fa-IR"/>
+        </w:rPr>
+      </w:pPr>
+    </w:p>
+    <w:p>
+      <w:pPr>
+        <w:bidi/>
+        <w:rPr>
+          <w:rFonts w:cs="B Nazanin"/>
+          <w:sz w:val="24"/>
+          <w:szCs w:val="24"/>
+          <w:lang w:bidi="fa-IR"/>
+        </w:rPr>
+      </w:pPr>
+    </w:p>
+    <w:p>
+      <w:pPr>
+        <w:bidi/>
+        <w:rPr>
+          <w:rFonts w:cs="B Nazanin" w:hint="cs"/>
+          <w:sz w:val="24"/>
+          <w:szCs w:val="24"/>
+          <w:rtl/>
+          <w:lang w:bidi="fa-IR"/>
+        </w:rPr>
+      </w:pPr>
+    </w:p>
+    <w:p>
+      <w:pPr>
+        <w:bidi/>
+        <w:jc w:val="center"/>
         <w:rPr>
           <w:rFonts w:cs="B Nazanin"/>
           <w:b/>
           <w:bCs/>
-          <w:sz w:val="40"/>
-          <w:szCs w:val="40"/>
-          <w:lang w:bidi="fa-IR"/>
-        </w:rPr>
-      </w:pPr>
-      <w:r>
-        <w:rPr>
-          <w:rFonts w:cs="B Nazanin" w:hint="cs"/>
+          <w:sz w:val="36"/>
+          <w:szCs w:val="36"/>
+          <w:lang w:bidi="fa-IR"/>
+        </w:rPr>
+      </w:pPr>
+      <w:r>
+        <w:rPr>
+          <w:rFonts w:cs="B Nazanin"/>
           <w:b/>
           <w:bCs/>
-          <w:sz w:val="40"/>
-          <w:szCs w:val="40"/>
-          <w:rtl/>
-          <w:lang w:bidi="fa-IR"/>
-        </w:rPr>
-        <w:t xml:space="preserve">سوالات </w:t>
-      </w:r>
-    </w:p>
-    <w:p>
-      <w:pPr>
-        <w:bidi/>
-        <w:rPr>
-          <w:rFonts w:cs="B Nazanin"/>
+          <w:sz w:val="36"/>
+          <w:szCs w:val="36"/>
+          <w:lang w:bidi="fa-IR"/>
+        </w:rPr>
+        <w:t>--------------------</w:t>
+      </w:r>
+      <w:r>
+        <w:rPr>
+          <w:rFonts w:cs="B Nazanin" w:hint="cs"/>
           <w:b/>
           <w:bCs/>
-          <w:sz w:val="40"/>
-          <w:szCs w:val="40"/>
-          <w:rtl/>
-          <w:lang w:bidi="fa-IR"/>
-        </w:rPr>
-      </w:pPr>
-    </w:p>
-    <w:p>
-      <w:pPr>
-        <w:pStyle w:val="ListParagraph"/>
-        <w:numPr>
-          <w:ilvl w:val="0"/>
-          <w:numId w:val="1"/>
-        </w:numPr>
-        <w:bidi/>
-        <w:rPr>
-          <w:rFonts w:cs="B Nazanin"/>
-          <w:sz w:val="24"/>
-          <w:szCs w:val="24"/>
-          <w:lang w:bidi="fa-IR"/>
-        </w:rPr>
-      </w:pPr>
-      <w:r>
-        <w:rPr>
-          <w:rFonts w:cs="B Nazanin" w:hint="cs"/>
-          <w:sz w:val="24"/>
-          <w:szCs w:val="24"/>
-          <w:rtl/>
-          <w:lang w:bidi="fa-IR"/>
-        </w:rPr>
-        <w:t xml:space="preserve">اگر </w:t>
-      </w:r>
-      <w:r>
-        <w:rPr>
-          <w:rFonts w:cs="B Nazanin"/>
-          <w:sz w:val="24"/>
-          <w:szCs w:val="24"/>
-          <w:lang w:bidi="fa-IR"/>
-        </w:rPr>
-        <w:t>Route</w:t>
-      </w:r>
-      <w:r>
-        <w:rPr>
-          <w:rFonts w:cs="B Nazanin" w:hint="cs"/>
-          <w:sz w:val="24"/>
-          <w:szCs w:val="24"/>
-          <w:rtl/>
-          <w:lang w:bidi="fa-IR"/>
-        </w:rPr>
-        <w:t xml:space="preserve"> یک درخواست </w:t>
-      </w:r>
-      <w:r>
-        <w:rPr>
-          <w:rFonts w:cs="B Nazanin"/>
-          <w:sz w:val="24"/>
-          <w:szCs w:val="24"/>
-          <w:lang w:bidi="fa-IR"/>
-        </w:rPr>
-        <w:t>post</w:t>
-      </w:r>
-      <w:r>
-        <w:rPr>
-          <w:rFonts w:cs="B Nazanin" w:hint="cs"/>
-          <w:sz w:val="24"/>
-          <w:szCs w:val="24"/>
-          <w:rtl/>
-          <w:lang w:bidi="fa-IR"/>
-        </w:rPr>
-        <w:t xml:space="preserve"> باشد و ما در </w:t>
-      </w:r>
-      <w:r>
-        <w:rPr>
-          <w:rFonts w:cs="B Nazanin"/>
-          <w:sz w:val="24"/>
-          <w:szCs w:val="24"/>
-          <w:lang w:bidi="fa-IR"/>
-        </w:rPr>
-        <w:t>api</w:t>
-      </w:r>
-      <w:r>
-        <w:rPr>
-          <w:rFonts w:cs="B Nazanin" w:hint="cs"/>
-          <w:sz w:val="24"/>
-          <w:szCs w:val="24"/>
-          <w:rtl/>
-          <w:lang w:bidi="fa-IR"/>
-        </w:rPr>
-        <w:t xml:space="preserve"> مثلا دو متد </w:t>
-      </w:r>
-      <w:r>
-        <w:rPr>
-          <w:rFonts w:cs="B Nazanin"/>
-          <w:sz w:val="24"/>
-          <w:szCs w:val="24"/>
-          <w:lang w:bidi="fa-IR"/>
-        </w:rPr>
-        <w:t>post</w:t>
-      </w:r>
-      <w:r>
-        <w:rPr>
-          <w:rFonts w:cs="B Nazanin" w:hint="cs"/>
-          <w:sz w:val="24"/>
-          <w:szCs w:val="24"/>
-          <w:rtl/>
-          <w:lang w:bidi="fa-IR"/>
-        </w:rPr>
-        <w:t xml:space="preserve"> داشته باشیم که دارای </w:t>
-      </w:r>
-      <w:r>
-        <w:rPr>
-          <w:rFonts w:cs="B Nazanin"/>
-          <w:sz w:val="24"/>
-          <w:szCs w:val="24"/>
-          <w:lang w:bidi="fa-IR"/>
-        </w:rPr>
-        <w:t>route</w:t>
-      </w:r>
-      <w:r>
-        <w:rPr>
-          <w:rFonts w:cs="B Nazanin" w:hint="cs"/>
-          <w:sz w:val="24"/>
-          <w:szCs w:val="24"/>
-          <w:rtl/>
-          <w:lang w:bidi="fa-IR"/>
-        </w:rPr>
-        <w:t xml:space="preserve"> مشخص هستند آنگاه به کدام ارجاع داده می شود ؟</w:t>
-      </w:r>
-    </w:p>
-    <w:p>
-      <w:pPr>
-        <w:bidi/>
-        <w:rPr>
-          <w:rFonts w:cs="B Nazanin"/>
-          <w:sz w:val="24"/>
-          <w:szCs w:val="24"/>
-          <w:rtl/>
+          <w:sz w:val="36"/>
+          <w:szCs w:val="36"/>
+          <w:rtl/>
+          <w:lang w:bidi="fa-IR"/>
+        </w:rPr>
+        <w:t>مدیریت خطا در</w:t>
+      </w:r>
+      <w:r>
+        <w:rPr>
+          <w:rFonts w:cs="B Nazanin"/>
+          <w:b/>
+          <w:bCs/>
+          <w:sz w:val="36"/>
+          <w:szCs w:val="36"/>
+          <w:lang w:bidi="fa-IR"/>
+        </w:rPr>
+        <w:t xml:space="preserve"> API </w:t>
+      </w:r>
+      <w:r>
+        <w:rPr>
+          <w:rFonts w:cs="B Nazanin" w:hint="cs"/>
+          <w:b/>
+          <w:bCs/>
+          <w:sz w:val="36"/>
+          <w:szCs w:val="36"/>
+          <w:rtl/>
+          <w:lang w:bidi="fa-IR"/>
+        </w:rPr>
+        <w:t xml:space="preserve"> </w:t>
+      </w:r>
+      <w:r>
+        <w:rPr>
+          <w:rFonts w:cs="B Nazanin"/>
+          <w:b/>
+          <w:bCs/>
+          <w:sz w:val="36"/>
+          <w:szCs w:val="36"/>
+          <w:lang w:bidi="fa-IR"/>
+        </w:rPr>
+        <w:t>--------------------</w:t>
+      </w:r>
+    </w:p>
+    <w:p>
+      <w:pPr>
+        <w:bidi/>
+        <w:jc w:val="center"/>
+        <w:rPr>
+          <w:rFonts w:cs="B Nazanin"/>
+          <w:b/>
+          <w:bCs/>
+          <w:sz w:val="36"/>
+          <w:szCs w:val="36"/>
+          <w:rtl/>
+          <w:lang w:bidi="fa-IR"/>
+        </w:rPr>
+      </w:pPr>
+      <w:r>
+        <w:rPr>
+          <w:rFonts w:cs="B Nazanin"/>
+          <w:b/>
+          <w:bCs/>
+          <w:sz w:val="36"/>
+          <w:szCs w:val="36"/>
+          <w:lang w:bidi="fa-IR"/>
+        </w:rPr>
+        <w:t>---------------------</w:t>
+      </w:r>
+      <w:r>
+        <w:rPr>
+          <w:rFonts w:cs="B Nazanin" w:hint="cs"/>
+          <w:b/>
+          <w:bCs/>
+          <w:sz w:val="36"/>
+          <w:szCs w:val="36"/>
+          <w:rtl/>
+          <w:lang w:bidi="fa-IR"/>
+        </w:rPr>
+        <w:t>مقدمه</w:t>
+      </w:r>
+      <w:r>
+        <w:rPr>
+          <w:rFonts w:cs="B Nazanin"/>
+          <w:b/>
+          <w:bCs/>
+          <w:sz w:val="36"/>
+          <w:szCs w:val="36"/>
+          <w:lang w:bidi="fa-IR"/>
+        </w:rPr>
+        <w:t>---------------------</w:t>
+      </w:r>
+    </w:p>
+    <w:p>
+      <w:pPr>
+        <w:bidi/>
+        <w:rPr>
+          <w:rFonts w:cs="B Nazanin"/>
+          <w:b/>
+          <w:bCs/>
+          <w:sz w:val="36"/>
+          <w:szCs w:val="36"/>
+          <w:lang w:bidi="fa-IR"/>
+        </w:rPr>
+      </w:pPr>
+      <w:r>
+        <w:rPr>
+          <w:rFonts w:cs="B Nazanin"/>
+          <w:b/>
+          <w:bCs/>
+          <w:sz w:val="36"/>
+          <w:szCs w:val="36"/>
+          <w:lang w:bidi="fa-IR"/>
+        </w:rPr>
+        <w:t>CORS</w:t>
+      </w:r>
+    </w:p>
+    <w:p>
+      <w:pPr>
+        <w:bidi/>
+        <w:rPr>
+          <w:rFonts w:cs="B Nazanin"/>
+          <w:sz w:val="24"/>
+          <w:szCs w:val="24"/>
+          <w:rtl/>
+          <w:lang w:bidi="fa-IR"/>
+        </w:rPr>
+      </w:pPr>
+      <w:r>
+        <w:rPr>
+          <w:rFonts w:cs="B Nazanin" w:hint="cs"/>
+          <w:sz w:val="24"/>
+          <w:szCs w:val="24"/>
+          <w:rtl/>
+          <w:lang w:bidi="fa-IR"/>
+        </w:rPr>
+        <w:t xml:space="preserve">اگر دامنه یا </w:t>
+      </w:r>
+      <w:r>
+        <w:rPr>
+          <w:rFonts w:cs="B Nazanin"/>
+          <w:sz w:val="24"/>
+          <w:szCs w:val="24"/>
+          <w:lang w:bidi="fa-IR"/>
+        </w:rPr>
+        <w:t>URL Address</w:t>
+      </w:r>
+      <w:r>
+        <w:rPr>
+          <w:rFonts w:cs="B Nazanin" w:hint="cs"/>
+          <w:sz w:val="24"/>
+          <w:szCs w:val="24"/>
+          <w:rtl/>
+          <w:lang w:bidi="fa-IR"/>
+        </w:rPr>
+        <w:t xml:space="preserve"> </w:t>
+      </w:r>
+      <w:proofErr w:type="spellStart"/>
+      <w:r>
+        <w:rPr>
+          <w:rFonts w:cs="B Nazanin" w:hint="cs"/>
+          <w:sz w:val="24"/>
+          <w:szCs w:val="24"/>
+          <w:rtl/>
+          <w:lang w:bidi="fa-IR"/>
+        </w:rPr>
+        <w:t>بک</w:t>
+      </w:r>
+      <w:proofErr w:type="spellEnd"/>
+      <w:r>
+        <w:rPr>
+          <w:rFonts w:cs="B Nazanin" w:hint="cs"/>
+          <w:sz w:val="24"/>
+          <w:szCs w:val="24"/>
+          <w:rtl/>
+          <w:lang w:bidi="fa-IR"/>
+        </w:rPr>
+        <w:t xml:space="preserve"> و </w:t>
+      </w:r>
+      <w:proofErr w:type="spellStart"/>
+      <w:r>
+        <w:rPr>
+          <w:rFonts w:cs="B Nazanin" w:hint="cs"/>
+          <w:sz w:val="24"/>
+          <w:szCs w:val="24"/>
+          <w:rtl/>
+          <w:lang w:bidi="fa-IR"/>
+        </w:rPr>
+        <w:t>فرانت</w:t>
+      </w:r>
+      <w:proofErr w:type="spellEnd"/>
+      <w:r>
+        <w:rPr>
+          <w:rFonts w:cs="B Nazanin" w:hint="cs"/>
+          <w:sz w:val="24"/>
+          <w:szCs w:val="24"/>
+          <w:rtl/>
+          <w:lang w:bidi="fa-IR"/>
+        </w:rPr>
+        <w:t xml:space="preserve"> از هم جدا باشد</w:t>
+      </w:r>
+      <w:r>
+        <w:rPr>
+          <w:rFonts w:cs="B Nazanin" w:hint="cs"/>
+          <w:sz w:val="24"/>
+          <w:szCs w:val="24"/>
+          <w:rtl/>
+          <w:lang w:bidi="fa-IR"/>
+        </w:rPr>
+        <w:t xml:space="preserve"> باید با </w:t>
+      </w:r>
+      <w:r>
+        <w:rPr>
+          <w:rFonts w:cs="B Nazanin"/>
+          <w:sz w:val="24"/>
+          <w:szCs w:val="24"/>
+          <w:lang w:bidi="fa-IR"/>
+        </w:rPr>
+        <w:t>CORS</w:t>
+      </w:r>
+      <w:r>
+        <w:rPr>
+          <w:rFonts w:cs="B Nazanin" w:hint="cs"/>
+          <w:sz w:val="24"/>
+          <w:szCs w:val="24"/>
+          <w:rtl/>
+          <w:lang w:bidi="fa-IR"/>
+        </w:rPr>
+        <w:t xml:space="preserve"> ان ها را با هم </w:t>
+      </w:r>
+      <w:proofErr w:type="spellStart"/>
+      <w:r>
+        <w:rPr>
+          <w:rFonts w:cs="B Nazanin" w:hint="cs"/>
+          <w:sz w:val="24"/>
+          <w:szCs w:val="24"/>
+          <w:rtl/>
+          <w:lang w:bidi="fa-IR"/>
+        </w:rPr>
+        <w:t>اوکی</w:t>
+      </w:r>
+      <w:proofErr w:type="spellEnd"/>
+      <w:r>
+        <w:rPr>
+          <w:rFonts w:cs="B Nazanin" w:hint="cs"/>
+          <w:sz w:val="24"/>
+          <w:szCs w:val="24"/>
+          <w:rtl/>
+          <w:lang w:bidi="fa-IR"/>
+        </w:rPr>
+        <w:t xml:space="preserve"> کنیم .</w:t>
+      </w:r>
+    </w:p>
+    <w:p>
+      <w:pPr>
+        <w:bidi/>
+        <w:rPr>
+          <w:rFonts w:cs="B Nazanin"/>
+          <w:sz w:val="24"/>
+          <w:szCs w:val="24"/>
+          <w:rtl/>
+          <w:lang w:bidi="fa-IR"/>
+        </w:rPr>
+      </w:pPr>
+    </w:p>
+    <w:p>
+      <w:pPr>
+        <w:bidi/>
+        <w:rPr>
+          <w:rFonts w:cs="B Nazanin" w:hint="cs"/>
+          <w:b/>
+          <w:bCs/>
+          <w:sz w:val="36"/>
+          <w:szCs w:val="36"/>
+          <w:lang w:bidi="fa-IR"/>
+        </w:rPr>
+      </w:pPr>
+      <w:r>
+        <w:rPr>
+          <w:rFonts w:cs="B Nazanin" w:hint="cs"/>
+          <w:b/>
+          <w:bCs/>
+          <w:sz w:val="36"/>
+          <w:szCs w:val="36"/>
+          <w:rtl/>
+          <w:lang w:bidi="fa-IR"/>
+        </w:rPr>
+        <w:t xml:space="preserve">کد های پاسخ </w:t>
+      </w:r>
+      <w:r>
+        <w:rPr>
+          <w:rFonts w:cs="B Nazanin"/>
+          <w:b/>
+          <w:bCs/>
+          <w:sz w:val="36"/>
+          <w:szCs w:val="36"/>
+          <w:lang w:bidi="fa-IR"/>
+        </w:rPr>
+        <w:t>HTTP</w:t>
+      </w:r>
+    </w:p>
+    <w:p>
+      <w:pPr>
+        <w:bidi/>
+        <w:rPr>
+          <w:rFonts w:cs="B Nazanin" w:hint="cs"/>
+          <w:b/>
+          <w:bCs/>
+          <w:sz w:val="36"/>
+          <w:szCs w:val="36"/>
           <w:lang w:bidi="fa-IR"/>
         </w:rPr>
       </w:pPr>
@@ -11632,10 +12901,10 @@
         </w:rPr>
         <w:lastRenderedPageBreak/>
         <w:drawing>
-          <wp:inline distT="0" distB="0" distL="0" distR="0" wp14:anchorId="61374A00" wp14:editId="02107822">
-            <wp:extent cx="5943600" cy="4927600"/>
-            <wp:effectExtent l="0" t="0" r="0" b="6350"/>
-            <wp:docPr id="4" name="Picture 4"/>
+          <wp:inline distT="0" distB="0" distL="0" distR="0" wp14:anchorId="10F5F7B4" wp14:editId="52B74018">
+            <wp:extent cx="5943600" cy="4375785"/>
+            <wp:effectExtent l="0" t="0" r="0" b="5715"/>
+            <wp:docPr id="9" name="Picture 9"/>
             <wp:cNvGraphicFramePr>
               <a:graphicFrameLocks xmlns:a="http://schemas.openxmlformats.org/drawingml/2006/main" noChangeAspect="1"/>
             </wp:cNvGraphicFramePr>
@@ -11655,7 +12924,7 @@
                   <pic:spPr>
                     <a:xfrm>
                       <a:off x="0" y="0"/>
-                      <a:ext cx="5943600" cy="4927600"/>
+                      <a:ext cx="5943600" cy="4375785"/>
                     </a:xfrm>
                     <a:prstGeom prst="rect">
                       <a:avLst/>
@@ -11675,66 +12944,184 @@
           <w:rFonts w:cs="B Nazanin"/>
           <w:sz w:val="24"/>
           <w:szCs w:val="24"/>
-          <w:rtl/>
-          <w:lang w:bidi="fa-IR"/>
-        </w:rPr>
-      </w:pPr>
-    </w:p>
-    <w:p>
-      <w:pPr>
-        <w:bidi/>
-        <w:rPr>
-          <w:rFonts w:cs="B Nazanin"/>
-          <w:sz w:val="24"/>
-          <w:szCs w:val="24"/>
-          <w:rtl/>
-          <w:lang w:bidi="fa-IR"/>
-        </w:rPr>
-      </w:pPr>
-    </w:p>
-    <w:p>
-      <w:pPr>
-        <w:bidi/>
-        <w:rPr>
-          <w:rFonts w:cs="B Nazanin"/>
-          <w:sz w:val="24"/>
-          <w:szCs w:val="24"/>
-          <w:rtl/>
-          <w:lang w:bidi="fa-IR"/>
-        </w:rPr>
-      </w:pPr>
-    </w:p>
-    <w:p>
-      <w:pPr>
-        <w:bidi/>
-        <w:rPr>
-          <w:rFonts w:cs="B Nazanin"/>
-          <w:sz w:val="24"/>
-          <w:szCs w:val="24"/>
-          <w:rtl/>
-          <w:lang w:bidi="fa-IR"/>
-        </w:rPr>
-      </w:pPr>
-    </w:p>
-    <w:p>
-      <w:pPr>
-        <w:bidi/>
-        <w:rPr>
-          <w:rFonts w:cs="B Nazanin"/>
-          <w:sz w:val="24"/>
-          <w:szCs w:val="24"/>
-          <w:rtl/>
-          <w:lang w:bidi="fa-IR"/>
-        </w:rPr>
-      </w:pPr>
-    </w:p>
-    <w:p>
-      <w:pPr>
-        <w:bidi/>
-        <w:rPr>
-          <w:rFonts w:cs="B Nazanin"/>
-          <w:sz w:val="24"/>
-          <w:szCs w:val="24"/>
+          <w:lang w:bidi="fa-IR"/>
+        </w:rPr>
+      </w:pPr>
+    </w:p>
+    <w:p>
+      <w:pPr>
+        <w:bidi/>
+        <w:rPr>
+          <w:rFonts w:cs="B Nazanin" w:hint="cs"/>
+          <w:sz w:val="24"/>
+          <w:szCs w:val="24"/>
+          <w:rtl/>
+          <w:lang w:bidi="fa-IR"/>
+        </w:rPr>
+      </w:pPr>
+      <w:r>
+        <w:rPr>
+          <w:rFonts w:cs="B Nazanin" w:hint="cs"/>
+          <w:sz w:val="24"/>
+          <w:szCs w:val="24"/>
+          <w:rtl/>
+          <w:lang w:bidi="fa-IR"/>
+        </w:rPr>
+        <w:t xml:space="preserve">در دوره جاری در </w:t>
+      </w:r>
+      <w:r>
+        <w:rPr>
+          <w:rFonts w:cs="B Nazanin"/>
+          <w:sz w:val="24"/>
+          <w:szCs w:val="24"/>
+          <w:lang w:bidi="fa-IR"/>
+        </w:rPr>
+        <w:t>API</w:t>
+      </w:r>
+      <w:r>
+        <w:rPr>
+          <w:rFonts w:cs="B Nazanin" w:hint="cs"/>
+          <w:sz w:val="24"/>
+          <w:szCs w:val="24"/>
+          <w:rtl/>
+          <w:lang w:bidi="fa-IR"/>
+        </w:rPr>
+        <w:t xml:space="preserve"> با نام </w:t>
+      </w:r>
+      <w:proofErr w:type="spellStart"/>
+      <w:r>
+        <w:rPr>
+          <w:rFonts w:cs="B Nazanin"/>
+          <w:sz w:val="24"/>
+          <w:szCs w:val="24"/>
+          <w:lang w:bidi="fa-IR"/>
+        </w:rPr>
+        <w:t>BuggyController</w:t>
+      </w:r>
+      <w:proofErr w:type="spellEnd"/>
+      <w:r>
+        <w:rPr>
+          <w:rFonts w:cs="B Nazanin" w:hint="cs"/>
+          <w:sz w:val="24"/>
+          <w:szCs w:val="24"/>
+          <w:rtl/>
+          <w:lang w:bidi="fa-IR"/>
+        </w:rPr>
+        <w:t xml:space="preserve"> این خطا ها مدیریت شده </w:t>
+      </w:r>
+      <w:proofErr w:type="spellStart"/>
+      <w:r>
+        <w:rPr>
+          <w:rFonts w:cs="B Nazanin" w:hint="cs"/>
+          <w:sz w:val="24"/>
+          <w:szCs w:val="24"/>
+          <w:rtl/>
+          <w:lang w:bidi="fa-IR"/>
+        </w:rPr>
+        <w:t>اند</w:t>
+      </w:r>
+      <w:proofErr w:type="spellEnd"/>
+      <w:r>
+        <w:rPr>
+          <w:rFonts w:cs="B Nazanin" w:hint="cs"/>
+          <w:sz w:val="24"/>
+          <w:szCs w:val="24"/>
+          <w:rtl/>
+          <w:lang w:bidi="fa-IR"/>
+        </w:rPr>
+        <w:t xml:space="preserve"> .</w:t>
+      </w:r>
+    </w:p>
+    <w:p>
+      <w:pPr>
+        <w:bidi/>
+        <w:rPr>
+          <w:rFonts w:cs="B Nazanin"/>
+          <w:sz w:val="24"/>
+          <w:szCs w:val="24"/>
+          <w:lang w:bidi="fa-IR"/>
+        </w:rPr>
+      </w:pPr>
+    </w:p>
+    <w:p>
+      <w:pPr>
+        <w:bidi/>
+        <w:rPr>
+          <w:rFonts w:cs="B Nazanin"/>
+          <w:sz w:val="24"/>
+          <w:szCs w:val="24"/>
+          <w:lang w:bidi="fa-IR"/>
+        </w:rPr>
+      </w:pPr>
+    </w:p>
+    <w:p>
+      <w:pPr>
+        <w:bidi/>
+        <w:rPr>
+          <w:rFonts w:cs="B Nazanin"/>
+          <w:sz w:val="24"/>
+          <w:szCs w:val="24"/>
+          <w:lang w:bidi="fa-IR"/>
+        </w:rPr>
+      </w:pPr>
+    </w:p>
+    <w:p>
+      <w:pPr>
+        <w:bidi/>
+        <w:rPr>
+          <w:rFonts w:cs="B Nazanin"/>
+          <w:sz w:val="24"/>
+          <w:szCs w:val="24"/>
+          <w:lang w:bidi="fa-IR"/>
+        </w:rPr>
+      </w:pPr>
+    </w:p>
+    <w:p>
+      <w:pPr>
+        <w:bidi/>
+        <w:rPr>
+          <w:rFonts w:cs="B Nazanin"/>
+          <w:sz w:val="24"/>
+          <w:szCs w:val="24"/>
+          <w:rtl/>
+          <w:lang w:bidi="fa-IR"/>
+        </w:rPr>
+      </w:pPr>
+    </w:p>
+    <w:p>
+      <w:pPr>
+        <w:bidi/>
+        <w:rPr>
+          <w:rFonts w:cs="B Nazanin"/>
+          <w:b/>
+          <w:bCs/>
+          <w:sz w:val="40"/>
+          <w:szCs w:val="40"/>
+          <w:lang w:bidi="fa-IR"/>
+        </w:rPr>
+      </w:pPr>
+      <w:r>
+        <w:rPr>
+          <w:rFonts w:cs="B Nazanin" w:hint="cs"/>
+          <w:b/>
+          <w:bCs/>
+          <w:sz w:val="40"/>
+          <w:szCs w:val="40"/>
+          <w:rtl/>
+          <w:lang w:bidi="fa-IR"/>
+        </w:rPr>
+        <w:t xml:space="preserve">سوالات </w:t>
+      </w:r>
+    </w:p>
+    <w:p>
+      <w:pPr>
+        <w:bidi/>
+        <w:rPr>
+          <w:rFonts w:cs="B Nazanin"/>
+          <w:b/>
+          <w:bCs/>
+          <w:sz w:val="40"/>
+          <w:szCs w:val="40"/>
           <w:rtl/>
           <w:lang w:bidi="fa-IR"/>
         </w:rPr>
@@ -11763,26 +13150,27 @@
           <w:rtl/>
           <w:lang w:bidi="fa-IR"/>
         </w:rPr>
-        <w:t xml:space="preserve">آیا می توان برای </w:t>
-      </w:r>
-      <w:r>
-        <w:rPr>
-          <w:rFonts w:cs="B Nazanin"/>
-          <w:sz w:val="24"/>
-          <w:szCs w:val="24"/>
-          <w:lang w:bidi="fa-IR"/>
-        </w:rPr>
-        <w:t>Update</w:t>
-      </w:r>
-      <w:r>
-        <w:rPr>
-          <w:rFonts w:cs="B Nazanin" w:hint="cs"/>
-          <w:sz w:val="24"/>
-          <w:szCs w:val="24"/>
-          <w:rtl/>
-          <w:lang w:bidi="fa-IR"/>
-        </w:rPr>
-        <w:t xml:space="preserve"> از </w:t>
+        <w:lastRenderedPageBreak/>
+        <w:t xml:space="preserve">اگر </w:t>
+      </w:r>
+      <w:r>
+        <w:rPr>
+          <w:rFonts w:cs="B Nazanin"/>
+          <w:sz w:val="24"/>
+          <w:szCs w:val="24"/>
+          <w:lang w:bidi="fa-IR"/>
+        </w:rPr>
+        <w:t>Route</w:t>
+      </w:r>
+      <w:r>
+        <w:rPr>
+          <w:rFonts w:cs="B Nazanin" w:hint="cs"/>
+          <w:sz w:val="24"/>
+          <w:szCs w:val="24"/>
+          <w:rtl/>
+          <w:lang w:bidi="fa-IR"/>
+        </w:rPr>
+        <w:t xml:space="preserve"> یک درخواست </w:t>
       </w:r>
       <w:r>
         <w:rPr>
@@ -11801,281 +13189,76 @@
           <w:rtl/>
           <w:lang w:bidi="fa-IR"/>
         </w:rPr>
-        <w:t xml:space="preserve"> به جای </w:t>
-      </w:r>
-      <w:r>
-        <w:rPr>
-          <w:rFonts w:cs="B Nazanin"/>
-          <w:sz w:val="24"/>
-          <w:szCs w:val="24"/>
-          <w:lang w:bidi="fa-IR"/>
-        </w:rPr>
-        <w:t>put</w:t>
-      </w:r>
-      <w:r>
-        <w:rPr>
-          <w:rFonts w:cs="B Nazanin" w:hint="cs"/>
-          <w:sz w:val="24"/>
-          <w:szCs w:val="24"/>
-          <w:rtl/>
-          <w:lang w:bidi="fa-IR"/>
-        </w:rPr>
-        <w:t xml:space="preserve"> استفاده کرد ؟</w:t>
-      </w:r>
-    </w:p>
-    <w:p>
-      <w:pPr>
-        <w:bidi/>
-        <w:ind w:left="360"/>
-        <w:rPr>
-          <w:rFonts w:cs="B Nazanin"/>
-          <w:sz w:val="24"/>
-          <w:szCs w:val="24"/>
-          <w:rtl/>
-          <w:lang w:bidi="fa-IR"/>
-        </w:rPr>
-      </w:pPr>
-      <w:r>
-        <w:rPr>
-          <w:rFonts w:cs="B Nazanin"/>
-          <w:sz w:val="24"/>
-          <w:szCs w:val="24"/>
-          <w:rtl/>
-          <w:lang w:bidi="fa-IR"/>
-        </w:rPr>
-        <w:t>نه، اگر برای</w:t>
-      </w:r>
-      <w:r>
-        <w:rPr>
-          <w:rFonts w:cs="B Nazanin"/>
-          <w:sz w:val="24"/>
-          <w:szCs w:val="24"/>
-          <w:lang w:bidi="fa-IR"/>
-        </w:rPr>
-        <w:t xml:space="preserve"> Update </w:t>
-      </w:r>
-      <w:r>
-        <w:rPr>
-          <w:rFonts w:cs="B Nazanin"/>
-          <w:sz w:val="24"/>
-          <w:szCs w:val="24"/>
-          <w:rtl/>
-          <w:lang w:bidi="fa-IR"/>
-        </w:rPr>
-        <w:t>از</w:t>
-      </w:r>
-      <w:r>
-        <w:rPr>
-          <w:rFonts w:cs="B Nazanin"/>
-          <w:sz w:val="24"/>
-          <w:szCs w:val="24"/>
-          <w:lang w:bidi="fa-IR"/>
-        </w:rPr>
-        <w:t xml:space="preserve"> POST </w:t>
-      </w:r>
-      <w:r>
-        <w:rPr>
-          <w:rFonts w:cs="B Nazanin"/>
-          <w:sz w:val="24"/>
-          <w:szCs w:val="24"/>
-          <w:rtl/>
-          <w:lang w:bidi="fa-IR"/>
-        </w:rPr>
-        <w:t>استفاده کنی، از نظر فنی لزوماً غلط نیست و</w:t>
-      </w:r>
-      <w:r>
-        <w:rPr>
-          <w:rFonts w:cs="B Nazanin"/>
-          <w:sz w:val="24"/>
-          <w:szCs w:val="24"/>
-          <w:lang w:bidi="fa-IR"/>
-        </w:rPr>
-        <w:t xml:space="preserve"> ASP.NET Core </w:t>
-      </w:r>
-      <w:r>
-        <w:rPr>
-          <w:rFonts w:cs="B Nazanin"/>
-          <w:sz w:val="24"/>
-          <w:szCs w:val="24"/>
-          <w:rtl/>
-          <w:lang w:bidi="fa-IR"/>
-        </w:rPr>
-        <w:t>هم می‌تواند کاملاً با آن کار کند</w:t>
-      </w:r>
-      <w:r>
-        <w:rPr>
-          <w:rFonts w:cs="B Nazanin"/>
-          <w:sz w:val="24"/>
-          <w:szCs w:val="24"/>
-          <w:lang w:bidi="fa-IR"/>
-        </w:rPr>
-        <w:t>.</w:t>
-      </w:r>
-      <w:r>
-        <w:rPr>
-          <w:rFonts w:cs="B Nazanin"/>
-          <w:sz w:val="24"/>
-          <w:szCs w:val="24"/>
-          <w:rtl/>
-          <w:lang w:bidi="fa-IR"/>
-        </w:rPr>
-        <w:t>اما از نظر</w:t>
-      </w:r>
-      <w:r>
-        <w:rPr>
-          <w:rFonts w:cs="B Nazanin"/>
-          <w:sz w:val="24"/>
-          <w:szCs w:val="24"/>
-          <w:lang w:bidi="fa-IR"/>
-        </w:rPr>
-        <w:t xml:space="preserve"> RESTful API design </w:t>
-      </w:r>
-      <w:r>
-        <w:rPr>
-          <w:rFonts w:cs="B Nazanin"/>
-          <w:sz w:val="24"/>
-          <w:szCs w:val="24"/>
-          <w:rtl/>
-          <w:lang w:bidi="fa-IR"/>
-        </w:rPr>
-        <w:t>معمولاً برای</w:t>
-      </w:r>
-      <w:r>
-        <w:rPr>
-          <w:rFonts w:cs="B Nazanin"/>
-          <w:sz w:val="24"/>
-          <w:szCs w:val="24"/>
-          <w:lang w:bidi="fa-IR"/>
-        </w:rPr>
-        <w:t xml:space="preserve"> Update </w:t>
-      </w:r>
-      <w:r>
-        <w:rPr>
-          <w:rFonts w:cs="B Nazanin"/>
-          <w:sz w:val="24"/>
-          <w:szCs w:val="24"/>
-          <w:rtl/>
-          <w:lang w:bidi="fa-IR"/>
-        </w:rPr>
-        <w:t>از</w:t>
-      </w:r>
-      <w:r>
-        <w:rPr>
-          <w:rFonts w:cs="B Nazanin"/>
-          <w:sz w:val="24"/>
-          <w:szCs w:val="24"/>
-          <w:lang w:bidi="fa-IR"/>
-        </w:rPr>
-        <w:t xml:space="preserve"> PUT </w:t>
-      </w:r>
-      <w:r>
-        <w:rPr>
-          <w:rFonts w:cs="B Nazanin"/>
-          <w:sz w:val="24"/>
-          <w:szCs w:val="24"/>
-          <w:rtl/>
-          <w:lang w:bidi="fa-IR"/>
-        </w:rPr>
-        <w:t>یا</w:t>
-      </w:r>
-      <w:r>
-        <w:rPr>
-          <w:rFonts w:cs="B Nazanin"/>
-          <w:sz w:val="24"/>
-          <w:szCs w:val="24"/>
-          <w:lang w:bidi="fa-IR"/>
-        </w:rPr>
-        <w:t xml:space="preserve"> PATCH </w:t>
-      </w:r>
-      <w:r>
-        <w:rPr>
-          <w:rFonts w:cs="B Nazanin"/>
-          <w:sz w:val="24"/>
-          <w:szCs w:val="24"/>
-          <w:rtl/>
-          <w:lang w:bidi="fa-IR"/>
-        </w:rPr>
-        <w:t>استفاده می‌کنیم</w:t>
-      </w:r>
-      <w:r>
-        <w:rPr>
-          <w:rFonts w:cs="B Nazanin"/>
-          <w:sz w:val="24"/>
-          <w:szCs w:val="24"/>
-          <w:lang w:bidi="fa-IR"/>
-        </w:rPr>
-        <w:t>.</w:t>
-      </w:r>
-      <w:r>
-        <w:rPr>
-          <w:rFonts w:cs="B Nazanin" w:hint="cs"/>
-          <w:sz w:val="24"/>
-          <w:szCs w:val="24"/>
-          <w:rtl/>
-          <w:lang w:bidi="fa-IR"/>
-        </w:rPr>
-        <w:t xml:space="preserve">برای رعایت </w:t>
-      </w:r>
-      <w:r>
-        <w:rPr>
-          <w:rFonts w:cs="B Nazanin"/>
-          <w:sz w:val="24"/>
-          <w:szCs w:val="24"/>
-          <w:lang w:bidi="fa-IR"/>
-        </w:rPr>
-        <w:t>rest</w:t>
-      </w:r>
-      <w:r>
-        <w:rPr>
-          <w:rFonts w:cs="B Nazanin" w:hint="cs"/>
-          <w:sz w:val="24"/>
-          <w:szCs w:val="24"/>
-          <w:rtl/>
-          <w:lang w:bidi="fa-IR"/>
-        </w:rPr>
-        <w:t xml:space="preserve"> بودن یک </w:t>
-      </w:r>
-      <w:r>
-        <w:rPr>
-          <w:rFonts w:cs="B Nazanin"/>
-          <w:sz w:val="24"/>
-          <w:szCs w:val="24"/>
-          <w:lang w:bidi="fa-IR"/>
-        </w:rPr>
-        <w:t>API</w:t>
-      </w:r>
-      <w:r>
-        <w:rPr>
-          <w:rFonts w:cs="B Nazanin" w:hint="cs"/>
-          <w:sz w:val="24"/>
-          <w:szCs w:val="24"/>
-          <w:rtl/>
-          <w:lang w:bidi="fa-IR"/>
-        </w:rPr>
-        <w:t xml:space="preserve"> بهتر است از روش زیر استفاده کرد : </w:t>
-      </w:r>
-    </w:p>
-    <w:p>
-      <w:pPr>
-        <w:bidi/>
-        <w:ind w:left="360"/>
-        <w:rPr>
-          <w:rFonts w:cs="B Nazanin"/>
-          <w:sz w:val="24"/>
-          <w:szCs w:val="24"/>
-          <w:rtl/>
-          <w:lang w:bidi="fa-IR"/>
-        </w:rPr>
-      </w:pPr>
-    </w:p>
-    <w:p>
-      <w:pPr>
-        <w:bidi/>
-        <w:ind w:left="360"/>
-        <w:rPr>
-          <w:rFonts w:cs="B Nazanin"/>
-          <w:sz w:val="24"/>
-          <w:szCs w:val="24"/>
+        <w:t xml:space="preserve"> باشد و ما در </w:t>
+      </w:r>
+      <w:proofErr w:type="spellStart"/>
+      <w:r>
+        <w:rPr>
+          <w:rFonts w:cs="B Nazanin"/>
+          <w:sz w:val="24"/>
+          <w:szCs w:val="24"/>
+          <w:lang w:bidi="fa-IR"/>
+        </w:rPr>
+        <w:t>api</w:t>
+      </w:r>
+      <w:proofErr w:type="spellEnd"/>
+      <w:r>
+        <w:rPr>
+          <w:rFonts w:cs="B Nazanin" w:hint="cs"/>
+          <w:sz w:val="24"/>
+          <w:szCs w:val="24"/>
+          <w:rtl/>
+          <w:lang w:bidi="fa-IR"/>
+        </w:rPr>
+        <w:t xml:space="preserve"> مثلا دو متد </w:t>
+      </w:r>
+      <w:r>
+        <w:rPr>
+          <w:rFonts w:cs="B Nazanin"/>
+          <w:sz w:val="24"/>
+          <w:szCs w:val="24"/>
+          <w:lang w:bidi="fa-IR"/>
+        </w:rPr>
+        <w:t>post</w:t>
+      </w:r>
+      <w:r>
+        <w:rPr>
+          <w:rFonts w:cs="B Nazanin" w:hint="cs"/>
+          <w:sz w:val="24"/>
+          <w:szCs w:val="24"/>
+          <w:rtl/>
+          <w:lang w:bidi="fa-IR"/>
+        </w:rPr>
+        <w:t xml:space="preserve"> داشته باشیم که دارای </w:t>
+      </w:r>
+      <w:r>
+        <w:rPr>
+          <w:rFonts w:cs="B Nazanin"/>
+          <w:sz w:val="24"/>
+          <w:szCs w:val="24"/>
+          <w:lang w:bidi="fa-IR"/>
+        </w:rPr>
+        <w:t>route</w:t>
+      </w:r>
+      <w:r>
+        <w:rPr>
+          <w:rFonts w:cs="B Nazanin" w:hint="cs"/>
+          <w:sz w:val="24"/>
+          <w:szCs w:val="24"/>
+          <w:rtl/>
+          <w:lang w:bidi="fa-IR"/>
+        </w:rPr>
+        <w:t xml:space="preserve"> مشخص هستند آنگاه به کدام ارجاع داده می شود ؟</w:t>
+      </w:r>
+    </w:p>
+    <w:p>
+      <w:pPr>
+        <w:bidi/>
+        <w:rPr>
+          <w:rFonts w:cs="B Nazanin"/>
+          <w:sz w:val="24"/>
+          <w:szCs w:val="24"/>
+          <w:rtl/>
           <w:lang w:bidi="fa-IR"/>
         </w:rPr>
       </w:pPr>
@@ -12084,10 +13267,10 @@
           <w:noProof/>
         </w:rPr>
         <w:drawing>
-          <wp:inline distT="0" distB="0" distL="0" distR="0" wp14:anchorId="0FB616AA" wp14:editId="3105F371">
-            <wp:extent cx="5943600" cy="2432050"/>
+          <wp:inline distT="0" distB="0" distL="0" distR="0" wp14:anchorId="61374A00" wp14:editId="02107822">
+            <wp:extent cx="5943600" cy="4927600"/>
             <wp:effectExtent l="0" t="0" r="0" b="6350"/>
-            <wp:docPr id="5" name="Picture 5"/>
+            <wp:docPr id="4" name="Picture 4"/>
             <wp:cNvGraphicFramePr>
               <a:graphicFrameLocks xmlns:a="http://schemas.openxmlformats.org/drawingml/2006/main" noChangeAspect="1"/>
             </wp:cNvGraphicFramePr>
@@ -12107,6 +13290,481 @@
                   <pic:spPr>
                     <a:xfrm>
                       <a:off x="0" y="0"/>
+                      <a:ext cx="5943600" cy="4927600"/>
+                    </a:xfrm>
+                    <a:prstGeom prst="rect">
+                      <a:avLst/>
+                    </a:prstGeom>
+                  </pic:spPr>
+                </pic:pic>
+              </a:graphicData>
+            </a:graphic>
+          </wp:inline>
+        </w:drawing>
+      </w:r>
+    </w:p>
+    <w:p>
+      <w:pPr>
+        <w:bidi/>
+        <w:rPr>
+          <w:rFonts w:cs="B Nazanin"/>
+          <w:sz w:val="24"/>
+          <w:szCs w:val="24"/>
+          <w:rtl/>
+          <w:lang w:bidi="fa-IR"/>
+        </w:rPr>
+      </w:pPr>
+    </w:p>
+    <w:p>
+      <w:pPr>
+        <w:bidi/>
+        <w:rPr>
+          <w:rFonts w:cs="B Nazanin"/>
+          <w:sz w:val="24"/>
+          <w:szCs w:val="24"/>
+          <w:rtl/>
+          <w:lang w:bidi="fa-IR"/>
+        </w:rPr>
+      </w:pPr>
+    </w:p>
+    <w:p>
+      <w:pPr>
+        <w:bidi/>
+        <w:rPr>
+          <w:rFonts w:cs="B Nazanin"/>
+          <w:sz w:val="24"/>
+          <w:szCs w:val="24"/>
+          <w:rtl/>
+          <w:lang w:bidi="fa-IR"/>
+        </w:rPr>
+      </w:pPr>
+    </w:p>
+    <w:p>
+      <w:pPr>
+        <w:bidi/>
+        <w:rPr>
+          <w:rFonts w:cs="B Nazanin"/>
+          <w:sz w:val="24"/>
+          <w:szCs w:val="24"/>
+          <w:rtl/>
+          <w:lang w:bidi="fa-IR"/>
+        </w:rPr>
+      </w:pPr>
+    </w:p>
+    <w:p>
+      <w:pPr>
+        <w:bidi/>
+        <w:rPr>
+          <w:rFonts w:cs="B Nazanin"/>
+          <w:sz w:val="24"/>
+          <w:szCs w:val="24"/>
+          <w:rtl/>
+          <w:lang w:bidi="fa-IR"/>
+        </w:rPr>
+      </w:pPr>
+    </w:p>
+    <w:p>
+      <w:pPr>
+        <w:bidi/>
+        <w:rPr>
+          <w:rFonts w:cs="B Nazanin"/>
+          <w:sz w:val="24"/>
+          <w:szCs w:val="24"/>
+          <w:rtl/>
+          <w:lang w:bidi="fa-IR"/>
+        </w:rPr>
+      </w:pPr>
+    </w:p>
+    <w:p>
+      <w:pPr>
+        <w:pStyle w:val="ListParagraph"/>
+        <w:numPr>
+          <w:ilvl w:val="0"/>
+          <w:numId w:val="1"/>
+        </w:numPr>
+        <w:bidi/>
+        <w:rPr>
+          <w:rFonts w:cs="B Nazanin"/>
+          <w:sz w:val="24"/>
+          <w:szCs w:val="24"/>
+          <w:lang w:bidi="fa-IR"/>
+        </w:rPr>
+      </w:pPr>
+      <w:r>
+        <w:rPr>
+          <w:rFonts w:cs="B Nazanin" w:hint="cs"/>
+          <w:sz w:val="24"/>
+          <w:szCs w:val="24"/>
+          <w:rtl/>
+          <w:lang w:bidi="fa-IR"/>
+        </w:rPr>
+        <w:t xml:space="preserve">آیا می توان برای </w:t>
+      </w:r>
+      <w:r>
+        <w:rPr>
+          <w:rFonts w:cs="B Nazanin"/>
+          <w:sz w:val="24"/>
+          <w:szCs w:val="24"/>
+          <w:lang w:bidi="fa-IR"/>
+        </w:rPr>
+        <w:t>Update</w:t>
+      </w:r>
+      <w:r>
+        <w:rPr>
+          <w:rFonts w:cs="B Nazanin" w:hint="cs"/>
+          <w:sz w:val="24"/>
+          <w:szCs w:val="24"/>
+          <w:rtl/>
+          <w:lang w:bidi="fa-IR"/>
+        </w:rPr>
+        <w:t xml:space="preserve"> از </w:t>
+      </w:r>
+      <w:r>
+        <w:rPr>
+          <w:rFonts w:cs="B Nazanin"/>
+          <w:sz w:val="24"/>
+          <w:szCs w:val="24"/>
+          <w:lang w:bidi="fa-IR"/>
+        </w:rPr>
+        <w:t>post</w:t>
+      </w:r>
+      <w:r>
+        <w:rPr>
+          <w:rFonts w:cs="B Nazanin" w:hint="cs"/>
+          <w:sz w:val="24"/>
+          <w:szCs w:val="24"/>
+          <w:rtl/>
+          <w:lang w:bidi="fa-IR"/>
+        </w:rPr>
+        <w:t xml:space="preserve"> به جای </w:t>
+      </w:r>
+      <w:r>
+        <w:rPr>
+          <w:rFonts w:cs="B Nazanin"/>
+          <w:sz w:val="24"/>
+          <w:szCs w:val="24"/>
+          <w:lang w:bidi="fa-IR"/>
+        </w:rPr>
+        <w:t>put</w:t>
+      </w:r>
+      <w:r>
+        <w:rPr>
+          <w:rFonts w:cs="B Nazanin" w:hint="cs"/>
+          <w:sz w:val="24"/>
+          <w:szCs w:val="24"/>
+          <w:rtl/>
+          <w:lang w:bidi="fa-IR"/>
+        </w:rPr>
+        <w:t xml:space="preserve"> استفاده کرد ؟</w:t>
+      </w:r>
+    </w:p>
+    <w:p>
+      <w:pPr>
+        <w:bidi/>
+        <w:ind w:left="360"/>
+        <w:rPr>
+          <w:rFonts w:cs="B Nazanin"/>
+          <w:sz w:val="24"/>
+          <w:szCs w:val="24"/>
+          <w:rtl/>
+          <w:lang w:bidi="fa-IR"/>
+        </w:rPr>
+      </w:pPr>
+      <w:r>
+        <w:rPr>
+          <w:rFonts w:cs="B Nazanin"/>
+          <w:sz w:val="24"/>
+          <w:szCs w:val="24"/>
+          <w:rtl/>
+          <w:lang w:bidi="fa-IR"/>
+        </w:rPr>
+        <w:lastRenderedPageBreak/>
+        <w:t>نه، اگر برای</w:t>
+      </w:r>
+      <w:r>
+        <w:rPr>
+          <w:rFonts w:cs="B Nazanin"/>
+          <w:sz w:val="24"/>
+          <w:szCs w:val="24"/>
+          <w:lang w:bidi="fa-IR"/>
+        </w:rPr>
+        <w:t xml:space="preserve"> Update </w:t>
+      </w:r>
+      <w:r>
+        <w:rPr>
+          <w:rFonts w:cs="B Nazanin"/>
+          <w:sz w:val="24"/>
+          <w:szCs w:val="24"/>
+          <w:rtl/>
+          <w:lang w:bidi="fa-IR"/>
+        </w:rPr>
+        <w:t>از</w:t>
+      </w:r>
+      <w:r>
+        <w:rPr>
+          <w:rFonts w:cs="B Nazanin"/>
+          <w:sz w:val="24"/>
+          <w:szCs w:val="24"/>
+          <w:lang w:bidi="fa-IR"/>
+        </w:rPr>
+        <w:t xml:space="preserve"> POST </w:t>
+      </w:r>
+      <w:r>
+        <w:rPr>
+          <w:rFonts w:cs="B Nazanin"/>
+          <w:sz w:val="24"/>
+          <w:szCs w:val="24"/>
+          <w:rtl/>
+          <w:lang w:bidi="fa-IR"/>
+        </w:rPr>
+        <w:t>استفاده کنی، از نظر فنی لزوماً غلط نیست و</w:t>
+      </w:r>
+      <w:r>
+        <w:rPr>
+          <w:rFonts w:cs="B Nazanin"/>
+          <w:sz w:val="24"/>
+          <w:szCs w:val="24"/>
+          <w:lang w:bidi="fa-IR"/>
+        </w:rPr>
+        <w:t xml:space="preserve"> ASP.NET Core </w:t>
+      </w:r>
+      <w:r>
+        <w:rPr>
+          <w:rFonts w:cs="B Nazanin"/>
+          <w:sz w:val="24"/>
+          <w:szCs w:val="24"/>
+          <w:rtl/>
+          <w:lang w:bidi="fa-IR"/>
+        </w:rPr>
+        <w:t xml:space="preserve">هم </w:t>
+      </w:r>
+      <w:proofErr w:type="spellStart"/>
+      <w:r>
+        <w:rPr>
+          <w:rFonts w:cs="B Nazanin"/>
+          <w:sz w:val="24"/>
+          <w:szCs w:val="24"/>
+          <w:rtl/>
+          <w:lang w:bidi="fa-IR"/>
+        </w:rPr>
+        <w:t>می‌تواند</w:t>
+      </w:r>
+      <w:proofErr w:type="spellEnd"/>
+      <w:r>
+        <w:rPr>
+          <w:rFonts w:cs="B Nazanin"/>
+          <w:sz w:val="24"/>
+          <w:szCs w:val="24"/>
+          <w:rtl/>
+          <w:lang w:bidi="fa-IR"/>
+        </w:rPr>
+        <w:t xml:space="preserve"> کاملاً با آن کار کند</w:t>
+      </w:r>
+      <w:r>
+        <w:rPr>
+          <w:rFonts w:cs="B Nazanin"/>
+          <w:sz w:val="24"/>
+          <w:szCs w:val="24"/>
+          <w:lang w:bidi="fa-IR"/>
+        </w:rPr>
+        <w:t>.</w:t>
+      </w:r>
+      <w:r>
+        <w:rPr>
+          <w:rFonts w:cs="B Nazanin"/>
+          <w:sz w:val="24"/>
+          <w:szCs w:val="24"/>
+          <w:rtl/>
+          <w:lang w:bidi="fa-IR"/>
+        </w:rPr>
+        <w:t>اما از نظر</w:t>
+      </w:r>
+      <w:r>
+        <w:rPr>
+          <w:rFonts w:cs="B Nazanin"/>
+          <w:sz w:val="24"/>
+          <w:szCs w:val="24"/>
+          <w:lang w:bidi="fa-IR"/>
+        </w:rPr>
+        <w:t xml:space="preserve"> RESTful API design </w:t>
+      </w:r>
+      <w:r>
+        <w:rPr>
+          <w:rFonts w:cs="B Nazanin"/>
+          <w:sz w:val="24"/>
+          <w:szCs w:val="24"/>
+          <w:rtl/>
+          <w:lang w:bidi="fa-IR"/>
+        </w:rPr>
+        <w:t>معمولاً برای</w:t>
+      </w:r>
+      <w:r>
+        <w:rPr>
+          <w:rFonts w:cs="B Nazanin"/>
+          <w:sz w:val="24"/>
+          <w:szCs w:val="24"/>
+          <w:lang w:bidi="fa-IR"/>
+        </w:rPr>
+        <w:t xml:space="preserve"> Update </w:t>
+      </w:r>
+      <w:r>
+        <w:rPr>
+          <w:rFonts w:cs="B Nazanin"/>
+          <w:sz w:val="24"/>
+          <w:szCs w:val="24"/>
+          <w:rtl/>
+          <w:lang w:bidi="fa-IR"/>
+        </w:rPr>
+        <w:t>از</w:t>
+      </w:r>
+      <w:r>
+        <w:rPr>
+          <w:rFonts w:cs="B Nazanin"/>
+          <w:sz w:val="24"/>
+          <w:szCs w:val="24"/>
+          <w:lang w:bidi="fa-IR"/>
+        </w:rPr>
+        <w:t xml:space="preserve"> PUT </w:t>
+      </w:r>
+      <w:r>
+        <w:rPr>
+          <w:rFonts w:cs="B Nazanin"/>
+          <w:sz w:val="24"/>
+          <w:szCs w:val="24"/>
+          <w:rtl/>
+          <w:lang w:bidi="fa-IR"/>
+        </w:rPr>
+        <w:t>یا</w:t>
+      </w:r>
+      <w:r>
+        <w:rPr>
+          <w:rFonts w:cs="B Nazanin"/>
+          <w:sz w:val="24"/>
+          <w:szCs w:val="24"/>
+          <w:lang w:bidi="fa-IR"/>
+        </w:rPr>
+        <w:t xml:space="preserve"> PATCH </w:t>
+      </w:r>
+      <w:r>
+        <w:rPr>
+          <w:rFonts w:cs="B Nazanin"/>
+          <w:sz w:val="24"/>
+          <w:szCs w:val="24"/>
+          <w:rtl/>
+          <w:lang w:bidi="fa-IR"/>
+        </w:rPr>
+        <w:t>استفاده می‌کنیم</w:t>
+      </w:r>
+      <w:r>
+        <w:rPr>
+          <w:rFonts w:cs="B Nazanin"/>
+          <w:sz w:val="24"/>
+          <w:szCs w:val="24"/>
+          <w:lang w:bidi="fa-IR"/>
+        </w:rPr>
+        <w:t>.</w:t>
+      </w:r>
+      <w:r>
+        <w:rPr>
+          <w:rFonts w:cs="B Nazanin" w:hint="cs"/>
+          <w:sz w:val="24"/>
+          <w:szCs w:val="24"/>
+          <w:rtl/>
+          <w:lang w:bidi="fa-IR"/>
+        </w:rPr>
+        <w:t xml:space="preserve">برای رعایت </w:t>
+      </w:r>
+      <w:r>
+        <w:rPr>
+          <w:rFonts w:cs="B Nazanin"/>
+          <w:sz w:val="24"/>
+          <w:szCs w:val="24"/>
+          <w:lang w:bidi="fa-IR"/>
+        </w:rPr>
+        <w:t>rest</w:t>
+      </w:r>
+      <w:r>
+        <w:rPr>
+          <w:rFonts w:cs="B Nazanin" w:hint="cs"/>
+          <w:sz w:val="24"/>
+          <w:szCs w:val="24"/>
+          <w:rtl/>
+          <w:lang w:bidi="fa-IR"/>
+        </w:rPr>
+        <w:t xml:space="preserve"> بودن یک </w:t>
+      </w:r>
+      <w:r>
+        <w:rPr>
+          <w:rFonts w:cs="B Nazanin"/>
+          <w:sz w:val="24"/>
+          <w:szCs w:val="24"/>
+          <w:lang w:bidi="fa-IR"/>
+        </w:rPr>
+        <w:t>API</w:t>
+      </w:r>
+      <w:r>
+        <w:rPr>
+          <w:rFonts w:cs="B Nazanin" w:hint="cs"/>
+          <w:sz w:val="24"/>
+          <w:szCs w:val="24"/>
+          <w:rtl/>
+          <w:lang w:bidi="fa-IR"/>
+        </w:rPr>
+        <w:t xml:space="preserve"> بهتر است از روش زیر استفاده کرد : </w:t>
+      </w:r>
+    </w:p>
+    <w:p>
+      <w:pPr>
+        <w:bidi/>
+        <w:ind w:left="360"/>
+        <w:rPr>
+          <w:rFonts w:cs="B Nazanin"/>
+          <w:sz w:val="24"/>
+          <w:szCs w:val="24"/>
+          <w:rtl/>
+          <w:lang w:bidi="fa-IR"/>
+        </w:rPr>
+      </w:pPr>
+    </w:p>
+    <w:p>
+      <w:pPr>
+        <w:bidi/>
+        <w:ind w:left="360"/>
+        <w:rPr>
+          <w:rFonts w:cs="B Nazanin"/>
+          <w:sz w:val="24"/>
+          <w:szCs w:val="24"/>
+          <w:lang w:bidi="fa-IR"/>
+        </w:rPr>
+      </w:pPr>
+      <w:r>
+        <w:rPr>
+          <w:noProof/>
+        </w:rPr>
+        <w:drawing>
+          <wp:inline distT="0" distB="0" distL="0" distR="0" wp14:anchorId="0FB616AA" wp14:editId="3105F371">
+            <wp:extent cx="5943600" cy="2432050"/>
+            <wp:effectExtent l="0" t="0" r="0" b="6350"/>
+            <wp:docPr id="5" name="Picture 5"/>
+            <wp:cNvGraphicFramePr>
+              <a:graphicFrameLocks xmlns:a="http://schemas.openxmlformats.org/drawingml/2006/main" noChangeAspect="1"/>
+            </wp:cNvGraphicFramePr>
+            <a:graphic xmlns:a="http://schemas.openxmlformats.org/drawingml/2006/main">
+              <a:graphicData uri="http://schemas.openxmlformats.org/drawingml/2006/picture">
+                <pic:pic xmlns:pic="http://schemas.openxmlformats.org/drawingml/2006/picture">
+                  <pic:nvPicPr>
+                    <pic:cNvPr id="1" name=""/>
+                    <pic:cNvPicPr/>
+                  </pic:nvPicPr>
+                  <pic:blipFill>
+                    <a:blip r:embed="rId13"/>
+                    <a:stretch>
+                      <a:fillRect/>
+                    </a:stretch>
+                  </pic:blipFill>
+                  <pic:spPr>
+                    <a:xfrm>
+                      <a:off x="0" y="0"/>
                       <a:ext cx="5943600" cy="2432050"/>
                     </a:xfrm>
                     <a:prstGeom prst="rect">
@@ -12240,7 +13898,29 @@
           <w:rtl/>
           <w:lang w:bidi="fa-IR"/>
         </w:rPr>
-        <w:t xml:space="preserve">در کل عبارت دو نقطه یا  : چه کاربرد هایی در </w:t>
+        <w:t xml:space="preserve">در کل عبارت دو نقطه یا  : چه کاربرد </w:t>
+      </w:r>
+      <w:proofErr w:type="spellStart"/>
+      <w:r>
+        <w:rPr>
+          <w:rFonts w:cs="B Nazanin" w:hint="cs"/>
+          <w:sz w:val="24"/>
+          <w:szCs w:val="24"/>
+          <w:rtl/>
+          <w:lang w:bidi="fa-IR"/>
+        </w:rPr>
+        <w:t>هایی</w:t>
+      </w:r>
+      <w:proofErr w:type="spellEnd"/>
+      <w:r>
+        <w:rPr>
+          <w:rFonts w:cs="B Nazanin" w:hint="cs"/>
+          <w:sz w:val="24"/>
+          <w:szCs w:val="24"/>
+          <w:rtl/>
+          <w:lang w:bidi="fa-IR"/>
+        </w:rPr>
+        <w:t xml:space="preserve"> در </w:t>
       </w:r>
       <w:r>
         <w:rPr>
@@ -12298,15 +13978,27 @@
           <w:lang w:bidi="fa-IR"/>
         </w:rPr>
       </w:pPr>
-      <w:r>
-        <w:rPr>
-          <w:rFonts w:cs="B Nazanin"/>
-          <w:sz w:val="24"/>
-          <w:szCs w:val="24"/>
-          <w:rtl/>
-          <w:lang w:bidi="fa-IR"/>
-        </w:rPr>
-        <w:t xml:space="preserve">ارث‌بری از کلاس </w:t>
+      <w:proofErr w:type="spellStart"/>
+      <w:r>
+        <w:rPr>
+          <w:rFonts w:cs="B Nazanin"/>
+          <w:sz w:val="24"/>
+          <w:szCs w:val="24"/>
+          <w:rtl/>
+          <w:lang w:bidi="fa-IR"/>
+        </w:rPr>
+        <w:t>ارث‌بری</w:t>
+      </w:r>
+      <w:proofErr w:type="spellEnd"/>
+      <w:r>
+        <w:rPr>
+          <w:rFonts w:cs="B Nazanin"/>
+          <w:sz w:val="24"/>
+          <w:szCs w:val="24"/>
+          <w:rtl/>
+          <w:lang w:bidi="fa-IR"/>
+        </w:rPr>
+        <w:t xml:space="preserve"> از کلاس </w:t>
       </w:r>
     </w:p>
     <w:p>
@@ -12429,6 +14121,7 @@
         </w:rPr>
         <w:t xml:space="preserve"> (ii      </w:t>
       </w:r>
+      <w:proofErr w:type="spellStart"/>
       <w:r>
         <w:rPr>
           <w:rFonts w:cs="B Nazanin"/>
@@ -12439,6 +14132,7 @@
         </w:rPr>
         <w:t>پیاده‌سازی</w:t>
       </w:r>
+      <w:proofErr w:type="spellEnd"/>
       <w:r>
         <w:rPr>
           <w:rFonts w:cs="B Nazanin"/>
@@ -12465,8 +14159,20 @@
           <w:szCs w:val="24"/>
           <w:lang w:bidi="fa-IR"/>
         </w:rPr>
-        <w:t>class Product : IProduct</w:t>
-      </w:r>
+        <w:lastRenderedPageBreak/>
+        <w:t xml:space="preserve">class Product : </w:t>
+      </w:r>
+      <w:proofErr w:type="spellStart"/>
+      <w:r>
+        <w:rPr>
+          <w:rFonts w:cs="B Nazanin"/>
+          <w:sz w:val="24"/>
+          <w:szCs w:val="24"/>
+          <w:lang w:bidi="fa-IR"/>
+        </w:rPr>
+        <w:t>IProduct</w:t>
+      </w:r>
+      <w:proofErr w:type="spellEnd"/>
     </w:p>
     <w:p>
       <w:pPr>
@@ -12508,25 +14214,70 @@
         </w:rPr>
         <w:t xml:space="preserve">، </w:t>
       </w:r>
-      <w:r>
-        <w:rPr>
-          <w:rFonts w:cs="B Nazanin"/>
-          <w:sz w:val="24"/>
-          <w:szCs w:val="24"/>
-          <w:lang w:bidi="fa-IR"/>
-        </w:rPr>
-        <w:t xml:space="preserve">IProduct </w:t>
-      </w:r>
-      <w:r>
-        <w:rPr>
-          <w:rFonts w:cs="B Nazanin"/>
-          <w:sz w:val="24"/>
-          <w:szCs w:val="24"/>
-          <w:rtl/>
-          <w:lang w:bidi="fa-IR"/>
-        </w:rPr>
-        <w:t>را پیاده‌سازی می‌کند</w:t>
-      </w:r>
+      <w:proofErr w:type="spellStart"/>
+      <w:r>
+        <w:rPr>
+          <w:rFonts w:cs="B Nazanin"/>
+          <w:sz w:val="24"/>
+          <w:szCs w:val="24"/>
+          <w:lang w:bidi="fa-IR"/>
+        </w:rPr>
+        <w:t>IProduct</w:t>
+      </w:r>
+      <w:proofErr w:type="spellEnd"/>
+      <w:r>
+        <w:rPr>
+          <w:rFonts w:cs="B Nazanin"/>
+          <w:sz w:val="24"/>
+          <w:szCs w:val="24"/>
+          <w:lang w:bidi="fa-IR"/>
+        </w:rPr>
+        <w:t xml:space="preserve"> </w:t>
+      </w:r>
+      <w:r>
+        <w:rPr>
+          <w:rFonts w:cs="B Nazanin"/>
+          <w:sz w:val="24"/>
+          <w:szCs w:val="24"/>
+          <w:rtl/>
+          <w:lang w:bidi="fa-IR"/>
+        </w:rPr>
+        <w:t xml:space="preserve">را </w:t>
+      </w:r>
+      <w:proofErr w:type="spellStart"/>
+      <w:r>
+        <w:rPr>
+          <w:rFonts w:cs="B Nazanin"/>
+          <w:sz w:val="24"/>
+          <w:szCs w:val="24"/>
+          <w:rtl/>
+          <w:lang w:bidi="fa-IR"/>
+        </w:rPr>
+        <w:t>پیاده‌سازی</w:t>
+      </w:r>
+      <w:proofErr w:type="spellEnd"/>
+      <w:r>
+        <w:rPr>
+          <w:rFonts w:cs="B Nazanin"/>
+          <w:sz w:val="24"/>
+          <w:szCs w:val="24"/>
+          <w:rtl/>
+          <w:lang w:bidi="fa-IR"/>
+        </w:rPr>
+        <w:t xml:space="preserve"> </w:t>
+      </w:r>
+      <w:proofErr w:type="spellStart"/>
+      <w:r>
+        <w:rPr>
+          <w:rFonts w:cs="B Nazanin"/>
+          <w:sz w:val="24"/>
+          <w:szCs w:val="24"/>
+          <w:rtl/>
+          <w:lang w:bidi="fa-IR"/>
+        </w:rPr>
+        <w:t>می‌کند</w:t>
+      </w:r>
+      <w:proofErr w:type="spellEnd"/>
       <w:r>
         <w:rPr>
           <w:rFonts w:cs="B Nazanin"/>
@@ -12616,7 +14367,6 @@
           <w:szCs w:val="24"/>
           <w:lang w:bidi="fa-IR"/>
         </w:rPr>
-        <w:lastRenderedPageBreak/>
         <w:t>Product() : base(...)</w:t>
       </w:r>
     </w:p>
@@ -13285,7 +15035,7 @@
                     <pic:cNvPicPr/>
                   </pic:nvPicPr>
                   <pic:blipFill>
-                    <a:blip r:embed="rId13"/>
+                    <a:blip r:embed="rId14"/>
                     <a:stretch>
                       <a:fillRect/>
                     </a:stretch>
@@ -14563,7 +16313,7 @@
   <w:style w:type="paragraph" w:default="1" w:styleId="Normal">
     <w:name w:val="Normal"/>
     <w:qFormat/>
-    <w:rsid w:val="008C1F40"/>
+    <w:rsid w:val="00AB5620"/>
   </w:style>
   <w:style w:type="character" w:default="1" w:styleId="DefaultParagraphFont">
     <w:name w:val="Default Paragraph Font"/>

</xml_diff>